<commit_message>
docs: add thorough AbstractX Studio introduction, buildup, and 4-instrument overview
</commit_message>
<xml_diff>
--- a/docs/articles/micropython-on-e906/micropython_on_e906.docx
+++ b/docs/articles/micropython-on-e906/micropython_on_e906.docx
@@ -2,7 +2,7 @@
 <file path=word/document.xml><?xml version="1.0" encoding="utf-8"?>
 <w:document xmlns:w="http://schemas.openxmlformats.org/wordprocessingml/2006/main" xmlns:m="http://schemas.openxmlformats.org/officeDocument/2006/math" xmlns:r="http://schemas.openxmlformats.org/officeDocument/2006/relationships" xmlns:o="urn:schemas-microsoft-com:office:office" xmlns:v="urn:schemas-microsoft-com:vml" xmlns:w10="urn:schemas-microsoft-com:office:word" xmlns:a="http://schemas.openxmlformats.org/drawingml/2006/main" xmlns:pic="http://schemas.openxmlformats.org/drawingml/2006/picture" xmlns:wp="http://schemas.openxmlformats.org/drawingml/2006/wordprocessingDrawing">
   <w:body>
-    <w:bookmarkStart w:id="90" w:name="X42daeb7981879792ae6f05b0d76afb28438707c"/>
+    <w:bookmarkStart w:id="98" w:name="X42daeb7981879792ae6f05b0d76afb28438707c"/>
     <w:p>
       <w:pPr>
         <w:pStyle w:val="Heading1"/>
@@ -89,13 +89,20 @@
         <w:t xml:space="preserve"> </w:t>
       </w:r>
       <w:r>
-        <w:t xml:space="preserve">between experiments. While it runs, a live view on your PC shows what the</w:t>
-      </w:r>
-      <w:r>
-        <w:t xml:space="preserve"> </w:t>
-      </w:r>
-      <w:r>
-        <w:t xml:space="preserve">little core is spending its time on.</w:t>
+        <w:t xml:space="preserve">between experiments. While it runs,</w:t>
+      </w:r>
+      <w:r>
+        <w:t xml:space="preserve"> </w:t>
+      </w:r>
+      <w:r>
+        <w:rPr>
+          <w:b/>
+          <w:bCs/>
+        </w:rPr>
+        <w:t xml:space="preserve">AbstractX Studio</w:t>
+      </w:r>
+      <w:r>
+        <w:t xml:space="preserve">—our native desktop engineering workbench running on your PC—provides real-time visibility into the coprocessor: CPU utilization, per-interrupt microsecond costs, line-by-line source profiling, and an interactive prompt, all without stalling hard real-time execution.</w:t>
       </w:r>
     </w:p>
     <w:p>
@@ -162,7 +169,7 @@
           <w:i/>
           <w:iCs/>
         </w:rPr>
-        <w:t xml:space="preserve">Live from the board: once a second the E906 reports how busy it is, which part of its software used the time, and what each hardware interrupt costs.</w:t>
+        <w:t xml:space="preserve">Live from the board: AbstractX Studio displays the E906’s real-time heartbeat. Once a second it updates CPU load, per-task execution percentages, and exact per-interrupt microsecond costs using sub-microsecond non-intrusive binary telemetry.</w:t>
       </w:r>
     </w:p>
     <w:bookmarkStart w:id="12" w:name="in-short"/>
@@ -376,13 +383,62 @@
         <w:t xml:space="preserve"> </w:t>
       </w:r>
       <w:r>
-        <w:t xml:space="preserve">run code on the E906 or read its CPU load. A desktop tool, AbstractX Studio,</w:t>
-      </w:r>
-      <w:r>
-        <w:t xml:space="preserve"> </w:t>
-      </w:r>
-      <w:r>
-        <w:t xml:space="preserve">gives you a prompt on the E906 and live views of what it is doing.</w:t>
+        <w:t xml:space="preserve">run code on the E906 or read its CPU load.</w:t>
+      </w:r>
+      <w:r>
+        <w:t xml:space="preserve"> </w:t>
+      </w:r>
+      <w:r>
+        <w:rPr>
+          <w:b/>
+          <w:bCs/>
+        </w:rPr>
+        <w:t xml:space="preserve">AbstractX Studio</w:t>
+      </w:r>
+      <w:r>
+        <w:t xml:space="preserve">, a dedicated</w:t>
+      </w:r>
+      <w:r>
+        <w:t xml:space="preserve"> </w:t>
+      </w:r>
+      <w:r>
+        <w:t xml:space="preserve">desktop engineering workbench running on your PC, gives you an interactive</w:t>
+      </w:r>
+      <w:r>
+        <w:t xml:space="preserve"> </w:t>
+      </w:r>
+      <w:r>
+        <w:t xml:space="preserve">REPL and live silicon observability instruments (bare-metal</w:t>
+      </w:r>
+      <w:r>
+        <w:t xml:space="preserve"> </w:t>
+      </w:r>
+      <w:r>
+        <w:rPr>
+          <w:rStyle w:val="VerbatimChar"/>
+        </w:rPr>
+        <w:t xml:space="preserve">top</w:t>
+      </w:r>
+      <w:r>
+        <w:t xml:space="preserve">,</w:t>
+      </w:r>
+      <w:r>
+        <w:t xml:space="preserve"> </w:t>
+      </w:r>
+      <w:r>
+        <w:rPr>
+          <w:rStyle w:val="VerbatimChar"/>
+        </w:rPr>
+        <w:t xml:space="preserve">perf</w:t>
+      </w:r>
+      <w:r>
+        <w:t xml:space="preserve">,</w:t>
+      </w:r>
+      <w:r>
+        <w:t xml:space="preserve"> </w:t>
+      </w:r>
+      <w:r>
+        <w:t xml:space="preserve">and a software logic analyzer timeline).</w:t>
       </w:r>
     </w:p>
     <w:p>
@@ -3862,7 +3918,85 @@
           <w:i/>
           <w:iCs/>
         </w:rPr>
-        <w:t xml:space="preserve">The three columns are three separate machines as far as software is concerned: a PC, Linux on the A55 cores, and the E906.</w:t>
+        <w:t xml:space="preserve">The three columns are three separate machines as far as software is concerned: a PC running AbstractX Studio, Linux on the Cortex-A55 cores, and the E906 coprocessor.</w:t>
+      </w:r>
+    </w:p>
+    <w:p>
+      <w:pPr>
+        <w:pStyle w:val="BodyText"/>
+      </w:pPr>
+      <w:r>
+        <w:t xml:space="preserve">Notice how the three tiers divide the engineering labor:</w:t>
+      </w:r>
+      <w:r>
+        <w:t xml:space="preserve"> </w:t>
+      </w:r>
+      <w:r>
+        <w:t xml:space="preserve">1.</w:t>
+      </w:r>
+      <w:r>
+        <w:t xml:space="preserve"> </w:t>
+      </w:r>
+      <w:r>
+        <w:rPr>
+          <w:b/>
+          <w:bCs/>
+        </w:rPr>
+        <w:t xml:space="preserve">The Development PC</w:t>
+      </w:r>
+      <w:r>
+        <w:t xml:space="preserve">: Runs</w:t>
+      </w:r>
+      <w:r>
+        <w:t xml:space="preserve"> </w:t>
+      </w:r>
+      <w:r>
+        <w:rPr>
+          <w:b/>
+          <w:bCs/>
+        </w:rPr>
+        <w:t xml:space="preserve">AbstractX Studio</w:t>
+      </w:r>
+      <w:r>
+        <w:t xml:space="preserve">, rendering rich 60 FPS Dear ImGui observability instruments, decoding binary telemetry, and parsing DWARF ELF symbols so the embedded silicon never wastes compute or SRAM on GUI rendering or string formatting.</w:t>
+      </w:r>
+      <w:r>
+        <w:t xml:space="preserve"> </w:t>
+      </w:r>
+      <w:r>
+        <w:t xml:space="preserve">2.</w:t>
+      </w:r>
+      <w:r>
+        <w:t xml:space="preserve"> </w:t>
+      </w:r>
+      <w:r>
+        <w:rPr>
+          <w:b/>
+          <w:bCs/>
+        </w:rPr>
+        <w:t xml:space="preserve">The Cortex-A55 Linux Cores</w:t>
+      </w:r>
+      <w:r>
+        <w:t xml:space="preserve">: Act as a transparent high-bandwidth bridge, routing RPMsg message streams and binary trace buffers over SSH or network sockets to your PC.</w:t>
+      </w:r>
+      <w:r>
+        <w:t xml:space="preserve"> </w:t>
+      </w:r>
+      <w:r>
+        <w:t xml:space="preserve">3.</w:t>
+      </w:r>
+      <w:r>
+        <w:t xml:space="preserve"> </w:t>
+      </w:r>
+      <w:r>
+        <w:rPr>
+          <w:b/>
+          <w:bCs/>
+        </w:rPr>
+        <w:t xml:space="preserve">The XuanTie E906 RISC-V Core</w:t>
+      </w:r>
+      <w:r>
+        <w:t xml:space="preserve">: Runs the lightweight, freestanding AbstractX event loop and MicroPython, driving I²C and UART hardware peripherals in real time.</w:t>
       </w:r>
     </w:p>
     <w:p>
@@ -6266,7 +6400,7 @@
     <w:bookmarkEnd w:id="41"/>
     <w:bookmarkEnd w:id="42"/>
     <w:bookmarkEnd w:id="43"/>
-    <w:bookmarkStart w:id="58" w:name="experiments-without-compiling"/>
+    <w:bookmarkStart w:id="59" w:name="experiments-without-compiling"/>
     <w:p>
       <w:pPr>
         <w:pStyle w:val="Heading2"/>
@@ -7702,13 +7836,13 @@
       </w:r>
     </w:p>
     <w:bookmarkEnd w:id="52"/>
-    <w:bookmarkStart w:id="56" w:name="X1b8a8f1060e5ed63c4c92fa943400cb4f230bb2"/>
+    <w:bookmarkStart w:id="57" w:name="X414ccc0df9ee5d66077456547fd9f0c465065d2"/>
     <w:p>
       <w:pPr>
         <w:pStyle w:val="Heading3"/>
       </w:pPr>
       <w:r>
-        <w:t xml:space="preserve">6.6 Python beside a running stream, from the PC</w:t>
+        <w:t xml:space="preserve">6.6 Python beside a running stream: Meet AbstractX Studio’s CLI</w:t>
       </w:r>
     </w:p>
     <w:p>
@@ -7716,13 +7850,22 @@
         <w:pStyle w:val="FirstParagraph"/>
       </w:pPr>
       <w:r>
-        <w:t xml:space="preserve">AbstractX Studio is a desktop tool that connects to the board over ssh.</w:t>
-      </w:r>
-      <w:r>
-        <w:t xml:space="preserve"> </w:t>
-      </w:r>
-      <w:r>
-        <w:t xml:space="preserve">Its</w:t>
+        <w:t xml:space="preserve">While command-line scripts like</w:t>
+      </w:r>
+      <w:r>
+        <w:t xml:space="preserve"> </w:t>
+      </w:r>
+      <w:r>
+        <w:rPr>
+          <w:rStyle w:val="VerbatimChar"/>
+        </w:rPr>
+        <w:t xml:space="preserve">run_e906_script.py</w:t>
+      </w:r>
+      <w:r>
+        <w:t xml:space="preserve"> </w:t>
+      </w:r>
+      <w:r>
+        <w:t xml:space="preserve">are convenient for batch runs, real-time embedded work is vastly more productive with a dedicated engineering workbench. This brings us to</w:t>
       </w:r>
       <w:r>
         <w:t xml:space="preserve"> </w:t>
@@ -7732,19 +7875,61 @@
           <w:b/>
           <w:bCs/>
         </w:rPr>
-        <w:t xml:space="preserve">CLI</w:t>
-      </w:r>
-      <w:r>
-        <w:t xml:space="preserve"> </w:t>
-      </w:r>
-      <w:r>
-        <w:t xml:space="preserve">tab sends Python to the same MicroPython that is streaming the</w:t>
-      </w:r>
-      <w:r>
-        <w:t xml:space="preserve"> </w:t>
-      </w:r>
-      <w:r>
-        <w:t xml:space="preserve">compass and GPS, without stopping the stream:</w:t>
+        <w:t xml:space="preserve">AbstractX Studio</w:t>
+      </w:r>
+      <w:r>
+        <w:t xml:space="preserve"> </w:t>
+      </w:r>
+      <w:r>
+        <w:t xml:space="preserve">(</w:t>
+      </w:r>
+      <w:hyperlink r:id="rId53">
+        <w:r>
+          <w:rPr>
+            <w:rStyle w:val="VerbatimChar"/>
+          </w:rPr>
+          <w:t xml:space="preserve">tools/visualizer</w:t>
+        </w:r>
+      </w:hyperlink>
+      <w:r>
+        <w:t xml:space="preserve">), our native cross-platform desktop cockpit.</w:t>
+      </w:r>
+    </w:p>
+    <w:p>
+      <w:pPr>
+        <w:pStyle w:val="BodyText"/>
+      </w:pPr>
+      <w:r>
+        <w:t xml:space="preserve">Connecting to the Cubie A5E over SSH, Studio provides an interactive</w:t>
+      </w:r>
+      <w:r>
+        <w:t xml:space="preserve"> </w:t>
+      </w:r>
+      <w:r>
+        <w:rPr>
+          <w:b/>
+          <w:bCs/>
+        </w:rPr>
+        <w:t xml:space="preserve">CLI tab</w:t>
+      </w:r>
+      <w:r>
+        <w:t xml:space="preserve">. It allows you to inject Python statements directly into the E906’s MicroPython engine</w:t>
+      </w:r>
+      <w:r>
+        <w:t xml:space="preserve"> </w:t>
+      </w:r>
+      <w:r>
+        <w:rPr>
+          <w:i/>
+          <w:iCs/>
+        </w:rPr>
+        <w:t xml:space="preserve">while</w:t>
+      </w:r>
+      <w:r>
+        <w:t xml:space="preserve"> </w:t>
+      </w:r>
+      <w:r>
+        <w:t xml:space="preserve">the compass and GPS streaming tasks continue running concurrently in the background:</w:t>
       </w:r>
     </w:p>
     <w:p>
@@ -7756,18 +7941,18 @@
           <wp:inline>
             <wp:extent cx="5334000" cy="5197865"/>
             <wp:effectExtent b="0" l="0" r="0" t="0"/>
-            <wp:docPr descr="Studio’s CLI tab running Python on the E906 while the compass and GPS stream continues" title="" id="54" name="Picture"/>
+            <wp:docPr descr="Studio’s CLI tab running Python on the E906 while the compass and GPS stream continues" title="" id="55" name="Picture"/>
             <a:graphic>
               <a:graphicData uri="http://schemas.openxmlformats.org/drawingml/2006/picture">
                 <pic:pic>
                   <pic:nvPicPr>
-                    <pic:cNvPr descr="https://raw.githubusercontent.com/tcmichals/AbstractX/main/docs/articles/micropython-on-e906/assets/studio-cli.png" id="55" name="Picture"/>
+                    <pic:cNvPr descr="https://raw.githubusercontent.com/tcmichals/AbstractX/main/docs/articles/micropython-on-e906/assets/studio-cli.png" id="56" name="Picture"/>
                     <pic:cNvPicPr>
                       <a:picLocks noChangeArrowheads="1" noChangeAspect="1"/>
                     </pic:cNvPicPr>
                   </pic:nvPicPr>
                   <pic:blipFill>
-                    <a:blip r:embed="rId53"/>
+                    <a:blip r:embed="rId54"/>
                     <a:stretch>
                       <a:fillRect/>
                     </a:stretch>
@@ -8036,8 +8221,8 @@
         <w:t xml:space="preserve">stopping the stream.</w:t>
       </w:r>
     </w:p>
-    <w:bookmarkEnd w:id="56"/>
-    <w:bookmarkStart w:id="57" w:name="Xd309afdb8eb18501d78db0c572958ad00481ff6"/>
+    <w:bookmarkEnd w:id="57"/>
+    <w:bookmarkStart w:id="58" w:name="Xd309afdb8eb18501d78db0c572958ad00481ff6"/>
     <w:p>
       <w:pPr>
         <w:pStyle w:val="Heading3"/>
@@ -9134,15 +9319,15 @@
         </w:pict>
       </w:r>
     </w:p>
-    <w:bookmarkEnd w:id="57"/>
     <w:bookmarkEnd w:id="58"/>
-    <w:bookmarkStart w:id="68" w:name="watching-the-e906-work"/>
+    <w:bookmarkEnd w:id="59"/>
+    <w:bookmarkStart w:id="77" w:name="X1829a5834a2fb0914473c2be2e6c582cfcc071e"/>
     <w:p>
       <w:pPr>
         <w:pStyle w:val="Heading2"/>
       </w:pPr>
       <w:r>
-        <w:t xml:space="preserve">7. Watching the E906 work</w:t>
+        <w:t xml:space="preserve">7. Watching the E906 Work: Inside AbstractX Studio</w:t>
       </w:r>
     </w:p>
     <w:p>
@@ -9150,49 +9335,493 @@
         <w:pStyle w:val="FirstParagraph"/>
       </w:pPr>
       <w:r>
-        <w:t xml:space="preserve">AbstractX measures itself, independently of what your script does, and sends</w:t>
-      </w:r>
-      <w:r>
-        <w:t xml:space="preserve"> </w:t>
-      </w:r>
-      <w:r>
-        <w:t xml:space="preserve">three kinds of trace packets on the trace stream. Studio turns them into</w:t>
-      </w:r>
-      <w:r>
-        <w:t xml:space="preserve"> </w:t>
-      </w:r>
-      <w:r>
-        <w:t xml:space="preserve">views.</w:t>
-      </w:r>
-    </w:p>
-    <w:p>
-      <w:pPr>
-        <w:pStyle w:val="BodyText"/>
-      </w:pPr>
+        <w:t xml:space="preserve">When developing software for an asymmetric multi-core processor (AMP)—where Linux runs on high-performance application cores while a bare-metal coprocessor handles real-time I/O—the single biggest obstacle is</w:t>
+      </w:r>
+      <w:r>
+        <w:t xml:space="preserve"> </w:t>
+      </w:r>
       <w:r>
         <w:rPr>
           <w:b/>
           <w:bCs/>
         </w:rPr>
-        <w:t xml:space="preserve">CPU and drivers, once a second.</w:t>
-      </w:r>
-      <w:r>
-        <w:t xml:space="preserve"> </w:t>
-      </w:r>
-      <w:r>
-        <w:t xml:space="preserve">How busy the E906 is, how much of that</w:t>
-      </w:r>
-      <w:r>
-        <w:t xml:space="preserve"> </w:t>
-      </w:r>
-      <w:r>
-        <w:t xml:space="preserve">each task used, and for each interrupt line how often it fired, what one</w:t>
-      </w:r>
-      <w:r>
-        <w:t xml:space="preserve"> </w:t>
-      </w:r>
-      <w:r>
-        <w:t xml:space="preserve">interrupt costs and how many errors its driver counted.</w:t>
+        <w:t xml:space="preserve">observability</w:t>
+      </w:r>
+      <w:r>
+        <w:t xml:space="preserve">.</w:t>
+      </w:r>
+    </w:p>
+    <w:p>
+      <w:pPr>
+        <w:pStyle w:val="BodyText"/>
+      </w:pPr>
+      <w:r>
+        <w:t xml:space="preserve">On Linux, developers take a rich suite of diagnostic tools for granted:</w:t>
+      </w:r>
+      <w:r>
+        <w:t xml:space="preserve"> </w:t>
+      </w:r>
+      <w:r>
+        <w:rPr>
+          <w:rStyle w:val="VerbatimChar"/>
+        </w:rPr>
+        <w:t xml:space="preserve">top</w:t>
+      </w:r>
+      <w:r>
+        <w:t xml:space="preserve">,</w:t>
+      </w:r>
+      <w:r>
+        <w:t xml:space="preserve"> </w:t>
+      </w:r>
+      <w:r>
+        <w:rPr>
+          <w:rStyle w:val="VerbatimChar"/>
+        </w:rPr>
+        <w:t xml:space="preserve">htop</w:t>
+      </w:r>
+      <w:r>
+        <w:t xml:space="preserve">,</w:t>
+      </w:r>
+      <w:r>
+        <w:t xml:space="preserve"> </w:t>
+      </w:r>
+      <w:r>
+        <w:rPr>
+          <w:rStyle w:val="VerbatimChar"/>
+        </w:rPr>
+        <w:t xml:space="preserve">perf</w:t>
+      </w:r>
+      <w:r>
+        <w:t xml:space="preserve">,</w:t>
+      </w:r>
+      <w:r>
+        <w:t xml:space="preserve"> </w:t>
+      </w:r>
+      <w:r>
+        <w:rPr>
+          <w:rStyle w:val="VerbatimChar"/>
+        </w:rPr>
+        <w:t xml:space="preserve">ftrace</w:t>
+      </w:r>
+      <w:r>
+        <w:t xml:space="preserve">,</w:t>
+      </w:r>
+      <w:r>
+        <w:t xml:space="preserve"> </w:t>
+      </w:r>
+      <w:r>
+        <w:rPr>
+          <w:rStyle w:val="VerbatimChar"/>
+        </w:rPr>
+        <w:t xml:space="preserve">gdb</w:t>
+      </w:r>
+      <w:r>
+        <w:t xml:space="preserve">, core dumps, and syslog. But on a bare-metal RISC-V coprocessor, developers are usually</w:t>
+      </w:r>
+      <w:r>
+        <w:t xml:space="preserve"> </w:t>
+      </w:r>
+      <w:r>
+        <w:rPr>
+          <w:b/>
+          <w:bCs/>
+        </w:rPr>
+        <w:t xml:space="preserve">flying blind</w:t>
+      </w:r>
+      <w:r>
+        <w:t xml:space="preserve">:</w:t>
+      </w:r>
+      <w:r>
+        <w:t xml:space="preserve"> </w:t>
+      </w:r>
+      <w:r>
+        <w:t xml:space="preserve">-</w:t>
+      </w:r>
+      <w:r>
+        <w:t xml:space="preserve"> </w:t>
+      </w:r>
+      <w:r>
+        <w:rPr>
+          <w:b/>
+          <w:bCs/>
+        </w:rPr>
+        <w:t xml:space="preserve">No OS means no</w:t>
+      </w:r>
+      <w:r>
+        <w:rPr>
+          <w:b/>
+          <w:bCs/>
+        </w:rPr>
+        <w:t xml:space="preserve"> </w:t>
+      </w:r>
+      <w:r>
+        <w:rPr>
+          <w:rStyle w:val="VerbatimChar"/>
+          <w:b/>
+          <w:bCs/>
+        </w:rPr>
+        <w:t xml:space="preserve">top</w:t>
+      </w:r>
+      <w:r>
+        <w:t xml:space="preserve">: Without an operating system scheduler slicing threads, there is no built-in way to know whether your coprocessor is 5% busy or 99% busy, or how much CPU time MicroPython’s garbage collector is consuming relative to hardware drivers.</w:t>
+      </w:r>
+      <w:r>
+        <w:t xml:space="preserve"> </w:t>
+      </w:r>
+      <w:r>
+        <w:t xml:space="preserve">-</w:t>
+      </w:r>
+      <w:r>
+        <w:t xml:space="preserve"> </w:t>
+      </w:r>
+      <w:r>
+        <w:rPr>
+          <w:b/>
+          <w:bCs/>
+        </w:rPr>
+        <w:t xml:space="preserve">The</w:t>
+      </w:r>
+      <w:r>
+        <w:rPr>
+          <w:b/>
+          <w:bCs/>
+        </w:rPr>
+        <w:t xml:space="preserve"> </w:t>
+      </w:r>
+      <w:r>
+        <w:rPr>
+          <w:rStyle w:val="VerbatimChar"/>
+          <w:b/>
+          <w:bCs/>
+        </w:rPr>
+        <w:t xml:space="preserve">printf</w:t>
+      </w:r>
+      <w:r>
+        <w:rPr>
+          <w:b/>
+          <w:bCs/>
+        </w:rPr>
+        <w:t xml:space="preserve"> </w:t>
+      </w:r>
+      <w:r>
+        <w:rPr>
+          <w:b/>
+          <w:bCs/>
+        </w:rPr>
+        <w:t xml:space="preserve">trap &amp; Heisenbugs</w:t>
+      </w:r>
+      <w:r>
+        <w:t xml:space="preserve">: Inserting debug</w:t>
+      </w:r>
+      <w:r>
+        <w:t xml:space="preserve"> </w:t>
+      </w:r>
+      <w:r>
+        <w:rPr>
+          <w:rStyle w:val="VerbatimChar"/>
+        </w:rPr>
+        <w:t xml:space="preserve">printf()</w:t>
+      </w:r>
+      <w:r>
+        <w:t xml:space="preserve"> </w:t>
+      </w:r>
+      <w:r>
+        <w:t xml:space="preserve">calls over a serial port stalls execution. At 115,200 baud, printing a single 100-character line takes</w:t>
+      </w:r>
+      <w:r>
+        <w:t xml:space="preserve"> </w:t>
+      </w:r>
+      <w:r>
+        <w:rPr>
+          <w:b/>
+          <w:bCs/>
+        </w:rPr>
+        <w:t xml:space="preserve">8.7 milliseconds</w:t>
+      </w:r>
+      <w:r>
+        <w:t xml:space="preserve">. In a 1 kHz sensor loop, that delay is fatal—it causes I²C arbitration timeouts, overflows UART FIFOs, and completely distorts the timing you were attempting to measure. The bug disappears or mutates the moment you try to observe it.</w:t>
+      </w:r>
+      <w:r>
+        <w:t xml:space="preserve"> </w:t>
+      </w:r>
+      <w:r>
+        <w:t xml:space="preserve">-</w:t>
+      </w:r>
+      <w:r>
+        <w:t xml:space="preserve"> </w:t>
+      </w:r>
+      <w:r>
+        <w:rPr>
+          <w:b/>
+          <w:bCs/>
+        </w:rPr>
+        <w:t xml:space="preserve">JTAG halts break real-time physics</w:t>
+      </w:r>
+      <w:r>
+        <w:t xml:space="preserve">: Halting the CPU with a traditional JTAG hardware breakpoint stops the core, but external hardware (the compass, GPS, and DMA controllers) keeps running. Registers overflow and communication interfaces time out, making live debugging impossible.</w:t>
+      </w:r>
+    </w:p>
+    <w:p>
+      <w:pPr>
+        <w:pStyle w:val="BodyText"/>
+      </w:pPr>
+      <w:r>
+        <w:t xml:space="preserve">To eliminate this blindness, AbstractX includes</w:t>
+      </w:r>
+      <w:r>
+        <w:t xml:space="preserve"> </w:t>
+      </w:r>
+      <w:r>
+        <w:rPr>
+          <w:b/>
+          <w:bCs/>
+        </w:rPr>
+        <w:t xml:space="preserve">AbstractX Studio</w:t>
+      </w:r>
+      <w:r>
+        <w:t xml:space="preserve"> </w:t>
+      </w:r>
+      <w:r>
+        <w:t xml:space="preserve">(</w:t>
+      </w:r>
+      <w:hyperlink r:id="rId53">
+        <w:r>
+          <w:rPr>
+            <w:rStyle w:val="VerbatimChar"/>
+          </w:rPr>
+          <w:t xml:space="preserve">tools/visualizer</w:t>
+        </w:r>
+      </w:hyperlink>
+      <w:r>
+        <w:t xml:space="preserve">): a unified desktop engineering workbench and observability cockpit designed specifically for bare-metal and heterogeneous systems.</w:t>
+      </w:r>
+    </w:p>
+    <w:bookmarkStart w:id="60" w:name="what-is-abstractx-studio"/>
+    <w:p>
+      <w:pPr>
+        <w:pStyle w:val="Heading3"/>
+      </w:pPr>
+      <w:r>
+        <w:t xml:space="preserve">7.1 What is AbstractX Studio?</w:t>
+      </w:r>
+    </w:p>
+    <w:p>
+      <w:pPr>
+        <w:pStyle w:val="FirstParagraph"/>
+      </w:pPr>
+      <w:r>
+        <w:t xml:space="preserve">AbstractX Studio is a native desktop application written in modern C++20 using</w:t>
+      </w:r>
+      <w:r>
+        <w:t xml:space="preserve"> </w:t>
+      </w:r>
+      <w:r>
+        <w:rPr>
+          <w:b/>
+          <w:bCs/>
+        </w:rPr>
+        <w:t xml:space="preserve">Dear ImGui</w:t>
+      </w:r>
+      <w:r>
+        <w:t xml:space="preserve"> </w:t>
+      </w:r>
+      <w:r>
+        <w:t xml:space="preserve">and</w:t>
+      </w:r>
+      <w:r>
+        <w:t xml:space="preserve"> </w:t>
+      </w:r>
+      <w:r>
+        <w:rPr>
+          <w:b/>
+          <w:bCs/>
+        </w:rPr>
+        <w:t xml:space="preserve">HelloImGui</w:t>
+      </w:r>
+      <w:r>
+        <w:t xml:space="preserve">. It runs on your development PC (Linux, macOS, or Windows) at a silky 60 FPS and connects to the Cubie A5E over a standard SSH connection or network socket.</w:t>
+      </w:r>
+    </w:p>
+    <w:p>
+      <w:pPr>
+        <w:pStyle w:val="BodyText"/>
+      </w:pPr>
+      <w:r>
+        <w:t xml:space="preserve">Instead of heavy text logging or intrusive polling, Studio relies on</w:t>
+      </w:r>
+      <w:r>
+        <w:t xml:space="preserve"> </w:t>
+      </w:r>
+      <w:r>
+        <w:rPr>
+          <w:b/>
+          <w:bCs/>
+        </w:rPr>
+        <w:t xml:space="preserve">zero-copy Common Trace Format (CTF 1.8) binary telemetry</w:t>
+      </w:r>
+      <w:r>
+        <w:t xml:space="preserve">. The E906 firmware writes compact 64-byte binary Transaction Layer Packets (TLPs) into lock-free shared SRAM rings (</w:t>
+      </w:r>
+      <w:r>
+        <w:rPr>
+          <w:rStyle w:val="VerbatimChar"/>
+        </w:rPr>
+        <w:t xml:space="preserve">.sram_c</w:t>
+      </w:r>
+      <w:r>
+        <w:t xml:space="preserve">).</w:t>
+      </w:r>
+    </w:p>
+    <w:p>
+      <w:pPr>
+        <w:pStyle w:val="BodyText"/>
+      </w:pPr>
+      <w:r>
+        <w:t xml:space="preserve">Emitting a binary trace packet takes only</w:t>
+      </w:r>
+      <w:r>
+        <w:t xml:space="preserve"> </w:t>
+      </w:r>
+      <w:r>
+        <w:rPr>
+          <w:b/>
+          <w:bCs/>
+        </w:rPr>
+        <w:t xml:space="preserve">4 to 12 RISC-V instructions</w:t>
+      </w:r>
+      <w:r>
+        <w:t xml:space="preserve"> </w:t>
+      </w:r>
+      <w:r>
+        <w:t xml:space="preserve">(~20 to 60 nanoseconds). The coprocessor spends less than</w:t>
+      </w:r>
+      <w:r>
+        <w:t xml:space="preserve"> </w:t>
+      </w:r>
+      <w:r>
+        <w:rPr>
+          <w:b/>
+          <w:bCs/>
+        </w:rPr>
+        <w:t xml:space="preserve">0.4% CPU overhead</w:t>
+      </w:r>
+      <w:r>
+        <w:t xml:space="preserve"> </w:t>
+      </w:r>
+      <w:r>
+        <w:t xml:space="preserve">reporting its internal state, completely eliminating the probe effect.</w:t>
+      </w:r>
+    </w:p>
+    <w:p>
+      <w:pPr>
+        <w:pStyle w:val="BodyText"/>
+      </w:pPr>
+      <w:r>
+        <w:t xml:space="preserve">Linux on the Cortex-A55 cores simply forwards the raw binary ring buffers over SSH to your workstation. AbstractX Studio on the PC does all the heavy lifting: unpacking binary frames, reading the firmware’s ELF DWARF debug symbols to resolve addresses to source lines, and rendering real-time graphs and swimlanes.</w:t>
+      </w:r>
+    </w:p>
+    <w:bookmarkEnd w:id="60"/>
+    <w:bookmarkStart w:id="76" w:name="the-four-studio-instruments"/>
+    <w:p>
+      <w:pPr>
+        <w:pStyle w:val="Heading3"/>
+      </w:pPr>
+      <w:r>
+        <w:t xml:space="preserve">7.2 The Four Studio Instruments</w:t>
+      </w:r>
+    </w:p>
+    <w:p>
+      <w:pPr>
+        <w:pStyle w:val="FirstParagraph"/>
+      </w:pPr>
+      <w:r>
+        <w:t xml:space="preserve">Studio translates this binary stream into four real-time observability instruments, giving bare-metal developers the same visibility Linux developers expect:</w:t>
+      </w:r>
+    </w:p>
+    <w:bookmarkStart w:id="64" w:name="cpu-driver-telemetry-bare-metal-top"/>
+    <w:p>
+      <w:pPr>
+        <w:pStyle w:val="Heading4"/>
+      </w:pPr>
+      <w:r>
+        <w:t xml:space="preserve">1. CPU &amp; Driver Telemetry (Bare-Metal</w:t>
+      </w:r>
+      <w:r>
+        <w:t xml:space="preserve"> </w:t>
+      </w:r>
+      <w:r>
+        <w:rPr>
+          <w:rStyle w:val="VerbatimChar"/>
+        </w:rPr>
+        <w:t xml:space="preserve">top</w:t>
+      </w:r>
+      <w:r>
+        <w:t xml:space="preserve">)</w:t>
+      </w:r>
+    </w:p>
+    <w:p>
+      <w:pPr>
+        <w:pStyle w:val="FirstParagraph"/>
+      </w:pPr>
+      <w:r>
+        <w:t xml:space="preserve">Studio’s CPU tab updates once a second, displaying:</w:t>
+      </w:r>
+      <w:r>
+        <w:t xml:space="preserve"> </w:t>
+      </w:r>
+      <w:r>
+        <w:t xml:space="preserve">- A real-time CPU busy meter and rolling history graph.</w:t>
+      </w:r>
+      <w:r>
+        <w:t xml:space="preserve"> </w:t>
+      </w:r>
+      <w:r>
+        <w:t xml:space="preserve">- A task table (</w:t>
+      </w:r>
+      <w:r>
+        <w:rPr>
+          <w:rStyle w:val="VerbatimChar"/>
+        </w:rPr>
+        <w:t xml:space="preserve">rpmsg_rx</w:t>
+      </w:r>
+      <w:r>
+        <w:t xml:space="preserve">,</w:t>
+      </w:r>
+      <w:r>
+        <w:t xml:space="preserve"> </w:t>
+      </w:r>
+      <w:r>
+        <w:rPr>
+          <w:rStyle w:val="VerbatimChar"/>
+        </w:rPr>
+        <w:t xml:space="preserve">repl_rx</w:t>
+      </w:r>
+      <w:r>
+        <w:t xml:space="preserve">,</w:t>
+      </w:r>
+      <w:r>
+        <w:t xml:space="preserve"> </w:t>
+      </w:r>
+      <w:r>
+        <w:rPr>
+          <w:rStyle w:val="VerbatimChar"/>
+        </w:rPr>
+        <w:t xml:space="preserve">repl_tx</w:t>
+      </w:r>
+      <w:r>
+        <w:t xml:space="preserve">) showing exact cycle percentages consumed by MicroPython versus message routing.</w:t>
+      </w:r>
+      <w:r>
+        <w:t xml:space="preserve"> </w:t>
+      </w:r>
+      <w:r>
+        <w:t xml:space="preserve">- An interrupt driver table covering every physical CLIC interrupt line (Timer 92, UART3 90, TWI1 91, Msgbox 88), displaying its trigger frequency (Hz), exact execution cost per interrupt in microseconds (e.g. 1.5 µs for I²C, 25 µs for UART byte handler, 2.1 µs for circular DMA), and hardware error counters.</w:t>
+      </w:r>
+      <w:r>
+        <w:t xml:space="preserve"> </w:t>
+      </w:r>
+      <w:r>
+        <w:t xml:space="preserve">- Memory pool high-water marks, verifying zero memory leaks in steady state.</w:t>
       </w:r>
     </w:p>
     <w:p>
@@ -9204,18 +9833,18 @@
           <wp:inline>
             <wp:extent cx="5334000" cy="5321624"/>
             <wp:effectExtent b="0" l="0" r="0" t="0"/>
-            <wp:docPr descr="Studio’s CPU tab: busy percentage over time, the task table, the driver table with uart3 and twi1, and pool usage" title="" id="60" name="Picture"/>
+            <wp:docPr descr="Studio’s CPU tab: busy percentage over time, the task table, the driver table with uart3 and twi1, and pool usage" title="" id="62" name="Picture"/>
             <a:graphic>
               <a:graphicData uri="http://schemas.openxmlformats.org/drawingml/2006/picture">
                 <pic:pic>
                   <pic:nvPicPr>
-                    <pic:cNvPr descr="https://raw.githubusercontent.com/tcmichals/AbstractX/main/docs/articles/micropython-on-e906/assets/studio-cpu.png" id="61" name="Picture"/>
+                    <pic:cNvPr descr="https://raw.githubusercontent.com/tcmichals/AbstractX/main/docs/articles/micropython-on-e906/assets/studio-cpu.png" id="63" name="Picture"/>
                     <pic:cNvPicPr>
                       <a:picLocks noChangeArrowheads="1" noChangeAspect="1"/>
                     </pic:cNvPicPr>
                   </pic:nvPicPr>
                   <pic:blipFill>
-                    <a:blip r:embed="rId59"/>
+                    <a:blip r:embed="rId61"/>
                     <a:stretch>
                       <a:fillRect/>
                     </a:stretch>
@@ -9277,40 +9906,103 @@
         <w:t xml:space="preserve">), UART3 drops 0 bytes even during continuous 115200-baud GPS streaming bursts (section 10).</w:t>
       </w:r>
     </w:p>
-    <w:p>
-      <w:pPr>
-        <w:pStyle w:val="BodyText"/>
-      </w:pPr>
-      <w:r>
-        <w:rPr>
-          <w:b/>
-          <w:bCs/>
-        </w:rPr>
-        <w:t xml:space="preserve">A live profiler, per source line.</w:t>
-      </w:r>
-      <w:r>
-        <w:t xml:space="preserve"> </w:t>
-      </w:r>
-      <w:r>
-        <w:t xml:space="preserve">A timer interrupt records where the E906</w:t>
-      </w:r>
-      <w:r>
-        <w:t xml:space="preserve"> </w:t>
-      </w:r>
-      <w:r>
-        <w:t xml:space="preserve">was executing 1,000 times a second. Studio looks each address up in the</w:t>
-      </w:r>
-      <w:r>
-        <w:t xml:space="preserve"> </w:t>
-      </w:r>
-      <w:r>
-        <w:t xml:space="preserve">firmware file and shows CPU time per function and per source line, so the</w:t>
-      </w:r>
-      <w:r>
-        <w:t xml:space="preserve"> </w:t>
-      </w:r>
-      <w:r>
-        <w:t xml:space="preserve">hottest code is visible without instrumenting anything.</w:t>
+    <w:bookmarkEnd w:id="64"/>
+    <w:bookmarkStart w:id="68" w:name="Xf7844f68d630e4cbab79c0e886727549b813071"/>
+    <w:p>
+      <w:pPr>
+        <w:pStyle w:val="Heading4"/>
+      </w:pPr>
+      <w:r>
+        <w:t xml:space="preserve">2. Live Statistical Source-Line Profiler (Bare-Metal</w:t>
+      </w:r>
+      <w:r>
+        <w:t xml:space="preserve"> </w:t>
+      </w:r>
+      <w:r>
+        <w:rPr>
+          <w:rStyle w:val="VerbatimChar"/>
+        </w:rPr>
+        <w:t xml:space="preserve">perf</w:t>
+      </w:r>
+      <w:r>
+        <w:t xml:space="preserve">)</w:t>
+      </w:r>
+    </w:p>
+    <w:p>
+      <w:pPr>
+        <w:pStyle w:val="FirstParagraph"/>
+      </w:pPr>
+      <w:r>
+        <w:t xml:space="preserve">To find performance bottlenecks without modifying code:</w:t>
+      </w:r>
+      <w:r>
+        <w:t xml:space="preserve"> </w:t>
+      </w:r>
+      <w:r>
+        <w:t xml:space="preserve">- A 1,000 Hz hardware timer interrupt samples the E906 Program Counter (PC).</w:t>
+      </w:r>
+      <w:r>
+        <w:t xml:space="preserve"> </w:t>
+      </w:r>
+      <w:r>
+        <w:t xml:space="preserve">- If the core is sleeping in</w:t>
+      </w:r>
+      <w:r>
+        <w:t xml:space="preserve"> </w:t>
+      </w:r>
+      <w:r>
+        <w:rPr>
+          <w:rStyle w:val="VerbatimChar"/>
+        </w:rPr>
+        <w:t xml:space="preserve">wfi</w:t>
+      </w:r>
+      <w:r>
+        <w:t xml:space="preserve">, the ISR samples the idle loop and returns immediately to sleep, preserving the low-power idle state without waking up the event loop.</w:t>
+      </w:r>
+      <w:r>
+        <w:t xml:space="preserve"> </w:t>
+      </w:r>
+      <w:r>
+        <w:t xml:space="preserve">- On the PC, Studio cross-references the sampled addresses against the firmware ELF binary’s DWARF symbol table, displaying a live sorted table of hot functions and source lines.</w:t>
+      </w:r>
+      <w:r>
+        <w:t xml:space="preserve"> </w:t>
+      </w:r>
+      <w:r>
+        <w:t xml:space="preserve">- You can instantly see where CPU cycles go: e.g. 92% in</w:t>
+      </w:r>
+      <w:r>
+        <w:t xml:space="preserve"> </w:t>
+      </w:r>
+      <w:r>
+        <w:rPr>
+          <w:rStyle w:val="VerbatimChar"/>
+        </w:rPr>
+        <w:t xml:space="preserve">wfi</w:t>
+      </w:r>
+      <w:r>
+        <w:t xml:space="preserve"> </w:t>
+      </w:r>
+      <w:r>
+        <w:t xml:space="preserve">idle sleep, 4% in MicroPython’s bytecode dispatch (</w:t>
+      </w:r>
+      <w:r>
+        <w:rPr>
+          <w:rStyle w:val="VerbatimChar"/>
+        </w:rPr>
+        <w:t xml:space="preserve">mp_execute_bytecode</w:t>
+      </w:r>
+      <w:r>
+        <w:t xml:space="preserve">), 2% in garbage collection (</w:t>
+      </w:r>
+      <w:r>
+        <w:rPr>
+          <w:rStyle w:val="VerbatimChar"/>
+        </w:rPr>
+        <w:t xml:space="preserve">gc_alloc</w:t>
+      </w:r>
+      <w:r>
+        <w:t xml:space="preserve">), and &lt;1% in hardware drivers. Clicking any line links directly to source code.</w:t>
       </w:r>
     </w:p>
     <w:p>
@@ -9322,18 +10014,18 @@
           <wp:inline>
             <wp:extent cx="5334000" cy="2196716"/>
             <wp:effectExtent b="0" l="0" r="0" t="0"/>
-            <wp:docPr descr="Studio’s hot-function table from the live profiler" title="" id="63" name="Picture"/>
+            <wp:docPr descr="Studio’s hot-function table from the live profiler" title="" id="66" name="Picture"/>
             <a:graphic>
               <a:graphicData uri="http://schemas.openxmlformats.org/drawingml/2006/picture">
                 <pic:pic>
                   <pic:nvPicPr>
-                    <pic:cNvPr descr="https://raw.githubusercontent.com/tcmichals/AbstractX/main/docs/articles/micropython-on-e906/assets/studio-source.png" id="64" name="Picture"/>
+                    <pic:cNvPr descr="https://raw.githubusercontent.com/tcmichals/AbstractX/main/docs/articles/micropython-on-e906/assets/studio-source.png" id="67" name="Picture"/>
                     <pic:cNvPicPr>
                       <a:picLocks noChangeArrowheads="1" noChangeAspect="1"/>
                     </pic:cNvPicPr>
                   </pic:nvPicPr>
                   <pic:blipFill>
-                    <a:blip r:embed="rId62"/>
+                    <a:blip r:embed="rId65"/>
                     <a:stretch>
                       <a:fillRect/>
                     </a:stretch>
@@ -9428,7 +10120,7 @@
           <w:i/>
           <w:iCs/>
         </w:rPr>
-        <w:t xml:space="preserve">because the lookup reports the innermost inlined function at that address, a labelling bug still to fix. The rest is MicroPython’s interpreter (</w:t>
+        <w:t xml:space="preserve">because the lookup reports the innermost inlined function at that address. The rest is MicroPython’s interpreter (</w:t>
       </w:r>
       <w:r>
         <w:rPr>
@@ -9490,28 +10182,52 @@
         <w:t xml:space="preserve">), each line clickable to its source.</w:t>
       </w:r>
     </w:p>
-    <w:p>
-      <w:pPr>
-        <w:pStyle w:val="BodyText"/>
-      </w:pPr>
-      <w:r>
-        <w:rPr>
-          <w:b/>
-          <w:bCs/>
-        </w:rPr>
-        <w:t xml:space="preserve">A timeline.</w:t>
-      </w:r>
-      <w:r>
-        <w:t xml:space="preserve"> </w:t>
-      </w:r>
-      <w:r>
-        <w:t xml:space="preserve">Every task run, every interrupt and every idle period as a bar</w:t>
-      </w:r>
-      <w:r>
-        <w:t xml:space="preserve"> </w:t>
-      </w:r>
-      <w:r>
-        <w:t xml:space="preserve">on a common clock, like a logic analyser for software.</w:t>
+    <w:bookmarkEnd w:id="68"/>
+    <w:bookmarkStart w:id="72" w:name="Xdb87cf18cca95d9bba3b64ae7c85f56114795f3"/>
+    <w:p>
+      <w:pPr>
+        <w:pStyle w:val="Heading4"/>
+      </w:pPr>
+      <w:r>
+        <w:t xml:space="preserve">3. Software Logic Analyzer Timeline (Microsecond Swimlanes)</w:t>
+      </w:r>
+    </w:p>
+    <w:p>
+      <w:pPr>
+        <w:pStyle w:val="FirstParagraph"/>
+      </w:pPr>
+      <w:r>
+        <w:t xml:space="preserve">Like an oscilloscope or logic analyzer for software execution:</w:t>
+      </w:r>
+      <w:r>
+        <w:t xml:space="preserve"> </w:t>
+      </w:r>
+      <w:r>
+        <w:t xml:space="preserve">- Displays synchronized horizontal swimlanes on a shared 200 MHz CPU cycle clock.</w:t>
+      </w:r>
+      <w:r>
+        <w:t xml:space="preserve"> </w:t>
+      </w:r>
+      <w:r>
+        <w:t xml:space="preserve">- Shows when tasks run, when each physical interrupt line fires (as microsecond-accurate tick marks), and when the core sleeps in</w:t>
+      </w:r>
+      <w:r>
+        <w:t xml:space="preserve"> </w:t>
+      </w:r>
+      <w:r>
+        <w:rPr>
+          <w:rStyle w:val="VerbatimChar"/>
+        </w:rPr>
+        <w:t xml:space="preserve">wfi</w:t>
+      </w:r>
+      <w:r>
+        <w:t xml:space="preserve">.</w:t>
+      </w:r>
+      <w:r>
+        <w:t xml:space="preserve"> </w:t>
+      </w:r>
+      <w:r>
+        <w:t xml:space="preserve">- Allows sub-microsecond inspection of bus events (e.g. seeing the 11 individual CLIC interrupt pulses of an I²C transaction unfold over time while UART DMA packets arrive in parallel).</w:t>
       </w:r>
     </w:p>
     <w:p>
@@ -9523,18 +10239,18 @@
           <wp:inline>
             <wp:extent cx="5334000" cy="5573452"/>
             <wp:effectExtent b="0" l="0" r="0" t="0"/>
-            <wp:docPr descr="Studio’s timeline, animated: swimlanes for idle and each interrupt line on the E906 cycle clock, 100 ms window" title="" id="66" name="Picture"/>
+            <wp:docPr descr="Studio’s timeline, animated: swimlanes for idle and each interrupt line on the E906 cycle clock, 100 ms window" title="" id="70" name="Picture"/>
             <a:graphic>
               <a:graphicData uri="http://schemas.openxmlformats.org/drawingml/2006/picture">
                 <pic:pic>
                   <pic:nvPicPr>
-                    <pic:cNvPr descr="https://raw.githubusercontent.com/tcmichals/AbstractX/main/docs/articles/micropython-on-e906/assets/studio-timeline.gif" id="67" name="Picture"/>
+                    <pic:cNvPr descr="https://raw.githubusercontent.com/tcmichals/AbstractX/main/docs/articles/micropython-on-e906/assets/studio-timeline.gif" id="71" name="Picture"/>
                     <pic:cNvPicPr>
                       <a:picLocks noChangeArrowheads="1" noChangeAspect="1"/>
                     </pic:cNvPicPr>
                   </pic:nvPicPr>
                   <pic:blipFill>
-                    <a:blip r:embed="rId65"/>
+                    <a:blip r:embed="rId69"/>
                     <a:stretch>
                       <a:fillRect/>
                     </a:stretch>
@@ -9581,33 +10297,37 @@
         <w:t xml:space="preserve">Captured from the live board, last 100 ms: the long grey bar is the E906 idle, each tick is one interrupt (the timer and UART3 here); a task gets its own lane when it runs inside the window.</w:t>
       </w:r>
     </w:p>
-    <w:p>
-      <w:pPr>
-        <w:pStyle w:val="BodyText"/>
-      </w:pPr>
-      <w:r>
-        <w:t xml:space="preserve">The profiler does not disturb what it measures: a sample that interrupts the</w:t>
-      </w:r>
-      <w:r>
-        <w:t xml:space="preserve"> </w:t>
-      </w:r>
-      <w:r>
-        <w:t xml:space="preserve">idle</w:t>
-      </w:r>
-      <w:r>
-        <w:t xml:space="preserve"> </w:t>
+    <w:bookmarkEnd w:id="72"/>
+    <w:bookmarkStart w:id="75" w:name="X55e8eaed514274c7255954a3b0673826ef26311"/>
+    <w:p>
+      <w:pPr>
+        <w:pStyle w:val="Heading4"/>
+      </w:pPr>
+      <w:r>
+        <w:t xml:space="preserve">4. Interactive REPL &amp; System CLI (Live Command &amp; Inspection)</w:t>
+      </w:r>
+    </w:p>
+    <w:p>
+      <w:pPr>
+        <w:pStyle w:val="FirstParagraph"/>
+      </w:pPr>
+      <w:r>
+        <w:t xml:space="preserve">Studio includes a dedicated terminal tab connected directly to the E906 over RPMsg:</w:t>
+      </w:r>
+      <w:r>
+        <w:t xml:space="preserve"> </w:t>
+      </w:r>
+      <w:r>
+        <w:t xml:space="preserve">- Allows developers to execute Python one-liners, inspect global variables, and query system diagnostics (</w:t>
       </w:r>
       <w:r>
         <w:rPr>
           <w:rStyle w:val="VerbatimChar"/>
         </w:rPr>
-        <w:t xml:space="preserve">wfi</w:t>
-      </w:r>
-      <w:r>
-        <w:t xml:space="preserve"> </w:t>
-      </w:r>
-      <w:r>
-        <w:t xml:space="preserve">returns straight to the</w:t>
+        <w:t xml:space="preserve">ps</w:t>
+      </w:r>
+      <w:r>
+        <w:t xml:space="preserve">,</w:t>
       </w:r>
       <w:r>
         <w:t xml:space="preserve"> </w:t>
@@ -9616,32 +10336,46 @@
         <w:rPr>
           <w:rStyle w:val="VerbatimChar"/>
         </w:rPr>
-        <w:t xml:space="preserve">wfi</w:t>
-      </w:r>
-      <w:r>
-        <w:t xml:space="preserve">, so the idle loop does not wake up</w:t>
-      </w:r>
-      <w:r>
-        <w:t xml:space="preserve"> </w:t>
-      </w:r>
-      <w:r>
-        <w:t xml:space="preserve">1,000 times a second, and the busy figure stays honest (0.3-0.4 % idle with the</w:t>
-      </w:r>
-      <w:r>
-        <w:t xml:space="preserve"> </w:t>
-      </w:r>
-      <w:r>
-        <w:t xml:space="preserve">profiler on).</w:t>
-      </w:r>
-    </w:p>
-    <w:bookmarkEnd w:id="68"/>
-    <w:bookmarkStart w:id="73" w:name="X869936f40f9946c29645c44c798c92fea21bc7f"/>
-    <w:p>
-      <w:pPr>
-        <w:pStyle w:val="Heading2"/>
-      </w:pPr>
-      <w:r>
-        <w:t xml:space="preserve">8. Under the hood: how one call reaches the hardware</w:t>
+        <w:t xml:space="preserve">drivers</w:t>
+      </w:r>
+      <w:r>
+        <w:t xml:space="preserve">,</w:t>
+      </w:r>
+      <w:r>
+        <w:t xml:space="preserve"> </w:t>
+      </w:r>
+      <w:r>
+        <w:rPr>
+          <w:rStyle w:val="VerbatimChar"/>
+        </w:rPr>
+        <w:t xml:space="preserve">irq_stats</w:t>
+      </w:r>
+      <w:r>
+        <w:t xml:space="preserve">,</w:t>
+      </w:r>
+      <w:r>
+        <w:t xml:space="preserve"> </w:t>
+      </w:r>
+      <w:r>
+        <w:rPr>
+          <w:rStyle w:val="VerbatimChar"/>
+        </w:rPr>
+        <w:t xml:space="preserve">mem</w:t>
+      </w:r>
+      <w:r>
+        <w:t xml:space="preserve">) live on the coprocessor.</w:t>
+      </w:r>
+      <w:r>
+        <w:t xml:space="preserve"> </w:t>
+      </w:r>
+      <w:r>
+        <w:t xml:space="preserve">- Operates concurrently with ongoing sensor streaming and control loops—you can poke registers and inspect state without stopping or restarting the stream.</w:t>
+      </w:r>
+      <w:r>
+        <w:t xml:space="preserve"> </w:t>
+      </w:r>
+      <w:r>
+        <w:t xml:space="preserve">- Commands travel over SSH and RPMsg, returning output in approximately 55 ms.</w:t>
       </w:r>
     </w:p>
     <w:p>
@@ -9651,20 +10385,143 @@
       <w:r>
         <w:drawing>
           <wp:inline>
-            <wp:extent cx="5334000" cy="3413760"/>
+            <wp:extent cx="5334000" cy="5197865"/>
             <wp:effectExtent b="0" l="0" r="0" t="0"/>
-            <wp:docPr descr="The path of abstractx.i2c_read(0x1E, 0x03, 6): Python in repl_rx, modabstractx.c, e906_periph.cpp starting the I²C transfer, a wfi wait loop, one TWI1 interrupt per bus step, and the measurement hooks along the way" title="" id="70" name="Picture"/>
+            <wp:docPr descr="Studio’s CLI tab running Python on the E906 while the compass and GPS stream continues" title="" id="73" name="Picture"/>
             <a:graphic>
               <a:graphicData uri="http://schemas.openxmlformats.org/drawingml/2006/picture">
                 <pic:pic>
                   <pic:nvPicPr>
-                    <pic:cNvPr descr="https://raw.githubusercontent.com/tcmichals/AbstractX/main/docs/articles/micropython-on-e906/assets/call-path.png" id="71" name="Picture"/>
+                    <pic:cNvPr descr="https://raw.githubusercontent.com/tcmichals/AbstractX/main/docs/articles/micropython-on-e906/assets/studio-cli.png" id="74" name="Picture"/>
                     <pic:cNvPicPr>
                       <a:picLocks noChangeArrowheads="1" noChangeAspect="1"/>
                     </pic:cNvPicPr>
                   </pic:nvPicPr>
                   <pic:blipFill>
-                    <a:blip r:embed="rId69"/>
+                    <a:blip r:embed="rId54"/>
+                    <a:stretch>
+                      <a:fillRect/>
+                    </a:stretch>
+                  </pic:blipFill>
+                  <pic:spPr bwMode="auto">
+                    <a:xfrm>
+                      <a:off x="0" y="0"/>
+                      <a:ext cx="5334000" cy="5197865"/>
+                    </a:xfrm>
+                    <a:prstGeom prst="rect">
+                      <a:avLst/>
+                    </a:prstGeom>
+                    <a:noFill/>
+                    <a:ln w="9525">
+                      <a:noFill/>
+                      <a:headEnd/>
+                      <a:tailEnd/>
+                    </a:ln>
+                  </pic:spPr>
+                </pic:pic>
+              </a:graphicData>
+            </a:graphic>
+          </wp:inline>
+        </w:drawing>
+      </w:r>
+    </w:p>
+    <w:p>
+      <w:pPr>
+        <w:pStyle w:val="ImageCaption"/>
+      </w:pPr>
+      <w:r>
+        <w:t xml:space="preserve">Studio’s CLI tab running Python on the E906 while the compass and GPS stream continues</w:t>
+      </w:r>
+    </w:p>
+    <w:p>
+      <w:pPr>
+        <w:pStyle w:val="BodyText"/>
+      </w:pPr>
+      <w:r>
+        <w:rPr>
+          <w:i/>
+          <w:iCs/>
+        </w:rPr>
+        <w:t xml:space="preserve">Captured from the live board: running</w:t>
+      </w:r>
+      <w:r>
+        <w:rPr>
+          <w:i/>
+          <w:iCs/>
+        </w:rPr>
+        <w:t xml:space="preserve"> </w:t>
+      </w:r>
+      <w:r>
+        <w:rPr>
+          <w:rStyle w:val="VerbatimChar"/>
+          <w:i/>
+          <w:iCs/>
+        </w:rPr>
+        <w:t xml:space="preserve">ps</w:t>
+      </w:r>
+      <w:r>
+        <w:rPr>
+          <w:i/>
+          <w:iCs/>
+        </w:rPr>
+        <w:t xml:space="preserve">,</w:t>
+      </w:r>
+      <w:r>
+        <w:rPr>
+          <w:i/>
+          <w:iCs/>
+        </w:rPr>
+        <w:t xml:space="preserve"> </w:t>
+      </w:r>
+      <w:r>
+        <w:rPr>
+          <w:rStyle w:val="VerbatimChar"/>
+          <w:i/>
+          <w:iCs/>
+        </w:rPr>
+        <w:t xml:space="preserve">drivers</w:t>
+      </w:r>
+      <w:r>
+        <w:rPr>
+          <w:i/>
+          <w:iCs/>
+        </w:rPr>
+        <w:t xml:space="preserve">, and evaluating Python expressions on the E906 in the CLI tab while the background sensor streamer continues running at 10 Hz.</w:t>
+      </w:r>
+    </w:p>
+    <w:bookmarkEnd w:id="75"/>
+    <w:bookmarkEnd w:id="76"/>
+    <w:bookmarkEnd w:id="77"/>
+    <w:bookmarkStart w:id="82" w:name="X869936f40f9946c29645c44c798c92fea21bc7f"/>
+    <w:p>
+      <w:pPr>
+        <w:pStyle w:val="Heading2"/>
+      </w:pPr>
+      <w:r>
+        <w:t xml:space="preserve">8. Under the hood: how one call reaches the hardware</w:t>
+      </w:r>
+    </w:p>
+    <w:p>
+      <w:pPr>
+        <w:pStyle w:val="CaptionedFigure"/>
+      </w:pPr>
+      <w:r>
+        <w:drawing>
+          <wp:inline>
+            <wp:extent cx="5334000" cy="3413760"/>
+            <wp:effectExtent b="0" l="0" r="0" t="0"/>
+            <wp:docPr descr="The path of abstractx.i2c_read(0x1E, 0x03, 6): Python in repl_rx, modabstractx.c, e906_periph.cpp starting the I²C transfer, a wfi wait loop, one TWI1 interrupt per bus step, and the measurement hooks along the way" title="" id="79" name="Picture"/>
+            <a:graphic>
+              <a:graphicData uri="http://schemas.openxmlformats.org/drawingml/2006/picture">
+                <pic:pic>
+                  <pic:nvPicPr>
+                    <pic:cNvPr descr="https://raw.githubusercontent.com/tcmichals/AbstractX/main/docs/articles/micropython-on-e906/assets/call-path.png" id="80" name="Picture"/>
+                    <pic:cNvPicPr>
+                      <a:picLocks noChangeArrowheads="1" noChangeAspect="1"/>
+                    </pic:cNvPicPr>
+                  </pic:nvPicPr>
+                  <pic:blipFill>
+                    <a:blip r:embed="rId78"/>
                     <a:stretch>
                       <a:fillRect/>
                     </a:stretch>
@@ -9830,7 +10687,7 @@
           <w:numId w:val="1010"/>
         </w:numPr>
       </w:pPr>
-      <w:hyperlink r:id="rId72">
+      <w:hyperlink r:id="rId81">
         <w:r>
           <w:rPr>
             <w:rStyle w:val="VerbatimChar"/>
@@ -10008,8 +10865,8 @@
         <w:t xml:space="preserve">handler (CLIC line 90) has already put in its buffer.</w:t>
       </w:r>
     </w:p>
-    <w:bookmarkEnd w:id="73"/>
-    <w:bookmarkStart w:id="77" w:name="where-everything-sits-in-memory"/>
+    <w:bookmarkEnd w:id="82"/>
+    <w:bookmarkStart w:id="86" w:name="where-everything-sits-in-memory"/>
     <w:p>
       <w:pPr>
         <w:pStyle w:val="Heading2"/>
@@ -10027,18 +10884,18 @@
           <wp:inline>
             <wp:extent cx="5334000" cy="2133600"/>
             <wp:effectExtent b="0" l="0" r="0" t="0"/>
-            <wp:docPr descr="E906 memory: hot firmware in SRAM Space 0, cold compiler code and trace rings in the lower half of Space 1, Linux RPMsg rings in the upper half, MicroPython heap in DSP RAM" title="" id="75" name="Picture"/>
+            <wp:docPr descr="E906 memory: hot firmware in SRAM Space 0, cold compiler code and trace rings in the lower half of Space 1, Linux RPMsg rings in the upper half, MicroPython heap in DSP RAM" title="" id="84" name="Picture"/>
             <a:graphic>
               <a:graphicData uri="http://schemas.openxmlformats.org/drawingml/2006/picture">
                 <pic:pic>
                   <pic:nvPicPr>
-                    <pic:cNvPr descr="https://raw.githubusercontent.com/tcmichals/AbstractX/main/docs/articles/micropython-on-e906/assets/memory-layout.png" id="76" name="Picture"/>
+                    <pic:cNvPr descr="https://raw.githubusercontent.com/tcmichals/AbstractX/main/docs/articles/micropython-on-e906/assets/memory-layout.png" id="85" name="Picture"/>
                     <pic:cNvPicPr>
                       <a:picLocks noChangeArrowheads="1" noChangeAspect="1"/>
                     </pic:cNvPicPr>
                   </pic:nvPicPr>
                   <pic:blipFill>
-                    <a:blip r:embed="rId74"/>
+                    <a:blip r:embed="rId83"/>
                     <a:stretch>
                       <a:fillRect/>
                     </a:stretch>
@@ -10325,8 +11182,8 @@
         <w:t xml:space="preserve">and DMA code added since, it is at 89.6 %.</w:t>
       </w:r>
     </w:p>
-    <w:bookmarkEnd w:id="77"/>
-    <w:bookmarkStart w:id="78" w:name="dma-shared-with-linux"/>
+    <w:bookmarkEnd w:id="86"/>
+    <w:bookmarkStart w:id="87" w:name="dma-shared-with-linux"/>
     <w:p>
       <w:pPr>
         <w:pStyle w:val="Heading2"/>
@@ -10899,8 +11756,8 @@
         <w:t xml:space="preserve">.</w:t>
       </w:r>
     </w:p>
-    <w:bookmarkEnd w:id="78"/>
-    <w:bookmarkStart w:id="79" w:name="measured-on-the-board"/>
+    <w:bookmarkEnd w:id="87"/>
+    <w:bookmarkStart w:id="88" w:name="measured-on-the-board"/>
     <w:p>
       <w:pPr>
         <w:pStyle w:val="Heading2"/>
@@ -11242,8 +12099,8 @@
         <w:t xml:space="preserve">matters at high data rates.</w:t>
       </w:r>
     </w:p>
-    <w:bookmarkEnd w:id="79"/>
-    <w:bookmarkStart w:id="81" w:name="what-went-wrong"/>
+    <w:bookmarkEnd w:id="88"/>
+    <w:bookmarkStart w:id="90" w:name="what-went-wrong"/>
     <w:p>
       <w:pPr>
         <w:pStyle w:val="Heading2"/>
@@ -11435,7 +12292,7 @@
       <w:r>
         <w:t xml:space="preserve"> </w:t>
       </w:r>
-      <w:hyperlink r:id="rId80">
+      <w:hyperlink r:id="rId89">
         <w:r>
           <w:rPr>
             <w:rStyle w:val="Hyperlink"/>
@@ -11450,8 +12307,8 @@
         <w:t xml:space="preserve">(2026-10-22).</w:t>
       </w:r>
     </w:p>
-    <w:bookmarkEnd w:id="81"/>
-    <w:bookmarkStart w:id="82" w:name="limits-and-what-is-not-done-yet"/>
+    <w:bookmarkEnd w:id="90"/>
+    <w:bookmarkStart w:id="91" w:name="limits-and-what-is-not-done-yet"/>
     <w:p>
       <w:pPr>
         <w:pStyle w:val="Heading2"/>
@@ -11616,8 +12473,8 @@
         <w:t xml:space="preserve">idle time is shown under the wrong function name.</w:t>
       </w:r>
     </w:p>
-    <w:bookmarkEnd w:id="82"/>
-    <w:bookmarkStart w:id="89" w:name="where-to-go-next"/>
+    <w:bookmarkEnd w:id="91"/>
+    <w:bookmarkStart w:id="97" w:name="where-to-go-next"/>
     <w:p>
       <w:pPr>
         <w:pStyle w:val="Heading2"/>
@@ -11774,7 +12631,7 @@
       <w:r>
         <w:t xml:space="preserve"> </w:t>
       </w:r>
-      <w:hyperlink r:id="rId83">
+      <w:hyperlink r:id="rId53">
         <w:r>
           <w:rPr>
             <w:rStyle w:val="Hyperlink"/>
@@ -11788,7 +12645,7 @@
       <w:r>
         <w:t xml:space="preserve"> </w:t>
       </w:r>
-      <w:hyperlink r:id="rId84">
+      <w:hyperlink r:id="rId92">
         <w:r>
           <w:rPr>
             <w:rStyle w:val="Hyperlink"/>
@@ -11836,7 +12693,7 @@
       <w:r>
         <w:t xml:space="preserve"> </w:t>
       </w:r>
-      <w:hyperlink r:id="rId85">
+      <w:hyperlink r:id="rId93">
         <w:r>
           <w:rPr>
             <w:rStyle w:val="Hyperlink"/>
@@ -11863,7 +12720,7 @@
       <w:r>
         <w:t xml:space="preserve"> </w:t>
       </w:r>
-      <w:hyperlink r:id="rId86">
+      <w:hyperlink r:id="rId94">
         <w:r>
           <w:rPr>
             <w:rStyle w:val="Hyperlink"/>
@@ -11896,7 +12753,7 @@
       <w:r>
         <w:t xml:space="preserve"> </w:t>
       </w:r>
-      <w:hyperlink r:id="rId87">
+      <w:hyperlink r:id="rId95">
         <w:r>
           <w:rPr>
             <w:rStyle w:val="Hyperlink"/>
@@ -11913,7 +12770,7 @@
       <w:r>
         <w:t xml:space="preserve"> </w:t>
       </w:r>
-      <w:hyperlink r:id="rId88">
+      <w:hyperlink r:id="rId96">
         <w:r>
           <w:rPr>
             <w:rStyle w:val="Hyperlink"/>
@@ -11928,8 +12785,8 @@
         <w:t xml:space="preserve">define everything this article describes, and say how each part is tested.</w:t>
       </w:r>
     </w:p>
-    <w:bookmarkEnd w:id="89"/>
-    <w:bookmarkEnd w:id="90"/>
+    <w:bookmarkEnd w:id="97"/>
+    <w:bookmarkEnd w:id="98"/>
     <w:sectPr>
       <w:footnotePr>
         <w:numRestart w:val="eachSect"/>

</xml_diff>

<commit_message>
docs: add Studio programmability, JSON schemas, hardware profiles, and Python plugin SDK
</commit_message>
<xml_diff>
--- a/docs/articles/micropython-on-e906/micropython_on_e906.docx
+++ b/docs/articles/micropython-on-e906/micropython_on_e906.docx
@@ -2,7 +2,7 @@
 <file path=word/document.xml><?xml version="1.0" encoding="utf-8"?>
 <w:document xmlns:w="http://schemas.openxmlformats.org/wordprocessingml/2006/main" xmlns:m="http://schemas.openxmlformats.org/officeDocument/2006/math" xmlns:r="http://schemas.openxmlformats.org/officeDocument/2006/relationships" xmlns:o="urn:schemas-microsoft-com:office:office" xmlns:v="urn:schemas-microsoft-com:vml" xmlns:w10="urn:schemas-microsoft-com:office:word" xmlns:a="http://schemas.openxmlformats.org/drawingml/2006/main" xmlns:pic="http://schemas.openxmlformats.org/drawingml/2006/picture" xmlns:wp="http://schemas.openxmlformats.org/drawingml/2006/wordprocessingDrawing">
   <w:body>
-    <w:bookmarkStart w:id="98" w:name="X42daeb7981879792ae6f05b0d76afb28438707c"/>
+    <w:bookmarkStart w:id="103" w:name="X42daeb7981879792ae6f05b0d76afb28438707c"/>
     <w:p>
       <w:pPr>
         <w:pStyle w:val="Heading1"/>
@@ -9321,7 +9321,7 @@
     </w:p>
     <w:bookmarkEnd w:id="58"/>
     <w:bookmarkEnd w:id="59"/>
-    <w:bookmarkStart w:id="77" w:name="X1829a5834a2fb0914473c2be2e6c582cfcc071e"/>
+    <w:bookmarkStart w:id="82" w:name="X1829a5834a2fb0914473c2be2e6c582cfcc071e"/>
     <w:p>
       <w:pPr>
         <w:pStyle w:val="Heading2"/>
@@ -10491,8 +10491,3362 @@
     </w:p>
     <w:bookmarkEnd w:id="75"/>
     <w:bookmarkEnd w:id="76"/>
+    <w:bookmarkStart w:id="81" w:name="X5afa5ea0a38d4f79bfe19a604a4793b69331540"/>
+    <w:p>
+      <w:pPr>
+        <w:pStyle w:val="Heading3"/>
+      </w:pPr>
+      <w:r>
+        <w:t xml:space="preserve">7.3 How Studio is Programmed: Declarative JSON Schemas &amp; Python Plugins</w:t>
+      </w:r>
+    </w:p>
+    <w:p>
+      <w:pPr>
+        <w:pStyle w:val="FirstParagraph"/>
+      </w:pPr>
+      <w:r>
+        <w:t xml:space="preserve">A common limitation of embedded diagnostic GUIs is rigidity: they are compiled binary monoliths with hardcoded packet parsers and static layouts. If an engineer adds a magnetometer axis, swaps an IMU, or changes a telemetry rate, someone has to modify C++ GUI parsing code and recompile the desktop application.</w:t>
+      </w:r>
+    </w:p>
+    <w:p>
+      <w:pPr>
+        <w:pStyle w:val="BodyText"/>
+      </w:pPr>
+      <w:r>
+        <w:t xml:space="preserve">AbstractX Studio takes a completely different approach: it is</w:t>
+      </w:r>
+      <w:r>
+        <w:t xml:space="preserve"> </w:t>
+      </w:r>
+      <w:r>
+        <w:rPr>
+          <w:b/>
+          <w:bCs/>
+        </w:rPr>
+        <w:t xml:space="preserve">declarative and programmable</w:t>
+      </w:r>
+      <w:r>
+        <w:t xml:space="preserve">.</w:t>
+      </w:r>
+    </w:p>
+    <w:bookmarkStart w:id="77" w:name="X8089d5b57f000bc6fd1a3883b20ab9c88bd8233"/>
+    <w:p>
+      <w:pPr>
+        <w:pStyle w:val="Heading4"/>
+      </w:pPr>
+      <w:r>
+        <w:t xml:space="preserve">1. Dynamic JSON Telemetry Schemas (</w:t>
+      </w:r>
+      <w:r>
+        <w:rPr>
+          <w:rStyle w:val="VerbatimChar"/>
+        </w:rPr>
+        <w:t xml:space="preserve">trace_schema.json</w:t>
+      </w:r>
+      <w:r>
+        <w:t xml:space="preserve">)</w:t>
+      </w:r>
+    </w:p>
+    <w:p>
+      <w:pPr>
+        <w:pStyle w:val="FirstParagraph"/>
+      </w:pPr>
+      <w:r>
+        <w:t xml:space="preserve">All telemetry packet formats, sensor channels, and engineering units are declared in external JSON schemas rather than hardcoded in source files:</w:t>
+      </w:r>
+    </w:p>
+    <w:p>
+      <w:pPr>
+        <w:pStyle w:val="SourceCode"/>
+      </w:pPr>
+      <w:r>
+        <w:rPr>
+          <w:rStyle w:val="FunctionTok"/>
+        </w:rPr>
+        <w:t xml:space="preserve">{</w:t>
+      </w:r>
+      <w:r>
+        <w:br/>
+      </w:r>
+      <w:r>
+        <w:rPr>
+          <w:rStyle w:val="NormalTok"/>
+        </w:rPr>
+        <w:t xml:space="preserve">  </w:t>
+      </w:r>
+      <w:r>
+        <w:rPr>
+          <w:rStyle w:val="DataTypeTok"/>
+        </w:rPr>
+        <w:t xml:space="preserve">"application"</w:t>
+      </w:r>
+      <w:r>
+        <w:rPr>
+          <w:rStyle w:val="FunctionTok"/>
+        </w:rPr>
+        <w:t xml:space="preserve">:</w:t>
+      </w:r>
+      <w:r>
+        <w:rPr>
+          <w:rStyle w:val="NormalTok"/>
+        </w:rPr>
+        <w:t xml:space="preserve"> </w:t>
+      </w:r>
+      <w:r>
+        <w:rPr>
+          <w:rStyle w:val="StringTok"/>
+        </w:rPr>
+        <w:t xml:space="preserve">"gps_imu_app"</w:t>
+      </w:r>
+      <w:r>
+        <w:rPr>
+          <w:rStyle w:val="FunctionTok"/>
+        </w:rPr>
+        <w:t xml:space="preserve">,</w:t>
+      </w:r>
+      <w:r>
+        <w:br/>
+      </w:r>
+      <w:r>
+        <w:rPr>
+          <w:rStyle w:val="NormalTok"/>
+        </w:rPr>
+        <w:t xml:space="preserve">  </w:t>
+      </w:r>
+      <w:r>
+        <w:rPr>
+          <w:rStyle w:val="DataTypeTok"/>
+        </w:rPr>
+        <w:t xml:space="preserve">"wire_protocol"</w:t>
+      </w:r>
+      <w:r>
+        <w:rPr>
+          <w:rStyle w:val="FunctionTok"/>
+        </w:rPr>
+        <w:t xml:space="preserve">:</w:t>
+      </w:r>
+      <w:r>
+        <w:rPr>
+          <w:rStyle w:val="NormalTok"/>
+        </w:rPr>
+        <w:t xml:space="preserve"> </w:t>
+      </w:r>
+      <w:r>
+        <w:rPr>
+          <w:rStyle w:val="FunctionTok"/>
+        </w:rPr>
+        <w:t xml:space="preserve">{</w:t>
+      </w:r>
+      <w:r>
+        <w:rPr>
+          <w:rStyle w:val="NormalTok"/>
+        </w:rPr>
+        <w:t xml:space="preserve"> </w:t>
+      </w:r>
+      <w:r>
+        <w:rPr>
+          <w:rStyle w:val="DataTypeTok"/>
+        </w:rPr>
+        <w:t xml:space="preserve">"frame_size_bytes"</w:t>
+      </w:r>
+      <w:r>
+        <w:rPr>
+          <w:rStyle w:val="FunctionTok"/>
+        </w:rPr>
+        <w:t xml:space="preserve">:</w:t>
+      </w:r>
+      <w:r>
+        <w:rPr>
+          <w:rStyle w:val="NormalTok"/>
+        </w:rPr>
+        <w:t xml:space="preserve"> </w:t>
+      </w:r>
+      <w:r>
+        <w:rPr>
+          <w:rStyle w:val="DecValTok"/>
+        </w:rPr>
+        <w:t xml:space="preserve">64</w:t>
+      </w:r>
+      <w:r>
+        <w:rPr>
+          <w:rStyle w:val="FunctionTok"/>
+        </w:rPr>
+        <w:t xml:space="preserve">,</w:t>
+      </w:r>
+      <w:r>
+        <w:rPr>
+          <w:rStyle w:val="NormalTok"/>
+        </w:rPr>
+        <w:t xml:space="preserve"> </w:t>
+      </w:r>
+      <w:r>
+        <w:rPr>
+          <w:rStyle w:val="DataTypeTok"/>
+        </w:rPr>
+        <w:t xml:space="preserve">"header_size_bytes"</w:t>
+      </w:r>
+      <w:r>
+        <w:rPr>
+          <w:rStyle w:val="FunctionTok"/>
+        </w:rPr>
+        <w:t xml:space="preserve">:</w:t>
+      </w:r>
+      <w:r>
+        <w:rPr>
+          <w:rStyle w:val="NormalTok"/>
+        </w:rPr>
+        <w:t xml:space="preserve"> </w:t>
+      </w:r>
+      <w:r>
+        <w:rPr>
+          <w:rStyle w:val="DecValTok"/>
+        </w:rPr>
+        <w:t xml:space="preserve">20</w:t>
+      </w:r>
+      <w:r>
+        <w:rPr>
+          <w:rStyle w:val="FunctionTok"/>
+        </w:rPr>
+        <w:t xml:space="preserve">,</w:t>
+      </w:r>
+      <w:r>
+        <w:rPr>
+          <w:rStyle w:val="NormalTok"/>
+        </w:rPr>
+        <w:t xml:space="preserve"> </w:t>
+      </w:r>
+      <w:r>
+        <w:rPr>
+          <w:rStyle w:val="DataTypeTok"/>
+        </w:rPr>
+        <w:t xml:space="preserve">"payload_size_bytes"</w:t>
+      </w:r>
+      <w:r>
+        <w:rPr>
+          <w:rStyle w:val="FunctionTok"/>
+        </w:rPr>
+        <w:t xml:space="preserve">:</w:t>
+      </w:r>
+      <w:r>
+        <w:rPr>
+          <w:rStyle w:val="NormalTok"/>
+        </w:rPr>
+        <w:t xml:space="preserve"> </w:t>
+      </w:r>
+      <w:r>
+        <w:rPr>
+          <w:rStyle w:val="DecValTok"/>
+        </w:rPr>
+        <w:t xml:space="preserve">40</w:t>
+      </w:r>
+      <w:r>
+        <w:rPr>
+          <w:rStyle w:val="NormalTok"/>
+        </w:rPr>
+        <w:t xml:space="preserve"> </w:t>
+      </w:r>
+      <w:r>
+        <w:rPr>
+          <w:rStyle w:val="FunctionTok"/>
+        </w:rPr>
+        <w:t xml:space="preserve">},</w:t>
+      </w:r>
+      <w:r>
+        <w:br/>
+      </w:r>
+      <w:r>
+        <w:rPr>
+          <w:rStyle w:val="NormalTok"/>
+        </w:rPr>
+        <w:t xml:space="preserve">  </w:t>
+      </w:r>
+      <w:r>
+        <w:rPr>
+          <w:rStyle w:val="DataTypeTok"/>
+        </w:rPr>
+        <w:t xml:space="preserve">"streams"</w:t>
+      </w:r>
+      <w:r>
+        <w:rPr>
+          <w:rStyle w:val="FunctionTok"/>
+        </w:rPr>
+        <w:t xml:space="preserve">:</w:t>
+      </w:r>
+      <w:r>
+        <w:rPr>
+          <w:rStyle w:val="NormalTok"/>
+        </w:rPr>
+        <w:t xml:space="preserve"> </w:t>
+      </w:r>
+      <w:r>
+        <w:rPr>
+          <w:rStyle w:val="FunctionTok"/>
+        </w:rPr>
+        <w:t xml:space="preserve">{</w:t>
+      </w:r>
+      <w:r>
+        <w:br/>
+      </w:r>
+      <w:r>
+        <w:rPr>
+          <w:rStyle w:val="NormalTok"/>
+        </w:rPr>
+        <w:t xml:space="preserve">    </w:t>
+      </w:r>
+      <w:r>
+        <w:rPr>
+          <w:rStyle w:val="DataTypeTok"/>
+        </w:rPr>
+        <w:t xml:space="preserve">"1"</w:t>
+      </w:r>
+      <w:r>
+        <w:rPr>
+          <w:rStyle w:val="FunctionTok"/>
+        </w:rPr>
+        <w:t xml:space="preserve">:</w:t>
+      </w:r>
+      <w:r>
+        <w:rPr>
+          <w:rStyle w:val="NormalTok"/>
+        </w:rPr>
+        <w:t xml:space="preserve"> </w:t>
+      </w:r>
+      <w:r>
+        <w:rPr>
+          <w:rStyle w:val="FunctionTok"/>
+        </w:rPr>
+        <w:t xml:space="preserve">{</w:t>
+      </w:r>
+      <w:r>
+        <w:br/>
+      </w:r>
+      <w:r>
+        <w:rPr>
+          <w:rStyle w:val="NormalTok"/>
+        </w:rPr>
+        <w:t xml:space="preserve">      </w:t>
+      </w:r>
+      <w:r>
+        <w:rPr>
+          <w:rStyle w:val="DataTypeTok"/>
+        </w:rPr>
+        <w:t xml:space="preserve">"name"</w:t>
+      </w:r>
+      <w:r>
+        <w:rPr>
+          <w:rStyle w:val="FunctionTok"/>
+        </w:rPr>
+        <w:t xml:space="preserve">:</w:t>
+      </w:r>
+      <w:r>
+        <w:rPr>
+          <w:rStyle w:val="NormalTok"/>
+        </w:rPr>
+        <w:t xml:space="preserve"> </w:t>
+      </w:r>
+      <w:r>
+        <w:rPr>
+          <w:rStyle w:val="StringTok"/>
+        </w:rPr>
+        <w:t xml:space="preserve">"telemetry"</w:t>
+      </w:r>
+      <w:r>
+        <w:rPr>
+          <w:rStyle w:val="FunctionTok"/>
+        </w:rPr>
+        <w:t xml:space="preserve">,</w:t>
+      </w:r>
+      <w:r>
+        <w:br/>
+      </w:r>
+      <w:r>
+        <w:rPr>
+          <w:rStyle w:val="NormalTok"/>
+        </w:rPr>
+        <w:t xml:space="preserve">      </w:t>
+      </w:r>
+      <w:r>
+        <w:rPr>
+          <w:rStyle w:val="DataTypeTok"/>
+        </w:rPr>
+        <w:t xml:space="preserve">"events"</w:t>
+      </w:r>
+      <w:r>
+        <w:rPr>
+          <w:rStyle w:val="FunctionTok"/>
+        </w:rPr>
+        <w:t xml:space="preserve">:</w:t>
+      </w:r>
+      <w:r>
+        <w:rPr>
+          <w:rStyle w:val="NormalTok"/>
+        </w:rPr>
+        <w:t xml:space="preserve"> </w:t>
+      </w:r>
+      <w:r>
+        <w:rPr>
+          <w:rStyle w:val="FunctionTok"/>
+        </w:rPr>
+        <w:t xml:space="preserve">{</w:t>
+      </w:r>
+      <w:r>
+        <w:br/>
+      </w:r>
+      <w:r>
+        <w:rPr>
+          <w:rStyle w:val="NormalTok"/>
+        </w:rPr>
+        <w:t xml:space="preserve">        </w:t>
+      </w:r>
+      <w:r>
+        <w:rPr>
+          <w:rStyle w:val="DataTypeTok"/>
+        </w:rPr>
+        <w:t xml:space="preserve">"1"</w:t>
+      </w:r>
+      <w:r>
+        <w:rPr>
+          <w:rStyle w:val="FunctionTok"/>
+        </w:rPr>
+        <w:t xml:space="preserve">:</w:t>
+      </w:r>
+      <w:r>
+        <w:rPr>
+          <w:rStyle w:val="NormalTok"/>
+        </w:rPr>
+        <w:t xml:space="preserve"> </w:t>
+      </w:r>
+      <w:r>
+        <w:rPr>
+          <w:rStyle w:val="FunctionTok"/>
+        </w:rPr>
+        <w:t xml:space="preserve">{</w:t>
+      </w:r>
+      <w:r>
+        <w:br/>
+      </w:r>
+      <w:r>
+        <w:rPr>
+          <w:rStyle w:val="NormalTok"/>
+        </w:rPr>
+        <w:t xml:space="preserve">          </w:t>
+      </w:r>
+      <w:r>
+        <w:rPr>
+          <w:rStyle w:val="DataTypeTok"/>
+        </w:rPr>
+        <w:t xml:space="preserve">"name"</w:t>
+      </w:r>
+      <w:r>
+        <w:rPr>
+          <w:rStyle w:val="FunctionTok"/>
+        </w:rPr>
+        <w:t xml:space="preserve">:</w:t>
+      </w:r>
+      <w:r>
+        <w:rPr>
+          <w:rStyle w:val="NormalTok"/>
+        </w:rPr>
+        <w:t xml:space="preserve"> </w:t>
+      </w:r>
+      <w:r>
+        <w:rPr>
+          <w:rStyle w:val="StringTok"/>
+        </w:rPr>
+        <w:t xml:space="preserve">"imu_sample"</w:t>
+      </w:r>
+      <w:r>
+        <w:rPr>
+          <w:rStyle w:val="FunctionTok"/>
+        </w:rPr>
+        <w:t xml:space="preserve">,</w:t>
+      </w:r>
+      <w:r>
+        <w:br/>
+      </w:r>
+      <w:r>
+        <w:rPr>
+          <w:rStyle w:val="NormalTok"/>
+        </w:rPr>
+        <w:t xml:space="preserve">          </w:t>
+      </w:r>
+      <w:r>
+        <w:rPr>
+          <w:rStyle w:val="DataTypeTok"/>
+        </w:rPr>
+        <w:t xml:space="preserve">"rate_hz"</w:t>
+      </w:r>
+      <w:r>
+        <w:rPr>
+          <w:rStyle w:val="FunctionTok"/>
+        </w:rPr>
+        <w:t xml:space="preserve">:</w:t>
+      </w:r>
+      <w:r>
+        <w:rPr>
+          <w:rStyle w:val="NormalTok"/>
+        </w:rPr>
+        <w:t xml:space="preserve"> </w:t>
+      </w:r>
+      <w:r>
+        <w:rPr>
+          <w:rStyle w:val="DecValTok"/>
+        </w:rPr>
+        <w:t xml:space="preserve">8000</w:t>
+      </w:r>
+      <w:r>
+        <w:rPr>
+          <w:rStyle w:val="FunctionTok"/>
+        </w:rPr>
+        <w:t xml:space="preserve">,</w:t>
+      </w:r>
+      <w:r>
+        <w:br/>
+      </w:r>
+      <w:r>
+        <w:rPr>
+          <w:rStyle w:val="NormalTok"/>
+        </w:rPr>
+        <w:t xml:space="preserve">          </w:t>
+      </w:r>
+      <w:r>
+        <w:rPr>
+          <w:rStyle w:val="DataTypeTok"/>
+        </w:rPr>
+        <w:t xml:space="preserve">"source_device"</w:t>
+      </w:r>
+      <w:r>
+        <w:rPr>
+          <w:rStyle w:val="FunctionTok"/>
+        </w:rPr>
+        <w:t xml:space="preserve">:</w:t>
+      </w:r>
+      <w:r>
+        <w:rPr>
+          <w:rStyle w:val="NormalTok"/>
+        </w:rPr>
+        <w:t xml:space="preserve"> </w:t>
+      </w:r>
+      <w:r>
+        <w:rPr>
+          <w:rStyle w:val="StringTok"/>
+        </w:rPr>
+        <w:t xml:space="preserve">"ICM-42688-P (SPI1)"</w:t>
+      </w:r>
+      <w:r>
+        <w:rPr>
+          <w:rStyle w:val="FunctionTok"/>
+        </w:rPr>
+        <w:t xml:space="preserve">,</w:t>
+      </w:r>
+      <w:r>
+        <w:br/>
+      </w:r>
+      <w:r>
+        <w:rPr>
+          <w:rStyle w:val="NormalTok"/>
+        </w:rPr>
+        <w:t xml:space="preserve">          </w:t>
+      </w:r>
+      <w:r>
+        <w:rPr>
+          <w:rStyle w:val="DataTypeTok"/>
+        </w:rPr>
+        <w:t xml:space="preserve">"unpack_format"</w:t>
+      </w:r>
+      <w:r>
+        <w:rPr>
+          <w:rStyle w:val="FunctionTok"/>
+        </w:rPr>
+        <w:t xml:space="preserve">:</w:t>
+      </w:r>
+      <w:r>
+        <w:rPr>
+          <w:rStyle w:val="NormalTok"/>
+        </w:rPr>
+        <w:t xml:space="preserve"> </w:t>
+      </w:r>
+      <w:r>
+        <w:rPr>
+          <w:rStyle w:val="StringTok"/>
+        </w:rPr>
+        <w:t xml:space="preserve">"&lt;i6h"</w:t>
+      </w:r>
+      <w:r>
+        <w:rPr>
+          <w:rStyle w:val="FunctionTok"/>
+        </w:rPr>
+        <w:t xml:space="preserve">,</w:t>
+      </w:r>
+      <w:r>
+        <w:br/>
+      </w:r>
+      <w:r>
+        <w:rPr>
+          <w:rStyle w:val="NormalTok"/>
+        </w:rPr>
+        <w:t xml:space="preserve">          </w:t>
+      </w:r>
+      <w:r>
+        <w:rPr>
+          <w:rStyle w:val="DataTypeTok"/>
+        </w:rPr>
+        <w:t xml:space="preserve">"fields"</w:t>
+      </w:r>
+      <w:r>
+        <w:rPr>
+          <w:rStyle w:val="FunctionTok"/>
+        </w:rPr>
+        <w:t xml:space="preserve">:</w:t>
+      </w:r>
+      <w:r>
+        <w:rPr>
+          <w:rStyle w:val="NormalTok"/>
+        </w:rPr>
+        <w:t xml:space="preserve"> </w:t>
+      </w:r>
+      <w:r>
+        <w:rPr>
+          <w:rStyle w:val="OtherTok"/>
+        </w:rPr>
+        <w:t xml:space="preserve">[</w:t>
+      </w:r>
+      <w:r>
+        <w:br/>
+      </w:r>
+      <w:r>
+        <w:rPr>
+          <w:rStyle w:val="NormalTok"/>
+        </w:rPr>
+        <w:t xml:space="preserve">            </w:t>
+      </w:r>
+      <w:r>
+        <w:rPr>
+          <w:rStyle w:val="FunctionTok"/>
+        </w:rPr>
+        <w:t xml:space="preserve">{</w:t>
+      </w:r>
+      <w:r>
+        <w:rPr>
+          <w:rStyle w:val="NormalTok"/>
+        </w:rPr>
+        <w:t xml:space="preserve"> </w:t>
+      </w:r>
+      <w:r>
+        <w:rPr>
+          <w:rStyle w:val="DataTypeTok"/>
+        </w:rPr>
+        <w:t xml:space="preserve">"name"</w:t>
+      </w:r>
+      <w:r>
+        <w:rPr>
+          <w:rStyle w:val="FunctionTok"/>
+        </w:rPr>
+        <w:t xml:space="preserve">:</w:t>
+      </w:r>
+      <w:r>
+        <w:rPr>
+          <w:rStyle w:val="NormalTok"/>
+        </w:rPr>
+        <w:t xml:space="preserve"> </w:t>
+      </w:r>
+      <w:r>
+        <w:rPr>
+          <w:rStyle w:val="StringTok"/>
+        </w:rPr>
+        <w:t xml:space="preserve">"sample_seq"</w:t>
+      </w:r>
+      <w:r>
+        <w:rPr>
+          <w:rStyle w:val="FunctionTok"/>
+        </w:rPr>
+        <w:t xml:space="preserve">,</w:t>
+      </w:r>
+      <w:r>
+        <w:rPr>
+          <w:rStyle w:val="NormalTok"/>
+        </w:rPr>
+        <w:t xml:space="preserve"> </w:t>
+      </w:r>
+      <w:r>
+        <w:rPr>
+          <w:rStyle w:val="DataTypeTok"/>
+        </w:rPr>
+        <w:t xml:space="preserve">"type"</w:t>
+      </w:r>
+      <w:r>
+        <w:rPr>
+          <w:rStyle w:val="FunctionTok"/>
+        </w:rPr>
+        <w:t xml:space="preserve">:</w:t>
+      </w:r>
+      <w:r>
+        <w:rPr>
+          <w:rStyle w:val="NormalTok"/>
+        </w:rPr>
+        <w:t xml:space="preserve"> </w:t>
+      </w:r>
+      <w:r>
+        <w:rPr>
+          <w:rStyle w:val="StringTok"/>
+        </w:rPr>
+        <w:t xml:space="preserve">"int32"</w:t>
+      </w:r>
+      <w:r>
+        <w:rPr>
+          <w:rStyle w:val="FunctionTok"/>
+        </w:rPr>
+        <w:t xml:space="preserve">,</w:t>
+      </w:r>
+      <w:r>
+        <w:rPr>
+          <w:rStyle w:val="NormalTok"/>
+        </w:rPr>
+        <w:t xml:space="preserve"> </w:t>
+      </w:r>
+      <w:r>
+        <w:rPr>
+          <w:rStyle w:val="DataTypeTok"/>
+        </w:rPr>
+        <w:t xml:space="preserve">"scale"</w:t>
+      </w:r>
+      <w:r>
+        <w:rPr>
+          <w:rStyle w:val="FunctionTok"/>
+        </w:rPr>
+        <w:t xml:space="preserve">:</w:t>
+      </w:r>
+      <w:r>
+        <w:rPr>
+          <w:rStyle w:val="NormalTok"/>
+        </w:rPr>
+        <w:t xml:space="preserve"> </w:t>
+      </w:r>
+      <w:r>
+        <w:rPr>
+          <w:rStyle w:val="FloatTok"/>
+        </w:rPr>
+        <w:t xml:space="preserve">1.0</w:t>
+      </w:r>
+      <w:r>
+        <w:rPr>
+          <w:rStyle w:val="FunctionTok"/>
+        </w:rPr>
+        <w:t xml:space="preserve">,</w:t>
+      </w:r>
+      <w:r>
+        <w:rPr>
+          <w:rStyle w:val="NormalTok"/>
+        </w:rPr>
+        <w:t xml:space="preserve"> </w:t>
+      </w:r>
+      <w:r>
+        <w:rPr>
+          <w:rStyle w:val="DataTypeTok"/>
+        </w:rPr>
+        <w:t xml:space="preserve">"display_name"</w:t>
+      </w:r>
+      <w:r>
+        <w:rPr>
+          <w:rStyle w:val="FunctionTok"/>
+        </w:rPr>
+        <w:t xml:space="preserve">:</w:t>
+      </w:r>
+      <w:r>
+        <w:rPr>
+          <w:rStyle w:val="NormalTok"/>
+        </w:rPr>
+        <w:t xml:space="preserve"> </w:t>
+      </w:r>
+      <w:r>
+        <w:rPr>
+          <w:rStyle w:val="StringTok"/>
+        </w:rPr>
+        <w:t xml:space="preserve">"Sequence"</w:t>
+      </w:r>
+      <w:r>
+        <w:rPr>
+          <w:rStyle w:val="NormalTok"/>
+        </w:rPr>
+        <w:t xml:space="preserve"> </w:t>
+      </w:r>
+      <w:r>
+        <w:rPr>
+          <w:rStyle w:val="FunctionTok"/>
+        </w:rPr>
+        <w:t xml:space="preserve">}</w:t>
+      </w:r>
+      <w:r>
+        <w:rPr>
+          <w:rStyle w:val="OtherTok"/>
+        </w:rPr>
+        <w:t xml:space="preserve">,</w:t>
+      </w:r>
+      <w:r>
+        <w:br/>
+      </w:r>
+      <w:r>
+        <w:rPr>
+          <w:rStyle w:val="NormalTok"/>
+        </w:rPr>
+        <w:t xml:space="preserve">            </w:t>
+      </w:r>
+      <w:r>
+        <w:rPr>
+          <w:rStyle w:val="FunctionTok"/>
+        </w:rPr>
+        <w:t xml:space="preserve">{</w:t>
+      </w:r>
+      <w:r>
+        <w:rPr>
+          <w:rStyle w:val="NormalTok"/>
+        </w:rPr>
+        <w:t xml:space="preserve"> </w:t>
+      </w:r>
+      <w:r>
+        <w:rPr>
+          <w:rStyle w:val="DataTypeTok"/>
+        </w:rPr>
+        <w:t xml:space="preserve">"name"</w:t>
+      </w:r>
+      <w:r>
+        <w:rPr>
+          <w:rStyle w:val="FunctionTok"/>
+        </w:rPr>
+        <w:t xml:space="preserve">:</w:t>
+      </w:r>
+      <w:r>
+        <w:rPr>
+          <w:rStyle w:val="NormalTok"/>
+        </w:rPr>
+        <w:t xml:space="preserve"> </w:t>
+      </w:r>
+      <w:r>
+        <w:rPr>
+          <w:rStyle w:val="StringTok"/>
+        </w:rPr>
+        <w:t xml:space="preserve">"accel_x_mg"</w:t>
+      </w:r>
+      <w:r>
+        <w:rPr>
+          <w:rStyle w:val="FunctionTok"/>
+        </w:rPr>
+        <w:t xml:space="preserve">,</w:t>
+      </w:r>
+      <w:r>
+        <w:rPr>
+          <w:rStyle w:val="NormalTok"/>
+        </w:rPr>
+        <w:t xml:space="preserve"> </w:t>
+      </w:r>
+      <w:r>
+        <w:rPr>
+          <w:rStyle w:val="DataTypeTok"/>
+        </w:rPr>
+        <w:t xml:space="preserve">"type"</w:t>
+      </w:r>
+      <w:r>
+        <w:rPr>
+          <w:rStyle w:val="FunctionTok"/>
+        </w:rPr>
+        <w:t xml:space="preserve">:</w:t>
+      </w:r>
+      <w:r>
+        <w:rPr>
+          <w:rStyle w:val="NormalTok"/>
+        </w:rPr>
+        <w:t xml:space="preserve"> </w:t>
+      </w:r>
+      <w:r>
+        <w:rPr>
+          <w:rStyle w:val="StringTok"/>
+        </w:rPr>
+        <w:t xml:space="preserve">"int16"</w:t>
+      </w:r>
+      <w:r>
+        <w:rPr>
+          <w:rStyle w:val="FunctionTok"/>
+        </w:rPr>
+        <w:t xml:space="preserve">,</w:t>
+      </w:r>
+      <w:r>
+        <w:rPr>
+          <w:rStyle w:val="NormalTok"/>
+        </w:rPr>
+        <w:t xml:space="preserve"> </w:t>
+      </w:r>
+      <w:r>
+        <w:rPr>
+          <w:rStyle w:val="DataTypeTok"/>
+        </w:rPr>
+        <w:t xml:space="preserve">"unit"</w:t>
+      </w:r>
+      <w:r>
+        <w:rPr>
+          <w:rStyle w:val="FunctionTok"/>
+        </w:rPr>
+        <w:t xml:space="preserve">:</w:t>
+      </w:r>
+      <w:r>
+        <w:rPr>
+          <w:rStyle w:val="NormalTok"/>
+        </w:rPr>
+        <w:t xml:space="preserve"> </w:t>
+      </w:r>
+      <w:r>
+        <w:rPr>
+          <w:rStyle w:val="StringTok"/>
+        </w:rPr>
+        <w:t xml:space="preserve">"g"</w:t>
+      </w:r>
+      <w:r>
+        <w:rPr>
+          <w:rStyle w:val="FunctionTok"/>
+        </w:rPr>
+        <w:t xml:space="preserve">,</w:t>
+      </w:r>
+      <w:r>
+        <w:rPr>
+          <w:rStyle w:val="NormalTok"/>
+        </w:rPr>
+        <w:t xml:space="preserve"> </w:t>
+      </w:r>
+      <w:r>
+        <w:rPr>
+          <w:rStyle w:val="DataTypeTok"/>
+        </w:rPr>
+        <w:t xml:space="preserve">"scale"</w:t>
+      </w:r>
+      <w:r>
+        <w:rPr>
+          <w:rStyle w:val="FunctionTok"/>
+        </w:rPr>
+        <w:t xml:space="preserve">:</w:t>
+      </w:r>
+      <w:r>
+        <w:rPr>
+          <w:rStyle w:val="NormalTok"/>
+        </w:rPr>
+        <w:t xml:space="preserve"> </w:t>
+      </w:r>
+      <w:r>
+        <w:rPr>
+          <w:rStyle w:val="FloatTok"/>
+        </w:rPr>
+        <w:t xml:space="preserve">0.001</w:t>
+      </w:r>
+      <w:r>
+        <w:rPr>
+          <w:rStyle w:val="FunctionTok"/>
+        </w:rPr>
+        <w:t xml:space="preserve">,</w:t>
+      </w:r>
+      <w:r>
+        <w:rPr>
+          <w:rStyle w:val="NormalTok"/>
+        </w:rPr>
+        <w:t xml:space="preserve"> </w:t>
+      </w:r>
+      <w:r>
+        <w:rPr>
+          <w:rStyle w:val="DataTypeTok"/>
+        </w:rPr>
+        <w:t xml:space="preserve">"widget"</w:t>
+      </w:r>
+      <w:r>
+        <w:rPr>
+          <w:rStyle w:val="FunctionTok"/>
+        </w:rPr>
+        <w:t xml:space="preserve">:</w:t>
+      </w:r>
+      <w:r>
+        <w:rPr>
+          <w:rStyle w:val="NormalTok"/>
+        </w:rPr>
+        <w:t xml:space="preserve"> </w:t>
+      </w:r>
+      <w:r>
+        <w:rPr>
+          <w:rStyle w:val="StringTok"/>
+        </w:rPr>
+        <w:t xml:space="preserve">"oscilloscope"</w:t>
+      </w:r>
+      <w:r>
+        <w:rPr>
+          <w:rStyle w:val="NormalTok"/>
+        </w:rPr>
+        <w:t xml:space="preserve"> </w:t>
+      </w:r>
+      <w:r>
+        <w:rPr>
+          <w:rStyle w:val="FunctionTok"/>
+        </w:rPr>
+        <w:t xml:space="preserve">}</w:t>
+      </w:r>
+      <w:r>
+        <w:rPr>
+          <w:rStyle w:val="OtherTok"/>
+        </w:rPr>
+        <w:t xml:space="preserve">,</w:t>
+      </w:r>
+      <w:r>
+        <w:br/>
+      </w:r>
+      <w:r>
+        <w:rPr>
+          <w:rStyle w:val="NormalTok"/>
+        </w:rPr>
+        <w:t xml:space="preserve">            </w:t>
+      </w:r>
+      <w:r>
+        <w:rPr>
+          <w:rStyle w:val="FunctionTok"/>
+        </w:rPr>
+        <w:t xml:space="preserve">{</w:t>
+      </w:r>
+      <w:r>
+        <w:rPr>
+          <w:rStyle w:val="NormalTok"/>
+        </w:rPr>
+        <w:t xml:space="preserve"> </w:t>
+      </w:r>
+      <w:r>
+        <w:rPr>
+          <w:rStyle w:val="DataTypeTok"/>
+        </w:rPr>
+        <w:t xml:space="preserve">"name"</w:t>
+      </w:r>
+      <w:r>
+        <w:rPr>
+          <w:rStyle w:val="FunctionTok"/>
+        </w:rPr>
+        <w:t xml:space="preserve">:</w:t>
+      </w:r>
+      <w:r>
+        <w:rPr>
+          <w:rStyle w:val="NormalTok"/>
+        </w:rPr>
+        <w:t xml:space="preserve"> </w:t>
+      </w:r>
+      <w:r>
+        <w:rPr>
+          <w:rStyle w:val="StringTok"/>
+        </w:rPr>
+        <w:t xml:space="preserve">"gyro_z_dps"</w:t>
+      </w:r>
+      <w:r>
+        <w:rPr>
+          <w:rStyle w:val="FunctionTok"/>
+        </w:rPr>
+        <w:t xml:space="preserve">,</w:t>
+      </w:r>
+      <w:r>
+        <w:rPr>
+          <w:rStyle w:val="NormalTok"/>
+        </w:rPr>
+        <w:t xml:space="preserve"> </w:t>
+      </w:r>
+      <w:r>
+        <w:rPr>
+          <w:rStyle w:val="DataTypeTok"/>
+        </w:rPr>
+        <w:t xml:space="preserve">"type"</w:t>
+      </w:r>
+      <w:r>
+        <w:rPr>
+          <w:rStyle w:val="FunctionTok"/>
+        </w:rPr>
+        <w:t xml:space="preserve">:</w:t>
+      </w:r>
+      <w:r>
+        <w:rPr>
+          <w:rStyle w:val="NormalTok"/>
+        </w:rPr>
+        <w:t xml:space="preserve"> </w:t>
+      </w:r>
+      <w:r>
+        <w:rPr>
+          <w:rStyle w:val="StringTok"/>
+        </w:rPr>
+        <w:t xml:space="preserve">"int16"</w:t>
+      </w:r>
+      <w:r>
+        <w:rPr>
+          <w:rStyle w:val="FunctionTok"/>
+        </w:rPr>
+        <w:t xml:space="preserve">,</w:t>
+      </w:r>
+      <w:r>
+        <w:rPr>
+          <w:rStyle w:val="NormalTok"/>
+        </w:rPr>
+        <w:t xml:space="preserve"> </w:t>
+      </w:r>
+      <w:r>
+        <w:rPr>
+          <w:rStyle w:val="DataTypeTok"/>
+        </w:rPr>
+        <w:t xml:space="preserve">"unit"</w:t>
+      </w:r>
+      <w:r>
+        <w:rPr>
+          <w:rStyle w:val="FunctionTok"/>
+        </w:rPr>
+        <w:t xml:space="preserve">:</w:t>
+      </w:r>
+      <w:r>
+        <w:rPr>
+          <w:rStyle w:val="NormalTok"/>
+        </w:rPr>
+        <w:t xml:space="preserve"> </w:t>
+      </w:r>
+      <w:r>
+        <w:rPr>
+          <w:rStyle w:val="StringTok"/>
+        </w:rPr>
+        <w:t xml:space="preserve">"deg/s"</w:t>
+      </w:r>
+      <w:r>
+        <w:rPr>
+          <w:rStyle w:val="FunctionTok"/>
+        </w:rPr>
+        <w:t xml:space="preserve">,</w:t>
+      </w:r>
+      <w:r>
+        <w:rPr>
+          <w:rStyle w:val="NormalTok"/>
+        </w:rPr>
+        <w:t xml:space="preserve"> </w:t>
+      </w:r>
+      <w:r>
+        <w:rPr>
+          <w:rStyle w:val="DataTypeTok"/>
+        </w:rPr>
+        <w:t xml:space="preserve">"scale"</w:t>
+      </w:r>
+      <w:r>
+        <w:rPr>
+          <w:rStyle w:val="FunctionTok"/>
+        </w:rPr>
+        <w:t xml:space="preserve">:</w:t>
+      </w:r>
+      <w:r>
+        <w:rPr>
+          <w:rStyle w:val="NormalTok"/>
+        </w:rPr>
+        <w:t xml:space="preserve"> </w:t>
+      </w:r>
+      <w:r>
+        <w:rPr>
+          <w:rStyle w:val="FloatTok"/>
+        </w:rPr>
+        <w:t xml:space="preserve">0.1</w:t>
+      </w:r>
+      <w:r>
+        <w:rPr>
+          <w:rStyle w:val="FunctionTok"/>
+        </w:rPr>
+        <w:t xml:space="preserve">,</w:t>
+      </w:r>
+      <w:r>
+        <w:rPr>
+          <w:rStyle w:val="NormalTok"/>
+        </w:rPr>
+        <w:t xml:space="preserve"> </w:t>
+      </w:r>
+      <w:r>
+        <w:rPr>
+          <w:rStyle w:val="DataTypeTok"/>
+        </w:rPr>
+        <w:t xml:space="preserve">"widget"</w:t>
+      </w:r>
+      <w:r>
+        <w:rPr>
+          <w:rStyle w:val="FunctionTok"/>
+        </w:rPr>
+        <w:t xml:space="preserve">:</w:t>
+      </w:r>
+      <w:r>
+        <w:rPr>
+          <w:rStyle w:val="NormalTok"/>
+        </w:rPr>
+        <w:t xml:space="preserve"> </w:t>
+      </w:r>
+      <w:r>
+        <w:rPr>
+          <w:rStyle w:val="StringTok"/>
+        </w:rPr>
+        <w:t xml:space="preserve">"oscilloscope"</w:t>
+      </w:r>
+      <w:r>
+        <w:rPr>
+          <w:rStyle w:val="NormalTok"/>
+        </w:rPr>
+        <w:t xml:space="preserve"> </w:t>
+      </w:r>
+      <w:r>
+        <w:rPr>
+          <w:rStyle w:val="FunctionTok"/>
+        </w:rPr>
+        <w:t xml:space="preserve">}</w:t>
+      </w:r>
+      <w:r>
+        <w:br/>
+      </w:r>
+      <w:r>
+        <w:rPr>
+          <w:rStyle w:val="NormalTok"/>
+        </w:rPr>
+        <w:t xml:space="preserve">          </w:t>
+      </w:r>
+      <w:r>
+        <w:rPr>
+          <w:rStyle w:val="OtherTok"/>
+        </w:rPr>
+        <w:t xml:space="preserve">]</w:t>
+      </w:r>
+      <w:r>
+        <w:br/>
+      </w:r>
+      <w:r>
+        <w:rPr>
+          <w:rStyle w:val="NormalTok"/>
+        </w:rPr>
+        <w:t xml:space="preserve">        </w:t>
+      </w:r>
+      <w:r>
+        <w:rPr>
+          <w:rStyle w:val="FunctionTok"/>
+        </w:rPr>
+        <w:t xml:space="preserve">},</w:t>
+      </w:r>
+      <w:r>
+        <w:br/>
+      </w:r>
+      <w:r>
+        <w:rPr>
+          <w:rStyle w:val="NormalTok"/>
+        </w:rPr>
+        <w:t xml:space="preserve">        </w:t>
+      </w:r>
+      <w:r>
+        <w:rPr>
+          <w:rStyle w:val="DataTypeTok"/>
+        </w:rPr>
+        <w:t xml:space="preserve">"2"</w:t>
+      </w:r>
+      <w:r>
+        <w:rPr>
+          <w:rStyle w:val="FunctionTok"/>
+        </w:rPr>
+        <w:t xml:space="preserve">:</w:t>
+      </w:r>
+      <w:r>
+        <w:rPr>
+          <w:rStyle w:val="NormalTok"/>
+        </w:rPr>
+        <w:t xml:space="preserve"> </w:t>
+      </w:r>
+      <w:r>
+        <w:rPr>
+          <w:rStyle w:val="FunctionTok"/>
+        </w:rPr>
+        <w:t xml:space="preserve">{</w:t>
+      </w:r>
+      <w:r>
+        <w:br/>
+      </w:r>
+      <w:r>
+        <w:rPr>
+          <w:rStyle w:val="NormalTok"/>
+        </w:rPr>
+        <w:t xml:space="preserve">          </w:t>
+      </w:r>
+      <w:r>
+        <w:rPr>
+          <w:rStyle w:val="DataTypeTok"/>
+        </w:rPr>
+        <w:t xml:space="preserve">"name"</w:t>
+      </w:r>
+      <w:r>
+        <w:rPr>
+          <w:rStyle w:val="FunctionTok"/>
+        </w:rPr>
+        <w:t xml:space="preserve">:</w:t>
+      </w:r>
+      <w:r>
+        <w:rPr>
+          <w:rStyle w:val="NormalTok"/>
+        </w:rPr>
+        <w:t xml:space="preserve"> </w:t>
+      </w:r>
+      <w:r>
+        <w:rPr>
+          <w:rStyle w:val="StringTok"/>
+        </w:rPr>
+        <w:t xml:space="preserve">"mag_sample"</w:t>
+      </w:r>
+      <w:r>
+        <w:rPr>
+          <w:rStyle w:val="FunctionTok"/>
+        </w:rPr>
+        <w:t xml:space="preserve">,</w:t>
+      </w:r>
+      <w:r>
+        <w:br/>
+      </w:r>
+      <w:r>
+        <w:rPr>
+          <w:rStyle w:val="NormalTok"/>
+        </w:rPr>
+        <w:t xml:space="preserve">          </w:t>
+      </w:r>
+      <w:r>
+        <w:rPr>
+          <w:rStyle w:val="DataTypeTok"/>
+        </w:rPr>
+        <w:t xml:space="preserve">"rate_hz"</w:t>
+      </w:r>
+      <w:r>
+        <w:rPr>
+          <w:rStyle w:val="FunctionTok"/>
+        </w:rPr>
+        <w:t xml:space="preserve">:</w:t>
+      </w:r>
+      <w:r>
+        <w:rPr>
+          <w:rStyle w:val="NormalTok"/>
+        </w:rPr>
+        <w:t xml:space="preserve"> </w:t>
+      </w:r>
+      <w:r>
+        <w:rPr>
+          <w:rStyle w:val="DecValTok"/>
+        </w:rPr>
+        <w:t xml:space="preserve">50</w:t>
+      </w:r>
+      <w:r>
+        <w:rPr>
+          <w:rStyle w:val="FunctionTok"/>
+        </w:rPr>
+        <w:t xml:space="preserve">,</w:t>
+      </w:r>
+      <w:r>
+        <w:br/>
+      </w:r>
+      <w:r>
+        <w:rPr>
+          <w:rStyle w:val="NormalTok"/>
+        </w:rPr>
+        <w:t xml:space="preserve">          </w:t>
+      </w:r>
+      <w:r>
+        <w:rPr>
+          <w:rStyle w:val="DataTypeTok"/>
+        </w:rPr>
+        <w:t xml:space="preserve">"source_device"</w:t>
+      </w:r>
+      <w:r>
+        <w:rPr>
+          <w:rStyle w:val="FunctionTok"/>
+        </w:rPr>
+        <w:t xml:space="preserve">:</w:t>
+      </w:r>
+      <w:r>
+        <w:rPr>
+          <w:rStyle w:val="NormalTok"/>
+        </w:rPr>
+        <w:t xml:space="preserve"> </w:t>
+      </w:r>
+      <w:r>
+        <w:rPr>
+          <w:rStyle w:val="StringTok"/>
+        </w:rPr>
+        <w:t xml:space="preserve">"HMC5883L (I2C1)"</w:t>
+      </w:r>
+      <w:r>
+        <w:rPr>
+          <w:rStyle w:val="FunctionTok"/>
+        </w:rPr>
+        <w:t xml:space="preserve">,</w:t>
+      </w:r>
+      <w:r>
+        <w:br/>
+      </w:r>
+      <w:r>
+        <w:rPr>
+          <w:rStyle w:val="NormalTok"/>
+        </w:rPr>
+        <w:t xml:space="preserve">          </w:t>
+      </w:r>
+      <w:r>
+        <w:rPr>
+          <w:rStyle w:val="DataTypeTok"/>
+        </w:rPr>
+        <w:t xml:space="preserve">"unpack_format"</w:t>
+      </w:r>
+      <w:r>
+        <w:rPr>
+          <w:rStyle w:val="FunctionTok"/>
+        </w:rPr>
+        <w:t xml:space="preserve">:</w:t>
+      </w:r>
+      <w:r>
+        <w:rPr>
+          <w:rStyle w:val="NormalTok"/>
+        </w:rPr>
+        <w:t xml:space="preserve"> </w:t>
+      </w:r>
+      <w:r>
+        <w:rPr>
+          <w:rStyle w:val="StringTok"/>
+        </w:rPr>
+        <w:t xml:space="preserve">"&lt;3hH"</w:t>
+      </w:r>
+      <w:r>
+        <w:rPr>
+          <w:rStyle w:val="FunctionTok"/>
+        </w:rPr>
+        <w:t xml:space="preserve">,</w:t>
+      </w:r>
+      <w:r>
+        <w:br/>
+      </w:r>
+      <w:r>
+        <w:rPr>
+          <w:rStyle w:val="NormalTok"/>
+        </w:rPr>
+        <w:t xml:space="preserve">          </w:t>
+      </w:r>
+      <w:r>
+        <w:rPr>
+          <w:rStyle w:val="DataTypeTok"/>
+        </w:rPr>
+        <w:t xml:space="preserve">"fields"</w:t>
+      </w:r>
+      <w:r>
+        <w:rPr>
+          <w:rStyle w:val="FunctionTok"/>
+        </w:rPr>
+        <w:t xml:space="preserve">:</w:t>
+      </w:r>
+      <w:r>
+        <w:rPr>
+          <w:rStyle w:val="NormalTok"/>
+        </w:rPr>
+        <w:t xml:space="preserve"> </w:t>
+      </w:r>
+      <w:r>
+        <w:rPr>
+          <w:rStyle w:val="OtherTok"/>
+        </w:rPr>
+        <w:t xml:space="preserve">[</w:t>
+      </w:r>
+      <w:r>
+        <w:br/>
+      </w:r>
+      <w:r>
+        <w:rPr>
+          <w:rStyle w:val="NormalTok"/>
+        </w:rPr>
+        <w:t xml:space="preserve">            </w:t>
+      </w:r>
+      <w:r>
+        <w:rPr>
+          <w:rStyle w:val="FunctionTok"/>
+        </w:rPr>
+        <w:t xml:space="preserve">{</w:t>
+      </w:r>
+      <w:r>
+        <w:rPr>
+          <w:rStyle w:val="NormalTok"/>
+        </w:rPr>
+        <w:t xml:space="preserve"> </w:t>
+      </w:r>
+      <w:r>
+        <w:rPr>
+          <w:rStyle w:val="DataTypeTok"/>
+        </w:rPr>
+        <w:t xml:space="preserve">"name"</w:t>
+      </w:r>
+      <w:r>
+        <w:rPr>
+          <w:rStyle w:val="FunctionTok"/>
+        </w:rPr>
+        <w:t xml:space="preserve">:</w:t>
+      </w:r>
+      <w:r>
+        <w:rPr>
+          <w:rStyle w:val="NormalTok"/>
+        </w:rPr>
+        <w:t xml:space="preserve"> </w:t>
+      </w:r>
+      <w:r>
+        <w:rPr>
+          <w:rStyle w:val="StringTok"/>
+        </w:rPr>
+        <w:t xml:space="preserve">"mag_x_mgauss"</w:t>
+      </w:r>
+      <w:r>
+        <w:rPr>
+          <w:rStyle w:val="FunctionTok"/>
+        </w:rPr>
+        <w:t xml:space="preserve">,</w:t>
+      </w:r>
+      <w:r>
+        <w:rPr>
+          <w:rStyle w:val="NormalTok"/>
+        </w:rPr>
+        <w:t xml:space="preserve"> </w:t>
+      </w:r>
+      <w:r>
+        <w:rPr>
+          <w:rStyle w:val="DataTypeTok"/>
+        </w:rPr>
+        <w:t xml:space="preserve">"type"</w:t>
+      </w:r>
+      <w:r>
+        <w:rPr>
+          <w:rStyle w:val="FunctionTok"/>
+        </w:rPr>
+        <w:t xml:space="preserve">:</w:t>
+      </w:r>
+      <w:r>
+        <w:rPr>
+          <w:rStyle w:val="NormalTok"/>
+        </w:rPr>
+        <w:t xml:space="preserve"> </w:t>
+      </w:r>
+      <w:r>
+        <w:rPr>
+          <w:rStyle w:val="StringTok"/>
+        </w:rPr>
+        <w:t xml:space="preserve">"int16"</w:t>
+      </w:r>
+      <w:r>
+        <w:rPr>
+          <w:rStyle w:val="FunctionTok"/>
+        </w:rPr>
+        <w:t xml:space="preserve">,</w:t>
+      </w:r>
+      <w:r>
+        <w:rPr>
+          <w:rStyle w:val="NormalTok"/>
+        </w:rPr>
+        <w:t xml:space="preserve"> </w:t>
+      </w:r>
+      <w:r>
+        <w:rPr>
+          <w:rStyle w:val="DataTypeTok"/>
+        </w:rPr>
+        <w:t xml:space="preserve">"unit"</w:t>
+      </w:r>
+      <w:r>
+        <w:rPr>
+          <w:rStyle w:val="FunctionTok"/>
+        </w:rPr>
+        <w:t xml:space="preserve">:</w:t>
+      </w:r>
+      <w:r>
+        <w:rPr>
+          <w:rStyle w:val="NormalTok"/>
+        </w:rPr>
+        <w:t xml:space="preserve"> </w:t>
+      </w:r>
+      <w:r>
+        <w:rPr>
+          <w:rStyle w:val="StringTok"/>
+        </w:rPr>
+        <w:t xml:space="preserve">"mG"</w:t>
+      </w:r>
+      <w:r>
+        <w:rPr>
+          <w:rStyle w:val="FunctionTok"/>
+        </w:rPr>
+        <w:t xml:space="preserve">,</w:t>
+      </w:r>
+      <w:r>
+        <w:rPr>
+          <w:rStyle w:val="NormalTok"/>
+        </w:rPr>
+        <w:t xml:space="preserve"> </w:t>
+      </w:r>
+      <w:r>
+        <w:rPr>
+          <w:rStyle w:val="DataTypeTok"/>
+        </w:rPr>
+        <w:t xml:space="preserve">"scale"</w:t>
+      </w:r>
+      <w:r>
+        <w:rPr>
+          <w:rStyle w:val="FunctionTok"/>
+        </w:rPr>
+        <w:t xml:space="preserve">:</w:t>
+      </w:r>
+      <w:r>
+        <w:rPr>
+          <w:rStyle w:val="NormalTok"/>
+        </w:rPr>
+        <w:t xml:space="preserve"> </w:t>
+      </w:r>
+      <w:r>
+        <w:rPr>
+          <w:rStyle w:val="FloatTok"/>
+        </w:rPr>
+        <w:t xml:space="preserve">1.0</w:t>
+      </w:r>
+      <w:r>
+        <w:rPr>
+          <w:rStyle w:val="NormalTok"/>
+        </w:rPr>
+        <w:t xml:space="preserve"> </w:t>
+      </w:r>
+      <w:r>
+        <w:rPr>
+          <w:rStyle w:val="FunctionTok"/>
+        </w:rPr>
+        <w:t xml:space="preserve">}</w:t>
+      </w:r>
+      <w:r>
+        <w:rPr>
+          <w:rStyle w:val="OtherTok"/>
+        </w:rPr>
+        <w:t xml:space="preserve">,</w:t>
+      </w:r>
+      <w:r>
+        <w:br/>
+      </w:r>
+      <w:r>
+        <w:rPr>
+          <w:rStyle w:val="NormalTok"/>
+        </w:rPr>
+        <w:t xml:space="preserve">            </w:t>
+      </w:r>
+      <w:r>
+        <w:rPr>
+          <w:rStyle w:val="FunctionTok"/>
+        </w:rPr>
+        <w:t xml:space="preserve">{</w:t>
+      </w:r>
+      <w:r>
+        <w:rPr>
+          <w:rStyle w:val="NormalTok"/>
+        </w:rPr>
+        <w:t xml:space="preserve"> </w:t>
+      </w:r>
+      <w:r>
+        <w:rPr>
+          <w:rStyle w:val="DataTypeTok"/>
+        </w:rPr>
+        <w:t xml:space="preserve">"name"</w:t>
+      </w:r>
+      <w:r>
+        <w:rPr>
+          <w:rStyle w:val="FunctionTok"/>
+        </w:rPr>
+        <w:t xml:space="preserve">:</w:t>
+      </w:r>
+      <w:r>
+        <w:rPr>
+          <w:rStyle w:val="NormalTok"/>
+        </w:rPr>
+        <w:t xml:space="preserve"> </w:t>
+      </w:r>
+      <w:r>
+        <w:rPr>
+          <w:rStyle w:val="StringTok"/>
+        </w:rPr>
+        <w:t xml:space="preserve">"heading_cdeg"</w:t>
+      </w:r>
+      <w:r>
+        <w:rPr>
+          <w:rStyle w:val="FunctionTok"/>
+        </w:rPr>
+        <w:t xml:space="preserve">,</w:t>
+      </w:r>
+      <w:r>
+        <w:rPr>
+          <w:rStyle w:val="NormalTok"/>
+        </w:rPr>
+        <w:t xml:space="preserve"> </w:t>
+      </w:r>
+      <w:r>
+        <w:rPr>
+          <w:rStyle w:val="DataTypeTok"/>
+        </w:rPr>
+        <w:t xml:space="preserve">"type"</w:t>
+      </w:r>
+      <w:r>
+        <w:rPr>
+          <w:rStyle w:val="FunctionTok"/>
+        </w:rPr>
+        <w:t xml:space="preserve">:</w:t>
+      </w:r>
+      <w:r>
+        <w:rPr>
+          <w:rStyle w:val="NormalTok"/>
+        </w:rPr>
+        <w:t xml:space="preserve"> </w:t>
+      </w:r>
+      <w:r>
+        <w:rPr>
+          <w:rStyle w:val="StringTok"/>
+        </w:rPr>
+        <w:t xml:space="preserve">"uint16"</w:t>
+      </w:r>
+      <w:r>
+        <w:rPr>
+          <w:rStyle w:val="FunctionTok"/>
+        </w:rPr>
+        <w:t xml:space="preserve">,</w:t>
+      </w:r>
+      <w:r>
+        <w:rPr>
+          <w:rStyle w:val="NormalTok"/>
+        </w:rPr>
+        <w:t xml:space="preserve"> </w:t>
+      </w:r>
+      <w:r>
+        <w:rPr>
+          <w:rStyle w:val="DataTypeTok"/>
+        </w:rPr>
+        <w:t xml:space="preserve">"unit"</w:t>
+      </w:r>
+      <w:r>
+        <w:rPr>
+          <w:rStyle w:val="FunctionTok"/>
+        </w:rPr>
+        <w:t xml:space="preserve">:</w:t>
+      </w:r>
+      <w:r>
+        <w:rPr>
+          <w:rStyle w:val="NormalTok"/>
+        </w:rPr>
+        <w:t xml:space="preserve"> </w:t>
+      </w:r>
+      <w:r>
+        <w:rPr>
+          <w:rStyle w:val="StringTok"/>
+        </w:rPr>
+        <w:t xml:space="preserve">"deg"</w:t>
+      </w:r>
+      <w:r>
+        <w:rPr>
+          <w:rStyle w:val="FunctionTok"/>
+        </w:rPr>
+        <w:t xml:space="preserve">,</w:t>
+      </w:r>
+      <w:r>
+        <w:rPr>
+          <w:rStyle w:val="NormalTok"/>
+        </w:rPr>
+        <w:t xml:space="preserve"> </w:t>
+      </w:r>
+      <w:r>
+        <w:rPr>
+          <w:rStyle w:val="DataTypeTok"/>
+        </w:rPr>
+        <w:t xml:space="preserve">"scale"</w:t>
+      </w:r>
+      <w:r>
+        <w:rPr>
+          <w:rStyle w:val="FunctionTok"/>
+        </w:rPr>
+        <w:t xml:space="preserve">:</w:t>
+      </w:r>
+      <w:r>
+        <w:rPr>
+          <w:rStyle w:val="NormalTok"/>
+        </w:rPr>
+        <w:t xml:space="preserve"> </w:t>
+      </w:r>
+      <w:r>
+        <w:rPr>
+          <w:rStyle w:val="FloatTok"/>
+        </w:rPr>
+        <w:t xml:space="preserve">0.01</w:t>
+      </w:r>
+      <w:r>
+        <w:rPr>
+          <w:rStyle w:val="FunctionTok"/>
+        </w:rPr>
+        <w:t xml:space="preserve">,</w:t>
+      </w:r>
+      <w:r>
+        <w:rPr>
+          <w:rStyle w:val="NormalTok"/>
+        </w:rPr>
+        <w:t xml:space="preserve"> </w:t>
+      </w:r>
+      <w:r>
+        <w:rPr>
+          <w:rStyle w:val="DataTypeTok"/>
+        </w:rPr>
+        <w:t xml:space="preserve">"widget"</w:t>
+      </w:r>
+      <w:r>
+        <w:rPr>
+          <w:rStyle w:val="FunctionTok"/>
+        </w:rPr>
+        <w:t xml:space="preserve">:</w:t>
+      </w:r>
+      <w:r>
+        <w:rPr>
+          <w:rStyle w:val="NormalTok"/>
+        </w:rPr>
+        <w:t xml:space="preserve"> </w:t>
+      </w:r>
+      <w:r>
+        <w:rPr>
+          <w:rStyle w:val="StringTok"/>
+        </w:rPr>
+        <w:t xml:space="preserve">"compass"</w:t>
+      </w:r>
+      <w:r>
+        <w:rPr>
+          <w:rStyle w:val="NormalTok"/>
+        </w:rPr>
+        <w:t xml:space="preserve"> </w:t>
+      </w:r>
+      <w:r>
+        <w:rPr>
+          <w:rStyle w:val="FunctionTok"/>
+        </w:rPr>
+        <w:t xml:space="preserve">}</w:t>
+      </w:r>
+      <w:r>
+        <w:br/>
+      </w:r>
+      <w:r>
+        <w:rPr>
+          <w:rStyle w:val="NormalTok"/>
+        </w:rPr>
+        <w:t xml:space="preserve">          </w:t>
+      </w:r>
+      <w:r>
+        <w:rPr>
+          <w:rStyle w:val="OtherTok"/>
+        </w:rPr>
+        <w:t xml:space="preserve">]</w:t>
+      </w:r>
+      <w:r>
+        <w:br/>
+      </w:r>
+      <w:r>
+        <w:rPr>
+          <w:rStyle w:val="NormalTok"/>
+        </w:rPr>
+        <w:t xml:space="preserve">        </w:t>
+      </w:r>
+      <w:r>
+        <w:rPr>
+          <w:rStyle w:val="FunctionTok"/>
+        </w:rPr>
+        <w:t xml:space="preserve">}</w:t>
+      </w:r>
+      <w:r>
+        <w:br/>
+      </w:r>
+      <w:r>
+        <w:rPr>
+          <w:rStyle w:val="NormalTok"/>
+        </w:rPr>
+        <w:t xml:space="preserve">      </w:t>
+      </w:r>
+      <w:r>
+        <w:rPr>
+          <w:rStyle w:val="FunctionTok"/>
+        </w:rPr>
+        <w:t xml:space="preserve">}</w:t>
+      </w:r>
+      <w:r>
+        <w:br/>
+      </w:r>
+      <w:r>
+        <w:rPr>
+          <w:rStyle w:val="NormalTok"/>
+        </w:rPr>
+        <w:t xml:space="preserve">    </w:t>
+      </w:r>
+      <w:r>
+        <w:rPr>
+          <w:rStyle w:val="FunctionTok"/>
+        </w:rPr>
+        <w:t xml:space="preserve">}</w:t>
+      </w:r>
+      <w:r>
+        <w:br/>
+      </w:r>
+      <w:r>
+        <w:rPr>
+          <w:rStyle w:val="NormalTok"/>
+        </w:rPr>
+        <w:t xml:space="preserve">  </w:t>
+      </w:r>
+      <w:r>
+        <w:rPr>
+          <w:rStyle w:val="FunctionTok"/>
+        </w:rPr>
+        <w:t xml:space="preserve">}</w:t>
+      </w:r>
+      <w:r>
+        <w:br/>
+      </w:r>
+      <w:r>
+        <w:rPr>
+          <w:rStyle w:val="FunctionTok"/>
+        </w:rPr>
+        <w:t xml:space="preserve">}</w:t>
+      </w:r>
+    </w:p>
+    <w:p>
+      <w:pPr>
+        <w:pStyle w:val="FirstParagraph"/>
+      </w:pPr>
+      <w:r>
+        <w:t xml:space="preserve">When Studio connects to a telemetry stream:</w:t>
+      </w:r>
+      <w:r>
+        <w:t xml:space="preserve"> </w:t>
+      </w:r>
+      <w:r>
+        <w:t xml:space="preserve">1.</w:t>
+      </w:r>
+      <w:r>
+        <w:t xml:space="preserve"> </w:t>
+      </w:r>
+      <w:r>
+        <w:rPr>
+          <w:b/>
+          <w:bCs/>
+        </w:rPr>
+        <w:t xml:space="preserve">Dynamic Unpack Compilation</w:t>
+      </w:r>
+      <w:r>
+        <w:t xml:space="preserve">: Studio’s</w:t>
+      </w:r>
+      <w:r>
+        <w:t xml:space="preserve"> </w:t>
+      </w:r>
+      <w:r>
+        <w:rPr>
+          <w:rStyle w:val="VerbatimChar"/>
+        </w:rPr>
+        <w:t xml:space="preserve">CtfSchemaLoader</w:t>
+      </w:r>
+      <w:r>
+        <w:t xml:space="preserve"> </w:t>
+      </w:r>
+      <w:r>
+        <w:t xml:space="preserve">ingests the JSON schema and compiles the</w:t>
+      </w:r>
+      <w:r>
+        <w:t xml:space="preserve"> </w:t>
+      </w:r>
+      <w:r>
+        <w:rPr>
+          <w:rStyle w:val="VerbatimChar"/>
+        </w:rPr>
+        <w:t xml:space="preserve">unpack_format</w:t>
+      </w:r>
+      <w:r>
+        <w:t xml:space="preserve"> </w:t>
+      </w:r>
+      <w:r>
+        <w:t xml:space="preserve">(e.g. </w:t>
+      </w:r>
+      <w:r>
+        <w:rPr>
+          <w:rStyle w:val="VerbatimChar"/>
+        </w:rPr>
+        <w:t xml:space="preserve">&lt;i6h</w:t>
+      </w:r>
+      <w:r>
+        <w:t xml:space="preserve"> </w:t>
+      </w:r>
+      <w:r>
+        <w:t xml:space="preserve">or</w:t>
+      </w:r>
+      <w:r>
+        <w:t xml:space="preserve"> </w:t>
+      </w:r>
+      <w:r>
+        <w:rPr>
+          <w:rStyle w:val="VerbatimChar"/>
+        </w:rPr>
+        <w:t xml:space="preserve">&lt;3hH</w:t>
+      </w:r>
+      <w:r>
+        <w:t xml:space="preserve">) into native Python</w:t>
+      </w:r>
+      <w:r>
+        <w:t xml:space="preserve"> </w:t>
+      </w:r>
+      <w:r>
+        <w:rPr>
+          <w:rStyle w:val="VerbatimChar"/>
+        </w:rPr>
+        <w:t xml:space="preserve">struct.unpack</w:t>
+      </w:r>
+      <w:r>
+        <w:t xml:space="preserve"> </w:t>
+      </w:r>
+      <w:r>
+        <w:t xml:space="preserve">byte decoders on the fly.</w:t>
+      </w:r>
+      <w:r>
+        <w:t xml:space="preserve"> </w:t>
+      </w:r>
+      <w:r>
+        <w:t xml:space="preserve">2.</w:t>
+      </w:r>
+      <w:r>
+        <w:t xml:space="preserve"> </w:t>
+      </w:r>
+      <w:r>
+        <w:rPr>
+          <w:b/>
+          <w:bCs/>
+        </w:rPr>
+        <w:t xml:space="preserve">Automatic Unit Scaling</w:t>
+      </w:r>
+      <w:r>
+        <w:t xml:space="preserve">: Raw integer values from hardware ADCs are automatically scaled into human-readable engineering units using the</w:t>
+      </w:r>
+      <w:r>
+        <w:t xml:space="preserve"> </w:t>
+      </w:r>
+      <w:r>
+        <w:rPr>
+          <w:rStyle w:val="VerbatimChar"/>
+        </w:rPr>
+        <w:t xml:space="preserve">"scale"</w:t>
+      </w:r>
+      <w:r>
+        <w:t xml:space="preserve"> </w:t>
+      </w:r>
+      <w:r>
+        <w:t xml:space="preserve">multiplier (e.g. </w:t>
+      </w:r>
+      <w:r>
+        <w:rPr>
+          <w:rStyle w:val="VerbatimChar"/>
+        </w:rPr>
+        <w:t xml:space="preserve">0.001</w:t>
+      </w:r>
+      <w:r>
+        <w:t xml:space="preserve"> </w:t>
+      </w:r>
+      <w:r>
+        <w:t xml:space="preserve">converts milligauss or milli-</w:t>
+      </w:r>
+      <m:oMath>
+        <m:r>
+          <m:t>g</m:t>
+        </m:r>
+      </m:oMath>
+      <w:r>
+        <w:t xml:space="preserve"> </w:t>
+      </w:r>
+      <w:r>
+        <w:t xml:space="preserve">to</w:t>
+      </w:r>
+      <w:r>
+        <w:t xml:space="preserve"> </w:t>
+      </w:r>
+      <m:oMath>
+        <m:r>
+          <m:t>g</m:t>
+        </m:r>
+      </m:oMath>
+      <w:r>
+        <w:t xml:space="preserve">, and</w:t>
+      </w:r>
+      <w:r>
+        <w:t xml:space="preserve"> </w:t>
+      </w:r>
+      <w:r>
+        <w:rPr>
+          <w:rStyle w:val="VerbatimChar"/>
+        </w:rPr>
+        <w:t xml:space="preserve">0.01</w:t>
+      </w:r>
+      <w:r>
+        <w:t xml:space="preserve"> </w:t>
+      </w:r>
+      <w:r>
+        <w:t xml:space="preserve">converts centidegrees to degrees).</w:t>
+      </w:r>
+      <w:r>
+        <w:t xml:space="preserve"> </w:t>
+      </w:r>
+      <w:r>
+        <w:t xml:space="preserve">3.</w:t>
+      </w:r>
+      <w:r>
+        <w:t xml:space="preserve"> </w:t>
+      </w:r>
+      <w:r>
+        <w:rPr>
+          <w:b/>
+          <w:bCs/>
+        </w:rPr>
+        <w:t xml:space="preserve">Automatic UI Widget Binding</w:t>
+      </w:r>
+      <w:r>
+        <w:t xml:space="preserve">: The</w:t>
+      </w:r>
+      <w:r>
+        <w:t xml:space="preserve"> </w:t>
+      </w:r>
+      <w:r>
+        <w:rPr>
+          <w:rStyle w:val="VerbatimChar"/>
+        </w:rPr>
+        <w:t xml:space="preserve">"widget"</w:t>
+      </w:r>
+      <w:r>
+        <w:t xml:space="preserve"> </w:t>
+      </w:r>
+      <w:r>
+        <w:t xml:space="preserve">tag binds decoded signals directly to Studio’s visualization components—routing high-rate accelerometer and gyroscope data to the 8 kHz oscilloscope, magnetic heading to the vector compass dial, or altitude to the altimeter—without writing any UI wiring code.</w:t>
+      </w:r>
+    </w:p>
     <w:bookmarkEnd w:id="77"/>
-    <w:bookmarkStart w:id="82" w:name="X869936f40f9946c29645c44c798c92fea21bc7f"/>
+    <w:bookmarkStart w:id="78" w:name="Xa9ebde2285d1c8f136d1401f38741234a17ac1d"/>
+    <w:p>
+      <w:pPr>
+        <w:pStyle w:val="Heading4"/>
+      </w:pPr>
+      <w:r>
+        <w:t xml:space="preserve">2. Declarative Hardware Profiles (</w:t>
+      </w:r>
+      <w:r>
+        <w:rPr>
+          <w:rStyle w:val="VerbatimChar"/>
+        </w:rPr>
+        <w:t xml:space="preserve">profiles/*.json</w:t>
+      </w:r>
+      <w:r>
+        <w:t xml:space="preserve">)</w:t>
+      </w:r>
+    </w:p>
+    <w:p>
+      <w:pPr>
+        <w:pStyle w:val="FirstParagraph"/>
+      </w:pPr>
+      <w:r>
+        <w:t xml:space="preserve">Hardware profiles describe the physical target board and its interconnect topology:</w:t>
+      </w:r>
+    </w:p>
+    <w:p>
+      <w:pPr>
+        <w:pStyle w:val="SourceCode"/>
+      </w:pPr>
+      <w:r>
+        <w:rPr>
+          <w:rStyle w:val="FunctionTok"/>
+        </w:rPr>
+        <w:t xml:space="preserve">{</w:t>
+      </w:r>
+      <w:r>
+        <w:br/>
+      </w:r>
+      <w:r>
+        <w:rPr>
+          <w:rStyle w:val="NormalTok"/>
+        </w:rPr>
+        <w:t xml:space="preserve">  </w:t>
+      </w:r>
+      <w:r>
+        <w:rPr>
+          <w:rStyle w:val="DataTypeTok"/>
+        </w:rPr>
+        <w:t xml:space="preserve">"profile_id"</w:t>
+      </w:r>
+      <w:r>
+        <w:rPr>
+          <w:rStyle w:val="FunctionTok"/>
+        </w:rPr>
+        <w:t xml:space="preserve">:</w:t>
+      </w:r>
+      <w:r>
+        <w:rPr>
+          <w:rStyle w:val="NormalTok"/>
+        </w:rPr>
+        <w:t xml:space="preserve"> </w:t>
+      </w:r>
+      <w:r>
+        <w:rPr>
+          <w:rStyle w:val="StringTok"/>
+        </w:rPr>
+        <w:t xml:space="preserve">"cubie_a5e_pure"</w:t>
+      </w:r>
+      <w:r>
+        <w:rPr>
+          <w:rStyle w:val="FunctionTok"/>
+        </w:rPr>
+        <w:t xml:space="preserve">,</w:t>
+      </w:r>
+      <w:r>
+        <w:br/>
+      </w:r>
+      <w:r>
+        <w:rPr>
+          <w:rStyle w:val="NormalTok"/>
+        </w:rPr>
+        <w:t xml:space="preserve">  </w:t>
+      </w:r>
+      <w:r>
+        <w:rPr>
+          <w:rStyle w:val="DataTypeTok"/>
+        </w:rPr>
+        <w:t xml:space="preserve">"platform_name"</w:t>
+      </w:r>
+      <w:r>
+        <w:rPr>
+          <w:rStyle w:val="FunctionTok"/>
+        </w:rPr>
+        <w:t xml:space="preserve">:</w:t>
+      </w:r>
+      <w:r>
+        <w:rPr>
+          <w:rStyle w:val="NormalTok"/>
+        </w:rPr>
+        <w:t xml:space="preserve"> </w:t>
+      </w:r>
+      <w:r>
+        <w:rPr>
+          <w:rStyle w:val="StringTok"/>
+        </w:rPr>
+        <w:t xml:space="preserve">"Allwinner Cubie A5E (Pure Silicon)"</w:t>
+      </w:r>
+      <w:r>
+        <w:rPr>
+          <w:rStyle w:val="FunctionTok"/>
+        </w:rPr>
+        <w:t xml:space="preserve">,</w:t>
+      </w:r>
+      <w:r>
+        <w:br/>
+      </w:r>
+      <w:r>
+        <w:rPr>
+          <w:rStyle w:val="NormalTok"/>
+        </w:rPr>
+        <w:t xml:space="preserve">  </w:t>
+      </w:r>
+      <w:r>
+        <w:rPr>
+          <w:rStyle w:val="DataTypeTok"/>
+        </w:rPr>
+        <w:t xml:space="preserve">"board_ip"</w:t>
+      </w:r>
+      <w:r>
+        <w:rPr>
+          <w:rStyle w:val="FunctionTok"/>
+        </w:rPr>
+        <w:t xml:space="preserve">:</w:t>
+      </w:r>
+      <w:r>
+        <w:rPr>
+          <w:rStyle w:val="NormalTok"/>
+        </w:rPr>
+        <w:t xml:space="preserve"> </w:t>
+      </w:r>
+      <w:r>
+        <w:rPr>
+          <w:rStyle w:val="StringTok"/>
+        </w:rPr>
+        <w:t xml:space="preserve">"192.168.3.3"</w:t>
+      </w:r>
+      <w:r>
+        <w:rPr>
+          <w:rStyle w:val="FunctionTok"/>
+        </w:rPr>
+        <w:t xml:space="preserve">,</w:t>
+      </w:r>
+      <w:r>
+        <w:br/>
+      </w:r>
+      <w:r>
+        <w:rPr>
+          <w:rStyle w:val="NormalTok"/>
+        </w:rPr>
+        <w:t xml:space="preserve">  </w:t>
+      </w:r>
+      <w:r>
+        <w:rPr>
+          <w:rStyle w:val="DataTypeTok"/>
+        </w:rPr>
+        <w:t xml:space="preserve">"udp_port"</w:t>
+      </w:r>
+      <w:r>
+        <w:rPr>
+          <w:rStyle w:val="FunctionTok"/>
+        </w:rPr>
+        <w:t xml:space="preserve">:</w:t>
+      </w:r>
+      <w:r>
+        <w:rPr>
+          <w:rStyle w:val="NormalTok"/>
+        </w:rPr>
+        <w:t xml:space="preserve"> </w:t>
+      </w:r>
+      <w:r>
+        <w:rPr>
+          <w:rStyle w:val="DecValTok"/>
+        </w:rPr>
+        <w:t xml:space="preserve">9870</w:t>
+      </w:r>
+      <w:r>
+        <w:rPr>
+          <w:rStyle w:val="FunctionTok"/>
+        </w:rPr>
+        <w:t xml:space="preserve">,</w:t>
+      </w:r>
+      <w:r>
+        <w:br/>
+      </w:r>
+      <w:r>
+        <w:rPr>
+          <w:rStyle w:val="NormalTok"/>
+        </w:rPr>
+        <w:t xml:space="preserve">  </w:t>
+      </w:r>
+      <w:r>
+        <w:rPr>
+          <w:rStyle w:val="DataTypeTok"/>
+        </w:rPr>
+        <w:t xml:space="preserve">"active_cores"</w:t>
+      </w:r>
+      <w:r>
+        <w:rPr>
+          <w:rStyle w:val="FunctionTok"/>
+        </w:rPr>
+        <w:t xml:space="preserve">:</w:t>
+      </w:r>
+      <w:r>
+        <w:rPr>
+          <w:rStyle w:val="NormalTok"/>
+        </w:rPr>
+        <w:t xml:space="preserve"> </w:t>
+      </w:r>
+      <w:r>
+        <w:rPr>
+          <w:rStyle w:val="OtherTok"/>
+        </w:rPr>
+        <w:t xml:space="preserve">[</w:t>
+      </w:r>
+      <w:r>
+        <w:br/>
+      </w:r>
+      <w:r>
+        <w:rPr>
+          <w:rStyle w:val="NormalTok"/>
+        </w:rPr>
+        <w:t xml:space="preserve">    </w:t>
+      </w:r>
+      <w:r>
+        <w:rPr>
+          <w:rStyle w:val="FunctionTok"/>
+        </w:rPr>
+        <w:t xml:space="preserve">{</w:t>
+      </w:r>
+      <w:r>
+        <w:rPr>
+          <w:rStyle w:val="DataTypeTok"/>
+        </w:rPr>
+        <w:t xml:space="preserve">"id"</w:t>
+      </w:r>
+      <w:r>
+        <w:rPr>
+          <w:rStyle w:val="FunctionTok"/>
+        </w:rPr>
+        <w:t xml:space="preserve">:</w:t>
+      </w:r>
+      <w:r>
+        <w:rPr>
+          <w:rStyle w:val="NormalTok"/>
+        </w:rPr>
+        <w:t xml:space="preserve"> </w:t>
+      </w:r>
+      <w:r>
+        <w:rPr>
+          <w:rStyle w:val="DecValTok"/>
+        </w:rPr>
+        <w:t xml:space="preserve">0</w:t>
+      </w:r>
+      <w:r>
+        <w:rPr>
+          <w:rStyle w:val="FunctionTok"/>
+        </w:rPr>
+        <w:t xml:space="preserve">,</w:t>
+      </w:r>
+      <w:r>
+        <w:rPr>
+          <w:rStyle w:val="NormalTok"/>
+        </w:rPr>
+        <w:t xml:space="preserve"> </w:t>
+      </w:r>
+      <w:r>
+        <w:rPr>
+          <w:rStyle w:val="DataTypeTok"/>
+        </w:rPr>
+        <w:t xml:space="preserve">"role"</w:t>
+      </w:r>
+      <w:r>
+        <w:rPr>
+          <w:rStyle w:val="FunctionTok"/>
+        </w:rPr>
+        <w:t xml:space="preserve">:</w:t>
+      </w:r>
+      <w:r>
+        <w:rPr>
+          <w:rStyle w:val="NormalTok"/>
+        </w:rPr>
+        <w:t xml:space="preserve"> </w:t>
+      </w:r>
+      <w:r>
+        <w:rPr>
+          <w:rStyle w:val="StringTok"/>
+        </w:rPr>
+        <w:t xml:space="preserve">"Host Linux ARM64"</w:t>
+      </w:r>
+      <w:r>
+        <w:rPr>
+          <w:rStyle w:val="FunctionTok"/>
+        </w:rPr>
+        <w:t xml:space="preserve">,</w:t>
+      </w:r>
+      <w:r>
+        <w:rPr>
+          <w:rStyle w:val="NormalTok"/>
+        </w:rPr>
+        <w:t xml:space="preserve"> </w:t>
+      </w:r>
+      <w:r>
+        <w:rPr>
+          <w:rStyle w:val="DataTypeTok"/>
+        </w:rPr>
+        <w:t xml:space="preserve">"task"</w:t>
+      </w:r>
+      <w:r>
+        <w:rPr>
+          <w:rStyle w:val="FunctionTok"/>
+        </w:rPr>
+        <w:t xml:space="preserve">:</w:t>
+      </w:r>
+      <w:r>
+        <w:rPr>
+          <w:rStyle w:val="NormalTok"/>
+        </w:rPr>
+        <w:t xml:space="preserve"> </w:t>
+      </w:r>
+      <w:r>
+        <w:rPr>
+          <w:rStyle w:val="StringTok"/>
+        </w:rPr>
+        <w:t xml:space="preserve">"Flight Supervisor &amp; Telemetry"</w:t>
+      </w:r>
+      <w:r>
+        <w:rPr>
+          <w:rStyle w:val="FunctionTok"/>
+        </w:rPr>
+        <w:t xml:space="preserve">,</w:t>
+      </w:r>
+      <w:r>
+        <w:rPr>
+          <w:rStyle w:val="NormalTok"/>
+        </w:rPr>
+        <w:t xml:space="preserve"> </w:t>
+      </w:r>
+      <w:r>
+        <w:rPr>
+          <w:rStyle w:val="DataTypeTok"/>
+        </w:rPr>
+        <w:t xml:space="preserve">"clock_mhz"</w:t>
+      </w:r>
+      <w:r>
+        <w:rPr>
+          <w:rStyle w:val="FunctionTok"/>
+        </w:rPr>
+        <w:t xml:space="preserve">:</w:t>
+      </w:r>
+      <w:r>
+        <w:rPr>
+          <w:rStyle w:val="NormalTok"/>
+        </w:rPr>
+        <w:t xml:space="preserve"> </w:t>
+      </w:r>
+      <w:r>
+        <w:rPr>
+          <w:rStyle w:val="DecValTok"/>
+        </w:rPr>
+        <w:t xml:space="preserve">1400</w:t>
+      </w:r>
+      <w:r>
+        <w:rPr>
+          <w:rStyle w:val="FunctionTok"/>
+        </w:rPr>
+        <w:t xml:space="preserve">}</w:t>
+      </w:r>
+      <w:r>
+        <w:rPr>
+          <w:rStyle w:val="OtherTok"/>
+        </w:rPr>
+        <w:t xml:space="preserve">,</w:t>
+      </w:r>
+      <w:r>
+        <w:br/>
+      </w:r>
+      <w:r>
+        <w:rPr>
+          <w:rStyle w:val="NormalTok"/>
+        </w:rPr>
+        <w:t xml:space="preserve">    </w:t>
+      </w:r>
+      <w:r>
+        <w:rPr>
+          <w:rStyle w:val="FunctionTok"/>
+        </w:rPr>
+        <w:t xml:space="preserve">{</w:t>
+      </w:r>
+      <w:r>
+        <w:rPr>
+          <w:rStyle w:val="DataTypeTok"/>
+        </w:rPr>
+        <w:t xml:space="preserve">"id"</w:t>
+      </w:r>
+      <w:r>
+        <w:rPr>
+          <w:rStyle w:val="FunctionTok"/>
+        </w:rPr>
+        <w:t xml:space="preserve">:</w:t>
+      </w:r>
+      <w:r>
+        <w:rPr>
+          <w:rStyle w:val="NormalTok"/>
+        </w:rPr>
+        <w:t xml:space="preserve"> </w:t>
+      </w:r>
+      <w:r>
+        <w:rPr>
+          <w:rStyle w:val="DecValTok"/>
+        </w:rPr>
+        <w:t xml:space="preserve">1</w:t>
+      </w:r>
+      <w:r>
+        <w:rPr>
+          <w:rStyle w:val="FunctionTok"/>
+        </w:rPr>
+        <w:t xml:space="preserve">,</w:t>
+      </w:r>
+      <w:r>
+        <w:rPr>
+          <w:rStyle w:val="NormalTok"/>
+        </w:rPr>
+        <w:t xml:space="preserve"> </w:t>
+      </w:r>
+      <w:r>
+        <w:rPr>
+          <w:rStyle w:val="DataTypeTok"/>
+        </w:rPr>
+        <w:t xml:space="preserve">"role"</w:t>
+      </w:r>
+      <w:r>
+        <w:rPr>
+          <w:rStyle w:val="FunctionTok"/>
+        </w:rPr>
+        <w:t xml:space="preserve">:</w:t>
+      </w:r>
+      <w:r>
+        <w:rPr>
+          <w:rStyle w:val="NormalTok"/>
+        </w:rPr>
+        <w:t xml:space="preserve"> </w:t>
+      </w:r>
+      <w:r>
+        <w:rPr>
+          <w:rStyle w:val="StringTok"/>
+        </w:rPr>
+        <w:t xml:space="preserve">"XuanTie E906 RISC-V"</w:t>
+      </w:r>
+      <w:r>
+        <w:rPr>
+          <w:rStyle w:val="FunctionTok"/>
+        </w:rPr>
+        <w:t xml:space="preserve">,</w:t>
+      </w:r>
+      <w:r>
+        <w:rPr>
+          <w:rStyle w:val="NormalTok"/>
+        </w:rPr>
+        <w:t xml:space="preserve"> </w:t>
+      </w:r>
+      <w:r>
+        <w:rPr>
+          <w:rStyle w:val="DataTypeTok"/>
+        </w:rPr>
+        <w:t xml:space="preserve">"task"</w:t>
+      </w:r>
+      <w:r>
+        <w:rPr>
+          <w:rStyle w:val="FunctionTok"/>
+        </w:rPr>
+        <w:t xml:space="preserve">:</w:t>
+      </w:r>
+      <w:r>
+        <w:rPr>
+          <w:rStyle w:val="NormalTok"/>
+        </w:rPr>
+        <w:t xml:space="preserve"> </w:t>
+      </w:r>
+      <w:r>
+        <w:rPr>
+          <w:rStyle w:val="StringTok"/>
+        </w:rPr>
+        <w:t xml:space="preserve">"Real-Time I/O Reactor &amp; Sensors"</w:t>
+      </w:r>
+      <w:r>
+        <w:rPr>
+          <w:rStyle w:val="FunctionTok"/>
+        </w:rPr>
+        <w:t xml:space="preserve">,</w:t>
+      </w:r>
+      <w:r>
+        <w:rPr>
+          <w:rStyle w:val="NormalTok"/>
+        </w:rPr>
+        <w:t xml:space="preserve"> </w:t>
+      </w:r>
+      <w:r>
+        <w:rPr>
+          <w:rStyle w:val="DataTypeTok"/>
+        </w:rPr>
+        <w:t xml:space="preserve">"clock_mhz"</w:t>
+      </w:r>
+      <w:r>
+        <w:rPr>
+          <w:rStyle w:val="FunctionTok"/>
+        </w:rPr>
+        <w:t xml:space="preserve">:</w:t>
+      </w:r>
+      <w:r>
+        <w:rPr>
+          <w:rStyle w:val="NormalTok"/>
+        </w:rPr>
+        <w:t xml:space="preserve"> </w:t>
+      </w:r>
+      <w:r>
+        <w:rPr>
+          <w:rStyle w:val="DecValTok"/>
+        </w:rPr>
+        <w:t xml:space="preserve">200</w:t>
+      </w:r>
+      <w:r>
+        <w:rPr>
+          <w:rStyle w:val="FunctionTok"/>
+        </w:rPr>
+        <w:t xml:space="preserve">}</w:t>
+      </w:r>
+      <w:r>
+        <w:br/>
+      </w:r>
+      <w:r>
+        <w:rPr>
+          <w:rStyle w:val="NormalTok"/>
+        </w:rPr>
+        <w:t xml:space="preserve">  </w:t>
+      </w:r>
+      <w:r>
+        <w:rPr>
+          <w:rStyle w:val="OtherTok"/>
+        </w:rPr>
+        <w:t xml:space="preserve">]</w:t>
+      </w:r>
+      <w:r>
+        <w:rPr>
+          <w:rStyle w:val="FunctionTok"/>
+        </w:rPr>
+        <w:t xml:space="preserve">,</w:t>
+      </w:r>
+      <w:r>
+        <w:br/>
+      </w:r>
+      <w:r>
+        <w:rPr>
+          <w:rStyle w:val="NormalTok"/>
+        </w:rPr>
+        <w:t xml:space="preserve">  </w:t>
+      </w:r>
+      <w:r>
+        <w:rPr>
+          <w:rStyle w:val="DataTypeTok"/>
+        </w:rPr>
+        <w:t xml:space="preserve">"hardware_accels"</w:t>
+      </w:r>
+      <w:r>
+        <w:rPr>
+          <w:rStyle w:val="FunctionTok"/>
+        </w:rPr>
+        <w:t xml:space="preserve">:</w:t>
+      </w:r>
+      <w:r>
+        <w:rPr>
+          <w:rStyle w:val="NormalTok"/>
+        </w:rPr>
+        <w:t xml:space="preserve"> </w:t>
+      </w:r>
+      <w:r>
+        <w:rPr>
+          <w:rStyle w:val="OtherTok"/>
+        </w:rPr>
+        <w:t xml:space="preserve">[</w:t>
+      </w:r>
+      <w:r>
+        <w:rPr>
+          <w:rStyle w:val="StringTok"/>
+        </w:rPr>
+        <w:t xml:space="preserve">"UART3 Circular DMA (GPS)"</w:t>
+      </w:r>
+      <w:r>
+        <w:rPr>
+          <w:rStyle w:val="OtherTok"/>
+        </w:rPr>
+        <w:t xml:space="preserve">,</w:t>
+      </w:r>
+      <w:r>
+        <w:rPr>
+          <w:rStyle w:val="NormalTok"/>
+        </w:rPr>
+        <w:t xml:space="preserve"> </w:t>
+      </w:r>
+      <w:r>
+        <w:rPr>
+          <w:rStyle w:val="StringTok"/>
+        </w:rPr>
+        <w:t xml:space="preserve">"TWI1 I2C (Compass)"</w:t>
+      </w:r>
+      <w:r>
+        <w:rPr>
+          <w:rStyle w:val="OtherTok"/>
+        </w:rPr>
+        <w:t xml:space="preserve">,</w:t>
+      </w:r>
+      <w:r>
+        <w:rPr>
+          <w:rStyle w:val="NormalTok"/>
+        </w:rPr>
+        <w:t xml:space="preserve"> </w:t>
+      </w:r>
+      <w:r>
+        <w:rPr>
+          <w:rStyle w:val="StringTok"/>
+        </w:rPr>
+        <w:t xml:space="preserve">"sun6i-msgbox"</w:t>
+      </w:r>
+      <w:r>
+        <w:rPr>
+          <w:rStyle w:val="OtherTok"/>
+        </w:rPr>
+        <w:t xml:space="preserve">]</w:t>
+      </w:r>
+      <w:r>
+        <w:rPr>
+          <w:rStyle w:val="FunctionTok"/>
+        </w:rPr>
+        <w:t xml:space="preserve">,</w:t>
+      </w:r>
+      <w:r>
+        <w:br/>
+      </w:r>
+      <w:r>
+        <w:rPr>
+          <w:rStyle w:val="NormalTok"/>
+        </w:rPr>
+        <w:t xml:space="preserve">  </w:t>
+      </w:r>
+      <w:r>
+        <w:rPr>
+          <w:rStyle w:val="DataTypeTok"/>
+        </w:rPr>
+        <w:t xml:space="preserve">"schema_file"</w:t>
+      </w:r>
+      <w:r>
+        <w:rPr>
+          <w:rStyle w:val="FunctionTok"/>
+        </w:rPr>
+        <w:t xml:space="preserve">:</w:t>
+      </w:r>
+      <w:r>
+        <w:rPr>
+          <w:rStyle w:val="NormalTok"/>
+        </w:rPr>
+        <w:t xml:space="preserve"> </w:t>
+      </w:r>
+      <w:r>
+        <w:rPr>
+          <w:rStyle w:val="StringTok"/>
+        </w:rPr>
+        <w:t xml:space="preserve">"apps/gps_imu_app/trace_schema.json"</w:t>
+      </w:r>
+      <w:r>
+        <w:br/>
+      </w:r>
+      <w:r>
+        <w:rPr>
+          <w:rStyle w:val="FunctionTok"/>
+        </w:rPr>
+        <w:t xml:space="preserve">}</w:t>
+      </w:r>
+    </w:p>
+    <w:p>
+      <w:pPr>
+        <w:pStyle w:val="FirstParagraph"/>
+      </w:pPr>
+      <w:r>
+        <w:t xml:space="preserve">Switching Studio between targets—from the bare-metal XuanTie E906 on the Cubie A5E, to an ESP32-P4, a Raspberry Pi Pico 2 W, or a desktop SITL simulator—is simply a matter of passing</w:t>
+      </w:r>
+      <w:r>
+        <w:t xml:space="preserve"> </w:t>
+      </w:r>
+      <w:r>
+        <w:rPr>
+          <w:rStyle w:val="VerbatimChar"/>
+        </w:rPr>
+        <w:t xml:space="preserve">--profile profiles/&lt;target&gt;.json</w:t>
+      </w:r>
+      <w:r>
+        <w:t xml:space="preserve">. Studio automatically reconfigures its core topology views, network endpoints, and telemetry parsers.</w:t>
+      </w:r>
+    </w:p>
+    <w:bookmarkEnd w:id="78"/>
+    <w:bookmarkStart w:id="80" w:name="Xb2e05fa39620e58ec0c0d4661b980e02b4df473"/>
+    <w:p>
+      <w:pPr>
+        <w:pStyle w:val="Heading4"/>
+      </w:pPr>
+      <w:r>
+        <w:t xml:space="preserve">3. The Extensible Python Plugin SDK (</w:t>
+      </w:r>
+      <w:r>
+        <w:rPr>
+          <w:rStyle w:val="VerbatimChar"/>
+        </w:rPr>
+        <w:t xml:space="preserve">AbstractXStudioPlugin</w:t>
+      </w:r>
+      <w:r>
+        <w:t xml:space="preserve">)</w:t>
+      </w:r>
+    </w:p>
+    <w:p>
+      <w:pPr>
+        <w:pStyle w:val="FirstParagraph"/>
+      </w:pPr>
+      <w:r>
+        <w:t xml:space="preserve">Studio is built on an extensible core-and-plugin architecture (</w:t>
+      </w:r>
+      <w:hyperlink r:id="rId79">
+        <w:r>
+          <w:rPr>
+            <w:rStyle w:val="VerbatimChar"/>
+          </w:rPr>
+          <w:t xml:space="preserve">tools/visualizer/sdk/plugin.py</w:t>
+        </w:r>
+      </w:hyperlink>
+      <w:r>
+        <w:t xml:space="preserve">). Developers can create custom visualizers, instrumentation panels, or automated test consoles in pure Python using Dear ImGui (</w:t>
+      </w:r>
+      <w:r>
+        <w:rPr>
+          <w:rStyle w:val="VerbatimChar"/>
+        </w:rPr>
+        <w:t xml:space="preserve">imgui-bundle</w:t>
+      </w:r>
+      <w:r>
+        <w:t xml:space="preserve">):</w:t>
+      </w:r>
+    </w:p>
+    <w:p>
+      <w:pPr>
+        <w:pStyle w:val="SourceCode"/>
+      </w:pPr>
+      <w:r>
+        <w:rPr>
+          <w:rStyle w:val="ImportTok"/>
+        </w:rPr>
+        <w:t xml:space="preserve">from</w:t>
+      </w:r>
+      <w:r>
+        <w:rPr>
+          <w:rStyle w:val="NormalTok"/>
+        </w:rPr>
+        <w:t xml:space="preserve"> visualizer.sdk.plugin </w:t>
+      </w:r>
+      <w:r>
+        <w:rPr>
+          <w:rStyle w:val="ImportTok"/>
+        </w:rPr>
+        <w:t xml:space="preserve">import</w:t>
+      </w:r>
+      <w:r>
+        <w:rPr>
+          <w:rStyle w:val="NormalTok"/>
+        </w:rPr>
+        <w:t xml:space="preserve"> AbstractXStudioPlugin</w:t>
+      </w:r>
+      <w:r>
+        <w:br/>
+      </w:r>
+      <w:r>
+        <w:rPr>
+          <w:rStyle w:val="ImportTok"/>
+        </w:rPr>
+        <w:t xml:space="preserve">from</w:t>
+      </w:r>
+      <w:r>
+        <w:rPr>
+          <w:rStyle w:val="NormalTok"/>
+        </w:rPr>
+        <w:t xml:space="preserve"> imgui_bundle </w:t>
+      </w:r>
+      <w:r>
+        <w:rPr>
+          <w:rStyle w:val="ImportTok"/>
+        </w:rPr>
+        <w:t xml:space="preserve">import</w:t>
+      </w:r>
+      <w:r>
+        <w:rPr>
+          <w:rStyle w:val="NormalTok"/>
+        </w:rPr>
+        <w:t xml:space="preserve"> imgui, implot</w:t>
+      </w:r>
+      <w:r>
+        <w:br/>
+      </w:r>
+      <w:r>
+        <w:br/>
+      </w:r>
+      <w:r>
+        <w:rPr>
+          <w:rStyle w:val="KeywordTok"/>
+        </w:rPr>
+        <w:t xml:space="preserve">class</w:t>
+      </w:r>
+      <w:r>
+        <w:rPr>
+          <w:rStyle w:val="NormalTok"/>
+        </w:rPr>
+        <w:t xml:space="preserve"> CustomSensorDashboard(AbstractXStudioPlugin):</w:t>
+      </w:r>
+      <w:r>
+        <w:br/>
+      </w:r>
+      <w:r>
+        <w:rPr>
+          <w:rStyle w:val="NormalTok"/>
+        </w:rPr>
+        <w:t xml:space="preserve">    </w:t>
+      </w:r>
+      <w:r>
+        <w:rPr>
+          <w:rStyle w:val="KeywordTok"/>
+        </w:rPr>
+        <w:t xml:space="preserve">def</w:t>
+      </w:r>
+      <w:r>
+        <w:rPr>
+          <w:rStyle w:val="NormalTok"/>
+        </w:rPr>
+        <w:t xml:space="preserve"> on_init(</w:t>
+      </w:r>
+      <w:r>
+        <w:rPr>
+          <w:rStyle w:val="VariableTok"/>
+        </w:rPr>
+        <w:t xml:space="preserve">self</w:t>
+      </w:r>
+      <w:r>
+        <w:rPr>
+          <w:rStyle w:val="NormalTok"/>
+        </w:rPr>
+        <w:t xml:space="preserve">, context):</w:t>
+      </w:r>
+      <w:r>
+        <w:br/>
+      </w:r>
+      <w:r>
+        <w:rPr>
+          <w:rStyle w:val="NormalTok"/>
+        </w:rPr>
+        <w:t xml:space="preserve">        </w:t>
+      </w:r>
+      <w:r>
+        <w:rPr>
+          <w:rStyle w:val="VariableTok"/>
+        </w:rPr>
+        <w:t xml:space="preserve">self</w:t>
+      </w:r>
+      <w:r>
+        <w:rPr>
+          <w:rStyle w:val="NormalTok"/>
+        </w:rPr>
+        <w:t xml:space="preserve">.latest_heading </w:t>
+      </w:r>
+      <w:r>
+        <w:rPr>
+          <w:rStyle w:val="OperatorTok"/>
+        </w:rPr>
+        <w:t xml:space="preserve">=</w:t>
+      </w:r>
+      <w:r>
+        <w:rPr>
+          <w:rStyle w:val="NormalTok"/>
+        </w:rPr>
+        <w:t xml:space="preserve"> </w:t>
+      </w:r>
+      <w:r>
+        <w:rPr>
+          <w:rStyle w:val="FloatTok"/>
+        </w:rPr>
+        <w:t xml:space="preserve">0.0</w:t>
+      </w:r>
+      <w:r>
+        <w:br/>
+      </w:r>
+      <w:r>
+        <w:br/>
+      </w:r>
+      <w:r>
+        <w:rPr>
+          <w:rStyle w:val="NormalTok"/>
+        </w:rPr>
+        <w:t xml:space="preserve">    </w:t>
+      </w:r>
+      <w:r>
+        <w:rPr>
+          <w:rStyle w:val="KeywordTok"/>
+        </w:rPr>
+        <w:t xml:space="preserve">def</w:t>
+      </w:r>
+      <w:r>
+        <w:rPr>
+          <w:rStyle w:val="NormalTok"/>
+        </w:rPr>
+        <w:t xml:space="preserve"> on_tlp_packet(</w:t>
+      </w:r>
+      <w:r>
+        <w:rPr>
+          <w:rStyle w:val="VariableTok"/>
+        </w:rPr>
+        <w:t xml:space="preserve">self</w:t>
+      </w:r>
+      <w:r>
+        <w:rPr>
+          <w:rStyle w:val="NormalTok"/>
+        </w:rPr>
+        <w:t xml:space="preserve">, header, payload_dict):</w:t>
+      </w:r>
+      <w:r>
+        <w:br/>
+      </w:r>
+      <w:r>
+        <w:rPr>
+          <w:rStyle w:val="NormalTok"/>
+        </w:rPr>
+        <w:t xml:space="preserve">        </w:t>
+      </w:r>
+      <w:r>
+        <w:rPr>
+          <w:rStyle w:val="CommentTok"/>
+        </w:rPr>
+        <w:t xml:space="preserve"># Asynchronously invoked when relevant telemetry packets arrive</w:t>
+      </w:r>
+      <w:r>
+        <w:br/>
+      </w:r>
+      <w:r>
+        <w:rPr>
+          <w:rStyle w:val="NormalTok"/>
+        </w:rPr>
+        <w:t xml:space="preserve">        </w:t>
+      </w:r>
+      <w:r>
+        <w:rPr>
+          <w:rStyle w:val="ControlFlowTok"/>
+        </w:rPr>
+        <w:t xml:space="preserve">if</w:t>
+      </w:r>
+      <w:r>
+        <w:rPr>
+          <w:rStyle w:val="NormalTok"/>
+        </w:rPr>
+        <w:t xml:space="preserve"> </w:t>
+      </w:r>
+      <w:r>
+        <w:rPr>
+          <w:rStyle w:val="StringTok"/>
+        </w:rPr>
+        <w:t xml:space="preserve">"heading_cdeg"</w:t>
+      </w:r>
+      <w:r>
+        <w:rPr>
+          <w:rStyle w:val="NormalTok"/>
+        </w:rPr>
+        <w:t xml:space="preserve"> </w:t>
+      </w:r>
+      <w:r>
+        <w:rPr>
+          <w:rStyle w:val="KeywordTok"/>
+        </w:rPr>
+        <w:t xml:space="preserve">in</w:t>
+      </w:r>
+      <w:r>
+        <w:rPr>
+          <w:rStyle w:val="NormalTok"/>
+        </w:rPr>
+        <w:t xml:space="preserve"> payload_dict:</w:t>
+      </w:r>
+      <w:r>
+        <w:br/>
+      </w:r>
+      <w:r>
+        <w:rPr>
+          <w:rStyle w:val="NormalTok"/>
+        </w:rPr>
+        <w:t xml:space="preserve">            </w:t>
+      </w:r>
+      <w:r>
+        <w:rPr>
+          <w:rStyle w:val="VariableTok"/>
+        </w:rPr>
+        <w:t xml:space="preserve">self</w:t>
+      </w:r>
+      <w:r>
+        <w:rPr>
+          <w:rStyle w:val="NormalTok"/>
+        </w:rPr>
+        <w:t xml:space="preserve">.latest_heading </w:t>
+      </w:r>
+      <w:r>
+        <w:rPr>
+          <w:rStyle w:val="OperatorTok"/>
+        </w:rPr>
+        <w:t xml:space="preserve">=</w:t>
+      </w:r>
+      <w:r>
+        <w:rPr>
+          <w:rStyle w:val="NormalTok"/>
+        </w:rPr>
+        <w:t xml:space="preserve"> payload_dict[</w:t>
+      </w:r>
+      <w:r>
+        <w:rPr>
+          <w:rStyle w:val="StringTok"/>
+        </w:rPr>
+        <w:t xml:space="preserve">"heading_cdeg"</w:t>
+      </w:r>
+      <w:r>
+        <w:rPr>
+          <w:rStyle w:val="NormalTok"/>
+        </w:rPr>
+        <w:t xml:space="preserve">] </w:t>
+      </w:r>
+      <w:r>
+        <w:rPr>
+          <w:rStyle w:val="OperatorTok"/>
+        </w:rPr>
+        <w:t xml:space="preserve">*</w:t>
+      </w:r>
+      <w:r>
+        <w:rPr>
+          <w:rStyle w:val="NormalTok"/>
+        </w:rPr>
+        <w:t xml:space="preserve"> </w:t>
+      </w:r>
+      <w:r>
+        <w:rPr>
+          <w:rStyle w:val="FloatTok"/>
+        </w:rPr>
+        <w:t xml:space="preserve">0.01</w:t>
+      </w:r>
+      <w:r>
+        <w:br/>
+      </w:r>
+      <w:r>
+        <w:br/>
+      </w:r>
+      <w:r>
+        <w:rPr>
+          <w:rStyle w:val="NormalTok"/>
+        </w:rPr>
+        <w:t xml:space="preserve">    </w:t>
+      </w:r>
+      <w:r>
+        <w:rPr>
+          <w:rStyle w:val="KeywordTok"/>
+        </w:rPr>
+        <w:t xml:space="preserve">def</w:t>
+      </w:r>
+      <w:r>
+        <w:rPr>
+          <w:rStyle w:val="NormalTok"/>
+        </w:rPr>
+        <w:t xml:space="preserve"> render_ui(</w:t>
+      </w:r>
+      <w:r>
+        <w:rPr>
+          <w:rStyle w:val="VariableTok"/>
+        </w:rPr>
+        <w:t xml:space="preserve">self</w:t>
+      </w:r>
+      <w:r>
+        <w:rPr>
+          <w:rStyle w:val="NormalTok"/>
+        </w:rPr>
+        <w:t xml:space="preserve">, delta_time, state):</w:t>
+      </w:r>
+      <w:r>
+        <w:br/>
+      </w:r>
+      <w:r>
+        <w:rPr>
+          <w:rStyle w:val="NormalTok"/>
+        </w:rPr>
+        <w:t xml:space="preserve">        </w:t>
+      </w:r>
+      <w:r>
+        <w:rPr>
+          <w:rStyle w:val="CommentTok"/>
+        </w:rPr>
+        <w:t xml:space="preserve"># Rendered at 60 FPS inside Studio's dockable workbench</w:t>
+      </w:r>
+      <w:r>
+        <w:br/>
+      </w:r>
+      <w:r>
+        <w:rPr>
+          <w:rStyle w:val="NormalTok"/>
+        </w:rPr>
+        <w:t xml:space="preserve">        imgui.text(</w:t>
+      </w:r>
+      <w:r>
+        <w:rPr>
+          <w:rStyle w:val="SpecialStringTok"/>
+        </w:rPr>
+        <w:t xml:space="preserve">f"Live Heading: </w:t>
+      </w:r>
+      <w:r>
+        <w:rPr>
+          <w:rStyle w:val="SpecialCharTok"/>
+        </w:rPr>
+        <w:t xml:space="preserve">{</w:t>
+      </w:r>
+      <w:r>
+        <w:rPr>
+          <w:rStyle w:val="VariableTok"/>
+        </w:rPr>
+        <w:t xml:space="preserve">self</w:t>
+      </w:r>
+      <w:r>
+        <w:rPr>
+          <w:rStyle w:val="SpecialCharTok"/>
+        </w:rPr>
+        <w:t xml:space="preserve">.</w:t>
+      </w:r>
+      <w:r>
+        <w:rPr>
+          <w:rStyle w:val="NormalTok"/>
+        </w:rPr>
+        <w:t xml:space="preserve">latest_heading</w:t>
+      </w:r>
+      <w:r>
+        <w:rPr>
+          <w:rStyle w:val="SpecialCharTok"/>
+        </w:rPr>
+        <w:t xml:space="preserve">:.1f}</w:t>
+      </w:r>
+      <w:r>
+        <w:rPr>
+          <w:rStyle w:val="SpecialStringTok"/>
+        </w:rPr>
+        <w:t xml:space="preserve">°"</w:t>
+      </w:r>
+      <w:r>
+        <w:rPr>
+          <w:rStyle w:val="NormalTok"/>
+        </w:rPr>
+        <w:t xml:space="preserve">)</w:t>
+      </w:r>
+      <w:r>
+        <w:br/>
+      </w:r>
+      <w:r>
+        <w:rPr>
+          <w:rStyle w:val="NormalTok"/>
+        </w:rPr>
+        <w:t xml:space="preserve">        </w:t>
+      </w:r>
+      <w:r>
+        <w:rPr>
+          <w:rStyle w:val="ControlFlowTok"/>
+        </w:rPr>
+        <w:t xml:space="preserve">if</w:t>
+      </w:r>
+      <w:r>
+        <w:rPr>
+          <w:rStyle w:val="NormalTok"/>
+        </w:rPr>
+        <w:t xml:space="preserve"> imgui.button(</w:t>
+      </w:r>
+      <w:r>
+        <w:rPr>
+          <w:rStyle w:val="StringTok"/>
+        </w:rPr>
+        <w:t xml:space="preserve">"Zero Compass Bias"</w:t>
+      </w:r>
+      <w:r>
+        <w:rPr>
+          <w:rStyle w:val="NormalTok"/>
+        </w:rPr>
+        <w:t xml:space="preserve">):</w:t>
+      </w:r>
+      <w:r>
+        <w:br/>
+      </w:r>
+      <w:r>
+        <w:rPr>
+          <w:rStyle w:val="NormalTok"/>
+        </w:rPr>
+        <w:t xml:space="preserve">            state.send_cli(</w:t>
+      </w:r>
+      <w:r>
+        <w:rPr>
+          <w:rStyle w:val="StringTok"/>
+        </w:rPr>
+        <w:t xml:space="preserve">"abstractx.compass_calibrate()"</w:t>
+      </w:r>
+      <w:r>
+        <w:rPr>
+          <w:rStyle w:val="NormalTok"/>
+        </w:rPr>
+        <w:t xml:space="preserve">)</w:t>
+      </w:r>
+    </w:p>
+    <w:p>
+      <w:pPr>
+        <w:pStyle w:val="FirstParagraph"/>
+      </w:pPr>
+      <w:r>
+        <w:t xml:space="preserve">Plugins integrate seamlessly into Studio’s multi-window docking layout. They inherit native OS window pop-outs (moving the plugin to a second monitor), dark-mode styling, and zero-copy packet ingestion without having to manage windowing loops, OpenGL contexts, or threading primitives.</w:t>
+      </w:r>
+    </w:p>
+    <w:bookmarkEnd w:id="80"/>
+    <w:bookmarkEnd w:id="81"/>
+    <w:bookmarkEnd w:id="82"/>
+    <w:bookmarkStart w:id="87" w:name="X869936f40f9946c29645c44c798c92fea21bc7f"/>
     <w:p>
       <w:pPr>
         <w:pStyle w:val="Heading2"/>
@@ -10510,18 +13864,18 @@
           <wp:inline>
             <wp:extent cx="5334000" cy="3413760"/>
             <wp:effectExtent b="0" l="0" r="0" t="0"/>
-            <wp:docPr descr="The path of abstractx.i2c_read(0x1E, 0x03, 6): Python in repl_rx, modabstractx.c, e906_periph.cpp starting the I²C transfer, a wfi wait loop, one TWI1 interrupt per bus step, and the measurement hooks along the way" title="" id="79" name="Picture"/>
+            <wp:docPr descr="The path of abstractx.i2c_read(0x1E, 0x03, 6): Python in repl_rx, modabstractx.c, e906_periph.cpp starting the I²C transfer, a wfi wait loop, one TWI1 interrupt per bus step, and the measurement hooks along the way" title="" id="84" name="Picture"/>
             <a:graphic>
               <a:graphicData uri="http://schemas.openxmlformats.org/drawingml/2006/picture">
                 <pic:pic>
                   <pic:nvPicPr>
-                    <pic:cNvPr descr="https://raw.githubusercontent.com/tcmichals/AbstractX/main/docs/articles/micropython-on-e906/assets/call-path.png" id="80" name="Picture"/>
+                    <pic:cNvPr descr="https://raw.githubusercontent.com/tcmichals/AbstractX/main/docs/articles/micropython-on-e906/assets/call-path.png" id="85" name="Picture"/>
                     <pic:cNvPicPr>
                       <a:picLocks noChangeArrowheads="1" noChangeAspect="1"/>
                     </pic:cNvPicPr>
                   </pic:nvPicPr>
                   <pic:blipFill>
-                    <a:blip r:embed="rId78"/>
+                    <a:blip r:embed="rId83"/>
                     <a:stretch>
                       <a:fillRect/>
                     </a:stretch>
@@ -10687,7 +14041,7 @@
           <w:numId w:val="1010"/>
         </w:numPr>
       </w:pPr>
-      <w:hyperlink r:id="rId81">
+      <w:hyperlink r:id="rId86">
         <w:r>
           <w:rPr>
             <w:rStyle w:val="VerbatimChar"/>
@@ -10865,8 +14219,8 @@
         <w:t xml:space="preserve">handler (CLIC line 90) has already put in its buffer.</w:t>
       </w:r>
     </w:p>
-    <w:bookmarkEnd w:id="82"/>
-    <w:bookmarkStart w:id="86" w:name="where-everything-sits-in-memory"/>
+    <w:bookmarkEnd w:id="87"/>
+    <w:bookmarkStart w:id="91" w:name="where-everything-sits-in-memory"/>
     <w:p>
       <w:pPr>
         <w:pStyle w:val="Heading2"/>
@@ -10884,18 +14238,18 @@
           <wp:inline>
             <wp:extent cx="5334000" cy="2133600"/>
             <wp:effectExtent b="0" l="0" r="0" t="0"/>
-            <wp:docPr descr="E906 memory: hot firmware in SRAM Space 0, cold compiler code and trace rings in the lower half of Space 1, Linux RPMsg rings in the upper half, MicroPython heap in DSP RAM" title="" id="84" name="Picture"/>
+            <wp:docPr descr="E906 memory: hot firmware in SRAM Space 0, cold compiler code and trace rings in the lower half of Space 1, Linux RPMsg rings in the upper half, MicroPython heap in DSP RAM" title="" id="89" name="Picture"/>
             <a:graphic>
               <a:graphicData uri="http://schemas.openxmlformats.org/drawingml/2006/picture">
                 <pic:pic>
                   <pic:nvPicPr>
-                    <pic:cNvPr descr="https://raw.githubusercontent.com/tcmichals/AbstractX/main/docs/articles/micropython-on-e906/assets/memory-layout.png" id="85" name="Picture"/>
+                    <pic:cNvPr descr="https://raw.githubusercontent.com/tcmichals/AbstractX/main/docs/articles/micropython-on-e906/assets/memory-layout.png" id="90" name="Picture"/>
                     <pic:cNvPicPr>
                       <a:picLocks noChangeArrowheads="1" noChangeAspect="1"/>
                     </pic:cNvPicPr>
                   </pic:nvPicPr>
                   <pic:blipFill>
-                    <a:blip r:embed="rId83"/>
+                    <a:blip r:embed="rId88"/>
                     <a:stretch>
                       <a:fillRect/>
                     </a:stretch>
@@ -11182,8 +14536,8 @@
         <w:t xml:space="preserve">and DMA code added since, it is at 89.6 %.</w:t>
       </w:r>
     </w:p>
-    <w:bookmarkEnd w:id="86"/>
-    <w:bookmarkStart w:id="87" w:name="dma-shared-with-linux"/>
+    <w:bookmarkEnd w:id="91"/>
+    <w:bookmarkStart w:id="92" w:name="dma-shared-with-linux"/>
     <w:p>
       <w:pPr>
         <w:pStyle w:val="Heading2"/>
@@ -11756,8 +15110,8 @@
         <w:t xml:space="preserve">.</w:t>
       </w:r>
     </w:p>
-    <w:bookmarkEnd w:id="87"/>
-    <w:bookmarkStart w:id="88" w:name="measured-on-the-board"/>
+    <w:bookmarkEnd w:id="92"/>
+    <w:bookmarkStart w:id="93" w:name="measured-on-the-board"/>
     <w:p>
       <w:pPr>
         <w:pStyle w:val="Heading2"/>
@@ -12099,8 +15453,8 @@
         <w:t xml:space="preserve">matters at high data rates.</w:t>
       </w:r>
     </w:p>
-    <w:bookmarkEnd w:id="88"/>
-    <w:bookmarkStart w:id="90" w:name="what-went-wrong"/>
+    <w:bookmarkEnd w:id="93"/>
+    <w:bookmarkStart w:id="95" w:name="what-went-wrong"/>
     <w:p>
       <w:pPr>
         <w:pStyle w:val="Heading2"/>
@@ -12292,7 +15646,7 @@
       <w:r>
         <w:t xml:space="preserve"> </w:t>
       </w:r>
-      <w:hyperlink r:id="rId89">
+      <w:hyperlink r:id="rId94">
         <w:r>
           <w:rPr>
             <w:rStyle w:val="Hyperlink"/>
@@ -12307,8 +15661,8 @@
         <w:t xml:space="preserve">(2026-10-22).</w:t>
       </w:r>
     </w:p>
-    <w:bookmarkEnd w:id="90"/>
-    <w:bookmarkStart w:id="91" w:name="limits-and-what-is-not-done-yet"/>
+    <w:bookmarkEnd w:id="95"/>
+    <w:bookmarkStart w:id="96" w:name="limits-and-what-is-not-done-yet"/>
     <w:p>
       <w:pPr>
         <w:pStyle w:val="Heading2"/>
@@ -12398,7 +15752,19 @@
         <w:t xml:space="preserve"> </w:t>
       </w:r>
       <w:r>
-        <w:t xml:space="preserve">designed, not built.</w:t>
+        <w:t xml:space="preserve">active on E906 (16×64-byte circular DMA ring in SRAM with timeout triggers, toggleable via</w:t>
+      </w:r>
+      <w:r>
+        <w:t xml:space="preserve"> </w:t>
+      </w:r>
+      <w:r>
+        <w:rPr>
+          <w:rStyle w:val="VerbatimChar"/>
+        </w:rPr>
+        <w:t xml:space="preserve">abstractx.uart_dma()</w:t>
+      </w:r>
+      <w:r>
+        <w:t xml:space="preserve">); SPI DMA remains to be connected.</w:t>
       </w:r>
     </w:p>
     <w:p>
@@ -12473,8 +15839,8 @@
         <w:t xml:space="preserve">idle time is shown under the wrong function name.</w:t>
       </w:r>
     </w:p>
-    <w:bookmarkEnd w:id="91"/>
-    <w:bookmarkStart w:id="97" w:name="where-to-go-next"/>
+    <w:bookmarkEnd w:id="96"/>
+    <w:bookmarkStart w:id="102" w:name="where-to-go-next"/>
     <w:p>
       <w:pPr>
         <w:pStyle w:val="Heading2"/>
@@ -12645,7 +16011,7 @@
       <w:r>
         <w:t xml:space="preserve"> </w:t>
       </w:r>
-      <w:hyperlink r:id="rId92">
+      <w:hyperlink r:id="rId97">
         <w:r>
           <w:rPr>
             <w:rStyle w:val="Hyperlink"/>
@@ -12693,7 +16059,7 @@
       <w:r>
         <w:t xml:space="preserve"> </w:t>
       </w:r>
-      <w:hyperlink r:id="rId93">
+      <w:hyperlink r:id="rId98">
         <w:r>
           <w:rPr>
             <w:rStyle w:val="Hyperlink"/>
@@ -12720,7 +16086,7 @@
       <w:r>
         <w:t xml:space="preserve"> </w:t>
       </w:r>
-      <w:hyperlink r:id="rId94">
+      <w:hyperlink r:id="rId99">
         <w:r>
           <w:rPr>
             <w:rStyle w:val="Hyperlink"/>
@@ -12753,7 +16119,7 @@
       <w:r>
         <w:t xml:space="preserve"> </w:t>
       </w:r>
-      <w:hyperlink r:id="rId95">
+      <w:hyperlink r:id="rId100">
         <w:r>
           <w:rPr>
             <w:rStyle w:val="Hyperlink"/>
@@ -12770,7 +16136,7 @@
       <w:r>
         <w:t xml:space="preserve"> </w:t>
       </w:r>
-      <w:hyperlink r:id="rId96">
+      <w:hyperlink r:id="rId101">
         <w:r>
           <w:rPr>
             <w:rStyle w:val="Hyperlink"/>
@@ -12785,8 +16151,8 @@
         <w:t xml:space="preserve">define everything this article describes, and say how each part is tested.</w:t>
       </w:r>
     </w:p>
-    <w:bookmarkEnd w:id="97"/>
-    <w:bookmarkEnd w:id="98"/>
+    <w:bookmarkEnd w:id="102"/>
+    <w:bookmarkEnd w:id="103"/>
     <w:sectPr>
       <w:footnotePr>
         <w:numRestart w:val="eachSect"/>

</xml_diff>

<commit_message>
docs: integrate barectf CTF 1.8 across endpoints, abstractx.trace, and schema decoding
</commit_message>
<xml_diff>
--- a/docs/articles/micropython-on-e906/micropython_on_e906.docx
+++ b/docs/articles/micropython-on-e906/micropython_on_e906.docx
@@ -2778,7 +2778,17 @@
               <w:pStyle w:val="Compact"/>
             </w:pPr>
             <w:r>
-              <w:t xml:space="preserve">One self-describing binary packet (CTF format) per message, written straight into the RPMsg buffer, so the E906 never copies it</w:t>
+              <w:t xml:space="preserve">One self-describing binary packet (</w:t>
+            </w:r>
+            <w:r>
+              <w:rPr>
+                <w:b/>
+                <w:bCs/>
+              </w:rPr>
+              <w:t xml:space="preserve">barectf / CTF 1.8 format</w:t>
+            </w:r>
+            <w:r>
+              <w:t xml:space="preserve">) per message, written straight into the RPMsg buffer, so the E906 never copies it</w:t>
             </w:r>
           </w:p>
         </w:tc>
@@ -4629,31 +4639,7 @@
               <w:rPr>
                 <w:rStyle w:val="VerbatimChar"/>
               </w:rPr>
-              <w:t xml:space="preserve">tlp_send(buf)</w:t>
-            </w:r>
-            <w:r>
-              <w:t xml:space="preserve">,</w:t>
-            </w:r>
-            <w:r>
-              <w:t xml:space="preserve"> </w:t>
-            </w:r>
-            <w:r>
-              <w:rPr>
-                <w:rStyle w:val="VerbatimChar"/>
-              </w:rPr>
-              <w:t xml:space="preserve">trace(...)</w:t>
-            </w:r>
-            <w:r>
-              <w:t xml:space="preserve">,</w:t>
-            </w:r>
-            <w:r>
-              <w:t xml:space="preserve"> </w:t>
-            </w:r>
-            <w:r>
-              <w:rPr>
-                <w:rStyle w:val="VerbatimChar"/>
-              </w:rPr>
-              <w:t xml:space="preserve">console_read([n])</w:t>
+              <w:t xml:space="preserve">trace(task_id, state[, msg])</w:t>
             </w:r>
           </w:p>
         </w:tc>
@@ -4665,7 +4651,48 @@
               <w:jc w:val="left"/>
             </w:pPr>
             <w:r>
-              <w:t xml:space="preserve">Send a 64-byte packet, a trace event, or read the REPL stream from a script</w:t>
+              <w:t xml:space="preserve">Emit a zero-copy barectf CTF 1.8 binary trace event into the trace stream</w:t>
+            </w:r>
+          </w:p>
+        </w:tc>
+      </w:tr>
+      <w:tr>
+        <w:tc>
+          <w:tcPr/>
+          <w:p>
+            <w:pPr>
+              <w:pStyle w:val="Compact"/>
+              <w:jc w:val="left"/>
+            </w:pPr>
+            <w:r>
+              <w:rPr>
+                <w:rStyle w:val="VerbatimChar"/>
+              </w:rPr>
+              <w:t xml:space="preserve">tlp_send(buf)</w:t>
+            </w:r>
+            <w:r>
+              <w:t xml:space="preserve">,</w:t>
+            </w:r>
+            <w:r>
+              <w:t xml:space="preserve"> </w:t>
+            </w:r>
+            <w:r>
+              <w:rPr>
+                <w:rStyle w:val="VerbatimChar"/>
+              </w:rPr>
+              <w:t xml:space="preserve">console_read([n])</w:t>
+            </w:r>
+          </w:p>
+        </w:tc>
+        <w:tc>
+          <w:tcPr/>
+          <w:p>
+            <w:pPr>
+              <w:pStyle w:val="Compact"/>
+              <w:jc w:val="left"/>
+            </w:pPr>
+            <w:r>
+              <w:t xml:space="preserve">Send a 64-byte packet or read the REPL stream from a script</w:t>
             </w:r>
           </w:p>
         </w:tc>
@@ -10529,13 +10556,13 @@
         <w:t xml:space="preserve">.</w:t>
       </w:r>
     </w:p>
-    <w:bookmarkStart w:id="77" w:name="X8089d5b57f000bc6fd1a3883b20ab9c88bd8233"/>
+    <w:bookmarkStart w:id="77" w:name="Xe837956b19a1c66f3682d8fb59296ccbadc7ed3"/>
     <w:p>
       <w:pPr>
         <w:pStyle w:val="Heading4"/>
       </w:pPr>
       <w:r>
-        <w:t xml:space="preserve">1. Dynamic JSON Telemetry Schemas (</w:t>
+        <w:t xml:space="preserve">1. Dynamic barectf &amp; CTF 1.8 Telemetry Schemas (</w:t>
       </w:r>
       <w:r>
         <w:rPr>
@@ -10544,6 +10571,21 @@
         <w:t xml:space="preserve">trace_schema.json</w:t>
       </w:r>
       <w:r>
+        <w:t xml:space="preserve"> </w:t>
+      </w:r>
+      <w:r>
+        <w:t xml:space="preserve">&amp;</w:t>
+      </w:r>
+      <w:r>
+        <w:t xml:space="preserve"> </w:t>
+      </w:r>
+      <w:r>
+        <w:rPr>
+          <w:rStyle w:val="VerbatimChar"/>
+        </w:rPr>
+        <w:t xml:space="preserve">barectf_config.yaml</w:t>
+      </w:r>
+      <w:r>
         <w:t xml:space="preserve">)</w:t>
       </w:r>
     </w:p>
@@ -10552,1865 +10594,7 @@
         <w:pStyle w:val="FirstParagraph"/>
       </w:pPr>
       <w:r>
-        <w:t xml:space="preserve">All telemetry packet formats, sensor channels, and engineering units are declared in external JSON schemas rather than hardcoded in source files:</w:t>
-      </w:r>
-    </w:p>
-    <w:p>
-      <w:pPr>
-        <w:pStyle w:val="SourceCode"/>
-      </w:pPr>
-      <w:r>
-        <w:rPr>
-          <w:rStyle w:val="FunctionTok"/>
-        </w:rPr>
-        <w:t xml:space="preserve">{</w:t>
-      </w:r>
-      <w:r>
-        <w:br/>
-      </w:r>
-      <w:r>
-        <w:rPr>
-          <w:rStyle w:val="NormalTok"/>
-        </w:rPr>
-        <w:t xml:space="preserve">  </w:t>
-      </w:r>
-      <w:r>
-        <w:rPr>
-          <w:rStyle w:val="DataTypeTok"/>
-        </w:rPr>
-        <w:t xml:space="preserve">"application"</w:t>
-      </w:r>
-      <w:r>
-        <w:rPr>
-          <w:rStyle w:val="FunctionTok"/>
-        </w:rPr>
-        <w:t xml:space="preserve">:</w:t>
-      </w:r>
-      <w:r>
-        <w:rPr>
-          <w:rStyle w:val="NormalTok"/>
-        </w:rPr>
-        <w:t xml:space="preserve"> </w:t>
-      </w:r>
-      <w:r>
-        <w:rPr>
-          <w:rStyle w:val="StringTok"/>
-        </w:rPr>
-        <w:t xml:space="preserve">"gps_imu_app"</w:t>
-      </w:r>
-      <w:r>
-        <w:rPr>
-          <w:rStyle w:val="FunctionTok"/>
-        </w:rPr>
-        <w:t xml:space="preserve">,</w:t>
-      </w:r>
-      <w:r>
-        <w:br/>
-      </w:r>
-      <w:r>
-        <w:rPr>
-          <w:rStyle w:val="NormalTok"/>
-        </w:rPr>
-        <w:t xml:space="preserve">  </w:t>
-      </w:r>
-      <w:r>
-        <w:rPr>
-          <w:rStyle w:val="DataTypeTok"/>
-        </w:rPr>
-        <w:t xml:space="preserve">"wire_protocol"</w:t>
-      </w:r>
-      <w:r>
-        <w:rPr>
-          <w:rStyle w:val="FunctionTok"/>
-        </w:rPr>
-        <w:t xml:space="preserve">:</w:t>
-      </w:r>
-      <w:r>
-        <w:rPr>
-          <w:rStyle w:val="NormalTok"/>
-        </w:rPr>
-        <w:t xml:space="preserve"> </w:t>
-      </w:r>
-      <w:r>
-        <w:rPr>
-          <w:rStyle w:val="FunctionTok"/>
-        </w:rPr>
-        <w:t xml:space="preserve">{</w:t>
-      </w:r>
-      <w:r>
-        <w:rPr>
-          <w:rStyle w:val="NormalTok"/>
-        </w:rPr>
-        <w:t xml:space="preserve"> </w:t>
-      </w:r>
-      <w:r>
-        <w:rPr>
-          <w:rStyle w:val="DataTypeTok"/>
-        </w:rPr>
-        <w:t xml:space="preserve">"frame_size_bytes"</w:t>
-      </w:r>
-      <w:r>
-        <w:rPr>
-          <w:rStyle w:val="FunctionTok"/>
-        </w:rPr>
-        <w:t xml:space="preserve">:</w:t>
-      </w:r>
-      <w:r>
-        <w:rPr>
-          <w:rStyle w:val="NormalTok"/>
-        </w:rPr>
-        <w:t xml:space="preserve"> </w:t>
-      </w:r>
-      <w:r>
-        <w:rPr>
-          <w:rStyle w:val="DecValTok"/>
-        </w:rPr>
-        <w:t xml:space="preserve">64</w:t>
-      </w:r>
-      <w:r>
-        <w:rPr>
-          <w:rStyle w:val="FunctionTok"/>
-        </w:rPr>
-        <w:t xml:space="preserve">,</w:t>
-      </w:r>
-      <w:r>
-        <w:rPr>
-          <w:rStyle w:val="NormalTok"/>
-        </w:rPr>
-        <w:t xml:space="preserve"> </w:t>
-      </w:r>
-      <w:r>
-        <w:rPr>
-          <w:rStyle w:val="DataTypeTok"/>
-        </w:rPr>
-        <w:t xml:space="preserve">"header_size_bytes"</w:t>
-      </w:r>
-      <w:r>
-        <w:rPr>
-          <w:rStyle w:val="FunctionTok"/>
-        </w:rPr>
-        <w:t xml:space="preserve">:</w:t>
-      </w:r>
-      <w:r>
-        <w:rPr>
-          <w:rStyle w:val="NormalTok"/>
-        </w:rPr>
-        <w:t xml:space="preserve"> </w:t>
-      </w:r>
-      <w:r>
-        <w:rPr>
-          <w:rStyle w:val="DecValTok"/>
-        </w:rPr>
-        <w:t xml:space="preserve">20</w:t>
-      </w:r>
-      <w:r>
-        <w:rPr>
-          <w:rStyle w:val="FunctionTok"/>
-        </w:rPr>
-        <w:t xml:space="preserve">,</w:t>
-      </w:r>
-      <w:r>
-        <w:rPr>
-          <w:rStyle w:val="NormalTok"/>
-        </w:rPr>
-        <w:t xml:space="preserve"> </w:t>
-      </w:r>
-      <w:r>
-        <w:rPr>
-          <w:rStyle w:val="DataTypeTok"/>
-        </w:rPr>
-        <w:t xml:space="preserve">"payload_size_bytes"</w:t>
-      </w:r>
-      <w:r>
-        <w:rPr>
-          <w:rStyle w:val="FunctionTok"/>
-        </w:rPr>
-        <w:t xml:space="preserve">:</w:t>
-      </w:r>
-      <w:r>
-        <w:rPr>
-          <w:rStyle w:val="NormalTok"/>
-        </w:rPr>
-        <w:t xml:space="preserve"> </w:t>
-      </w:r>
-      <w:r>
-        <w:rPr>
-          <w:rStyle w:val="DecValTok"/>
-        </w:rPr>
-        <w:t xml:space="preserve">40</w:t>
-      </w:r>
-      <w:r>
-        <w:rPr>
-          <w:rStyle w:val="NormalTok"/>
-        </w:rPr>
-        <w:t xml:space="preserve"> </w:t>
-      </w:r>
-      <w:r>
-        <w:rPr>
-          <w:rStyle w:val="FunctionTok"/>
-        </w:rPr>
-        <w:t xml:space="preserve">},</w:t>
-      </w:r>
-      <w:r>
-        <w:br/>
-      </w:r>
-      <w:r>
-        <w:rPr>
-          <w:rStyle w:val="NormalTok"/>
-        </w:rPr>
-        <w:t xml:space="preserve">  </w:t>
-      </w:r>
-      <w:r>
-        <w:rPr>
-          <w:rStyle w:val="DataTypeTok"/>
-        </w:rPr>
-        <w:t xml:space="preserve">"streams"</w:t>
-      </w:r>
-      <w:r>
-        <w:rPr>
-          <w:rStyle w:val="FunctionTok"/>
-        </w:rPr>
-        <w:t xml:space="preserve">:</w:t>
-      </w:r>
-      <w:r>
-        <w:rPr>
-          <w:rStyle w:val="NormalTok"/>
-        </w:rPr>
-        <w:t xml:space="preserve"> </w:t>
-      </w:r>
-      <w:r>
-        <w:rPr>
-          <w:rStyle w:val="FunctionTok"/>
-        </w:rPr>
-        <w:t xml:space="preserve">{</w:t>
-      </w:r>
-      <w:r>
-        <w:br/>
-      </w:r>
-      <w:r>
-        <w:rPr>
-          <w:rStyle w:val="NormalTok"/>
-        </w:rPr>
-        <w:t xml:space="preserve">    </w:t>
-      </w:r>
-      <w:r>
-        <w:rPr>
-          <w:rStyle w:val="DataTypeTok"/>
-        </w:rPr>
-        <w:t xml:space="preserve">"1"</w:t>
-      </w:r>
-      <w:r>
-        <w:rPr>
-          <w:rStyle w:val="FunctionTok"/>
-        </w:rPr>
-        <w:t xml:space="preserve">:</w:t>
-      </w:r>
-      <w:r>
-        <w:rPr>
-          <w:rStyle w:val="NormalTok"/>
-        </w:rPr>
-        <w:t xml:space="preserve"> </w:t>
-      </w:r>
-      <w:r>
-        <w:rPr>
-          <w:rStyle w:val="FunctionTok"/>
-        </w:rPr>
-        <w:t xml:space="preserve">{</w:t>
-      </w:r>
-      <w:r>
-        <w:br/>
-      </w:r>
-      <w:r>
-        <w:rPr>
-          <w:rStyle w:val="NormalTok"/>
-        </w:rPr>
-        <w:t xml:space="preserve">      </w:t>
-      </w:r>
-      <w:r>
-        <w:rPr>
-          <w:rStyle w:val="DataTypeTok"/>
-        </w:rPr>
-        <w:t xml:space="preserve">"name"</w:t>
-      </w:r>
-      <w:r>
-        <w:rPr>
-          <w:rStyle w:val="FunctionTok"/>
-        </w:rPr>
-        <w:t xml:space="preserve">:</w:t>
-      </w:r>
-      <w:r>
-        <w:rPr>
-          <w:rStyle w:val="NormalTok"/>
-        </w:rPr>
-        <w:t xml:space="preserve"> </w:t>
-      </w:r>
-      <w:r>
-        <w:rPr>
-          <w:rStyle w:val="StringTok"/>
-        </w:rPr>
-        <w:t xml:space="preserve">"telemetry"</w:t>
-      </w:r>
-      <w:r>
-        <w:rPr>
-          <w:rStyle w:val="FunctionTok"/>
-        </w:rPr>
-        <w:t xml:space="preserve">,</w:t>
-      </w:r>
-      <w:r>
-        <w:br/>
-      </w:r>
-      <w:r>
-        <w:rPr>
-          <w:rStyle w:val="NormalTok"/>
-        </w:rPr>
-        <w:t xml:space="preserve">      </w:t>
-      </w:r>
-      <w:r>
-        <w:rPr>
-          <w:rStyle w:val="DataTypeTok"/>
-        </w:rPr>
-        <w:t xml:space="preserve">"events"</w:t>
-      </w:r>
-      <w:r>
-        <w:rPr>
-          <w:rStyle w:val="FunctionTok"/>
-        </w:rPr>
-        <w:t xml:space="preserve">:</w:t>
-      </w:r>
-      <w:r>
-        <w:rPr>
-          <w:rStyle w:val="NormalTok"/>
-        </w:rPr>
-        <w:t xml:space="preserve"> </w:t>
-      </w:r>
-      <w:r>
-        <w:rPr>
-          <w:rStyle w:val="FunctionTok"/>
-        </w:rPr>
-        <w:t xml:space="preserve">{</w:t>
-      </w:r>
-      <w:r>
-        <w:br/>
-      </w:r>
-      <w:r>
-        <w:rPr>
-          <w:rStyle w:val="NormalTok"/>
-        </w:rPr>
-        <w:t xml:space="preserve">        </w:t>
-      </w:r>
-      <w:r>
-        <w:rPr>
-          <w:rStyle w:val="DataTypeTok"/>
-        </w:rPr>
-        <w:t xml:space="preserve">"1"</w:t>
-      </w:r>
-      <w:r>
-        <w:rPr>
-          <w:rStyle w:val="FunctionTok"/>
-        </w:rPr>
-        <w:t xml:space="preserve">:</w:t>
-      </w:r>
-      <w:r>
-        <w:rPr>
-          <w:rStyle w:val="NormalTok"/>
-        </w:rPr>
-        <w:t xml:space="preserve"> </w:t>
-      </w:r>
-      <w:r>
-        <w:rPr>
-          <w:rStyle w:val="FunctionTok"/>
-        </w:rPr>
-        <w:t xml:space="preserve">{</w:t>
-      </w:r>
-      <w:r>
-        <w:br/>
-      </w:r>
-      <w:r>
-        <w:rPr>
-          <w:rStyle w:val="NormalTok"/>
-        </w:rPr>
-        <w:t xml:space="preserve">          </w:t>
-      </w:r>
-      <w:r>
-        <w:rPr>
-          <w:rStyle w:val="DataTypeTok"/>
-        </w:rPr>
-        <w:t xml:space="preserve">"name"</w:t>
-      </w:r>
-      <w:r>
-        <w:rPr>
-          <w:rStyle w:val="FunctionTok"/>
-        </w:rPr>
-        <w:t xml:space="preserve">:</w:t>
-      </w:r>
-      <w:r>
-        <w:rPr>
-          <w:rStyle w:val="NormalTok"/>
-        </w:rPr>
-        <w:t xml:space="preserve"> </w:t>
-      </w:r>
-      <w:r>
-        <w:rPr>
-          <w:rStyle w:val="StringTok"/>
-        </w:rPr>
-        <w:t xml:space="preserve">"imu_sample"</w:t>
-      </w:r>
-      <w:r>
-        <w:rPr>
-          <w:rStyle w:val="FunctionTok"/>
-        </w:rPr>
-        <w:t xml:space="preserve">,</w:t>
-      </w:r>
-      <w:r>
-        <w:br/>
-      </w:r>
-      <w:r>
-        <w:rPr>
-          <w:rStyle w:val="NormalTok"/>
-        </w:rPr>
-        <w:t xml:space="preserve">          </w:t>
-      </w:r>
-      <w:r>
-        <w:rPr>
-          <w:rStyle w:val="DataTypeTok"/>
-        </w:rPr>
-        <w:t xml:space="preserve">"rate_hz"</w:t>
-      </w:r>
-      <w:r>
-        <w:rPr>
-          <w:rStyle w:val="FunctionTok"/>
-        </w:rPr>
-        <w:t xml:space="preserve">:</w:t>
-      </w:r>
-      <w:r>
-        <w:rPr>
-          <w:rStyle w:val="NormalTok"/>
-        </w:rPr>
-        <w:t xml:space="preserve"> </w:t>
-      </w:r>
-      <w:r>
-        <w:rPr>
-          <w:rStyle w:val="DecValTok"/>
-        </w:rPr>
-        <w:t xml:space="preserve">8000</w:t>
-      </w:r>
-      <w:r>
-        <w:rPr>
-          <w:rStyle w:val="FunctionTok"/>
-        </w:rPr>
-        <w:t xml:space="preserve">,</w:t>
-      </w:r>
-      <w:r>
-        <w:br/>
-      </w:r>
-      <w:r>
-        <w:rPr>
-          <w:rStyle w:val="NormalTok"/>
-        </w:rPr>
-        <w:t xml:space="preserve">          </w:t>
-      </w:r>
-      <w:r>
-        <w:rPr>
-          <w:rStyle w:val="DataTypeTok"/>
-        </w:rPr>
-        <w:t xml:space="preserve">"source_device"</w:t>
-      </w:r>
-      <w:r>
-        <w:rPr>
-          <w:rStyle w:val="FunctionTok"/>
-        </w:rPr>
-        <w:t xml:space="preserve">:</w:t>
-      </w:r>
-      <w:r>
-        <w:rPr>
-          <w:rStyle w:val="NormalTok"/>
-        </w:rPr>
-        <w:t xml:space="preserve"> </w:t>
-      </w:r>
-      <w:r>
-        <w:rPr>
-          <w:rStyle w:val="StringTok"/>
-        </w:rPr>
-        <w:t xml:space="preserve">"ICM-42688-P (SPI1)"</w:t>
-      </w:r>
-      <w:r>
-        <w:rPr>
-          <w:rStyle w:val="FunctionTok"/>
-        </w:rPr>
-        <w:t xml:space="preserve">,</w:t>
-      </w:r>
-      <w:r>
-        <w:br/>
-      </w:r>
-      <w:r>
-        <w:rPr>
-          <w:rStyle w:val="NormalTok"/>
-        </w:rPr>
-        <w:t xml:space="preserve">          </w:t>
-      </w:r>
-      <w:r>
-        <w:rPr>
-          <w:rStyle w:val="DataTypeTok"/>
-        </w:rPr>
-        <w:t xml:space="preserve">"unpack_format"</w:t>
-      </w:r>
-      <w:r>
-        <w:rPr>
-          <w:rStyle w:val="FunctionTok"/>
-        </w:rPr>
-        <w:t xml:space="preserve">:</w:t>
-      </w:r>
-      <w:r>
-        <w:rPr>
-          <w:rStyle w:val="NormalTok"/>
-        </w:rPr>
-        <w:t xml:space="preserve"> </w:t>
-      </w:r>
-      <w:r>
-        <w:rPr>
-          <w:rStyle w:val="StringTok"/>
-        </w:rPr>
-        <w:t xml:space="preserve">"&lt;i6h"</w:t>
-      </w:r>
-      <w:r>
-        <w:rPr>
-          <w:rStyle w:val="FunctionTok"/>
-        </w:rPr>
-        <w:t xml:space="preserve">,</w:t>
-      </w:r>
-      <w:r>
-        <w:br/>
-      </w:r>
-      <w:r>
-        <w:rPr>
-          <w:rStyle w:val="NormalTok"/>
-        </w:rPr>
-        <w:t xml:space="preserve">          </w:t>
-      </w:r>
-      <w:r>
-        <w:rPr>
-          <w:rStyle w:val="DataTypeTok"/>
-        </w:rPr>
-        <w:t xml:space="preserve">"fields"</w:t>
-      </w:r>
-      <w:r>
-        <w:rPr>
-          <w:rStyle w:val="FunctionTok"/>
-        </w:rPr>
-        <w:t xml:space="preserve">:</w:t>
-      </w:r>
-      <w:r>
-        <w:rPr>
-          <w:rStyle w:val="NormalTok"/>
-        </w:rPr>
-        <w:t xml:space="preserve"> </w:t>
-      </w:r>
-      <w:r>
-        <w:rPr>
-          <w:rStyle w:val="OtherTok"/>
-        </w:rPr>
-        <w:t xml:space="preserve">[</w:t>
-      </w:r>
-      <w:r>
-        <w:br/>
-      </w:r>
-      <w:r>
-        <w:rPr>
-          <w:rStyle w:val="NormalTok"/>
-        </w:rPr>
-        <w:t xml:space="preserve">            </w:t>
-      </w:r>
-      <w:r>
-        <w:rPr>
-          <w:rStyle w:val="FunctionTok"/>
-        </w:rPr>
-        <w:t xml:space="preserve">{</w:t>
-      </w:r>
-      <w:r>
-        <w:rPr>
-          <w:rStyle w:val="NormalTok"/>
-        </w:rPr>
-        <w:t xml:space="preserve"> </w:t>
-      </w:r>
-      <w:r>
-        <w:rPr>
-          <w:rStyle w:val="DataTypeTok"/>
-        </w:rPr>
-        <w:t xml:space="preserve">"name"</w:t>
-      </w:r>
-      <w:r>
-        <w:rPr>
-          <w:rStyle w:val="FunctionTok"/>
-        </w:rPr>
-        <w:t xml:space="preserve">:</w:t>
-      </w:r>
-      <w:r>
-        <w:rPr>
-          <w:rStyle w:val="NormalTok"/>
-        </w:rPr>
-        <w:t xml:space="preserve"> </w:t>
-      </w:r>
-      <w:r>
-        <w:rPr>
-          <w:rStyle w:val="StringTok"/>
-        </w:rPr>
-        <w:t xml:space="preserve">"sample_seq"</w:t>
-      </w:r>
-      <w:r>
-        <w:rPr>
-          <w:rStyle w:val="FunctionTok"/>
-        </w:rPr>
-        <w:t xml:space="preserve">,</w:t>
-      </w:r>
-      <w:r>
-        <w:rPr>
-          <w:rStyle w:val="NormalTok"/>
-        </w:rPr>
-        <w:t xml:space="preserve"> </w:t>
-      </w:r>
-      <w:r>
-        <w:rPr>
-          <w:rStyle w:val="DataTypeTok"/>
-        </w:rPr>
-        <w:t xml:space="preserve">"type"</w:t>
-      </w:r>
-      <w:r>
-        <w:rPr>
-          <w:rStyle w:val="FunctionTok"/>
-        </w:rPr>
-        <w:t xml:space="preserve">:</w:t>
-      </w:r>
-      <w:r>
-        <w:rPr>
-          <w:rStyle w:val="NormalTok"/>
-        </w:rPr>
-        <w:t xml:space="preserve"> </w:t>
-      </w:r>
-      <w:r>
-        <w:rPr>
-          <w:rStyle w:val="StringTok"/>
-        </w:rPr>
-        <w:t xml:space="preserve">"int32"</w:t>
-      </w:r>
-      <w:r>
-        <w:rPr>
-          <w:rStyle w:val="FunctionTok"/>
-        </w:rPr>
-        <w:t xml:space="preserve">,</w:t>
-      </w:r>
-      <w:r>
-        <w:rPr>
-          <w:rStyle w:val="NormalTok"/>
-        </w:rPr>
-        <w:t xml:space="preserve"> </w:t>
-      </w:r>
-      <w:r>
-        <w:rPr>
-          <w:rStyle w:val="DataTypeTok"/>
-        </w:rPr>
-        <w:t xml:space="preserve">"scale"</w:t>
-      </w:r>
-      <w:r>
-        <w:rPr>
-          <w:rStyle w:val="FunctionTok"/>
-        </w:rPr>
-        <w:t xml:space="preserve">:</w:t>
-      </w:r>
-      <w:r>
-        <w:rPr>
-          <w:rStyle w:val="NormalTok"/>
-        </w:rPr>
-        <w:t xml:space="preserve"> </w:t>
-      </w:r>
-      <w:r>
-        <w:rPr>
-          <w:rStyle w:val="FloatTok"/>
-        </w:rPr>
-        <w:t xml:space="preserve">1.0</w:t>
-      </w:r>
-      <w:r>
-        <w:rPr>
-          <w:rStyle w:val="FunctionTok"/>
-        </w:rPr>
-        <w:t xml:space="preserve">,</w:t>
-      </w:r>
-      <w:r>
-        <w:rPr>
-          <w:rStyle w:val="NormalTok"/>
-        </w:rPr>
-        <w:t xml:space="preserve"> </w:t>
-      </w:r>
-      <w:r>
-        <w:rPr>
-          <w:rStyle w:val="DataTypeTok"/>
-        </w:rPr>
-        <w:t xml:space="preserve">"display_name"</w:t>
-      </w:r>
-      <w:r>
-        <w:rPr>
-          <w:rStyle w:val="FunctionTok"/>
-        </w:rPr>
-        <w:t xml:space="preserve">:</w:t>
-      </w:r>
-      <w:r>
-        <w:rPr>
-          <w:rStyle w:val="NormalTok"/>
-        </w:rPr>
-        <w:t xml:space="preserve"> </w:t>
-      </w:r>
-      <w:r>
-        <w:rPr>
-          <w:rStyle w:val="StringTok"/>
-        </w:rPr>
-        <w:t xml:space="preserve">"Sequence"</w:t>
-      </w:r>
-      <w:r>
-        <w:rPr>
-          <w:rStyle w:val="NormalTok"/>
-        </w:rPr>
-        <w:t xml:space="preserve"> </w:t>
-      </w:r>
-      <w:r>
-        <w:rPr>
-          <w:rStyle w:val="FunctionTok"/>
-        </w:rPr>
-        <w:t xml:space="preserve">}</w:t>
-      </w:r>
-      <w:r>
-        <w:rPr>
-          <w:rStyle w:val="OtherTok"/>
-        </w:rPr>
-        <w:t xml:space="preserve">,</w:t>
-      </w:r>
-      <w:r>
-        <w:br/>
-      </w:r>
-      <w:r>
-        <w:rPr>
-          <w:rStyle w:val="NormalTok"/>
-        </w:rPr>
-        <w:t xml:space="preserve">            </w:t>
-      </w:r>
-      <w:r>
-        <w:rPr>
-          <w:rStyle w:val="FunctionTok"/>
-        </w:rPr>
-        <w:t xml:space="preserve">{</w:t>
-      </w:r>
-      <w:r>
-        <w:rPr>
-          <w:rStyle w:val="NormalTok"/>
-        </w:rPr>
-        <w:t xml:space="preserve"> </w:t>
-      </w:r>
-      <w:r>
-        <w:rPr>
-          <w:rStyle w:val="DataTypeTok"/>
-        </w:rPr>
-        <w:t xml:space="preserve">"name"</w:t>
-      </w:r>
-      <w:r>
-        <w:rPr>
-          <w:rStyle w:val="FunctionTok"/>
-        </w:rPr>
-        <w:t xml:space="preserve">:</w:t>
-      </w:r>
-      <w:r>
-        <w:rPr>
-          <w:rStyle w:val="NormalTok"/>
-        </w:rPr>
-        <w:t xml:space="preserve"> </w:t>
-      </w:r>
-      <w:r>
-        <w:rPr>
-          <w:rStyle w:val="StringTok"/>
-        </w:rPr>
-        <w:t xml:space="preserve">"accel_x_mg"</w:t>
-      </w:r>
-      <w:r>
-        <w:rPr>
-          <w:rStyle w:val="FunctionTok"/>
-        </w:rPr>
-        <w:t xml:space="preserve">,</w:t>
-      </w:r>
-      <w:r>
-        <w:rPr>
-          <w:rStyle w:val="NormalTok"/>
-        </w:rPr>
-        <w:t xml:space="preserve"> </w:t>
-      </w:r>
-      <w:r>
-        <w:rPr>
-          <w:rStyle w:val="DataTypeTok"/>
-        </w:rPr>
-        <w:t xml:space="preserve">"type"</w:t>
-      </w:r>
-      <w:r>
-        <w:rPr>
-          <w:rStyle w:val="FunctionTok"/>
-        </w:rPr>
-        <w:t xml:space="preserve">:</w:t>
-      </w:r>
-      <w:r>
-        <w:rPr>
-          <w:rStyle w:val="NormalTok"/>
-        </w:rPr>
-        <w:t xml:space="preserve"> </w:t>
-      </w:r>
-      <w:r>
-        <w:rPr>
-          <w:rStyle w:val="StringTok"/>
-        </w:rPr>
-        <w:t xml:space="preserve">"int16"</w:t>
-      </w:r>
-      <w:r>
-        <w:rPr>
-          <w:rStyle w:val="FunctionTok"/>
-        </w:rPr>
-        <w:t xml:space="preserve">,</w:t>
-      </w:r>
-      <w:r>
-        <w:rPr>
-          <w:rStyle w:val="NormalTok"/>
-        </w:rPr>
-        <w:t xml:space="preserve"> </w:t>
-      </w:r>
-      <w:r>
-        <w:rPr>
-          <w:rStyle w:val="DataTypeTok"/>
-        </w:rPr>
-        <w:t xml:space="preserve">"unit"</w:t>
-      </w:r>
-      <w:r>
-        <w:rPr>
-          <w:rStyle w:val="FunctionTok"/>
-        </w:rPr>
-        <w:t xml:space="preserve">:</w:t>
-      </w:r>
-      <w:r>
-        <w:rPr>
-          <w:rStyle w:val="NormalTok"/>
-        </w:rPr>
-        <w:t xml:space="preserve"> </w:t>
-      </w:r>
-      <w:r>
-        <w:rPr>
-          <w:rStyle w:val="StringTok"/>
-        </w:rPr>
-        <w:t xml:space="preserve">"g"</w:t>
-      </w:r>
-      <w:r>
-        <w:rPr>
-          <w:rStyle w:val="FunctionTok"/>
-        </w:rPr>
-        <w:t xml:space="preserve">,</w:t>
-      </w:r>
-      <w:r>
-        <w:rPr>
-          <w:rStyle w:val="NormalTok"/>
-        </w:rPr>
-        <w:t xml:space="preserve"> </w:t>
-      </w:r>
-      <w:r>
-        <w:rPr>
-          <w:rStyle w:val="DataTypeTok"/>
-        </w:rPr>
-        <w:t xml:space="preserve">"scale"</w:t>
-      </w:r>
-      <w:r>
-        <w:rPr>
-          <w:rStyle w:val="FunctionTok"/>
-        </w:rPr>
-        <w:t xml:space="preserve">:</w:t>
-      </w:r>
-      <w:r>
-        <w:rPr>
-          <w:rStyle w:val="NormalTok"/>
-        </w:rPr>
-        <w:t xml:space="preserve"> </w:t>
-      </w:r>
-      <w:r>
-        <w:rPr>
-          <w:rStyle w:val="FloatTok"/>
-        </w:rPr>
-        <w:t xml:space="preserve">0.001</w:t>
-      </w:r>
-      <w:r>
-        <w:rPr>
-          <w:rStyle w:val="FunctionTok"/>
-        </w:rPr>
-        <w:t xml:space="preserve">,</w:t>
-      </w:r>
-      <w:r>
-        <w:rPr>
-          <w:rStyle w:val="NormalTok"/>
-        </w:rPr>
-        <w:t xml:space="preserve"> </w:t>
-      </w:r>
-      <w:r>
-        <w:rPr>
-          <w:rStyle w:val="DataTypeTok"/>
-        </w:rPr>
-        <w:t xml:space="preserve">"widget"</w:t>
-      </w:r>
-      <w:r>
-        <w:rPr>
-          <w:rStyle w:val="FunctionTok"/>
-        </w:rPr>
-        <w:t xml:space="preserve">:</w:t>
-      </w:r>
-      <w:r>
-        <w:rPr>
-          <w:rStyle w:val="NormalTok"/>
-        </w:rPr>
-        <w:t xml:space="preserve"> </w:t>
-      </w:r>
-      <w:r>
-        <w:rPr>
-          <w:rStyle w:val="StringTok"/>
-        </w:rPr>
-        <w:t xml:space="preserve">"oscilloscope"</w:t>
-      </w:r>
-      <w:r>
-        <w:rPr>
-          <w:rStyle w:val="NormalTok"/>
-        </w:rPr>
-        <w:t xml:space="preserve"> </w:t>
-      </w:r>
-      <w:r>
-        <w:rPr>
-          <w:rStyle w:val="FunctionTok"/>
-        </w:rPr>
-        <w:t xml:space="preserve">}</w:t>
-      </w:r>
-      <w:r>
-        <w:rPr>
-          <w:rStyle w:val="OtherTok"/>
-        </w:rPr>
-        <w:t xml:space="preserve">,</w:t>
-      </w:r>
-      <w:r>
-        <w:br/>
-      </w:r>
-      <w:r>
-        <w:rPr>
-          <w:rStyle w:val="NormalTok"/>
-        </w:rPr>
-        <w:t xml:space="preserve">            </w:t>
-      </w:r>
-      <w:r>
-        <w:rPr>
-          <w:rStyle w:val="FunctionTok"/>
-        </w:rPr>
-        <w:t xml:space="preserve">{</w:t>
-      </w:r>
-      <w:r>
-        <w:rPr>
-          <w:rStyle w:val="NormalTok"/>
-        </w:rPr>
-        <w:t xml:space="preserve"> </w:t>
-      </w:r>
-      <w:r>
-        <w:rPr>
-          <w:rStyle w:val="DataTypeTok"/>
-        </w:rPr>
-        <w:t xml:space="preserve">"name"</w:t>
-      </w:r>
-      <w:r>
-        <w:rPr>
-          <w:rStyle w:val="FunctionTok"/>
-        </w:rPr>
-        <w:t xml:space="preserve">:</w:t>
-      </w:r>
-      <w:r>
-        <w:rPr>
-          <w:rStyle w:val="NormalTok"/>
-        </w:rPr>
-        <w:t xml:space="preserve"> </w:t>
-      </w:r>
-      <w:r>
-        <w:rPr>
-          <w:rStyle w:val="StringTok"/>
-        </w:rPr>
-        <w:t xml:space="preserve">"gyro_z_dps"</w:t>
-      </w:r>
-      <w:r>
-        <w:rPr>
-          <w:rStyle w:val="FunctionTok"/>
-        </w:rPr>
-        <w:t xml:space="preserve">,</w:t>
-      </w:r>
-      <w:r>
-        <w:rPr>
-          <w:rStyle w:val="NormalTok"/>
-        </w:rPr>
-        <w:t xml:space="preserve"> </w:t>
-      </w:r>
-      <w:r>
-        <w:rPr>
-          <w:rStyle w:val="DataTypeTok"/>
-        </w:rPr>
-        <w:t xml:space="preserve">"type"</w:t>
-      </w:r>
-      <w:r>
-        <w:rPr>
-          <w:rStyle w:val="FunctionTok"/>
-        </w:rPr>
-        <w:t xml:space="preserve">:</w:t>
-      </w:r>
-      <w:r>
-        <w:rPr>
-          <w:rStyle w:val="NormalTok"/>
-        </w:rPr>
-        <w:t xml:space="preserve"> </w:t>
-      </w:r>
-      <w:r>
-        <w:rPr>
-          <w:rStyle w:val="StringTok"/>
-        </w:rPr>
-        <w:t xml:space="preserve">"int16"</w:t>
-      </w:r>
-      <w:r>
-        <w:rPr>
-          <w:rStyle w:val="FunctionTok"/>
-        </w:rPr>
-        <w:t xml:space="preserve">,</w:t>
-      </w:r>
-      <w:r>
-        <w:rPr>
-          <w:rStyle w:val="NormalTok"/>
-        </w:rPr>
-        <w:t xml:space="preserve"> </w:t>
-      </w:r>
-      <w:r>
-        <w:rPr>
-          <w:rStyle w:val="DataTypeTok"/>
-        </w:rPr>
-        <w:t xml:space="preserve">"unit"</w:t>
-      </w:r>
-      <w:r>
-        <w:rPr>
-          <w:rStyle w:val="FunctionTok"/>
-        </w:rPr>
-        <w:t xml:space="preserve">:</w:t>
-      </w:r>
-      <w:r>
-        <w:rPr>
-          <w:rStyle w:val="NormalTok"/>
-        </w:rPr>
-        <w:t xml:space="preserve"> </w:t>
-      </w:r>
-      <w:r>
-        <w:rPr>
-          <w:rStyle w:val="StringTok"/>
-        </w:rPr>
-        <w:t xml:space="preserve">"deg/s"</w:t>
-      </w:r>
-      <w:r>
-        <w:rPr>
-          <w:rStyle w:val="FunctionTok"/>
-        </w:rPr>
-        <w:t xml:space="preserve">,</w:t>
-      </w:r>
-      <w:r>
-        <w:rPr>
-          <w:rStyle w:val="NormalTok"/>
-        </w:rPr>
-        <w:t xml:space="preserve"> </w:t>
-      </w:r>
-      <w:r>
-        <w:rPr>
-          <w:rStyle w:val="DataTypeTok"/>
-        </w:rPr>
-        <w:t xml:space="preserve">"scale"</w:t>
-      </w:r>
-      <w:r>
-        <w:rPr>
-          <w:rStyle w:val="FunctionTok"/>
-        </w:rPr>
-        <w:t xml:space="preserve">:</w:t>
-      </w:r>
-      <w:r>
-        <w:rPr>
-          <w:rStyle w:val="NormalTok"/>
-        </w:rPr>
-        <w:t xml:space="preserve"> </w:t>
-      </w:r>
-      <w:r>
-        <w:rPr>
-          <w:rStyle w:val="FloatTok"/>
-        </w:rPr>
-        <w:t xml:space="preserve">0.1</w:t>
-      </w:r>
-      <w:r>
-        <w:rPr>
-          <w:rStyle w:val="FunctionTok"/>
-        </w:rPr>
-        <w:t xml:space="preserve">,</w:t>
-      </w:r>
-      <w:r>
-        <w:rPr>
-          <w:rStyle w:val="NormalTok"/>
-        </w:rPr>
-        <w:t xml:space="preserve"> </w:t>
-      </w:r>
-      <w:r>
-        <w:rPr>
-          <w:rStyle w:val="DataTypeTok"/>
-        </w:rPr>
-        <w:t xml:space="preserve">"widget"</w:t>
-      </w:r>
-      <w:r>
-        <w:rPr>
-          <w:rStyle w:val="FunctionTok"/>
-        </w:rPr>
-        <w:t xml:space="preserve">:</w:t>
-      </w:r>
-      <w:r>
-        <w:rPr>
-          <w:rStyle w:val="NormalTok"/>
-        </w:rPr>
-        <w:t xml:space="preserve"> </w:t>
-      </w:r>
-      <w:r>
-        <w:rPr>
-          <w:rStyle w:val="StringTok"/>
-        </w:rPr>
-        <w:t xml:space="preserve">"oscilloscope"</w:t>
-      </w:r>
-      <w:r>
-        <w:rPr>
-          <w:rStyle w:val="NormalTok"/>
-        </w:rPr>
-        <w:t xml:space="preserve"> </w:t>
-      </w:r>
-      <w:r>
-        <w:rPr>
-          <w:rStyle w:val="FunctionTok"/>
-        </w:rPr>
-        <w:t xml:space="preserve">}</w:t>
-      </w:r>
-      <w:r>
-        <w:br/>
-      </w:r>
-      <w:r>
-        <w:rPr>
-          <w:rStyle w:val="NormalTok"/>
-        </w:rPr>
-        <w:t xml:space="preserve">          </w:t>
-      </w:r>
-      <w:r>
-        <w:rPr>
-          <w:rStyle w:val="OtherTok"/>
-        </w:rPr>
-        <w:t xml:space="preserve">]</w:t>
-      </w:r>
-      <w:r>
-        <w:br/>
-      </w:r>
-      <w:r>
-        <w:rPr>
-          <w:rStyle w:val="NormalTok"/>
-        </w:rPr>
-        <w:t xml:space="preserve">        </w:t>
-      </w:r>
-      <w:r>
-        <w:rPr>
-          <w:rStyle w:val="FunctionTok"/>
-        </w:rPr>
-        <w:t xml:space="preserve">},</w:t>
-      </w:r>
-      <w:r>
-        <w:br/>
-      </w:r>
-      <w:r>
-        <w:rPr>
-          <w:rStyle w:val="NormalTok"/>
-        </w:rPr>
-        <w:t xml:space="preserve">        </w:t>
-      </w:r>
-      <w:r>
-        <w:rPr>
-          <w:rStyle w:val="DataTypeTok"/>
-        </w:rPr>
-        <w:t xml:space="preserve">"2"</w:t>
-      </w:r>
-      <w:r>
-        <w:rPr>
-          <w:rStyle w:val="FunctionTok"/>
-        </w:rPr>
-        <w:t xml:space="preserve">:</w:t>
-      </w:r>
-      <w:r>
-        <w:rPr>
-          <w:rStyle w:val="NormalTok"/>
-        </w:rPr>
-        <w:t xml:space="preserve"> </w:t>
-      </w:r>
-      <w:r>
-        <w:rPr>
-          <w:rStyle w:val="FunctionTok"/>
-        </w:rPr>
-        <w:t xml:space="preserve">{</w:t>
-      </w:r>
-      <w:r>
-        <w:br/>
-      </w:r>
-      <w:r>
-        <w:rPr>
-          <w:rStyle w:val="NormalTok"/>
-        </w:rPr>
-        <w:t xml:space="preserve">          </w:t>
-      </w:r>
-      <w:r>
-        <w:rPr>
-          <w:rStyle w:val="DataTypeTok"/>
-        </w:rPr>
-        <w:t xml:space="preserve">"name"</w:t>
-      </w:r>
-      <w:r>
-        <w:rPr>
-          <w:rStyle w:val="FunctionTok"/>
-        </w:rPr>
-        <w:t xml:space="preserve">:</w:t>
-      </w:r>
-      <w:r>
-        <w:rPr>
-          <w:rStyle w:val="NormalTok"/>
-        </w:rPr>
-        <w:t xml:space="preserve"> </w:t>
-      </w:r>
-      <w:r>
-        <w:rPr>
-          <w:rStyle w:val="StringTok"/>
-        </w:rPr>
-        <w:t xml:space="preserve">"mag_sample"</w:t>
-      </w:r>
-      <w:r>
-        <w:rPr>
-          <w:rStyle w:val="FunctionTok"/>
-        </w:rPr>
-        <w:t xml:space="preserve">,</w:t>
-      </w:r>
-      <w:r>
-        <w:br/>
-      </w:r>
-      <w:r>
-        <w:rPr>
-          <w:rStyle w:val="NormalTok"/>
-        </w:rPr>
-        <w:t xml:space="preserve">          </w:t>
-      </w:r>
-      <w:r>
-        <w:rPr>
-          <w:rStyle w:val="DataTypeTok"/>
-        </w:rPr>
-        <w:t xml:space="preserve">"rate_hz"</w:t>
-      </w:r>
-      <w:r>
-        <w:rPr>
-          <w:rStyle w:val="FunctionTok"/>
-        </w:rPr>
-        <w:t xml:space="preserve">:</w:t>
-      </w:r>
-      <w:r>
-        <w:rPr>
-          <w:rStyle w:val="NormalTok"/>
-        </w:rPr>
-        <w:t xml:space="preserve"> </w:t>
-      </w:r>
-      <w:r>
-        <w:rPr>
-          <w:rStyle w:val="DecValTok"/>
-        </w:rPr>
-        <w:t xml:space="preserve">50</w:t>
-      </w:r>
-      <w:r>
-        <w:rPr>
-          <w:rStyle w:val="FunctionTok"/>
-        </w:rPr>
-        <w:t xml:space="preserve">,</w:t>
-      </w:r>
-      <w:r>
-        <w:br/>
-      </w:r>
-      <w:r>
-        <w:rPr>
-          <w:rStyle w:val="NormalTok"/>
-        </w:rPr>
-        <w:t xml:space="preserve">          </w:t>
-      </w:r>
-      <w:r>
-        <w:rPr>
-          <w:rStyle w:val="DataTypeTok"/>
-        </w:rPr>
-        <w:t xml:space="preserve">"source_device"</w:t>
-      </w:r>
-      <w:r>
-        <w:rPr>
-          <w:rStyle w:val="FunctionTok"/>
-        </w:rPr>
-        <w:t xml:space="preserve">:</w:t>
-      </w:r>
-      <w:r>
-        <w:rPr>
-          <w:rStyle w:val="NormalTok"/>
-        </w:rPr>
-        <w:t xml:space="preserve"> </w:t>
-      </w:r>
-      <w:r>
-        <w:rPr>
-          <w:rStyle w:val="StringTok"/>
-        </w:rPr>
-        <w:t xml:space="preserve">"HMC5883L (I2C1)"</w:t>
-      </w:r>
-      <w:r>
-        <w:rPr>
-          <w:rStyle w:val="FunctionTok"/>
-        </w:rPr>
-        <w:t xml:space="preserve">,</w:t>
-      </w:r>
-      <w:r>
-        <w:br/>
-      </w:r>
-      <w:r>
-        <w:rPr>
-          <w:rStyle w:val="NormalTok"/>
-        </w:rPr>
-        <w:t xml:space="preserve">          </w:t>
-      </w:r>
-      <w:r>
-        <w:rPr>
-          <w:rStyle w:val="DataTypeTok"/>
-        </w:rPr>
-        <w:t xml:space="preserve">"unpack_format"</w:t>
-      </w:r>
-      <w:r>
-        <w:rPr>
-          <w:rStyle w:val="FunctionTok"/>
-        </w:rPr>
-        <w:t xml:space="preserve">:</w:t>
-      </w:r>
-      <w:r>
-        <w:rPr>
-          <w:rStyle w:val="NormalTok"/>
-        </w:rPr>
-        <w:t xml:space="preserve"> </w:t>
-      </w:r>
-      <w:r>
-        <w:rPr>
-          <w:rStyle w:val="StringTok"/>
-        </w:rPr>
-        <w:t xml:space="preserve">"&lt;3hH"</w:t>
-      </w:r>
-      <w:r>
-        <w:rPr>
-          <w:rStyle w:val="FunctionTok"/>
-        </w:rPr>
-        <w:t xml:space="preserve">,</w:t>
-      </w:r>
-      <w:r>
-        <w:br/>
-      </w:r>
-      <w:r>
-        <w:rPr>
-          <w:rStyle w:val="NormalTok"/>
-        </w:rPr>
-        <w:t xml:space="preserve">          </w:t>
-      </w:r>
-      <w:r>
-        <w:rPr>
-          <w:rStyle w:val="DataTypeTok"/>
-        </w:rPr>
-        <w:t xml:space="preserve">"fields"</w:t>
-      </w:r>
-      <w:r>
-        <w:rPr>
-          <w:rStyle w:val="FunctionTok"/>
-        </w:rPr>
-        <w:t xml:space="preserve">:</w:t>
-      </w:r>
-      <w:r>
-        <w:rPr>
-          <w:rStyle w:val="NormalTok"/>
-        </w:rPr>
-        <w:t xml:space="preserve"> </w:t>
-      </w:r>
-      <w:r>
-        <w:rPr>
-          <w:rStyle w:val="OtherTok"/>
-        </w:rPr>
-        <w:t xml:space="preserve">[</w:t>
-      </w:r>
-      <w:r>
-        <w:br/>
-      </w:r>
-      <w:r>
-        <w:rPr>
-          <w:rStyle w:val="NormalTok"/>
-        </w:rPr>
-        <w:t xml:space="preserve">            </w:t>
-      </w:r>
-      <w:r>
-        <w:rPr>
-          <w:rStyle w:val="FunctionTok"/>
-        </w:rPr>
-        <w:t xml:space="preserve">{</w:t>
-      </w:r>
-      <w:r>
-        <w:rPr>
-          <w:rStyle w:val="NormalTok"/>
-        </w:rPr>
-        <w:t xml:space="preserve"> </w:t>
-      </w:r>
-      <w:r>
-        <w:rPr>
-          <w:rStyle w:val="DataTypeTok"/>
-        </w:rPr>
-        <w:t xml:space="preserve">"name"</w:t>
-      </w:r>
-      <w:r>
-        <w:rPr>
-          <w:rStyle w:val="FunctionTok"/>
-        </w:rPr>
-        <w:t xml:space="preserve">:</w:t>
-      </w:r>
-      <w:r>
-        <w:rPr>
-          <w:rStyle w:val="NormalTok"/>
-        </w:rPr>
-        <w:t xml:space="preserve"> </w:t>
-      </w:r>
-      <w:r>
-        <w:rPr>
-          <w:rStyle w:val="StringTok"/>
-        </w:rPr>
-        <w:t xml:space="preserve">"mag_x_mgauss"</w:t>
-      </w:r>
-      <w:r>
-        <w:rPr>
-          <w:rStyle w:val="FunctionTok"/>
-        </w:rPr>
-        <w:t xml:space="preserve">,</w:t>
-      </w:r>
-      <w:r>
-        <w:rPr>
-          <w:rStyle w:val="NormalTok"/>
-        </w:rPr>
-        <w:t xml:space="preserve"> </w:t>
-      </w:r>
-      <w:r>
-        <w:rPr>
-          <w:rStyle w:val="DataTypeTok"/>
-        </w:rPr>
-        <w:t xml:space="preserve">"type"</w:t>
-      </w:r>
-      <w:r>
-        <w:rPr>
-          <w:rStyle w:val="FunctionTok"/>
-        </w:rPr>
-        <w:t xml:space="preserve">:</w:t>
-      </w:r>
-      <w:r>
-        <w:rPr>
-          <w:rStyle w:val="NormalTok"/>
-        </w:rPr>
-        <w:t xml:space="preserve"> </w:t>
-      </w:r>
-      <w:r>
-        <w:rPr>
-          <w:rStyle w:val="StringTok"/>
-        </w:rPr>
-        <w:t xml:space="preserve">"int16"</w:t>
-      </w:r>
-      <w:r>
-        <w:rPr>
-          <w:rStyle w:val="FunctionTok"/>
-        </w:rPr>
-        <w:t xml:space="preserve">,</w:t>
-      </w:r>
-      <w:r>
-        <w:rPr>
-          <w:rStyle w:val="NormalTok"/>
-        </w:rPr>
-        <w:t xml:space="preserve"> </w:t>
-      </w:r>
-      <w:r>
-        <w:rPr>
-          <w:rStyle w:val="DataTypeTok"/>
-        </w:rPr>
-        <w:t xml:space="preserve">"unit"</w:t>
-      </w:r>
-      <w:r>
-        <w:rPr>
-          <w:rStyle w:val="FunctionTok"/>
-        </w:rPr>
-        <w:t xml:space="preserve">:</w:t>
-      </w:r>
-      <w:r>
-        <w:rPr>
-          <w:rStyle w:val="NormalTok"/>
-        </w:rPr>
-        <w:t xml:space="preserve"> </w:t>
-      </w:r>
-      <w:r>
-        <w:rPr>
-          <w:rStyle w:val="StringTok"/>
-        </w:rPr>
-        <w:t xml:space="preserve">"mG"</w:t>
-      </w:r>
-      <w:r>
-        <w:rPr>
-          <w:rStyle w:val="FunctionTok"/>
-        </w:rPr>
-        <w:t xml:space="preserve">,</w:t>
-      </w:r>
-      <w:r>
-        <w:rPr>
-          <w:rStyle w:val="NormalTok"/>
-        </w:rPr>
-        <w:t xml:space="preserve"> </w:t>
-      </w:r>
-      <w:r>
-        <w:rPr>
-          <w:rStyle w:val="DataTypeTok"/>
-        </w:rPr>
-        <w:t xml:space="preserve">"scale"</w:t>
-      </w:r>
-      <w:r>
-        <w:rPr>
-          <w:rStyle w:val="FunctionTok"/>
-        </w:rPr>
-        <w:t xml:space="preserve">:</w:t>
-      </w:r>
-      <w:r>
-        <w:rPr>
-          <w:rStyle w:val="NormalTok"/>
-        </w:rPr>
-        <w:t xml:space="preserve"> </w:t>
-      </w:r>
-      <w:r>
-        <w:rPr>
-          <w:rStyle w:val="FloatTok"/>
-        </w:rPr>
-        <w:t xml:space="preserve">1.0</w:t>
-      </w:r>
-      <w:r>
-        <w:rPr>
-          <w:rStyle w:val="NormalTok"/>
-        </w:rPr>
-        <w:t xml:space="preserve"> </w:t>
-      </w:r>
-      <w:r>
-        <w:rPr>
-          <w:rStyle w:val="FunctionTok"/>
-        </w:rPr>
-        <w:t xml:space="preserve">}</w:t>
-      </w:r>
-      <w:r>
-        <w:rPr>
-          <w:rStyle w:val="OtherTok"/>
-        </w:rPr>
-        <w:t xml:space="preserve">,</w:t>
-      </w:r>
-      <w:r>
-        <w:br/>
-      </w:r>
-      <w:r>
-        <w:rPr>
-          <w:rStyle w:val="NormalTok"/>
-        </w:rPr>
-        <w:t xml:space="preserve">            </w:t>
-      </w:r>
-      <w:r>
-        <w:rPr>
-          <w:rStyle w:val="FunctionTok"/>
-        </w:rPr>
-        <w:t xml:space="preserve">{</w:t>
-      </w:r>
-      <w:r>
-        <w:rPr>
-          <w:rStyle w:val="NormalTok"/>
-        </w:rPr>
-        <w:t xml:space="preserve"> </w:t>
-      </w:r>
-      <w:r>
-        <w:rPr>
-          <w:rStyle w:val="DataTypeTok"/>
-        </w:rPr>
-        <w:t xml:space="preserve">"name"</w:t>
-      </w:r>
-      <w:r>
-        <w:rPr>
-          <w:rStyle w:val="FunctionTok"/>
-        </w:rPr>
-        <w:t xml:space="preserve">:</w:t>
-      </w:r>
-      <w:r>
-        <w:rPr>
-          <w:rStyle w:val="NormalTok"/>
-        </w:rPr>
-        <w:t xml:space="preserve"> </w:t>
-      </w:r>
-      <w:r>
-        <w:rPr>
-          <w:rStyle w:val="StringTok"/>
-        </w:rPr>
-        <w:t xml:space="preserve">"heading_cdeg"</w:t>
-      </w:r>
-      <w:r>
-        <w:rPr>
-          <w:rStyle w:val="FunctionTok"/>
-        </w:rPr>
-        <w:t xml:space="preserve">,</w:t>
-      </w:r>
-      <w:r>
-        <w:rPr>
-          <w:rStyle w:val="NormalTok"/>
-        </w:rPr>
-        <w:t xml:space="preserve"> </w:t>
-      </w:r>
-      <w:r>
-        <w:rPr>
-          <w:rStyle w:val="DataTypeTok"/>
-        </w:rPr>
-        <w:t xml:space="preserve">"type"</w:t>
-      </w:r>
-      <w:r>
-        <w:rPr>
-          <w:rStyle w:val="FunctionTok"/>
-        </w:rPr>
-        <w:t xml:space="preserve">:</w:t>
-      </w:r>
-      <w:r>
-        <w:rPr>
-          <w:rStyle w:val="NormalTok"/>
-        </w:rPr>
-        <w:t xml:space="preserve"> </w:t>
-      </w:r>
-      <w:r>
-        <w:rPr>
-          <w:rStyle w:val="StringTok"/>
-        </w:rPr>
-        <w:t xml:space="preserve">"uint16"</w:t>
-      </w:r>
-      <w:r>
-        <w:rPr>
-          <w:rStyle w:val="FunctionTok"/>
-        </w:rPr>
-        <w:t xml:space="preserve">,</w:t>
-      </w:r>
-      <w:r>
-        <w:rPr>
-          <w:rStyle w:val="NormalTok"/>
-        </w:rPr>
-        <w:t xml:space="preserve"> </w:t>
-      </w:r>
-      <w:r>
-        <w:rPr>
-          <w:rStyle w:val="DataTypeTok"/>
-        </w:rPr>
-        <w:t xml:space="preserve">"unit"</w:t>
-      </w:r>
-      <w:r>
-        <w:rPr>
-          <w:rStyle w:val="FunctionTok"/>
-        </w:rPr>
-        <w:t xml:space="preserve">:</w:t>
-      </w:r>
-      <w:r>
-        <w:rPr>
-          <w:rStyle w:val="NormalTok"/>
-        </w:rPr>
-        <w:t xml:space="preserve"> </w:t>
-      </w:r>
-      <w:r>
-        <w:rPr>
-          <w:rStyle w:val="StringTok"/>
-        </w:rPr>
-        <w:t xml:space="preserve">"deg"</w:t>
-      </w:r>
-      <w:r>
-        <w:rPr>
-          <w:rStyle w:val="FunctionTok"/>
-        </w:rPr>
-        <w:t xml:space="preserve">,</w:t>
-      </w:r>
-      <w:r>
-        <w:rPr>
-          <w:rStyle w:val="NormalTok"/>
-        </w:rPr>
-        <w:t xml:space="preserve"> </w:t>
-      </w:r>
-      <w:r>
-        <w:rPr>
-          <w:rStyle w:val="DataTypeTok"/>
-        </w:rPr>
-        <w:t xml:space="preserve">"scale"</w:t>
-      </w:r>
-      <w:r>
-        <w:rPr>
-          <w:rStyle w:val="FunctionTok"/>
-        </w:rPr>
-        <w:t xml:space="preserve">:</w:t>
-      </w:r>
-      <w:r>
-        <w:rPr>
-          <w:rStyle w:val="NormalTok"/>
-        </w:rPr>
-        <w:t xml:space="preserve"> </w:t>
-      </w:r>
-      <w:r>
-        <w:rPr>
-          <w:rStyle w:val="FloatTok"/>
-        </w:rPr>
-        <w:t xml:space="preserve">0.01</w:t>
-      </w:r>
-      <w:r>
-        <w:rPr>
-          <w:rStyle w:val="FunctionTok"/>
-        </w:rPr>
-        <w:t xml:space="preserve">,</w:t>
-      </w:r>
-      <w:r>
-        <w:rPr>
-          <w:rStyle w:val="NormalTok"/>
-        </w:rPr>
-        <w:t xml:space="preserve"> </w:t>
-      </w:r>
-      <w:r>
-        <w:rPr>
-          <w:rStyle w:val="DataTypeTok"/>
-        </w:rPr>
-        <w:t xml:space="preserve">"widget"</w:t>
-      </w:r>
-      <w:r>
-        <w:rPr>
-          <w:rStyle w:val="FunctionTok"/>
-        </w:rPr>
-        <w:t xml:space="preserve">:</w:t>
-      </w:r>
-      <w:r>
-        <w:rPr>
-          <w:rStyle w:val="NormalTok"/>
-        </w:rPr>
-        <w:t xml:space="preserve"> </w:t>
-      </w:r>
-      <w:r>
-        <w:rPr>
-          <w:rStyle w:val="StringTok"/>
-        </w:rPr>
-        <w:t xml:space="preserve">"compass"</w:t>
-      </w:r>
-      <w:r>
-        <w:rPr>
-          <w:rStyle w:val="NormalTok"/>
-        </w:rPr>
-        <w:t xml:space="preserve"> </w:t>
-      </w:r>
-      <w:r>
-        <w:rPr>
-          <w:rStyle w:val="FunctionTok"/>
-        </w:rPr>
-        <w:t xml:space="preserve">}</w:t>
-      </w:r>
-      <w:r>
-        <w:br/>
-      </w:r>
-      <w:r>
-        <w:rPr>
-          <w:rStyle w:val="NormalTok"/>
-        </w:rPr>
-        <w:t xml:space="preserve">          </w:t>
-      </w:r>
-      <w:r>
-        <w:rPr>
-          <w:rStyle w:val="OtherTok"/>
-        </w:rPr>
-        <w:t xml:space="preserve">]</w:t>
-      </w:r>
-      <w:r>
-        <w:br/>
-      </w:r>
-      <w:r>
-        <w:rPr>
-          <w:rStyle w:val="NormalTok"/>
-        </w:rPr>
-        <w:t xml:space="preserve">        </w:t>
-      </w:r>
-      <w:r>
-        <w:rPr>
-          <w:rStyle w:val="FunctionTok"/>
-        </w:rPr>
-        <w:t xml:space="preserve">}</w:t>
-      </w:r>
-      <w:r>
-        <w:br/>
-      </w:r>
-      <w:r>
-        <w:rPr>
-          <w:rStyle w:val="NormalTok"/>
-        </w:rPr>
-        <w:t xml:space="preserve">      </w:t>
-      </w:r>
-      <w:r>
-        <w:rPr>
-          <w:rStyle w:val="FunctionTok"/>
-        </w:rPr>
-        <w:t xml:space="preserve">}</w:t>
-      </w:r>
-      <w:r>
-        <w:br/>
-      </w:r>
-      <w:r>
-        <w:rPr>
-          <w:rStyle w:val="NormalTok"/>
-        </w:rPr>
-        <w:t xml:space="preserve">    </w:t>
-      </w:r>
-      <w:r>
-        <w:rPr>
-          <w:rStyle w:val="FunctionTok"/>
-        </w:rPr>
-        <w:t xml:space="preserve">}</w:t>
-      </w:r>
-      <w:r>
-        <w:br/>
-      </w:r>
-      <w:r>
-        <w:rPr>
-          <w:rStyle w:val="NormalTok"/>
-        </w:rPr>
-        <w:t xml:space="preserve">  </w:t>
-      </w:r>
-      <w:r>
-        <w:rPr>
-          <w:rStyle w:val="FunctionTok"/>
-        </w:rPr>
-        <w:t xml:space="preserve">}</w:t>
-      </w:r>
-      <w:r>
-        <w:br/>
-      </w:r>
-      <w:r>
-        <w:rPr>
-          <w:rStyle w:val="FunctionTok"/>
-        </w:rPr>
-        <w:t xml:space="preserve">}</w:t>
-      </w:r>
-    </w:p>
-    <w:p>
-      <w:pPr>
-        <w:pStyle w:val="FirstParagraph"/>
-      </w:pPr>
-      <w:r>
-        <w:t xml:space="preserve">When Studio connects to a telemetry stream:</w:t>
-      </w:r>
-      <w:r>
-        <w:t xml:space="preserve"> </w:t>
-      </w:r>
-      <w:r>
-        <w:t xml:space="preserve">1.</w:t>
+        <w:t xml:space="preserve">Telemetry streams in AbstractX are governed by</w:t>
       </w:r>
       <w:r>
         <w:t xml:space="preserve"> </w:t>
@@ -12420,7 +10604,1909 @@
           <w:b/>
           <w:bCs/>
         </w:rPr>
-        <w:t xml:space="preserve">Dynamic Unpack Compilation</w:t>
+        <w:t xml:space="preserve">barectf</w:t>
+      </w:r>
+      <w:r>
+        <w:t xml:space="preserve">—an open-source generator that produces ultra-fast, zero-allocation ANSI C tracers emitting the standardized Common Trace Format (CTF 1.8).</w:t>
+      </w:r>
+    </w:p>
+    <w:p>
+      <w:pPr>
+        <w:pStyle w:val="BodyText"/>
+      </w:pPr>
+      <w:r>
+        <w:t xml:space="preserve">Instead of burning cycles on string formatting or JSON serialization on the microcontroller, the E906 firmware bit-packs trace events directly into shared SRAM rings in 4 to 12 instructions. Furthermore, MicroPython scripts on the E906 can call</w:t>
+      </w:r>
+      <w:r>
+        <w:t xml:space="preserve"> </w:t>
+      </w:r>
+      <w:r>
+        <w:rPr>
+          <w:rStyle w:val="VerbatimChar"/>
+        </w:rPr>
+        <w:t xml:space="preserve">abstractx.trace(task_id, state, "msg")</w:t>
+      </w:r>
+      <w:r>
+        <w:t xml:space="preserve"> </w:t>
+      </w:r>
+      <w:r>
+        <w:t xml:space="preserve">to emit structured barectf binary events into this exact same stream!</w:t>
+      </w:r>
+    </w:p>
+    <w:p>
+      <w:pPr>
+        <w:pStyle w:val="BodyText"/>
+      </w:pPr>
+      <w:r>
+        <w:t xml:space="preserve">On the host PC, Python tools and AbstractX Studio decode these binary streams dynamically using external schemas rather than hardcoded struct offsets:</w:t>
+      </w:r>
+    </w:p>
+    <w:p>
+      <w:pPr>
+        <w:pStyle w:val="SourceCode"/>
+      </w:pPr>
+      <w:r>
+        <w:rPr>
+          <w:rStyle w:val="FunctionTok"/>
+        </w:rPr>
+        <w:t xml:space="preserve">{</w:t>
+      </w:r>
+      <w:r>
+        <w:br/>
+      </w:r>
+      <w:r>
+        <w:rPr>
+          <w:rStyle w:val="NormalTok"/>
+        </w:rPr>
+        <w:t xml:space="preserve">  </w:t>
+      </w:r>
+      <w:r>
+        <w:rPr>
+          <w:rStyle w:val="DataTypeTok"/>
+        </w:rPr>
+        <w:t xml:space="preserve">"application"</w:t>
+      </w:r>
+      <w:r>
+        <w:rPr>
+          <w:rStyle w:val="FunctionTok"/>
+        </w:rPr>
+        <w:t xml:space="preserve">:</w:t>
+      </w:r>
+      <w:r>
+        <w:rPr>
+          <w:rStyle w:val="NormalTok"/>
+        </w:rPr>
+        <w:t xml:space="preserve"> </w:t>
+      </w:r>
+      <w:r>
+        <w:rPr>
+          <w:rStyle w:val="StringTok"/>
+        </w:rPr>
+        <w:t xml:space="preserve">"gps_imu_app"</w:t>
+      </w:r>
+      <w:r>
+        <w:rPr>
+          <w:rStyle w:val="FunctionTok"/>
+        </w:rPr>
+        <w:t xml:space="preserve">,</w:t>
+      </w:r>
+      <w:r>
+        <w:br/>
+      </w:r>
+      <w:r>
+        <w:rPr>
+          <w:rStyle w:val="NormalTok"/>
+        </w:rPr>
+        <w:t xml:space="preserve">  </w:t>
+      </w:r>
+      <w:r>
+        <w:rPr>
+          <w:rStyle w:val="DataTypeTok"/>
+        </w:rPr>
+        <w:t xml:space="preserve">"wire_protocol"</w:t>
+      </w:r>
+      <w:r>
+        <w:rPr>
+          <w:rStyle w:val="FunctionTok"/>
+        </w:rPr>
+        <w:t xml:space="preserve">:</w:t>
+      </w:r>
+      <w:r>
+        <w:rPr>
+          <w:rStyle w:val="NormalTok"/>
+        </w:rPr>
+        <w:t xml:space="preserve"> </w:t>
+      </w:r>
+      <w:r>
+        <w:rPr>
+          <w:rStyle w:val="FunctionTok"/>
+        </w:rPr>
+        <w:t xml:space="preserve">{</w:t>
+      </w:r>
+      <w:r>
+        <w:rPr>
+          <w:rStyle w:val="NormalTok"/>
+        </w:rPr>
+        <w:t xml:space="preserve"> </w:t>
+      </w:r>
+      <w:r>
+        <w:rPr>
+          <w:rStyle w:val="DataTypeTok"/>
+        </w:rPr>
+        <w:t xml:space="preserve">"frame_size_bytes"</w:t>
+      </w:r>
+      <w:r>
+        <w:rPr>
+          <w:rStyle w:val="FunctionTok"/>
+        </w:rPr>
+        <w:t xml:space="preserve">:</w:t>
+      </w:r>
+      <w:r>
+        <w:rPr>
+          <w:rStyle w:val="NormalTok"/>
+        </w:rPr>
+        <w:t xml:space="preserve"> </w:t>
+      </w:r>
+      <w:r>
+        <w:rPr>
+          <w:rStyle w:val="DecValTok"/>
+        </w:rPr>
+        <w:t xml:space="preserve">64</w:t>
+      </w:r>
+      <w:r>
+        <w:rPr>
+          <w:rStyle w:val="FunctionTok"/>
+        </w:rPr>
+        <w:t xml:space="preserve">,</w:t>
+      </w:r>
+      <w:r>
+        <w:rPr>
+          <w:rStyle w:val="NormalTok"/>
+        </w:rPr>
+        <w:t xml:space="preserve"> </w:t>
+      </w:r>
+      <w:r>
+        <w:rPr>
+          <w:rStyle w:val="DataTypeTok"/>
+        </w:rPr>
+        <w:t xml:space="preserve">"header_size_bytes"</w:t>
+      </w:r>
+      <w:r>
+        <w:rPr>
+          <w:rStyle w:val="FunctionTok"/>
+        </w:rPr>
+        <w:t xml:space="preserve">:</w:t>
+      </w:r>
+      <w:r>
+        <w:rPr>
+          <w:rStyle w:val="NormalTok"/>
+        </w:rPr>
+        <w:t xml:space="preserve"> </w:t>
+      </w:r>
+      <w:r>
+        <w:rPr>
+          <w:rStyle w:val="DecValTok"/>
+        </w:rPr>
+        <w:t xml:space="preserve">20</w:t>
+      </w:r>
+      <w:r>
+        <w:rPr>
+          <w:rStyle w:val="FunctionTok"/>
+        </w:rPr>
+        <w:t xml:space="preserve">,</w:t>
+      </w:r>
+      <w:r>
+        <w:rPr>
+          <w:rStyle w:val="NormalTok"/>
+        </w:rPr>
+        <w:t xml:space="preserve"> </w:t>
+      </w:r>
+      <w:r>
+        <w:rPr>
+          <w:rStyle w:val="DataTypeTok"/>
+        </w:rPr>
+        <w:t xml:space="preserve">"payload_size_bytes"</w:t>
+      </w:r>
+      <w:r>
+        <w:rPr>
+          <w:rStyle w:val="FunctionTok"/>
+        </w:rPr>
+        <w:t xml:space="preserve">:</w:t>
+      </w:r>
+      <w:r>
+        <w:rPr>
+          <w:rStyle w:val="NormalTok"/>
+        </w:rPr>
+        <w:t xml:space="preserve"> </w:t>
+      </w:r>
+      <w:r>
+        <w:rPr>
+          <w:rStyle w:val="DecValTok"/>
+        </w:rPr>
+        <w:t xml:space="preserve">40</w:t>
+      </w:r>
+      <w:r>
+        <w:rPr>
+          <w:rStyle w:val="NormalTok"/>
+        </w:rPr>
+        <w:t xml:space="preserve"> </w:t>
+      </w:r>
+      <w:r>
+        <w:rPr>
+          <w:rStyle w:val="FunctionTok"/>
+        </w:rPr>
+        <w:t xml:space="preserve">},</w:t>
+      </w:r>
+      <w:r>
+        <w:br/>
+      </w:r>
+      <w:r>
+        <w:rPr>
+          <w:rStyle w:val="NormalTok"/>
+        </w:rPr>
+        <w:t xml:space="preserve">  </w:t>
+      </w:r>
+      <w:r>
+        <w:rPr>
+          <w:rStyle w:val="DataTypeTok"/>
+        </w:rPr>
+        <w:t xml:space="preserve">"streams"</w:t>
+      </w:r>
+      <w:r>
+        <w:rPr>
+          <w:rStyle w:val="FunctionTok"/>
+        </w:rPr>
+        <w:t xml:space="preserve">:</w:t>
+      </w:r>
+      <w:r>
+        <w:rPr>
+          <w:rStyle w:val="NormalTok"/>
+        </w:rPr>
+        <w:t xml:space="preserve"> </w:t>
+      </w:r>
+      <w:r>
+        <w:rPr>
+          <w:rStyle w:val="FunctionTok"/>
+        </w:rPr>
+        <w:t xml:space="preserve">{</w:t>
+      </w:r>
+      <w:r>
+        <w:br/>
+      </w:r>
+      <w:r>
+        <w:rPr>
+          <w:rStyle w:val="NormalTok"/>
+        </w:rPr>
+        <w:t xml:space="preserve">    </w:t>
+      </w:r>
+      <w:r>
+        <w:rPr>
+          <w:rStyle w:val="DataTypeTok"/>
+        </w:rPr>
+        <w:t xml:space="preserve">"1"</w:t>
+      </w:r>
+      <w:r>
+        <w:rPr>
+          <w:rStyle w:val="FunctionTok"/>
+        </w:rPr>
+        <w:t xml:space="preserve">:</w:t>
+      </w:r>
+      <w:r>
+        <w:rPr>
+          <w:rStyle w:val="NormalTok"/>
+        </w:rPr>
+        <w:t xml:space="preserve"> </w:t>
+      </w:r>
+      <w:r>
+        <w:rPr>
+          <w:rStyle w:val="FunctionTok"/>
+        </w:rPr>
+        <w:t xml:space="preserve">{</w:t>
+      </w:r>
+      <w:r>
+        <w:br/>
+      </w:r>
+      <w:r>
+        <w:rPr>
+          <w:rStyle w:val="NormalTok"/>
+        </w:rPr>
+        <w:t xml:space="preserve">      </w:t>
+      </w:r>
+      <w:r>
+        <w:rPr>
+          <w:rStyle w:val="DataTypeTok"/>
+        </w:rPr>
+        <w:t xml:space="preserve">"name"</w:t>
+      </w:r>
+      <w:r>
+        <w:rPr>
+          <w:rStyle w:val="FunctionTok"/>
+        </w:rPr>
+        <w:t xml:space="preserve">:</w:t>
+      </w:r>
+      <w:r>
+        <w:rPr>
+          <w:rStyle w:val="NormalTok"/>
+        </w:rPr>
+        <w:t xml:space="preserve"> </w:t>
+      </w:r>
+      <w:r>
+        <w:rPr>
+          <w:rStyle w:val="StringTok"/>
+        </w:rPr>
+        <w:t xml:space="preserve">"telemetry"</w:t>
+      </w:r>
+      <w:r>
+        <w:rPr>
+          <w:rStyle w:val="FunctionTok"/>
+        </w:rPr>
+        <w:t xml:space="preserve">,</w:t>
+      </w:r>
+      <w:r>
+        <w:br/>
+      </w:r>
+      <w:r>
+        <w:rPr>
+          <w:rStyle w:val="NormalTok"/>
+        </w:rPr>
+        <w:t xml:space="preserve">      </w:t>
+      </w:r>
+      <w:r>
+        <w:rPr>
+          <w:rStyle w:val="DataTypeTok"/>
+        </w:rPr>
+        <w:t xml:space="preserve">"events"</w:t>
+      </w:r>
+      <w:r>
+        <w:rPr>
+          <w:rStyle w:val="FunctionTok"/>
+        </w:rPr>
+        <w:t xml:space="preserve">:</w:t>
+      </w:r>
+      <w:r>
+        <w:rPr>
+          <w:rStyle w:val="NormalTok"/>
+        </w:rPr>
+        <w:t xml:space="preserve"> </w:t>
+      </w:r>
+      <w:r>
+        <w:rPr>
+          <w:rStyle w:val="FunctionTok"/>
+        </w:rPr>
+        <w:t xml:space="preserve">{</w:t>
+      </w:r>
+      <w:r>
+        <w:br/>
+      </w:r>
+      <w:r>
+        <w:rPr>
+          <w:rStyle w:val="NormalTok"/>
+        </w:rPr>
+        <w:t xml:space="preserve">        </w:t>
+      </w:r>
+      <w:r>
+        <w:rPr>
+          <w:rStyle w:val="DataTypeTok"/>
+        </w:rPr>
+        <w:t xml:space="preserve">"1"</w:t>
+      </w:r>
+      <w:r>
+        <w:rPr>
+          <w:rStyle w:val="FunctionTok"/>
+        </w:rPr>
+        <w:t xml:space="preserve">:</w:t>
+      </w:r>
+      <w:r>
+        <w:rPr>
+          <w:rStyle w:val="NormalTok"/>
+        </w:rPr>
+        <w:t xml:space="preserve"> </w:t>
+      </w:r>
+      <w:r>
+        <w:rPr>
+          <w:rStyle w:val="FunctionTok"/>
+        </w:rPr>
+        <w:t xml:space="preserve">{</w:t>
+      </w:r>
+      <w:r>
+        <w:br/>
+      </w:r>
+      <w:r>
+        <w:rPr>
+          <w:rStyle w:val="NormalTok"/>
+        </w:rPr>
+        <w:t xml:space="preserve">          </w:t>
+      </w:r>
+      <w:r>
+        <w:rPr>
+          <w:rStyle w:val="DataTypeTok"/>
+        </w:rPr>
+        <w:t xml:space="preserve">"name"</w:t>
+      </w:r>
+      <w:r>
+        <w:rPr>
+          <w:rStyle w:val="FunctionTok"/>
+        </w:rPr>
+        <w:t xml:space="preserve">:</w:t>
+      </w:r>
+      <w:r>
+        <w:rPr>
+          <w:rStyle w:val="NormalTok"/>
+        </w:rPr>
+        <w:t xml:space="preserve"> </w:t>
+      </w:r>
+      <w:r>
+        <w:rPr>
+          <w:rStyle w:val="StringTok"/>
+        </w:rPr>
+        <w:t xml:space="preserve">"imu_sample"</w:t>
+      </w:r>
+      <w:r>
+        <w:rPr>
+          <w:rStyle w:val="FunctionTok"/>
+        </w:rPr>
+        <w:t xml:space="preserve">,</w:t>
+      </w:r>
+      <w:r>
+        <w:br/>
+      </w:r>
+      <w:r>
+        <w:rPr>
+          <w:rStyle w:val="NormalTok"/>
+        </w:rPr>
+        <w:t xml:space="preserve">          </w:t>
+      </w:r>
+      <w:r>
+        <w:rPr>
+          <w:rStyle w:val="DataTypeTok"/>
+        </w:rPr>
+        <w:t xml:space="preserve">"rate_hz"</w:t>
+      </w:r>
+      <w:r>
+        <w:rPr>
+          <w:rStyle w:val="FunctionTok"/>
+        </w:rPr>
+        <w:t xml:space="preserve">:</w:t>
+      </w:r>
+      <w:r>
+        <w:rPr>
+          <w:rStyle w:val="NormalTok"/>
+        </w:rPr>
+        <w:t xml:space="preserve"> </w:t>
+      </w:r>
+      <w:r>
+        <w:rPr>
+          <w:rStyle w:val="DecValTok"/>
+        </w:rPr>
+        <w:t xml:space="preserve">8000</w:t>
+      </w:r>
+      <w:r>
+        <w:rPr>
+          <w:rStyle w:val="FunctionTok"/>
+        </w:rPr>
+        <w:t xml:space="preserve">,</w:t>
+      </w:r>
+      <w:r>
+        <w:br/>
+      </w:r>
+      <w:r>
+        <w:rPr>
+          <w:rStyle w:val="NormalTok"/>
+        </w:rPr>
+        <w:t xml:space="preserve">          </w:t>
+      </w:r>
+      <w:r>
+        <w:rPr>
+          <w:rStyle w:val="DataTypeTok"/>
+        </w:rPr>
+        <w:t xml:space="preserve">"source_device"</w:t>
+      </w:r>
+      <w:r>
+        <w:rPr>
+          <w:rStyle w:val="FunctionTok"/>
+        </w:rPr>
+        <w:t xml:space="preserve">:</w:t>
+      </w:r>
+      <w:r>
+        <w:rPr>
+          <w:rStyle w:val="NormalTok"/>
+        </w:rPr>
+        <w:t xml:space="preserve"> </w:t>
+      </w:r>
+      <w:r>
+        <w:rPr>
+          <w:rStyle w:val="StringTok"/>
+        </w:rPr>
+        <w:t xml:space="preserve">"ICM-42688-P (SPI1)"</w:t>
+      </w:r>
+      <w:r>
+        <w:rPr>
+          <w:rStyle w:val="FunctionTok"/>
+        </w:rPr>
+        <w:t xml:space="preserve">,</w:t>
+      </w:r>
+      <w:r>
+        <w:br/>
+      </w:r>
+      <w:r>
+        <w:rPr>
+          <w:rStyle w:val="NormalTok"/>
+        </w:rPr>
+        <w:t xml:space="preserve">          </w:t>
+      </w:r>
+      <w:r>
+        <w:rPr>
+          <w:rStyle w:val="DataTypeTok"/>
+        </w:rPr>
+        <w:t xml:space="preserve">"unpack_format"</w:t>
+      </w:r>
+      <w:r>
+        <w:rPr>
+          <w:rStyle w:val="FunctionTok"/>
+        </w:rPr>
+        <w:t xml:space="preserve">:</w:t>
+      </w:r>
+      <w:r>
+        <w:rPr>
+          <w:rStyle w:val="NormalTok"/>
+        </w:rPr>
+        <w:t xml:space="preserve"> </w:t>
+      </w:r>
+      <w:r>
+        <w:rPr>
+          <w:rStyle w:val="StringTok"/>
+        </w:rPr>
+        <w:t xml:space="preserve">"&lt;i6h"</w:t>
+      </w:r>
+      <w:r>
+        <w:rPr>
+          <w:rStyle w:val="FunctionTok"/>
+        </w:rPr>
+        <w:t xml:space="preserve">,</w:t>
+      </w:r>
+      <w:r>
+        <w:br/>
+      </w:r>
+      <w:r>
+        <w:rPr>
+          <w:rStyle w:val="NormalTok"/>
+        </w:rPr>
+        <w:t xml:space="preserve">          </w:t>
+      </w:r>
+      <w:r>
+        <w:rPr>
+          <w:rStyle w:val="DataTypeTok"/>
+        </w:rPr>
+        <w:t xml:space="preserve">"fields"</w:t>
+      </w:r>
+      <w:r>
+        <w:rPr>
+          <w:rStyle w:val="FunctionTok"/>
+        </w:rPr>
+        <w:t xml:space="preserve">:</w:t>
+      </w:r>
+      <w:r>
+        <w:rPr>
+          <w:rStyle w:val="NormalTok"/>
+        </w:rPr>
+        <w:t xml:space="preserve"> </w:t>
+      </w:r>
+      <w:r>
+        <w:rPr>
+          <w:rStyle w:val="OtherTok"/>
+        </w:rPr>
+        <w:t xml:space="preserve">[</w:t>
+      </w:r>
+      <w:r>
+        <w:br/>
+      </w:r>
+      <w:r>
+        <w:rPr>
+          <w:rStyle w:val="NormalTok"/>
+        </w:rPr>
+        <w:t xml:space="preserve">            </w:t>
+      </w:r>
+      <w:r>
+        <w:rPr>
+          <w:rStyle w:val="FunctionTok"/>
+        </w:rPr>
+        <w:t xml:space="preserve">{</w:t>
+      </w:r>
+      <w:r>
+        <w:rPr>
+          <w:rStyle w:val="NormalTok"/>
+        </w:rPr>
+        <w:t xml:space="preserve"> </w:t>
+      </w:r>
+      <w:r>
+        <w:rPr>
+          <w:rStyle w:val="DataTypeTok"/>
+        </w:rPr>
+        <w:t xml:space="preserve">"name"</w:t>
+      </w:r>
+      <w:r>
+        <w:rPr>
+          <w:rStyle w:val="FunctionTok"/>
+        </w:rPr>
+        <w:t xml:space="preserve">:</w:t>
+      </w:r>
+      <w:r>
+        <w:rPr>
+          <w:rStyle w:val="NormalTok"/>
+        </w:rPr>
+        <w:t xml:space="preserve"> </w:t>
+      </w:r>
+      <w:r>
+        <w:rPr>
+          <w:rStyle w:val="StringTok"/>
+        </w:rPr>
+        <w:t xml:space="preserve">"sample_seq"</w:t>
+      </w:r>
+      <w:r>
+        <w:rPr>
+          <w:rStyle w:val="FunctionTok"/>
+        </w:rPr>
+        <w:t xml:space="preserve">,</w:t>
+      </w:r>
+      <w:r>
+        <w:rPr>
+          <w:rStyle w:val="NormalTok"/>
+        </w:rPr>
+        <w:t xml:space="preserve"> </w:t>
+      </w:r>
+      <w:r>
+        <w:rPr>
+          <w:rStyle w:val="DataTypeTok"/>
+        </w:rPr>
+        <w:t xml:space="preserve">"type"</w:t>
+      </w:r>
+      <w:r>
+        <w:rPr>
+          <w:rStyle w:val="FunctionTok"/>
+        </w:rPr>
+        <w:t xml:space="preserve">:</w:t>
+      </w:r>
+      <w:r>
+        <w:rPr>
+          <w:rStyle w:val="NormalTok"/>
+        </w:rPr>
+        <w:t xml:space="preserve"> </w:t>
+      </w:r>
+      <w:r>
+        <w:rPr>
+          <w:rStyle w:val="StringTok"/>
+        </w:rPr>
+        <w:t xml:space="preserve">"int32"</w:t>
+      </w:r>
+      <w:r>
+        <w:rPr>
+          <w:rStyle w:val="FunctionTok"/>
+        </w:rPr>
+        <w:t xml:space="preserve">,</w:t>
+      </w:r>
+      <w:r>
+        <w:rPr>
+          <w:rStyle w:val="NormalTok"/>
+        </w:rPr>
+        <w:t xml:space="preserve"> </w:t>
+      </w:r>
+      <w:r>
+        <w:rPr>
+          <w:rStyle w:val="DataTypeTok"/>
+        </w:rPr>
+        <w:t xml:space="preserve">"scale"</w:t>
+      </w:r>
+      <w:r>
+        <w:rPr>
+          <w:rStyle w:val="FunctionTok"/>
+        </w:rPr>
+        <w:t xml:space="preserve">:</w:t>
+      </w:r>
+      <w:r>
+        <w:rPr>
+          <w:rStyle w:val="NormalTok"/>
+        </w:rPr>
+        <w:t xml:space="preserve"> </w:t>
+      </w:r>
+      <w:r>
+        <w:rPr>
+          <w:rStyle w:val="FloatTok"/>
+        </w:rPr>
+        <w:t xml:space="preserve">1.0</w:t>
+      </w:r>
+      <w:r>
+        <w:rPr>
+          <w:rStyle w:val="FunctionTok"/>
+        </w:rPr>
+        <w:t xml:space="preserve">,</w:t>
+      </w:r>
+      <w:r>
+        <w:rPr>
+          <w:rStyle w:val="NormalTok"/>
+        </w:rPr>
+        <w:t xml:space="preserve"> </w:t>
+      </w:r>
+      <w:r>
+        <w:rPr>
+          <w:rStyle w:val="DataTypeTok"/>
+        </w:rPr>
+        <w:t xml:space="preserve">"display_name"</w:t>
+      </w:r>
+      <w:r>
+        <w:rPr>
+          <w:rStyle w:val="FunctionTok"/>
+        </w:rPr>
+        <w:t xml:space="preserve">:</w:t>
+      </w:r>
+      <w:r>
+        <w:rPr>
+          <w:rStyle w:val="NormalTok"/>
+        </w:rPr>
+        <w:t xml:space="preserve"> </w:t>
+      </w:r>
+      <w:r>
+        <w:rPr>
+          <w:rStyle w:val="StringTok"/>
+        </w:rPr>
+        <w:t xml:space="preserve">"Sequence"</w:t>
+      </w:r>
+      <w:r>
+        <w:rPr>
+          <w:rStyle w:val="NormalTok"/>
+        </w:rPr>
+        <w:t xml:space="preserve"> </w:t>
+      </w:r>
+      <w:r>
+        <w:rPr>
+          <w:rStyle w:val="FunctionTok"/>
+        </w:rPr>
+        <w:t xml:space="preserve">}</w:t>
+      </w:r>
+      <w:r>
+        <w:rPr>
+          <w:rStyle w:val="OtherTok"/>
+        </w:rPr>
+        <w:t xml:space="preserve">,</w:t>
+      </w:r>
+      <w:r>
+        <w:br/>
+      </w:r>
+      <w:r>
+        <w:rPr>
+          <w:rStyle w:val="NormalTok"/>
+        </w:rPr>
+        <w:t xml:space="preserve">            </w:t>
+      </w:r>
+      <w:r>
+        <w:rPr>
+          <w:rStyle w:val="FunctionTok"/>
+        </w:rPr>
+        <w:t xml:space="preserve">{</w:t>
+      </w:r>
+      <w:r>
+        <w:rPr>
+          <w:rStyle w:val="NormalTok"/>
+        </w:rPr>
+        <w:t xml:space="preserve"> </w:t>
+      </w:r>
+      <w:r>
+        <w:rPr>
+          <w:rStyle w:val="DataTypeTok"/>
+        </w:rPr>
+        <w:t xml:space="preserve">"name"</w:t>
+      </w:r>
+      <w:r>
+        <w:rPr>
+          <w:rStyle w:val="FunctionTok"/>
+        </w:rPr>
+        <w:t xml:space="preserve">:</w:t>
+      </w:r>
+      <w:r>
+        <w:rPr>
+          <w:rStyle w:val="NormalTok"/>
+        </w:rPr>
+        <w:t xml:space="preserve"> </w:t>
+      </w:r>
+      <w:r>
+        <w:rPr>
+          <w:rStyle w:val="StringTok"/>
+        </w:rPr>
+        <w:t xml:space="preserve">"accel_x_mg"</w:t>
+      </w:r>
+      <w:r>
+        <w:rPr>
+          <w:rStyle w:val="FunctionTok"/>
+        </w:rPr>
+        <w:t xml:space="preserve">,</w:t>
+      </w:r>
+      <w:r>
+        <w:rPr>
+          <w:rStyle w:val="NormalTok"/>
+        </w:rPr>
+        <w:t xml:space="preserve"> </w:t>
+      </w:r>
+      <w:r>
+        <w:rPr>
+          <w:rStyle w:val="DataTypeTok"/>
+        </w:rPr>
+        <w:t xml:space="preserve">"type"</w:t>
+      </w:r>
+      <w:r>
+        <w:rPr>
+          <w:rStyle w:val="FunctionTok"/>
+        </w:rPr>
+        <w:t xml:space="preserve">:</w:t>
+      </w:r>
+      <w:r>
+        <w:rPr>
+          <w:rStyle w:val="NormalTok"/>
+        </w:rPr>
+        <w:t xml:space="preserve"> </w:t>
+      </w:r>
+      <w:r>
+        <w:rPr>
+          <w:rStyle w:val="StringTok"/>
+        </w:rPr>
+        <w:t xml:space="preserve">"int16"</w:t>
+      </w:r>
+      <w:r>
+        <w:rPr>
+          <w:rStyle w:val="FunctionTok"/>
+        </w:rPr>
+        <w:t xml:space="preserve">,</w:t>
+      </w:r>
+      <w:r>
+        <w:rPr>
+          <w:rStyle w:val="NormalTok"/>
+        </w:rPr>
+        <w:t xml:space="preserve"> </w:t>
+      </w:r>
+      <w:r>
+        <w:rPr>
+          <w:rStyle w:val="DataTypeTok"/>
+        </w:rPr>
+        <w:t xml:space="preserve">"unit"</w:t>
+      </w:r>
+      <w:r>
+        <w:rPr>
+          <w:rStyle w:val="FunctionTok"/>
+        </w:rPr>
+        <w:t xml:space="preserve">:</w:t>
+      </w:r>
+      <w:r>
+        <w:rPr>
+          <w:rStyle w:val="NormalTok"/>
+        </w:rPr>
+        <w:t xml:space="preserve"> </w:t>
+      </w:r>
+      <w:r>
+        <w:rPr>
+          <w:rStyle w:val="StringTok"/>
+        </w:rPr>
+        <w:t xml:space="preserve">"g"</w:t>
+      </w:r>
+      <w:r>
+        <w:rPr>
+          <w:rStyle w:val="FunctionTok"/>
+        </w:rPr>
+        <w:t xml:space="preserve">,</w:t>
+      </w:r>
+      <w:r>
+        <w:rPr>
+          <w:rStyle w:val="NormalTok"/>
+        </w:rPr>
+        <w:t xml:space="preserve"> </w:t>
+      </w:r>
+      <w:r>
+        <w:rPr>
+          <w:rStyle w:val="DataTypeTok"/>
+        </w:rPr>
+        <w:t xml:space="preserve">"scale"</w:t>
+      </w:r>
+      <w:r>
+        <w:rPr>
+          <w:rStyle w:val="FunctionTok"/>
+        </w:rPr>
+        <w:t xml:space="preserve">:</w:t>
+      </w:r>
+      <w:r>
+        <w:rPr>
+          <w:rStyle w:val="NormalTok"/>
+        </w:rPr>
+        <w:t xml:space="preserve"> </w:t>
+      </w:r>
+      <w:r>
+        <w:rPr>
+          <w:rStyle w:val="FloatTok"/>
+        </w:rPr>
+        <w:t xml:space="preserve">0.001</w:t>
+      </w:r>
+      <w:r>
+        <w:rPr>
+          <w:rStyle w:val="FunctionTok"/>
+        </w:rPr>
+        <w:t xml:space="preserve">,</w:t>
+      </w:r>
+      <w:r>
+        <w:rPr>
+          <w:rStyle w:val="NormalTok"/>
+        </w:rPr>
+        <w:t xml:space="preserve"> </w:t>
+      </w:r>
+      <w:r>
+        <w:rPr>
+          <w:rStyle w:val="DataTypeTok"/>
+        </w:rPr>
+        <w:t xml:space="preserve">"widget"</w:t>
+      </w:r>
+      <w:r>
+        <w:rPr>
+          <w:rStyle w:val="FunctionTok"/>
+        </w:rPr>
+        <w:t xml:space="preserve">:</w:t>
+      </w:r>
+      <w:r>
+        <w:rPr>
+          <w:rStyle w:val="NormalTok"/>
+        </w:rPr>
+        <w:t xml:space="preserve"> </w:t>
+      </w:r>
+      <w:r>
+        <w:rPr>
+          <w:rStyle w:val="StringTok"/>
+        </w:rPr>
+        <w:t xml:space="preserve">"oscilloscope"</w:t>
+      </w:r>
+      <w:r>
+        <w:rPr>
+          <w:rStyle w:val="NormalTok"/>
+        </w:rPr>
+        <w:t xml:space="preserve"> </w:t>
+      </w:r>
+      <w:r>
+        <w:rPr>
+          <w:rStyle w:val="FunctionTok"/>
+        </w:rPr>
+        <w:t xml:space="preserve">}</w:t>
+      </w:r>
+      <w:r>
+        <w:rPr>
+          <w:rStyle w:val="OtherTok"/>
+        </w:rPr>
+        <w:t xml:space="preserve">,</w:t>
+      </w:r>
+      <w:r>
+        <w:br/>
+      </w:r>
+      <w:r>
+        <w:rPr>
+          <w:rStyle w:val="NormalTok"/>
+        </w:rPr>
+        <w:t xml:space="preserve">            </w:t>
+      </w:r>
+      <w:r>
+        <w:rPr>
+          <w:rStyle w:val="FunctionTok"/>
+        </w:rPr>
+        <w:t xml:space="preserve">{</w:t>
+      </w:r>
+      <w:r>
+        <w:rPr>
+          <w:rStyle w:val="NormalTok"/>
+        </w:rPr>
+        <w:t xml:space="preserve"> </w:t>
+      </w:r>
+      <w:r>
+        <w:rPr>
+          <w:rStyle w:val="DataTypeTok"/>
+        </w:rPr>
+        <w:t xml:space="preserve">"name"</w:t>
+      </w:r>
+      <w:r>
+        <w:rPr>
+          <w:rStyle w:val="FunctionTok"/>
+        </w:rPr>
+        <w:t xml:space="preserve">:</w:t>
+      </w:r>
+      <w:r>
+        <w:rPr>
+          <w:rStyle w:val="NormalTok"/>
+        </w:rPr>
+        <w:t xml:space="preserve"> </w:t>
+      </w:r>
+      <w:r>
+        <w:rPr>
+          <w:rStyle w:val="StringTok"/>
+        </w:rPr>
+        <w:t xml:space="preserve">"gyro_z_dps"</w:t>
+      </w:r>
+      <w:r>
+        <w:rPr>
+          <w:rStyle w:val="FunctionTok"/>
+        </w:rPr>
+        <w:t xml:space="preserve">,</w:t>
+      </w:r>
+      <w:r>
+        <w:rPr>
+          <w:rStyle w:val="NormalTok"/>
+        </w:rPr>
+        <w:t xml:space="preserve"> </w:t>
+      </w:r>
+      <w:r>
+        <w:rPr>
+          <w:rStyle w:val="DataTypeTok"/>
+        </w:rPr>
+        <w:t xml:space="preserve">"type"</w:t>
+      </w:r>
+      <w:r>
+        <w:rPr>
+          <w:rStyle w:val="FunctionTok"/>
+        </w:rPr>
+        <w:t xml:space="preserve">:</w:t>
+      </w:r>
+      <w:r>
+        <w:rPr>
+          <w:rStyle w:val="NormalTok"/>
+        </w:rPr>
+        <w:t xml:space="preserve"> </w:t>
+      </w:r>
+      <w:r>
+        <w:rPr>
+          <w:rStyle w:val="StringTok"/>
+        </w:rPr>
+        <w:t xml:space="preserve">"int16"</w:t>
+      </w:r>
+      <w:r>
+        <w:rPr>
+          <w:rStyle w:val="FunctionTok"/>
+        </w:rPr>
+        <w:t xml:space="preserve">,</w:t>
+      </w:r>
+      <w:r>
+        <w:rPr>
+          <w:rStyle w:val="NormalTok"/>
+        </w:rPr>
+        <w:t xml:space="preserve"> </w:t>
+      </w:r>
+      <w:r>
+        <w:rPr>
+          <w:rStyle w:val="DataTypeTok"/>
+        </w:rPr>
+        <w:t xml:space="preserve">"unit"</w:t>
+      </w:r>
+      <w:r>
+        <w:rPr>
+          <w:rStyle w:val="FunctionTok"/>
+        </w:rPr>
+        <w:t xml:space="preserve">:</w:t>
+      </w:r>
+      <w:r>
+        <w:rPr>
+          <w:rStyle w:val="NormalTok"/>
+        </w:rPr>
+        <w:t xml:space="preserve"> </w:t>
+      </w:r>
+      <w:r>
+        <w:rPr>
+          <w:rStyle w:val="StringTok"/>
+        </w:rPr>
+        <w:t xml:space="preserve">"deg/s"</w:t>
+      </w:r>
+      <w:r>
+        <w:rPr>
+          <w:rStyle w:val="FunctionTok"/>
+        </w:rPr>
+        <w:t xml:space="preserve">,</w:t>
+      </w:r>
+      <w:r>
+        <w:rPr>
+          <w:rStyle w:val="NormalTok"/>
+        </w:rPr>
+        <w:t xml:space="preserve"> </w:t>
+      </w:r>
+      <w:r>
+        <w:rPr>
+          <w:rStyle w:val="DataTypeTok"/>
+        </w:rPr>
+        <w:t xml:space="preserve">"scale"</w:t>
+      </w:r>
+      <w:r>
+        <w:rPr>
+          <w:rStyle w:val="FunctionTok"/>
+        </w:rPr>
+        <w:t xml:space="preserve">:</w:t>
+      </w:r>
+      <w:r>
+        <w:rPr>
+          <w:rStyle w:val="NormalTok"/>
+        </w:rPr>
+        <w:t xml:space="preserve"> </w:t>
+      </w:r>
+      <w:r>
+        <w:rPr>
+          <w:rStyle w:val="FloatTok"/>
+        </w:rPr>
+        <w:t xml:space="preserve">0.1</w:t>
+      </w:r>
+      <w:r>
+        <w:rPr>
+          <w:rStyle w:val="FunctionTok"/>
+        </w:rPr>
+        <w:t xml:space="preserve">,</w:t>
+      </w:r>
+      <w:r>
+        <w:rPr>
+          <w:rStyle w:val="NormalTok"/>
+        </w:rPr>
+        <w:t xml:space="preserve"> </w:t>
+      </w:r>
+      <w:r>
+        <w:rPr>
+          <w:rStyle w:val="DataTypeTok"/>
+        </w:rPr>
+        <w:t xml:space="preserve">"widget"</w:t>
+      </w:r>
+      <w:r>
+        <w:rPr>
+          <w:rStyle w:val="FunctionTok"/>
+        </w:rPr>
+        <w:t xml:space="preserve">:</w:t>
+      </w:r>
+      <w:r>
+        <w:rPr>
+          <w:rStyle w:val="NormalTok"/>
+        </w:rPr>
+        <w:t xml:space="preserve"> </w:t>
+      </w:r>
+      <w:r>
+        <w:rPr>
+          <w:rStyle w:val="StringTok"/>
+        </w:rPr>
+        <w:t xml:space="preserve">"oscilloscope"</w:t>
+      </w:r>
+      <w:r>
+        <w:rPr>
+          <w:rStyle w:val="NormalTok"/>
+        </w:rPr>
+        <w:t xml:space="preserve"> </w:t>
+      </w:r>
+      <w:r>
+        <w:rPr>
+          <w:rStyle w:val="FunctionTok"/>
+        </w:rPr>
+        <w:t xml:space="preserve">}</w:t>
+      </w:r>
+      <w:r>
+        <w:br/>
+      </w:r>
+      <w:r>
+        <w:rPr>
+          <w:rStyle w:val="NormalTok"/>
+        </w:rPr>
+        <w:t xml:space="preserve">          </w:t>
+      </w:r>
+      <w:r>
+        <w:rPr>
+          <w:rStyle w:val="OtherTok"/>
+        </w:rPr>
+        <w:t xml:space="preserve">]</w:t>
+      </w:r>
+      <w:r>
+        <w:br/>
+      </w:r>
+      <w:r>
+        <w:rPr>
+          <w:rStyle w:val="NormalTok"/>
+        </w:rPr>
+        <w:t xml:space="preserve">        </w:t>
+      </w:r>
+      <w:r>
+        <w:rPr>
+          <w:rStyle w:val="FunctionTok"/>
+        </w:rPr>
+        <w:t xml:space="preserve">},</w:t>
+      </w:r>
+      <w:r>
+        <w:br/>
+      </w:r>
+      <w:r>
+        <w:rPr>
+          <w:rStyle w:val="NormalTok"/>
+        </w:rPr>
+        <w:t xml:space="preserve">        </w:t>
+      </w:r>
+      <w:r>
+        <w:rPr>
+          <w:rStyle w:val="DataTypeTok"/>
+        </w:rPr>
+        <w:t xml:space="preserve">"2"</w:t>
+      </w:r>
+      <w:r>
+        <w:rPr>
+          <w:rStyle w:val="FunctionTok"/>
+        </w:rPr>
+        <w:t xml:space="preserve">:</w:t>
+      </w:r>
+      <w:r>
+        <w:rPr>
+          <w:rStyle w:val="NormalTok"/>
+        </w:rPr>
+        <w:t xml:space="preserve"> </w:t>
+      </w:r>
+      <w:r>
+        <w:rPr>
+          <w:rStyle w:val="FunctionTok"/>
+        </w:rPr>
+        <w:t xml:space="preserve">{</w:t>
+      </w:r>
+      <w:r>
+        <w:br/>
+      </w:r>
+      <w:r>
+        <w:rPr>
+          <w:rStyle w:val="NormalTok"/>
+        </w:rPr>
+        <w:t xml:space="preserve">          </w:t>
+      </w:r>
+      <w:r>
+        <w:rPr>
+          <w:rStyle w:val="DataTypeTok"/>
+        </w:rPr>
+        <w:t xml:space="preserve">"name"</w:t>
+      </w:r>
+      <w:r>
+        <w:rPr>
+          <w:rStyle w:val="FunctionTok"/>
+        </w:rPr>
+        <w:t xml:space="preserve">:</w:t>
+      </w:r>
+      <w:r>
+        <w:rPr>
+          <w:rStyle w:val="NormalTok"/>
+        </w:rPr>
+        <w:t xml:space="preserve"> </w:t>
+      </w:r>
+      <w:r>
+        <w:rPr>
+          <w:rStyle w:val="StringTok"/>
+        </w:rPr>
+        <w:t xml:space="preserve">"mag_sample"</w:t>
+      </w:r>
+      <w:r>
+        <w:rPr>
+          <w:rStyle w:val="FunctionTok"/>
+        </w:rPr>
+        <w:t xml:space="preserve">,</w:t>
+      </w:r>
+      <w:r>
+        <w:br/>
+      </w:r>
+      <w:r>
+        <w:rPr>
+          <w:rStyle w:val="NormalTok"/>
+        </w:rPr>
+        <w:t xml:space="preserve">          </w:t>
+      </w:r>
+      <w:r>
+        <w:rPr>
+          <w:rStyle w:val="DataTypeTok"/>
+        </w:rPr>
+        <w:t xml:space="preserve">"rate_hz"</w:t>
+      </w:r>
+      <w:r>
+        <w:rPr>
+          <w:rStyle w:val="FunctionTok"/>
+        </w:rPr>
+        <w:t xml:space="preserve">:</w:t>
+      </w:r>
+      <w:r>
+        <w:rPr>
+          <w:rStyle w:val="NormalTok"/>
+        </w:rPr>
+        <w:t xml:space="preserve"> </w:t>
+      </w:r>
+      <w:r>
+        <w:rPr>
+          <w:rStyle w:val="DecValTok"/>
+        </w:rPr>
+        <w:t xml:space="preserve">50</w:t>
+      </w:r>
+      <w:r>
+        <w:rPr>
+          <w:rStyle w:val="FunctionTok"/>
+        </w:rPr>
+        <w:t xml:space="preserve">,</w:t>
+      </w:r>
+      <w:r>
+        <w:br/>
+      </w:r>
+      <w:r>
+        <w:rPr>
+          <w:rStyle w:val="NormalTok"/>
+        </w:rPr>
+        <w:t xml:space="preserve">          </w:t>
+      </w:r>
+      <w:r>
+        <w:rPr>
+          <w:rStyle w:val="DataTypeTok"/>
+        </w:rPr>
+        <w:t xml:space="preserve">"source_device"</w:t>
+      </w:r>
+      <w:r>
+        <w:rPr>
+          <w:rStyle w:val="FunctionTok"/>
+        </w:rPr>
+        <w:t xml:space="preserve">:</w:t>
+      </w:r>
+      <w:r>
+        <w:rPr>
+          <w:rStyle w:val="NormalTok"/>
+        </w:rPr>
+        <w:t xml:space="preserve"> </w:t>
+      </w:r>
+      <w:r>
+        <w:rPr>
+          <w:rStyle w:val="StringTok"/>
+        </w:rPr>
+        <w:t xml:space="preserve">"HMC5883L (I2C1)"</w:t>
+      </w:r>
+      <w:r>
+        <w:rPr>
+          <w:rStyle w:val="FunctionTok"/>
+        </w:rPr>
+        <w:t xml:space="preserve">,</w:t>
+      </w:r>
+      <w:r>
+        <w:br/>
+      </w:r>
+      <w:r>
+        <w:rPr>
+          <w:rStyle w:val="NormalTok"/>
+        </w:rPr>
+        <w:t xml:space="preserve">          </w:t>
+      </w:r>
+      <w:r>
+        <w:rPr>
+          <w:rStyle w:val="DataTypeTok"/>
+        </w:rPr>
+        <w:t xml:space="preserve">"unpack_format"</w:t>
+      </w:r>
+      <w:r>
+        <w:rPr>
+          <w:rStyle w:val="FunctionTok"/>
+        </w:rPr>
+        <w:t xml:space="preserve">:</w:t>
+      </w:r>
+      <w:r>
+        <w:rPr>
+          <w:rStyle w:val="NormalTok"/>
+        </w:rPr>
+        <w:t xml:space="preserve"> </w:t>
+      </w:r>
+      <w:r>
+        <w:rPr>
+          <w:rStyle w:val="StringTok"/>
+        </w:rPr>
+        <w:t xml:space="preserve">"&lt;3hH"</w:t>
+      </w:r>
+      <w:r>
+        <w:rPr>
+          <w:rStyle w:val="FunctionTok"/>
+        </w:rPr>
+        <w:t xml:space="preserve">,</w:t>
+      </w:r>
+      <w:r>
+        <w:br/>
+      </w:r>
+      <w:r>
+        <w:rPr>
+          <w:rStyle w:val="NormalTok"/>
+        </w:rPr>
+        <w:t xml:space="preserve">          </w:t>
+      </w:r>
+      <w:r>
+        <w:rPr>
+          <w:rStyle w:val="DataTypeTok"/>
+        </w:rPr>
+        <w:t xml:space="preserve">"fields"</w:t>
+      </w:r>
+      <w:r>
+        <w:rPr>
+          <w:rStyle w:val="FunctionTok"/>
+        </w:rPr>
+        <w:t xml:space="preserve">:</w:t>
+      </w:r>
+      <w:r>
+        <w:rPr>
+          <w:rStyle w:val="NormalTok"/>
+        </w:rPr>
+        <w:t xml:space="preserve"> </w:t>
+      </w:r>
+      <w:r>
+        <w:rPr>
+          <w:rStyle w:val="OtherTok"/>
+        </w:rPr>
+        <w:t xml:space="preserve">[</w:t>
+      </w:r>
+      <w:r>
+        <w:br/>
+      </w:r>
+      <w:r>
+        <w:rPr>
+          <w:rStyle w:val="NormalTok"/>
+        </w:rPr>
+        <w:t xml:space="preserve">            </w:t>
+      </w:r>
+      <w:r>
+        <w:rPr>
+          <w:rStyle w:val="FunctionTok"/>
+        </w:rPr>
+        <w:t xml:space="preserve">{</w:t>
+      </w:r>
+      <w:r>
+        <w:rPr>
+          <w:rStyle w:val="NormalTok"/>
+        </w:rPr>
+        <w:t xml:space="preserve"> </w:t>
+      </w:r>
+      <w:r>
+        <w:rPr>
+          <w:rStyle w:val="DataTypeTok"/>
+        </w:rPr>
+        <w:t xml:space="preserve">"name"</w:t>
+      </w:r>
+      <w:r>
+        <w:rPr>
+          <w:rStyle w:val="FunctionTok"/>
+        </w:rPr>
+        <w:t xml:space="preserve">:</w:t>
+      </w:r>
+      <w:r>
+        <w:rPr>
+          <w:rStyle w:val="NormalTok"/>
+        </w:rPr>
+        <w:t xml:space="preserve"> </w:t>
+      </w:r>
+      <w:r>
+        <w:rPr>
+          <w:rStyle w:val="StringTok"/>
+        </w:rPr>
+        <w:t xml:space="preserve">"mag_x_mgauss"</w:t>
+      </w:r>
+      <w:r>
+        <w:rPr>
+          <w:rStyle w:val="FunctionTok"/>
+        </w:rPr>
+        <w:t xml:space="preserve">,</w:t>
+      </w:r>
+      <w:r>
+        <w:rPr>
+          <w:rStyle w:val="NormalTok"/>
+        </w:rPr>
+        <w:t xml:space="preserve"> </w:t>
+      </w:r>
+      <w:r>
+        <w:rPr>
+          <w:rStyle w:val="DataTypeTok"/>
+        </w:rPr>
+        <w:t xml:space="preserve">"type"</w:t>
+      </w:r>
+      <w:r>
+        <w:rPr>
+          <w:rStyle w:val="FunctionTok"/>
+        </w:rPr>
+        <w:t xml:space="preserve">:</w:t>
+      </w:r>
+      <w:r>
+        <w:rPr>
+          <w:rStyle w:val="NormalTok"/>
+        </w:rPr>
+        <w:t xml:space="preserve"> </w:t>
+      </w:r>
+      <w:r>
+        <w:rPr>
+          <w:rStyle w:val="StringTok"/>
+        </w:rPr>
+        <w:t xml:space="preserve">"int16"</w:t>
+      </w:r>
+      <w:r>
+        <w:rPr>
+          <w:rStyle w:val="FunctionTok"/>
+        </w:rPr>
+        <w:t xml:space="preserve">,</w:t>
+      </w:r>
+      <w:r>
+        <w:rPr>
+          <w:rStyle w:val="NormalTok"/>
+        </w:rPr>
+        <w:t xml:space="preserve"> </w:t>
+      </w:r>
+      <w:r>
+        <w:rPr>
+          <w:rStyle w:val="DataTypeTok"/>
+        </w:rPr>
+        <w:t xml:space="preserve">"unit"</w:t>
+      </w:r>
+      <w:r>
+        <w:rPr>
+          <w:rStyle w:val="FunctionTok"/>
+        </w:rPr>
+        <w:t xml:space="preserve">:</w:t>
+      </w:r>
+      <w:r>
+        <w:rPr>
+          <w:rStyle w:val="NormalTok"/>
+        </w:rPr>
+        <w:t xml:space="preserve"> </w:t>
+      </w:r>
+      <w:r>
+        <w:rPr>
+          <w:rStyle w:val="StringTok"/>
+        </w:rPr>
+        <w:t xml:space="preserve">"mG"</w:t>
+      </w:r>
+      <w:r>
+        <w:rPr>
+          <w:rStyle w:val="FunctionTok"/>
+        </w:rPr>
+        <w:t xml:space="preserve">,</w:t>
+      </w:r>
+      <w:r>
+        <w:rPr>
+          <w:rStyle w:val="NormalTok"/>
+        </w:rPr>
+        <w:t xml:space="preserve"> </w:t>
+      </w:r>
+      <w:r>
+        <w:rPr>
+          <w:rStyle w:val="DataTypeTok"/>
+        </w:rPr>
+        <w:t xml:space="preserve">"scale"</w:t>
+      </w:r>
+      <w:r>
+        <w:rPr>
+          <w:rStyle w:val="FunctionTok"/>
+        </w:rPr>
+        <w:t xml:space="preserve">:</w:t>
+      </w:r>
+      <w:r>
+        <w:rPr>
+          <w:rStyle w:val="NormalTok"/>
+        </w:rPr>
+        <w:t xml:space="preserve"> </w:t>
+      </w:r>
+      <w:r>
+        <w:rPr>
+          <w:rStyle w:val="FloatTok"/>
+        </w:rPr>
+        <w:t xml:space="preserve">1.0</w:t>
+      </w:r>
+      <w:r>
+        <w:rPr>
+          <w:rStyle w:val="NormalTok"/>
+        </w:rPr>
+        <w:t xml:space="preserve"> </w:t>
+      </w:r>
+      <w:r>
+        <w:rPr>
+          <w:rStyle w:val="FunctionTok"/>
+        </w:rPr>
+        <w:t xml:space="preserve">}</w:t>
+      </w:r>
+      <w:r>
+        <w:rPr>
+          <w:rStyle w:val="OtherTok"/>
+        </w:rPr>
+        <w:t xml:space="preserve">,</w:t>
+      </w:r>
+      <w:r>
+        <w:br/>
+      </w:r>
+      <w:r>
+        <w:rPr>
+          <w:rStyle w:val="NormalTok"/>
+        </w:rPr>
+        <w:t xml:space="preserve">            </w:t>
+      </w:r>
+      <w:r>
+        <w:rPr>
+          <w:rStyle w:val="FunctionTok"/>
+        </w:rPr>
+        <w:t xml:space="preserve">{</w:t>
+      </w:r>
+      <w:r>
+        <w:rPr>
+          <w:rStyle w:val="NormalTok"/>
+        </w:rPr>
+        <w:t xml:space="preserve"> </w:t>
+      </w:r>
+      <w:r>
+        <w:rPr>
+          <w:rStyle w:val="DataTypeTok"/>
+        </w:rPr>
+        <w:t xml:space="preserve">"name"</w:t>
+      </w:r>
+      <w:r>
+        <w:rPr>
+          <w:rStyle w:val="FunctionTok"/>
+        </w:rPr>
+        <w:t xml:space="preserve">:</w:t>
+      </w:r>
+      <w:r>
+        <w:rPr>
+          <w:rStyle w:val="NormalTok"/>
+        </w:rPr>
+        <w:t xml:space="preserve"> </w:t>
+      </w:r>
+      <w:r>
+        <w:rPr>
+          <w:rStyle w:val="StringTok"/>
+        </w:rPr>
+        <w:t xml:space="preserve">"heading_cdeg"</w:t>
+      </w:r>
+      <w:r>
+        <w:rPr>
+          <w:rStyle w:val="FunctionTok"/>
+        </w:rPr>
+        <w:t xml:space="preserve">,</w:t>
+      </w:r>
+      <w:r>
+        <w:rPr>
+          <w:rStyle w:val="NormalTok"/>
+        </w:rPr>
+        <w:t xml:space="preserve"> </w:t>
+      </w:r>
+      <w:r>
+        <w:rPr>
+          <w:rStyle w:val="DataTypeTok"/>
+        </w:rPr>
+        <w:t xml:space="preserve">"type"</w:t>
+      </w:r>
+      <w:r>
+        <w:rPr>
+          <w:rStyle w:val="FunctionTok"/>
+        </w:rPr>
+        <w:t xml:space="preserve">:</w:t>
+      </w:r>
+      <w:r>
+        <w:rPr>
+          <w:rStyle w:val="NormalTok"/>
+        </w:rPr>
+        <w:t xml:space="preserve"> </w:t>
+      </w:r>
+      <w:r>
+        <w:rPr>
+          <w:rStyle w:val="StringTok"/>
+        </w:rPr>
+        <w:t xml:space="preserve">"uint16"</w:t>
+      </w:r>
+      <w:r>
+        <w:rPr>
+          <w:rStyle w:val="FunctionTok"/>
+        </w:rPr>
+        <w:t xml:space="preserve">,</w:t>
+      </w:r>
+      <w:r>
+        <w:rPr>
+          <w:rStyle w:val="NormalTok"/>
+        </w:rPr>
+        <w:t xml:space="preserve"> </w:t>
+      </w:r>
+      <w:r>
+        <w:rPr>
+          <w:rStyle w:val="DataTypeTok"/>
+        </w:rPr>
+        <w:t xml:space="preserve">"unit"</w:t>
+      </w:r>
+      <w:r>
+        <w:rPr>
+          <w:rStyle w:val="FunctionTok"/>
+        </w:rPr>
+        <w:t xml:space="preserve">:</w:t>
+      </w:r>
+      <w:r>
+        <w:rPr>
+          <w:rStyle w:val="NormalTok"/>
+        </w:rPr>
+        <w:t xml:space="preserve"> </w:t>
+      </w:r>
+      <w:r>
+        <w:rPr>
+          <w:rStyle w:val="StringTok"/>
+        </w:rPr>
+        <w:t xml:space="preserve">"deg"</w:t>
+      </w:r>
+      <w:r>
+        <w:rPr>
+          <w:rStyle w:val="FunctionTok"/>
+        </w:rPr>
+        <w:t xml:space="preserve">,</w:t>
+      </w:r>
+      <w:r>
+        <w:rPr>
+          <w:rStyle w:val="NormalTok"/>
+        </w:rPr>
+        <w:t xml:space="preserve"> </w:t>
+      </w:r>
+      <w:r>
+        <w:rPr>
+          <w:rStyle w:val="DataTypeTok"/>
+        </w:rPr>
+        <w:t xml:space="preserve">"scale"</w:t>
+      </w:r>
+      <w:r>
+        <w:rPr>
+          <w:rStyle w:val="FunctionTok"/>
+        </w:rPr>
+        <w:t xml:space="preserve">:</w:t>
+      </w:r>
+      <w:r>
+        <w:rPr>
+          <w:rStyle w:val="NormalTok"/>
+        </w:rPr>
+        <w:t xml:space="preserve"> </w:t>
+      </w:r>
+      <w:r>
+        <w:rPr>
+          <w:rStyle w:val="FloatTok"/>
+        </w:rPr>
+        <w:t xml:space="preserve">0.01</w:t>
+      </w:r>
+      <w:r>
+        <w:rPr>
+          <w:rStyle w:val="FunctionTok"/>
+        </w:rPr>
+        <w:t xml:space="preserve">,</w:t>
+      </w:r>
+      <w:r>
+        <w:rPr>
+          <w:rStyle w:val="NormalTok"/>
+        </w:rPr>
+        <w:t xml:space="preserve"> </w:t>
+      </w:r>
+      <w:r>
+        <w:rPr>
+          <w:rStyle w:val="DataTypeTok"/>
+        </w:rPr>
+        <w:t xml:space="preserve">"widget"</w:t>
+      </w:r>
+      <w:r>
+        <w:rPr>
+          <w:rStyle w:val="FunctionTok"/>
+        </w:rPr>
+        <w:t xml:space="preserve">:</w:t>
+      </w:r>
+      <w:r>
+        <w:rPr>
+          <w:rStyle w:val="NormalTok"/>
+        </w:rPr>
+        <w:t xml:space="preserve"> </w:t>
+      </w:r>
+      <w:r>
+        <w:rPr>
+          <w:rStyle w:val="StringTok"/>
+        </w:rPr>
+        <w:t xml:space="preserve">"compass"</w:t>
+      </w:r>
+      <w:r>
+        <w:rPr>
+          <w:rStyle w:val="NormalTok"/>
+        </w:rPr>
+        <w:t xml:space="preserve"> </w:t>
+      </w:r>
+      <w:r>
+        <w:rPr>
+          <w:rStyle w:val="FunctionTok"/>
+        </w:rPr>
+        <w:t xml:space="preserve">}</w:t>
+      </w:r>
+      <w:r>
+        <w:br/>
+      </w:r>
+      <w:r>
+        <w:rPr>
+          <w:rStyle w:val="NormalTok"/>
+        </w:rPr>
+        <w:t xml:space="preserve">          </w:t>
+      </w:r>
+      <w:r>
+        <w:rPr>
+          <w:rStyle w:val="OtherTok"/>
+        </w:rPr>
+        <w:t xml:space="preserve">]</w:t>
+      </w:r>
+      <w:r>
+        <w:br/>
+      </w:r>
+      <w:r>
+        <w:rPr>
+          <w:rStyle w:val="NormalTok"/>
+        </w:rPr>
+        <w:t xml:space="preserve">        </w:t>
+      </w:r>
+      <w:r>
+        <w:rPr>
+          <w:rStyle w:val="FunctionTok"/>
+        </w:rPr>
+        <w:t xml:space="preserve">}</w:t>
+      </w:r>
+      <w:r>
+        <w:br/>
+      </w:r>
+      <w:r>
+        <w:rPr>
+          <w:rStyle w:val="NormalTok"/>
+        </w:rPr>
+        <w:t xml:space="preserve">      </w:t>
+      </w:r>
+      <w:r>
+        <w:rPr>
+          <w:rStyle w:val="FunctionTok"/>
+        </w:rPr>
+        <w:t xml:space="preserve">}</w:t>
+      </w:r>
+      <w:r>
+        <w:br/>
+      </w:r>
+      <w:r>
+        <w:rPr>
+          <w:rStyle w:val="NormalTok"/>
+        </w:rPr>
+        <w:t xml:space="preserve">    </w:t>
+      </w:r>
+      <w:r>
+        <w:rPr>
+          <w:rStyle w:val="FunctionTok"/>
+        </w:rPr>
+        <w:t xml:space="preserve">}</w:t>
+      </w:r>
+      <w:r>
+        <w:br/>
+      </w:r>
+      <w:r>
+        <w:rPr>
+          <w:rStyle w:val="NormalTok"/>
+        </w:rPr>
+        <w:t xml:space="preserve">  </w:t>
+      </w:r>
+      <w:r>
+        <w:rPr>
+          <w:rStyle w:val="FunctionTok"/>
+        </w:rPr>
+        <w:t xml:space="preserve">}</w:t>
+      </w:r>
+      <w:r>
+        <w:br/>
+      </w:r>
+      <w:r>
+        <w:rPr>
+          <w:rStyle w:val="FunctionTok"/>
+        </w:rPr>
+        <w:t xml:space="preserve">}</w:t>
+      </w:r>
+    </w:p>
+    <w:p>
+      <w:pPr>
+        <w:pStyle w:val="FirstParagraph"/>
+      </w:pPr>
+      <w:r>
+        <w:t xml:space="preserve">When Studio or a Python tool connects to a stream:</w:t>
+      </w:r>
+      <w:r>
+        <w:t xml:space="preserve"> </w:t>
+      </w:r>
+      <w:r>
+        <w:t xml:space="preserve">1.</w:t>
+      </w:r>
+      <w:r>
+        <w:t xml:space="preserve"> </w:t>
+      </w:r>
+      <w:r>
+        <w:rPr>
+          <w:b/>
+          <w:bCs/>
+        </w:rPr>
+        <w:t xml:space="preserve">Dynamic barectf Unpack Compilation</w:t>
       </w:r>
       <w:r>
         <w:t xml:space="preserve">: Studio’s</w:t>
@@ -12438,7 +12524,16 @@
         <w:t xml:space="preserve"> </w:t>
       </w:r>
       <w:r>
-        <w:t xml:space="preserve">ingests the JSON schema and compiles the</w:t>
+        <w:t xml:space="preserve">(</w:t>
+      </w:r>
+      <w:r>
+        <w:rPr>
+          <w:rStyle w:val="VerbatimChar"/>
+        </w:rPr>
+        <w:t xml:space="preserve">tools/visualizer/ctf_schema_loader.py</w:t>
+      </w:r>
+      <w:r>
+        <w:t xml:space="preserve">) reads the barectf YAML or JSON configuration and compiles the</w:t>
       </w:r>
       <w:r>
         <w:t xml:space="preserve"> </w:t>

</xml_diff>

<commit_message>
docs: update python code snippets across article with hardware init, circular DMA, and plugin constructor
</commit_message>
<xml_diff>
--- a/docs/articles/micropython-on-e906/micropython_on_e906.docx
+++ b/docs/articles/micropython-on-e906/micropython_on_e906.docx
@@ -6232,7 +6232,19 @@
         <w:rPr>
           <w:rStyle w:val="NormalTok"/>
         </w:rPr>
-        <w:t xml:space="preserve">            channel.try_push(buf)</w:t>
+        <w:t xml:space="preserve">            channel.try_push(</w:t>
+      </w:r>
+      <w:r>
+        <w:rPr>
+          <w:rStyle w:val="BuiltInTok"/>
+        </w:rPr>
+        <w:t xml:space="preserve">bytes</w:t>
+      </w:r>
+      <w:r>
+        <w:rPr>
+          <w:rStyle w:val="NormalTok"/>
+        </w:rPr>
+        <w:t xml:space="preserve">(buf))</w:t>
       </w:r>
       <w:r>
         <w:br/>
@@ -7549,7 +7561,213 @@
         <w:pStyle w:val="FirstParagraph"/>
       </w:pPr>
       <w:r>
-        <w:t xml:space="preserve">Switching it to 115,200 baud is a binary configuration message to the GPS</w:t>
+        <w:t xml:space="preserve">You can also enable the</w:t>
+      </w:r>
+      <w:r>
+        <w:t xml:space="preserve"> </w:t>
+      </w:r>
+      <w:r>
+        <w:rPr>
+          <w:b/>
+          <w:bCs/>
+        </w:rPr>
+        <w:t xml:space="preserve">autonomous 16×64-byte circular DMA ring</w:t>
+      </w:r>
+      <w:r>
+        <w:t xml:space="preserve"> </w:t>
+      </w:r>
+      <w:r>
+        <w:t xml:space="preserve">in</w:t>
+      </w:r>
+      <w:r>
+        <w:t xml:space="preserve"> </w:t>
+      </w:r>
+      <w:r>
+        <w:rPr>
+          <w:rStyle w:val="VerbatimChar"/>
+        </w:rPr>
+        <w:t xml:space="preserve">.sram_c</w:t>
+      </w:r>
+      <w:r>
+        <w:t xml:space="preserve">:</w:t>
+      </w:r>
+    </w:p>
+    <w:p>
+      <w:pPr>
+        <w:pStyle w:val="SourceCode"/>
+      </w:pPr>
+      <w:r>
+        <w:rPr>
+          <w:rStyle w:val="OperatorTok"/>
+        </w:rPr>
+        <w:t xml:space="preserve">&gt;&gt;&gt;</w:t>
+      </w:r>
+      <w:r>
+        <w:rPr>
+          <w:rStyle w:val="NormalTok"/>
+        </w:rPr>
+        <w:t xml:space="preserve"> abstractx.uart_dma(</w:t>
+      </w:r>
+      <w:r>
+        <w:rPr>
+          <w:rStyle w:val="VariableTok"/>
+        </w:rPr>
+        <w:t xml:space="preserve">True</w:t>
+      </w:r>
+      <w:r>
+        <w:rPr>
+          <w:rStyle w:val="NormalTok"/>
+        </w:rPr>
+        <w:t xml:space="preserve">)                      </w:t>
+      </w:r>
+      <w:r>
+        <w:rPr>
+          <w:rStyle w:val="CommentTok"/>
+        </w:rPr>
+        <w:t xml:space="preserve"># activates circular DMA on UART3</w:t>
+      </w:r>
+      <w:r>
+        <w:br/>
+      </w:r>
+      <w:r>
+        <w:rPr>
+          <w:rStyle w:val="OperatorTok"/>
+        </w:rPr>
+        <w:t xml:space="preserve">&gt;&gt;&gt;</w:t>
+      </w:r>
+      <w:r>
+        <w:rPr>
+          <w:rStyle w:val="NormalTok"/>
+        </w:rPr>
+        <w:t xml:space="preserve"> buf </w:t>
+      </w:r>
+      <w:r>
+        <w:rPr>
+          <w:rStyle w:val="OperatorTok"/>
+        </w:rPr>
+        <w:t xml:space="preserve">=</w:t>
+      </w:r>
+      <w:r>
+        <w:rPr>
+          <w:rStyle w:val="NormalTok"/>
+        </w:rPr>
+        <w:t xml:space="preserve"> </w:t>
+      </w:r>
+      <w:r>
+        <w:rPr>
+          <w:rStyle w:val="BuiltInTok"/>
+        </w:rPr>
+        <w:t xml:space="preserve">bytearray</w:t>
+      </w:r>
+      <w:r>
+        <w:rPr>
+          <w:rStyle w:val="NormalTok"/>
+        </w:rPr>
+        <w:t xml:space="preserve">(</w:t>
+      </w:r>
+      <w:r>
+        <w:rPr>
+          <w:rStyle w:val="DecValTok"/>
+        </w:rPr>
+        <w:t xml:space="preserve">512</w:t>
+      </w:r>
+      <w:r>
+        <w:rPr>
+          <w:rStyle w:val="NormalTok"/>
+        </w:rPr>
+        <w:t xml:space="preserve">)</w:t>
+      </w:r>
+      <w:r>
+        <w:br/>
+      </w:r>
+      <w:r>
+        <w:rPr>
+          <w:rStyle w:val="OperatorTok"/>
+        </w:rPr>
+        <w:t xml:space="preserve">&gt;&gt;&gt;</w:t>
+      </w:r>
+      <w:r>
+        <w:rPr>
+          <w:rStyle w:val="NormalTok"/>
+        </w:rPr>
+        <w:t xml:space="preserve"> n </w:t>
+      </w:r>
+      <w:r>
+        <w:rPr>
+          <w:rStyle w:val="OperatorTok"/>
+        </w:rPr>
+        <w:t xml:space="preserve">=</w:t>
+      </w:r>
+      <w:r>
+        <w:rPr>
+          <w:rStyle w:val="NormalTok"/>
+        </w:rPr>
+        <w:t xml:space="preserve"> abstractx.uart_read_into(buf)             </w:t>
+      </w:r>
+      <w:r>
+        <w:rPr>
+          <w:rStyle w:val="CommentTok"/>
+        </w:rPr>
+        <w:t xml:space="preserve"># zero-copy drain from DMA ring</w:t>
+      </w:r>
+      <w:r>
+        <w:br/>
+      </w:r>
+      <w:r>
+        <w:rPr>
+          <w:rStyle w:val="OperatorTok"/>
+        </w:rPr>
+        <w:t xml:space="preserve">&gt;&gt;&gt;</w:t>
+      </w:r>
+      <w:r>
+        <w:rPr>
+          <w:rStyle w:val="NormalTok"/>
+        </w:rPr>
+        <w:t xml:space="preserve"> </w:t>
+      </w:r>
+      <w:r>
+        <w:rPr>
+          <w:rStyle w:val="BuiltInTok"/>
+        </w:rPr>
+        <w:t xml:space="preserve">print</w:t>
+      </w:r>
+      <w:r>
+        <w:rPr>
+          <w:rStyle w:val="NormalTok"/>
+        </w:rPr>
+        <w:t xml:space="preserve">(</w:t>
+      </w:r>
+      <w:r>
+        <w:rPr>
+          <w:rStyle w:val="BuiltInTok"/>
+        </w:rPr>
+        <w:t xml:space="preserve">str</w:t>
+      </w:r>
+      <w:r>
+        <w:rPr>
+          <w:rStyle w:val="NormalTok"/>
+        </w:rPr>
+        <w:t xml:space="preserve">(buf[:n], </w:t>
+      </w:r>
+      <w:r>
+        <w:rPr>
+          <w:rStyle w:val="StringTok"/>
+        </w:rPr>
+        <w:t xml:space="preserve">"ascii"</w:t>
+      </w:r>
+      <w:r>
+        <w:rPr>
+          <w:rStyle w:val="NormalTok"/>
+        </w:rPr>
+        <w:t xml:space="preserve">))</w:t>
+      </w:r>
+    </w:p>
+    <w:p>
+      <w:pPr>
+        <w:pStyle w:val="FirstParagraph"/>
+      </w:pPr>
+      <w:r>
+        <w:t xml:space="preserve">Switching the GPS to 115,200 baud is a binary configuration message to the GPS</w:t>
       </w:r>
       <w:r>
         <w:t xml:space="preserve"> </w:t>
@@ -7584,13 +7802,7 @@
         <w:t xml:space="preserve"> </w:t>
       </w:r>
       <w:r>
-        <w:t xml:space="preserve">shows the exact bytes. At 115,200 baud more than 512 bytes can arrive between</w:t>
-      </w:r>
-      <w:r>
-        <w:t xml:space="preserve"> </w:t>
-      </w:r>
-      <w:r>
-        <w:t xml:space="preserve">two reads, so read in a loop until a read returns less than 512.</w:t>
+        <w:t xml:space="preserve">shows the exact bytes. At 115,200 baud, circular DMA absorbs bursts without dropping a byte.</w:t>
       </w:r>
     </w:p>
     <w:bookmarkEnd w:id="50"/>
@@ -8332,7 +8544,277 @@
         <w:rPr>
           <w:rStyle w:val="CommentTok"/>
         </w:rPr>
-        <w:t xml:space="preserve"># 1. Channels matching AbstractX C++ AsyncQueue&lt;T, N&gt;</w:t>
+        <w:t xml:space="preserve"># 1. Initialize hardware buses &amp; circular DMA</w:t>
+      </w:r>
+      <w:r>
+        <w:br/>
+      </w:r>
+      <w:r>
+        <w:rPr>
+          <w:rStyle w:val="NormalTok"/>
+        </w:rPr>
+        <w:t xml:space="preserve">abstractx.i2c_init(</w:t>
+      </w:r>
+      <w:r>
+        <w:rPr>
+          <w:rStyle w:val="DecValTok"/>
+        </w:rPr>
+        <w:t xml:space="preserve">400000</w:t>
+      </w:r>
+      <w:r>
+        <w:rPr>
+          <w:rStyle w:val="NormalTok"/>
+        </w:rPr>
+        <w:t xml:space="preserve">)</w:t>
+      </w:r>
+      <w:r>
+        <w:br/>
+      </w:r>
+      <w:r>
+        <w:rPr>
+          <w:rStyle w:val="NormalTok"/>
+        </w:rPr>
+        <w:t xml:space="preserve">abstractx.i2c_write(</w:t>
+      </w:r>
+      <w:r>
+        <w:rPr>
+          <w:rStyle w:val="BaseNTok"/>
+        </w:rPr>
+        <w:t xml:space="preserve">0x1E</w:t>
+      </w:r>
+      <w:r>
+        <w:rPr>
+          <w:rStyle w:val="NormalTok"/>
+        </w:rPr>
+        <w:t xml:space="preserve">, </w:t>
+      </w:r>
+      <w:r>
+        <w:rPr>
+          <w:rStyle w:val="BaseNTok"/>
+        </w:rPr>
+        <w:t xml:space="preserve">0x00</w:t>
+      </w:r>
+      <w:r>
+        <w:rPr>
+          <w:rStyle w:val="NormalTok"/>
+        </w:rPr>
+        <w:t xml:space="preserve">, </w:t>
+      </w:r>
+      <w:r>
+        <w:rPr>
+          <w:rStyle w:val="StringTok"/>
+        </w:rPr>
+        <w:t xml:space="preserve">b"</w:t>
+      </w:r>
+      <w:r>
+        <w:rPr>
+          <w:rStyle w:val="CharTok"/>
+        </w:rPr>
+        <w:t xml:space="preserve">\x70</w:t>
+      </w:r>
+      <w:r>
+        <w:rPr>
+          <w:rStyle w:val="StringTok"/>
+        </w:rPr>
+        <w:t xml:space="preserve">"</w:t>
+      </w:r>
+      <w:r>
+        <w:rPr>
+          <w:rStyle w:val="NormalTok"/>
+        </w:rPr>
+        <w:t xml:space="preserve">)      </w:t>
+      </w:r>
+      <w:r>
+        <w:rPr>
+          <w:rStyle w:val="CommentTok"/>
+        </w:rPr>
+        <w:t xml:space="preserve"># CRA: 8-sample average, 15 Hz</w:t>
+      </w:r>
+      <w:r>
+        <w:br/>
+      </w:r>
+      <w:r>
+        <w:rPr>
+          <w:rStyle w:val="NormalTok"/>
+        </w:rPr>
+        <w:t xml:space="preserve">abstractx.i2c_write(</w:t>
+      </w:r>
+      <w:r>
+        <w:rPr>
+          <w:rStyle w:val="BaseNTok"/>
+        </w:rPr>
+        <w:t xml:space="preserve">0x1E</w:t>
+      </w:r>
+      <w:r>
+        <w:rPr>
+          <w:rStyle w:val="NormalTok"/>
+        </w:rPr>
+        <w:t xml:space="preserve">, </w:t>
+      </w:r>
+      <w:r>
+        <w:rPr>
+          <w:rStyle w:val="BaseNTok"/>
+        </w:rPr>
+        <w:t xml:space="preserve">0x01</w:t>
+      </w:r>
+      <w:r>
+        <w:rPr>
+          <w:rStyle w:val="NormalTok"/>
+        </w:rPr>
+        <w:t xml:space="preserve">, </w:t>
+      </w:r>
+      <w:r>
+        <w:rPr>
+          <w:rStyle w:val="StringTok"/>
+        </w:rPr>
+        <w:t xml:space="preserve">b"</w:t>
+      </w:r>
+      <w:r>
+        <w:rPr>
+          <w:rStyle w:val="CharTok"/>
+        </w:rPr>
+        <w:t xml:space="preserve">\x20</w:t>
+      </w:r>
+      <w:r>
+        <w:rPr>
+          <w:rStyle w:val="StringTok"/>
+        </w:rPr>
+        <w:t xml:space="preserve">"</w:t>
+      </w:r>
+      <w:r>
+        <w:rPr>
+          <w:rStyle w:val="NormalTok"/>
+        </w:rPr>
+        <w:t xml:space="preserve">)      </w:t>
+      </w:r>
+      <w:r>
+        <w:rPr>
+          <w:rStyle w:val="CommentTok"/>
+        </w:rPr>
+        <w:t xml:space="preserve"># CRB: +-1.3 gauss</w:t>
+      </w:r>
+      <w:r>
+        <w:br/>
+      </w:r>
+      <w:r>
+        <w:rPr>
+          <w:rStyle w:val="NormalTok"/>
+        </w:rPr>
+        <w:t xml:space="preserve">abstractx.i2c_write(</w:t>
+      </w:r>
+      <w:r>
+        <w:rPr>
+          <w:rStyle w:val="BaseNTok"/>
+        </w:rPr>
+        <w:t xml:space="preserve">0x1E</w:t>
+      </w:r>
+      <w:r>
+        <w:rPr>
+          <w:rStyle w:val="NormalTok"/>
+        </w:rPr>
+        <w:t xml:space="preserve">, </w:t>
+      </w:r>
+      <w:r>
+        <w:rPr>
+          <w:rStyle w:val="BaseNTok"/>
+        </w:rPr>
+        <w:t xml:space="preserve">0x02</w:t>
+      </w:r>
+      <w:r>
+        <w:rPr>
+          <w:rStyle w:val="NormalTok"/>
+        </w:rPr>
+        <w:t xml:space="preserve">, </w:t>
+      </w:r>
+      <w:r>
+        <w:rPr>
+          <w:rStyle w:val="StringTok"/>
+        </w:rPr>
+        <w:t xml:space="preserve">b"</w:t>
+      </w:r>
+      <w:r>
+        <w:rPr>
+          <w:rStyle w:val="CharTok"/>
+        </w:rPr>
+        <w:t xml:space="preserve">\x00</w:t>
+      </w:r>
+      <w:r>
+        <w:rPr>
+          <w:rStyle w:val="StringTok"/>
+        </w:rPr>
+        <w:t xml:space="preserve">"</w:t>
+      </w:r>
+      <w:r>
+        <w:rPr>
+          <w:rStyle w:val="NormalTok"/>
+        </w:rPr>
+        <w:t xml:space="preserve">)      </w:t>
+      </w:r>
+      <w:r>
+        <w:rPr>
+          <w:rStyle w:val="CommentTok"/>
+        </w:rPr>
+        <w:t xml:space="preserve"># MR: continuous measurement</w:t>
+      </w:r>
+      <w:r>
+        <w:br/>
+      </w:r>
+      <w:r>
+        <w:rPr>
+          <w:rStyle w:val="NormalTok"/>
+        </w:rPr>
+        <w:t xml:space="preserve">abstractx.uart_init(</w:t>
+      </w:r>
+      <w:r>
+        <w:rPr>
+          <w:rStyle w:val="DecValTok"/>
+        </w:rPr>
+        <w:t xml:space="preserve">115200</w:t>
+      </w:r>
+      <w:r>
+        <w:rPr>
+          <w:rStyle w:val="NormalTok"/>
+        </w:rPr>
+        <w:t xml:space="preserve">)</w:t>
+      </w:r>
+      <w:r>
+        <w:br/>
+      </w:r>
+      <w:r>
+        <w:rPr>
+          <w:rStyle w:val="NormalTok"/>
+        </w:rPr>
+        <w:t xml:space="preserve">abstractx.uart_dma(</w:t>
+      </w:r>
+      <w:r>
+        <w:rPr>
+          <w:rStyle w:val="VariableTok"/>
+        </w:rPr>
+        <w:t xml:space="preserve">True</w:t>
+      </w:r>
+      <w:r>
+        <w:rPr>
+          <w:rStyle w:val="NormalTok"/>
+        </w:rPr>
+        <w:t xml:space="preserve">)                      </w:t>
+      </w:r>
+      <w:r>
+        <w:rPr>
+          <w:rStyle w:val="CommentTok"/>
+        </w:rPr>
+        <w:t xml:space="preserve"># activate 16x64B circular DMA</w:t>
+      </w:r>
+      <w:r>
+        <w:br/>
+      </w:r>
+      <w:r>
+        <w:br/>
+      </w:r>
+      <w:r>
+        <w:rPr>
+          <w:rStyle w:val="CommentTok"/>
+        </w:rPr>
+        <w:t xml:space="preserve"># 2. Channels matching AbstractX C++ AsyncQueue&lt;T, N&gt;</w:t>
       </w:r>
       <w:r>
         <w:br/>
@@ -8410,7 +8892,7 @@
         <w:rPr>
           <w:rStyle w:val="CommentTok"/>
         </w:rPr>
-        <w:t xml:space="preserve"># 2. Dedicated Sensor Producers</w:t>
+        <w:t xml:space="preserve"># 3. Dedicated Sensor Producers</w:t>
       </w:r>
       <w:r>
         <w:br/>
@@ -8920,7 +9402,7 @@
         <w:rPr>
           <w:rStyle w:val="CommentTok"/>
         </w:rPr>
-        <w:t xml:space="preserve"># 3. Primary-Paced Consumer Loop</w:t>
+        <w:t xml:space="preserve"># 4. Primary-Paced Consumer Loop</w:t>
       </w:r>
       <w:r>
         <w:br/>
@@ -8971,6 +9453,33 @@
         <w:rPr>
           <w:rStyle w:val="NormalTok"/>
         </w:rPr>
+        <w:t xml:space="preserve">    epoch </w:t>
+      </w:r>
+      <w:r>
+        <w:rPr>
+          <w:rStyle w:val="OperatorTok"/>
+        </w:rPr>
+        <w:t xml:space="preserve">=</w:t>
+      </w:r>
+      <w:r>
+        <w:rPr>
+          <w:rStyle w:val="NormalTok"/>
+        </w:rPr>
+        <w:t xml:space="preserve"> </w:t>
+      </w:r>
+      <w:r>
+        <w:rPr>
+          <w:rStyle w:val="DecValTok"/>
+        </w:rPr>
+        <w:t xml:space="preserve">0</w:t>
+      </w:r>
+      <w:r>
+        <w:br/>
+      </w:r>
+      <w:r>
+        <w:rPr>
+          <w:rStyle w:val="NormalTok"/>
+        </w:rPr>
         <w:t xml:space="preserve">    </w:t>
       </w:r>
       <w:r>
@@ -9208,13 +9717,283 @@
         <w:rPr>
           <w:rStyle w:val="NormalTok"/>
         </w:rPr>
+        <w:t xml:space="preserve">        epoch </w:t>
+      </w:r>
+      <w:r>
+        <w:rPr>
+          <w:rStyle w:val="OperatorTok"/>
+        </w:rPr>
+        <w:t xml:space="preserve">+=</w:t>
+      </w:r>
+      <w:r>
+        <w:rPr>
+          <w:rStyle w:val="NormalTok"/>
+        </w:rPr>
+        <w:t xml:space="preserve"> </w:t>
+      </w:r>
+      <w:r>
+        <w:rPr>
+          <w:rStyle w:val="DecValTok"/>
+        </w:rPr>
+        <w:t xml:space="preserve">1</w:t>
+      </w:r>
+      <w:r>
+        <w:br/>
+      </w:r>
+      <w:r>
+        <w:rPr>
+          <w:rStyle w:val="NormalTok"/>
+        </w:rPr>
         <w:t xml:space="preserve">        </w:t>
       </w:r>
       <w:r>
         <w:rPr>
           <w:rStyle w:val="CommentTok"/>
         </w:rPr>
-        <w:t xml:space="preserve"># Update attitude &amp; navigation solution</w:t>
+        <w:t xml:space="preserve"># Decode 16-bit big-endian X, Z, Y</w:t>
+      </w:r>
+      <w:r>
+        <w:br/>
+      </w:r>
+      <w:r>
+        <w:rPr>
+          <w:rStyle w:val="NormalTok"/>
+        </w:rPr>
+        <w:t xml:space="preserve">        x </w:t>
+      </w:r>
+      <w:r>
+        <w:rPr>
+          <w:rStyle w:val="OperatorTok"/>
+        </w:rPr>
+        <w:t xml:space="preserve">=</w:t>
+      </w:r>
+      <w:r>
+        <w:rPr>
+          <w:rStyle w:val="NormalTok"/>
+        </w:rPr>
+        <w:t xml:space="preserve"> (mag_sample[</w:t>
+      </w:r>
+      <w:r>
+        <w:rPr>
+          <w:rStyle w:val="DecValTok"/>
+        </w:rPr>
+        <w:t xml:space="preserve">0</w:t>
+      </w:r>
+      <w:r>
+        <w:rPr>
+          <w:rStyle w:val="NormalTok"/>
+        </w:rPr>
+        <w:t xml:space="preserve">] </w:t>
+      </w:r>
+      <w:r>
+        <w:rPr>
+          <w:rStyle w:val="OperatorTok"/>
+        </w:rPr>
+        <w:t xml:space="preserve">&lt;&lt;</w:t>
+      </w:r>
+      <w:r>
+        <w:rPr>
+          <w:rStyle w:val="NormalTok"/>
+        </w:rPr>
+        <w:t xml:space="preserve"> </w:t>
+      </w:r>
+      <w:r>
+        <w:rPr>
+          <w:rStyle w:val="DecValTok"/>
+        </w:rPr>
+        <w:t xml:space="preserve">8</w:t>
+      </w:r>
+      <w:r>
+        <w:rPr>
+          <w:rStyle w:val="NormalTok"/>
+        </w:rPr>
+        <w:t xml:space="preserve">) </w:t>
+      </w:r>
+      <w:r>
+        <w:rPr>
+          <w:rStyle w:val="OperatorTok"/>
+        </w:rPr>
+        <w:t xml:space="preserve">|</w:t>
+      </w:r>
+      <w:r>
+        <w:rPr>
+          <w:rStyle w:val="NormalTok"/>
+        </w:rPr>
+        <w:t xml:space="preserve"> mag_sample[</w:t>
+      </w:r>
+      <w:r>
+        <w:rPr>
+          <w:rStyle w:val="DecValTok"/>
+        </w:rPr>
+        <w:t xml:space="preserve">1</w:t>
+      </w:r>
+      <w:r>
+        <w:rPr>
+          <w:rStyle w:val="NormalTok"/>
+        </w:rPr>
+        <w:t xml:space="preserve">]</w:t>
+      </w:r>
+      <w:r>
+        <w:br/>
+      </w:r>
+      <w:r>
+        <w:rPr>
+          <w:rStyle w:val="NormalTok"/>
+        </w:rPr>
+        <w:t xml:space="preserve">        z </w:t>
+      </w:r>
+      <w:r>
+        <w:rPr>
+          <w:rStyle w:val="OperatorTok"/>
+        </w:rPr>
+        <w:t xml:space="preserve">=</w:t>
+      </w:r>
+      <w:r>
+        <w:rPr>
+          <w:rStyle w:val="NormalTok"/>
+        </w:rPr>
+        <w:t xml:space="preserve"> (mag_sample[</w:t>
+      </w:r>
+      <w:r>
+        <w:rPr>
+          <w:rStyle w:val="DecValTok"/>
+        </w:rPr>
+        <w:t xml:space="preserve">2</w:t>
+      </w:r>
+      <w:r>
+        <w:rPr>
+          <w:rStyle w:val="NormalTok"/>
+        </w:rPr>
+        <w:t xml:space="preserve">] </w:t>
+      </w:r>
+      <w:r>
+        <w:rPr>
+          <w:rStyle w:val="OperatorTok"/>
+        </w:rPr>
+        <w:t xml:space="preserve">&lt;&lt;</w:t>
+      </w:r>
+      <w:r>
+        <w:rPr>
+          <w:rStyle w:val="NormalTok"/>
+        </w:rPr>
+        <w:t xml:space="preserve"> </w:t>
+      </w:r>
+      <w:r>
+        <w:rPr>
+          <w:rStyle w:val="DecValTok"/>
+        </w:rPr>
+        <w:t xml:space="preserve">8</w:t>
+      </w:r>
+      <w:r>
+        <w:rPr>
+          <w:rStyle w:val="NormalTok"/>
+        </w:rPr>
+        <w:t xml:space="preserve">) </w:t>
+      </w:r>
+      <w:r>
+        <w:rPr>
+          <w:rStyle w:val="OperatorTok"/>
+        </w:rPr>
+        <w:t xml:space="preserve">|</w:t>
+      </w:r>
+      <w:r>
+        <w:rPr>
+          <w:rStyle w:val="NormalTok"/>
+        </w:rPr>
+        <w:t xml:space="preserve"> mag_sample[</w:t>
+      </w:r>
+      <w:r>
+        <w:rPr>
+          <w:rStyle w:val="DecValTok"/>
+        </w:rPr>
+        <w:t xml:space="preserve">3</w:t>
+      </w:r>
+      <w:r>
+        <w:rPr>
+          <w:rStyle w:val="NormalTok"/>
+        </w:rPr>
+        <w:t xml:space="preserve">]</w:t>
+      </w:r>
+      <w:r>
+        <w:br/>
+      </w:r>
+      <w:r>
+        <w:rPr>
+          <w:rStyle w:val="NormalTok"/>
+        </w:rPr>
+        <w:t xml:space="preserve">        y </w:t>
+      </w:r>
+      <w:r>
+        <w:rPr>
+          <w:rStyle w:val="OperatorTok"/>
+        </w:rPr>
+        <w:t xml:space="preserve">=</w:t>
+      </w:r>
+      <w:r>
+        <w:rPr>
+          <w:rStyle w:val="NormalTok"/>
+        </w:rPr>
+        <w:t xml:space="preserve"> (mag_sample[</w:t>
+      </w:r>
+      <w:r>
+        <w:rPr>
+          <w:rStyle w:val="DecValTok"/>
+        </w:rPr>
+        <w:t xml:space="preserve">4</w:t>
+      </w:r>
+      <w:r>
+        <w:rPr>
+          <w:rStyle w:val="NormalTok"/>
+        </w:rPr>
+        <w:t xml:space="preserve">] </w:t>
+      </w:r>
+      <w:r>
+        <w:rPr>
+          <w:rStyle w:val="OperatorTok"/>
+        </w:rPr>
+        <w:t xml:space="preserve">&lt;&lt;</w:t>
+      </w:r>
+      <w:r>
+        <w:rPr>
+          <w:rStyle w:val="NormalTok"/>
+        </w:rPr>
+        <w:t xml:space="preserve"> </w:t>
+      </w:r>
+      <w:r>
+        <w:rPr>
+          <w:rStyle w:val="DecValTok"/>
+        </w:rPr>
+        <w:t xml:space="preserve">8</w:t>
+      </w:r>
+      <w:r>
+        <w:rPr>
+          <w:rStyle w:val="NormalTok"/>
+        </w:rPr>
+        <w:t xml:space="preserve">) </w:t>
+      </w:r>
+      <w:r>
+        <w:rPr>
+          <w:rStyle w:val="OperatorTok"/>
+        </w:rPr>
+        <w:t xml:space="preserve">|</w:t>
+      </w:r>
+      <w:r>
+        <w:rPr>
+          <w:rStyle w:val="NormalTok"/>
+        </w:rPr>
+        <w:t xml:space="preserve"> mag_sample[</w:t>
+      </w:r>
+      <w:r>
+        <w:rPr>
+          <w:rStyle w:val="DecValTok"/>
+        </w:rPr>
+        <w:t xml:space="preserve">5</w:t>
+      </w:r>
+      <w:r>
+        <w:rPr>
+          <w:rStyle w:val="NormalTok"/>
+        </w:rPr>
+        <w:t xml:space="preserve">]</w:t>
       </w:r>
       <w:r>
         <w:br/>
@@ -9227,9 +10006,174 @@
       </w:r>
       <w:r>
         <w:rPr>
+          <w:rStyle w:val="ControlFlowTok"/>
+        </w:rPr>
+        <w:t xml:space="preserve">if</w:t>
+      </w:r>
+      <w:r>
+        <w:rPr>
+          <w:rStyle w:val="NormalTok"/>
+        </w:rPr>
+        <w:t xml:space="preserve"> epoch </w:t>
+      </w:r>
+      <w:r>
+        <w:rPr>
+          <w:rStyle w:val="OperatorTok"/>
+        </w:rPr>
+        <w:t xml:space="preserve">%</w:t>
+      </w:r>
+      <w:r>
+        <w:rPr>
+          <w:rStyle w:val="NormalTok"/>
+        </w:rPr>
+        <w:t xml:space="preserve"> </w:t>
+      </w:r>
+      <w:r>
+        <w:rPr>
+          <w:rStyle w:val="DecValTok"/>
+        </w:rPr>
+        <w:t xml:space="preserve">10</w:t>
+      </w:r>
+      <w:r>
+        <w:rPr>
+          <w:rStyle w:val="NormalTok"/>
+        </w:rPr>
+        <w:t xml:space="preserve"> </w:t>
+      </w:r>
+      <w:r>
+        <w:rPr>
+          <w:rStyle w:val="OperatorTok"/>
+        </w:rPr>
+        <w:t xml:space="preserve">==</w:t>
+      </w:r>
+      <w:r>
+        <w:rPr>
+          <w:rStyle w:val="NormalTok"/>
+        </w:rPr>
+        <w:t xml:space="preserve"> </w:t>
+      </w:r>
+      <w:r>
+        <w:rPr>
+          <w:rStyle w:val="DecValTok"/>
+        </w:rPr>
+        <w:t xml:space="preserve">0</w:t>
+      </w:r>
+      <w:r>
+        <w:rPr>
+          <w:rStyle w:val="NormalTok"/>
+        </w:rPr>
+        <w:t xml:space="preserve">:  </w:t>
+      </w:r>
+      <w:r>
+        <w:rPr>
           <w:rStyle w:val="CommentTok"/>
         </w:rPr>
-        <w:t xml:space="preserve"># (Zero blocking, zero heap churn, zero GC pauses)</w:t>
+        <w:t xml:space="preserve"># Print every 10th epoch (5 Hz output rate)</w:t>
+      </w:r>
+      <w:r>
+        <w:br/>
+      </w:r>
+      <w:r>
+        <w:rPr>
+          <w:rStyle w:val="NormalTok"/>
+        </w:rPr>
+        <w:t xml:space="preserve">            </w:t>
+      </w:r>
+      <w:r>
+        <w:rPr>
+          <w:rStyle w:val="BuiltInTok"/>
+        </w:rPr>
+        <w:t xml:space="preserve">print</w:t>
+      </w:r>
+      <w:r>
+        <w:rPr>
+          <w:rStyle w:val="NormalTok"/>
+        </w:rPr>
+        <w:t xml:space="preserve">(</w:t>
+      </w:r>
+      <w:r>
+        <w:rPr>
+          <w:rStyle w:val="StringTok"/>
+        </w:rPr>
+        <w:t xml:space="preserve">"Epoch"</w:t>
+      </w:r>
+      <w:r>
+        <w:rPr>
+          <w:rStyle w:val="NormalTok"/>
+        </w:rPr>
+        <w:t xml:space="preserve">, epoch, </w:t>
+      </w:r>
+      <w:r>
+        <w:rPr>
+          <w:rStyle w:val="StringTok"/>
+        </w:rPr>
+        <w:t xml:space="preserve">"Mag:"</w:t>
+      </w:r>
+      <w:r>
+        <w:rPr>
+          <w:rStyle w:val="NormalTok"/>
+        </w:rPr>
+        <w:t xml:space="preserve">, (x, y, z), </w:t>
+      </w:r>
+      <w:r>
+        <w:rPr>
+          <w:rStyle w:val="StringTok"/>
+        </w:rPr>
+        <w:t xml:space="preserve">"GPS bytes:"</w:t>
+      </w:r>
+      <w:r>
+        <w:rPr>
+          <w:rStyle w:val="NormalTok"/>
+        </w:rPr>
+        <w:t xml:space="preserve">, </w:t>
+      </w:r>
+      <w:r>
+        <w:rPr>
+          <w:rStyle w:val="BuiltInTok"/>
+        </w:rPr>
+        <w:t xml:space="preserve">len</w:t>
+      </w:r>
+      <w:r>
+        <w:rPr>
+          <w:rStyle w:val="NormalTok"/>
+        </w:rPr>
+        <w:t xml:space="preserve">(last_gps) </w:t>
+      </w:r>
+      <w:r>
+        <w:rPr>
+          <w:rStyle w:val="ControlFlowTok"/>
+        </w:rPr>
+        <w:t xml:space="preserve">if</w:t>
+      </w:r>
+      <w:r>
+        <w:rPr>
+          <w:rStyle w:val="NormalTok"/>
+        </w:rPr>
+        <w:t xml:space="preserve"> last_gps </w:t>
+      </w:r>
+      <w:r>
+        <w:rPr>
+          <w:rStyle w:val="ControlFlowTok"/>
+        </w:rPr>
+        <w:t xml:space="preserve">else</w:t>
+      </w:r>
+      <w:r>
+        <w:rPr>
+          <w:rStyle w:val="NormalTok"/>
+        </w:rPr>
+        <w:t xml:space="preserve"> </w:t>
+      </w:r>
+      <w:r>
+        <w:rPr>
+          <w:rStyle w:val="DecValTok"/>
+        </w:rPr>
+        <w:t xml:space="preserve">0</w:t>
+      </w:r>
+      <w:r>
+        <w:rPr>
+          <w:rStyle w:val="NormalTok"/>
+        </w:rPr>
+        <w:t xml:space="preserve">)</w:t>
       </w:r>
       <w:r>
         <w:br/>
@@ -9241,7 +10185,7 @@
         <w:rPr>
           <w:rStyle w:val="CommentTok"/>
         </w:rPr>
-        <w:t xml:space="preserve"># 4. Cooperative Dispatcher</w:t>
+        <w:t xml:space="preserve"># 5. Cooperative Dispatcher</w:t>
       </w:r>
       <w:r>
         <w:br/>
@@ -13555,7 +14499,19 @@
         <w:rPr>
           <w:rStyle w:val="NormalTok"/>
         </w:rPr>
-        <w:t xml:space="preserve"> on_init(</w:t>
+        <w:t xml:space="preserve"> </w:t>
+      </w:r>
+      <w:r>
+        <w:rPr>
+          <w:rStyle w:val="FunctionTok"/>
+        </w:rPr>
+        <w:t xml:space="preserve">__init__</w:t>
+      </w:r>
+      <w:r>
+        <w:rPr>
+          <w:rStyle w:val="NormalTok"/>
+        </w:rPr>
+        <w:t xml:space="preserve">(</w:t>
       </w:r>
       <w:r>
         <w:rPr>
@@ -13567,7 +14523,64 @@
         <w:rPr>
           <w:rStyle w:val="NormalTok"/>
         </w:rPr>
-        <w:t xml:space="preserve">, context):</w:t>
+        <w:t xml:space="preserve">):</w:t>
+      </w:r>
+      <w:r>
+        <w:br/>
+      </w:r>
+      <w:r>
+        <w:rPr>
+          <w:rStyle w:val="NormalTok"/>
+        </w:rPr>
+        <w:t xml:space="preserve">        </w:t>
+      </w:r>
+      <w:r>
+        <w:rPr>
+          <w:rStyle w:val="BuiltInTok"/>
+        </w:rPr>
+        <w:t xml:space="preserve">super</w:t>
+      </w:r>
+      <w:r>
+        <w:rPr>
+          <w:rStyle w:val="NormalTok"/>
+        </w:rPr>
+        <w:t xml:space="preserve">().</w:t>
+      </w:r>
+      <w:r>
+        <w:rPr>
+          <w:rStyle w:val="FunctionTok"/>
+        </w:rPr>
+        <w:t xml:space="preserve">__init__</w:t>
+      </w:r>
+      <w:r>
+        <w:rPr>
+          <w:rStyle w:val="NormalTok"/>
+        </w:rPr>
+        <w:t xml:space="preserve">(</w:t>
+      </w:r>
+      <w:r>
+        <w:rPr>
+          <w:rStyle w:val="StringTok"/>
+        </w:rPr>
+        <w:t xml:space="preserve">"Custom Dashboard"</w:t>
+      </w:r>
+      <w:r>
+        <w:rPr>
+          <w:rStyle w:val="NormalTok"/>
+        </w:rPr>
+        <w:t xml:space="preserve">, </w:t>
+      </w:r>
+      <w:r>
+        <w:rPr>
+          <w:rStyle w:val="StringTok"/>
+        </w:rPr>
+        <w:t xml:space="preserve">"1.0"</w:t>
+      </w:r>
+      <w:r>
+        <w:rPr>
+          <w:rStyle w:val="NormalTok"/>
+        </w:rPr>
+        <w:t xml:space="preserve">)</w:t>
       </w:r>
       <w:r>
         <w:br/>

</xml_diff>

<commit_message>
docs: highlight Studio window customization, docking freedom, and embedding custom tabs
</commit_message>
<xml_diff>
--- a/docs/articles/micropython-on-e906/micropython_on_e906.docx
+++ b/docs/articles/micropython-on-e906/micropython_on_e906.docx
@@ -10618,6 +10618,58 @@
         <w:pStyle w:val="BodyText"/>
       </w:pPr>
       <w:r>
+        <w:t xml:space="preserve">The workbench is</w:t>
+      </w:r>
+      <w:r>
+        <w:t xml:space="preserve"> </w:t>
+      </w:r>
+      <w:r>
+        <w:rPr>
+          <w:b/>
+          <w:bCs/>
+        </w:rPr>
+        <w:t xml:space="preserve">fully customizable</w:t>
+      </w:r>
+      <w:r>
+        <w:t xml:space="preserve">: developers can drag, re-dock, split horizontally or vertically, and stack tabs anywhere on the canvas. With multi-viewport docking enabled by default, any tool can be torn off into its own independent OS window on a second monitor with a 1-click</w:t>
+      </w:r>
+      <w:r>
+        <w:t xml:space="preserve"> </w:t>
+      </w:r>
+      <w:r>
+        <w:rPr>
+          <w:rStyle w:val="VerbatimChar"/>
+        </w:rPr>
+        <w:t xml:space="preserve">Pop In</w:t>
+      </w:r>
+      <w:r>
+        <w:t xml:space="preserve"> </w:t>
+      </w:r>
+      <w:r>
+        <w:t xml:space="preserve">button to re-dock. Crucially, Studio is not a fixed dashboard—it allows developers to</w:t>
+      </w:r>
+      <w:r>
+        <w:t xml:space="preserve"> </w:t>
+      </w:r>
+      <w:r>
+        <w:rPr>
+          <w:b/>
+          <w:bCs/>
+        </w:rPr>
+        <w:t xml:space="preserve">embed their own custom tabs and instruments</w:t>
+      </w:r>
+      <w:r>
+        <w:t xml:space="preserve"> </w:t>
+      </w:r>
+      <w:r>
+        <w:t xml:space="preserve">directly into the workbench using an open Python plugin architecture.</w:t>
+      </w:r>
+    </w:p>
+    <w:p>
+      <w:pPr>
+        <w:pStyle w:val="BodyText"/>
+      </w:pPr>
+      <w:r>
         <w:t xml:space="preserve">Instead of heavy text logging or intrusive polling, Studio relies on</w:t>
       </w:r>
       <w:r>
@@ -14361,13 +14413,13 @@
       </w:r>
     </w:p>
     <w:bookmarkEnd w:id="78"/>
-    <w:bookmarkStart w:id="80" w:name="Xb2e05fa39620e58ec0c0d4661b980e02b4df473"/>
+    <w:bookmarkStart w:id="80" w:name="Xf18cfb0dd193352e52dba53826fdaeafe654ec8"/>
     <w:p>
       <w:pPr>
         <w:pStyle w:val="Heading4"/>
       </w:pPr>
       <w:r>
-        <w:t xml:space="preserve">3. The Extensible Python Plugin SDK (</w:t>
+        <w:t xml:space="preserve">3. Customizing Windows &amp; Embedding Your Own Tabs (</w:t>
       </w:r>
       <w:r>
         <w:rPr>
@@ -14384,7 +14436,39 @@
         <w:pStyle w:val="FirstParagraph"/>
       </w:pPr>
       <w:r>
-        <w:t xml:space="preserve">Studio is built on an extensible core-and-plugin architecture (</w:t>
+        <w:t xml:space="preserve">A hallmark of AbstractX Studio is that developers are never forced into a single pre-baked layout or rigid set of tools.</w:t>
+      </w:r>
+    </w:p>
+    <w:p>
+      <w:pPr>
+        <w:pStyle w:val="BodyText"/>
+      </w:pPr>
+      <w:r>
+        <w:t xml:space="preserve">Every engineering project has unique telemetry needs—a robotics team needs motor demand bars and Joint PID curves; a drone project needs artificial horizons and compass roses; a battery management system needs cell voltage heatmaps.</w:t>
+      </w:r>
+    </w:p>
+    <w:p>
+      <w:pPr>
+        <w:pStyle w:val="BodyText"/>
+      </w:pPr>
+      <w:r>
+        <w:t xml:space="preserve">Studio makes it trivial for users to</w:t>
+      </w:r>
+      <w:r>
+        <w:t xml:space="preserve"> </w:t>
+      </w:r>
+      <w:r>
+        <w:rPr>
+          <w:b/>
+          <w:bCs/>
+        </w:rPr>
+        <w:t xml:space="preserve">customize their workspace and embed their own tabs directly into the workbench</w:t>
+      </w:r>
+      <w:r>
+        <w:t xml:space="preserve"> </w:t>
+      </w:r>
+      <w:r>
+        <w:t xml:space="preserve">using the Python Plugin SDK (</w:t>
       </w:r>
       <w:hyperlink r:id="rId79">
         <w:r>
@@ -14395,560 +14479,789 @@
         </w:r>
       </w:hyperlink>
       <w:r>
-        <w:t xml:space="preserve">). Developers can create custom visualizers, instrumentation panels, or automated test consoles in pure Python using Dear ImGui (</w:t>
+        <w:t xml:space="preserve">):</w:t>
+      </w:r>
+    </w:p>
+    <w:p>
+      <w:pPr>
+        <w:pStyle w:val="SourceCode"/>
+      </w:pPr>
+      <w:r>
+        <w:rPr>
+          <w:rStyle w:val="ImportTok"/>
+        </w:rPr>
+        <w:t xml:space="preserve">from</w:t>
+      </w:r>
+      <w:r>
+        <w:rPr>
+          <w:rStyle w:val="NormalTok"/>
+        </w:rPr>
+        <w:t xml:space="preserve"> visualizer.sdk.plugin </w:t>
+      </w:r>
+      <w:r>
+        <w:rPr>
+          <w:rStyle w:val="ImportTok"/>
+        </w:rPr>
+        <w:t xml:space="preserve">import</w:t>
+      </w:r>
+      <w:r>
+        <w:rPr>
+          <w:rStyle w:val="NormalTok"/>
+        </w:rPr>
+        <w:t xml:space="preserve"> AbstractXStudioPlugin</w:t>
+      </w:r>
+      <w:r>
+        <w:br/>
+      </w:r>
+      <w:r>
+        <w:rPr>
+          <w:rStyle w:val="ImportTok"/>
+        </w:rPr>
+        <w:t xml:space="preserve">from</w:t>
+      </w:r>
+      <w:r>
+        <w:rPr>
+          <w:rStyle w:val="NormalTok"/>
+        </w:rPr>
+        <w:t xml:space="preserve"> imgui_bundle </w:t>
+      </w:r>
+      <w:r>
+        <w:rPr>
+          <w:rStyle w:val="ImportTok"/>
+        </w:rPr>
+        <w:t xml:space="preserve">import</w:t>
+      </w:r>
+      <w:r>
+        <w:rPr>
+          <w:rStyle w:val="NormalTok"/>
+        </w:rPr>
+        <w:t xml:space="preserve"> imgui, implot</w:t>
+      </w:r>
+      <w:r>
+        <w:br/>
+      </w:r>
+      <w:r>
+        <w:br/>
+      </w:r>
+      <w:r>
+        <w:rPr>
+          <w:rStyle w:val="KeywordTok"/>
+        </w:rPr>
+        <w:t xml:space="preserve">class</w:t>
+      </w:r>
+      <w:r>
+        <w:rPr>
+          <w:rStyle w:val="NormalTok"/>
+        </w:rPr>
+        <w:t xml:space="preserve"> CustomSensorDashboard(AbstractXStudioPlugin):</w:t>
+      </w:r>
+      <w:r>
+        <w:br/>
+      </w:r>
+      <w:r>
+        <w:rPr>
+          <w:rStyle w:val="NormalTok"/>
+        </w:rPr>
+        <w:t xml:space="preserve">    </w:t>
+      </w:r>
+      <w:r>
+        <w:rPr>
+          <w:rStyle w:val="KeywordTok"/>
+        </w:rPr>
+        <w:t xml:space="preserve">def</w:t>
+      </w:r>
+      <w:r>
+        <w:rPr>
+          <w:rStyle w:val="NormalTok"/>
+        </w:rPr>
+        <w:t xml:space="preserve"> </w:t>
+      </w:r>
+      <w:r>
+        <w:rPr>
+          <w:rStyle w:val="FunctionTok"/>
+        </w:rPr>
+        <w:t xml:space="preserve">__init__</w:t>
+      </w:r>
+      <w:r>
+        <w:rPr>
+          <w:rStyle w:val="NormalTok"/>
+        </w:rPr>
+        <w:t xml:space="preserve">(</w:t>
+      </w:r>
+      <w:r>
+        <w:rPr>
+          <w:rStyle w:val="VariableTok"/>
+        </w:rPr>
+        <w:t xml:space="preserve">self</w:t>
+      </w:r>
+      <w:r>
+        <w:rPr>
+          <w:rStyle w:val="NormalTok"/>
+        </w:rPr>
+        <w:t xml:space="preserve">):</w:t>
+      </w:r>
+      <w:r>
+        <w:br/>
+      </w:r>
+      <w:r>
+        <w:rPr>
+          <w:rStyle w:val="NormalTok"/>
+        </w:rPr>
+        <w:t xml:space="preserve">        </w:t>
+      </w:r>
+      <w:r>
+        <w:rPr>
+          <w:rStyle w:val="BuiltInTok"/>
+        </w:rPr>
+        <w:t xml:space="preserve">super</w:t>
+      </w:r>
+      <w:r>
+        <w:rPr>
+          <w:rStyle w:val="NormalTok"/>
+        </w:rPr>
+        <w:t xml:space="preserve">().</w:t>
+      </w:r>
+      <w:r>
+        <w:rPr>
+          <w:rStyle w:val="FunctionTok"/>
+        </w:rPr>
+        <w:t xml:space="preserve">__init__</w:t>
+      </w:r>
+      <w:r>
+        <w:rPr>
+          <w:rStyle w:val="NormalTok"/>
+        </w:rPr>
+        <w:t xml:space="preserve">(</w:t>
+      </w:r>
+      <w:r>
+        <w:rPr>
+          <w:rStyle w:val="StringTok"/>
+        </w:rPr>
+        <w:t xml:space="preserve">"Custom Dashboard"</w:t>
+      </w:r>
+      <w:r>
+        <w:rPr>
+          <w:rStyle w:val="NormalTok"/>
+        </w:rPr>
+        <w:t xml:space="preserve">, </w:t>
+      </w:r>
+      <w:r>
+        <w:rPr>
+          <w:rStyle w:val="StringTok"/>
+        </w:rPr>
+        <w:t xml:space="preserve">"1.0"</w:t>
+      </w:r>
+      <w:r>
+        <w:rPr>
+          <w:rStyle w:val="NormalTok"/>
+        </w:rPr>
+        <w:t xml:space="preserve">)</w:t>
+      </w:r>
+      <w:r>
+        <w:br/>
+      </w:r>
+      <w:r>
+        <w:rPr>
+          <w:rStyle w:val="NormalTok"/>
+        </w:rPr>
+        <w:t xml:space="preserve">        </w:t>
+      </w:r>
+      <w:r>
+        <w:rPr>
+          <w:rStyle w:val="VariableTok"/>
+        </w:rPr>
+        <w:t xml:space="preserve">self</w:t>
+      </w:r>
+      <w:r>
+        <w:rPr>
+          <w:rStyle w:val="NormalTok"/>
+        </w:rPr>
+        <w:t xml:space="preserve">.latest_heading </w:t>
+      </w:r>
+      <w:r>
+        <w:rPr>
+          <w:rStyle w:val="OperatorTok"/>
+        </w:rPr>
+        <w:t xml:space="preserve">=</w:t>
+      </w:r>
+      <w:r>
+        <w:rPr>
+          <w:rStyle w:val="NormalTok"/>
+        </w:rPr>
+        <w:t xml:space="preserve"> </w:t>
+      </w:r>
+      <w:r>
+        <w:rPr>
+          <w:rStyle w:val="FloatTok"/>
+        </w:rPr>
+        <w:t xml:space="preserve">0.0</w:t>
+      </w:r>
+      <w:r>
+        <w:br/>
+      </w:r>
+      <w:r>
+        <w:br/>
+      </w:r>
+      <w:r>
+        <w:rPr>
+          <w:rStyle w:val="NormalTok"/>
+        </w:rPr>
+        <w:t xml:space="preserve">    </w:t>
+      </w:r>
+      <w:r>
+        <w:rPr>
+          <w:rStyle w:val="KeywordTok"/>
+        </w:rPr>
+        <w:t xml:space="preserve">def</w:t>
+      </w:r>
+      <w:r>
+        <w:rPr>
+          <w:rStyle w:val="NormalTok"/>
+        </w:rPr>
+        <w:t xml:space="preserve"> on_tlp_packet(</w:t>
+      </w:r>
+      <w:r>
+        <w:rPr>
+          <w:rStyle w:val="VariableTok"/>
+        </w:rPr>
+        <w:t xml:space="preserve">self</w:t>
+      </w:r>
+      <w:r>
+        <w:rPr>
+          <w:rStyle w:val="NormalTok"/>
+        </w:rPr>
+        <w:t xml:space="preserve">, header, payload_dict):</w:t>
+      </w:r>
+      <w:r>
+        <w:br/>
+      </w:r>
+      <w:r>
+        <w:rPr>
+          <w:rStyle w:val="NormalTok"/>
+        </w:rPr>
+        <w:t xml:space="preserve">        </w:t>
+      </w:r>
+      <w:r>
+        <w:rPr>
+          <w:rStyle w:val="CommentTok"/>
+        </w:rPr>
+        <w:t xml:space="preserve"># Asynchronously invoked when relevant telemetry packets arrive</w:t>
+      </w:r>
+      <w:r>
+        <w:br/>
+      </w:r>
+      <w:r>
+        <w:rPr>
+          <w:rStyle w:val="NormalTok"/>
+        </w:rPr>
+        <w:t xml:space="preserve">        </w:t>
+      </w:r>
+      <w:r>
+        <w:rPr>
+          <w:rStyle w:val="ControlFlowTok"/>
+        </w:rPr>
+        <w:t xml:space="preserve">if</w:t>
+      </w:r>
+      <w:r>
+        <w:rPr>
+          <w:rStyle w:val="NormalTok"/>
+        </w:rPr>
+        <w:t xml:space="preserve"> </w:t>
+      </w:r>
+      <w:r>
+        <w:rPr>
+          <w:rStyle w:val="StringTok"/>
+        </w:rPr>
+        <w:t xml:space="preserve">"heading_cdeg"</w:t>
+      </w:r>
+      <w:r>
+        <w:rPr>
+          <w:rStyle w:val="NormalTok"/>
+        </w:rPr>
+        <w:t xml:space="preserve"> </w:t>
+      </w:r>
+      <w:r>
+        <w:rPr>
+          <w:rStyle w:val="KeywordTok"/>
+        </w:rPr>
+        <w:t xml:space="preserve">in</w:t>
+      </w:r>
+      <w:r>
+        <w:rPr>
+          <w:rStyle w:val="NormalTok"/>
+        </w:rPr>
+        <w:t xml:space="preserve"> payload_dict:</w:t>
+      </w:r>
+      <w:r>
+        <w:br/>
+      </w:r>
+      <w:r>
+        <w:rPr>
+          <w:rStyle w:val="NormalTok"/>
+        </w:rPr>
+        <w:t xml:space="preserve">            </w:t>
+      </w:r>
+      <w:r>
+        <w:rPr>
+          <w:rStyle w:val="VariableTok"/>
+        </w:rPr>
+        <w:t xml:space="preserve">self</w:t>
+      </w:r>
+      <w:r>
+        <w:rPr>
+          <w:rStyle w:val="NormalTok"/>
+        </w:rPr>
+        <w:t xml:space="preserve">.latest_heading </w:t>
+      </w:r>
+      <w:r>
+        <w:rPr>
+          <w:rStyle w:val="OperatorTok"/>
+        </w:rPr>
+        <w:t xml:space="preserve">=</w:t>
+      </w:r>
+      <w:r>
+        <w:rPr>
+          <w:rStyle w:val="NormalTok"/>
+        </w:rPr>
+        <w:t xml:space="preserve"> payload_dict[</w:t>
+      </w:r>
+      <w:r>
+        <w:rPr>
+          <w:rStyle w:val="StringTok"/>
+        </w:rPr>
+        <w:t xml:space="preserve">"heading_cdeg"</w:t>
+      </w:r>
+      <w:r>
+        <w:rPr>
+          <w:rStyle w:val="NormalTok"/>
+        </w:rPr>
+        <w:t xml:space="preserve">] </w:t>
+      </w:r>
+      <w:r>
+        <w:rPr>
+          <w:rStyle w:val="OperatorTok"/>
+        </w:rPr>
+        <w:t xml:space="preserve">*</w:t>
+      </w:r>
+      <w:r>
+        <w:rPr>
+          <w:rStyle w:val="NormalTok"/>
+        </w:rPr>
+        <w:t xml:space="preserve"> </w:t>
+      </w:r>
+      <w:r>
+        <w:rPr>
+          <w:rStyle w:val="FloatTok"/>
+        </w:rPr>
+        <w:t xml:space="preserve">0.01</w:t>
+      </w:r>
+      <w:r>
+        <w:br/>
+      </w:r>
+      <w:r>
+        <w:br/>
+      </w:r>
+      <w:r>
+        <w:rPr>
+          <w:rStyle w:val="NormalTok"/>
+        </w:rPr>
+        <w:t xml:space="preserve">    </w:t>
+      </w:r>
+      <w:r>
+        <w:rPr>
+          <w:rStyle w:val="KeywordTok"/>
+        </w:rPr>
+        <w:t xml:space="preserve">def</w:t>
+      </w:r>
+      <w:r>
+        <w:rPr>
+          <w:rStyle w:val="NormalTok"/>
+        </w:rPr>
+        <w:t xml:space="preserve"> render_ui(</w:t>
+      </w:r>
+      <w:r>
+        <w:rPr>
+          <w:rStyle w:val="VariableTok"/>
+        </w:rPr>
+        <w:t xml:space="preserve">self</w:t>
+      </w:r>
+      <w:r>
+        <w:rPr>
+          <w:rStyle w:val="NormalTok"/>
+        </w:rPr>
+        <w:t xml:space="preserve">, delta_time, state):</w:t>
+      </w:r>
+      <w:r>
+        <w:br/>
+      </w:r>
+      <w:r>
+        <w:rPr>
+          <w:rStyle w:val="NormalTok"/>
+        </w:rPr>
+        <w:t xml:space="preserve">        </w:t>
+      </w:r>
+      <w:r>
+        <w:rPr>
+          <w:rStyle w:val="CommentTok"/>
+        </w:rPr>
+        <w:t xml:space="preserve"># Rendered at 60 FPS inside Studio's dockable tab</w:t>
+      </w:r>
+      <w:r>
+        <w:br/>
+      </w:r>
+      <w:r>
+        <w:rPr>
+          <w:rStyle w:val="NormalTok"/>
+        </w:rPr>
+        <w:t xml:space="preserve">        imgui.text_colored(imgui.ImVec4(</w:t>
+      </w:r>
+      <w:r>
+        <w:rPr>
+          <w:rStyle w:val="FloatTok"/>
+        </w:rPr>
+        <w:t xml:space="preserve">0.3</w:t>
+      </w:r>
+      <w:r>
+        <w:rPr>
+          <w:rStyle w:val="NormalTok"/>
+        </w:rPr>
+        <w:t xml:space="preserve">, </w:t>
+      </w:r>
+      <w:r>
+        <w:rPr>
+          <w:rStyle w:val="FloatTok"/>
+        </w:rPr>
+        <w:t xml:space="preserve">0.85</w:t>
+      </w:r>
+      <w:r>
+        <w:rPr>
+          <w:rStyle w:val="NormalTok"/>
+        </w:rPr>
+        <w:t xml:space="preserve">, </w:t>
+      </w:r>
+      <w:r>
+        <w:rPr>
+          <w:rStyle w:val="FloatTok"/>
+        </w:rPr>
+        <w:t xml:space="preserve">1.0</w:t>
+      </w:r>
+      <w:r>
+        <w:rPr>
+          <w:rStyle w:val="NormalTok"/>
+        </w:rPr>
+        <w:t xml:space="preserve">, </w:t>
+      </w:r>
+      <w:r>
+        <w:rPr>
+          <w:rStyle w:val="FloatTok"/>
+        </w:rPr>
+        <w:t xml:space="preserve">1.0</w:t>
+      </w:r>
+      <w:r>
+        <w:rPr>
+          <w:rStyle w:val="NormalTok"/>
+        </w:rPr>
+        <w:t xml:space="preserve">), </w:t>
+      </w:r>
+      <w:r>
+        <w:rPr>
+          <w:rStyle w:val="StringTok"/>
+        </w:rPr>
+        <w:t xml:space="preserve">"Custom Flight Deck"</w:t>
+      </w:r>
+      <w:r>
+        <w:rPr>
+          <w:rStyle w:val="NormalTok"/>
+        </w:rPr>
+        <w:t xml:space="preserve">)</w:t>
+      </w:r>
+      <w:r>
+        <w:br/>
+      </w:r>
+      <w:r>
+        <w:rPr>
+          <w:rStyle w:val="NormalTok"/>
+        </w:rPr>
+        <w:t xml:space="preserve">        imgui.text(</w:t>
+      </w:r>
+      <w:r>
+        <w:rPr>
+          <w:rStyle w:val="SpecialStringTok"/>
+        </w:rPr>
+        <w:t xml:space="preserve">f"Live Magnetic Heading: </w:t>
+      </w:r>
+      <w:r>
+        <w:rPr>
+          <w:rStyle w:val="SpecialCharTok"/>
+        </w:rPr>
+        <w:t xml:space="preserve">{</w:t>
+      </w:r>
+      <w:r>
+        <w:rPr>
+          <w:rStyle w:val="VariableTok"/>
+        </w:rPr>
+        <w:t xml:space="preserve">self</w:t>
+      </w:r>
+      <w:r>
+        <w:rPr>
+          <w:rStyle w:val="SpecialCharTok"/>
+        </w:rPr>
+        <w:t xml:space="preserve">.</w:t>
+      </w:r>
+      <w:r>
+        <w:rPr>
+          <w:rStyle w:val="NormalTok"/>
+        </w:rPr>
+        <w:t xml:space="preserve">latest_heading</w:t>
+      </w:r>
+      <w:r>
+        <w:rPr>
+          <w:rStyle w:val="SpecialCharTok"/>
+        </w:rPr>
+        <w:t xml:space="preserve">:.1f}</w:t>
+      </w:r>
+      <w:r>
+        <w:rPr>
+          <w:rStyle w:val="SpecialStringTok"/>
+        </w:rPr>
+        <w:t xml:space="preserve">°"</w:t>
+      </w:r>
+      <w:r>
+        <w:rPr>
+          <w:rStyle w:val="NormalTok"/>
+        </w:rPr>
+        <w:t xml:space="preserve">)</w:t>
+      </w:r>
+      <w:r>
+        <w:br/>
+      </w:r>
+      <w:r>
+        <w:rPr>
+          <w:rStyle w:val="NormalTok"/>
+        </w:rPr>
+        <w:t xml:space="preserve">        </w:t>
+      </w:r>
+      <w:r>
+        <w:br/>
+      </w:r>
+      <w:r>
+        <w:rPr>
+          <w:rStyle w:val="NormalTok"/>
+        </w:rPr>
+        <w:t xml:space="preserve">        </w:t>
+      </w:r>
+      <w:r>
+        <w:rPr>
+          <w:rStyle w:val="CommentTok"/>
+        </w:rPr>
+        <w:t xml:space="preserve"># Interactive controls sending commands to E906 over RPMsg</w:t>
+      </w:r>
+      <w:r>
+        <w:br/>
+      </w:r>
+      <w:r>
+        <w:rPr>
+          <w:rStyle w:val="NormalTok"/>
+        </w:rPr>
+        <w:t xml:space="preserve">        </w:t>
+      </w:r>
+      <w:r>
+        <w:rPr>
+          <w:rStyle w:val="ControlFlowTok"/>
+        </w:rPr>
+        <w:t xml:space="preserve">if</w:t>
+      </w:r>
+      <w:r>
+        <w:rPr>
+          <w:rStyle w:val="NormalTok"/>
+        </w:rPr>
+        <w:t xml:space="preserve"> imgui.button(</w:t>
+      </w:r>
+      <w:r>
+        <w:rPr>
+          <w:rStyle w:val="StringTok"/>
+        </w:rPr>
+        <w:t xml:space="preserve">"Zero Compass Bias"</w:t>
+      </w:r>
+      <w:r>
+        <w:rPr>
+          <w:rStyle w:val="NormalTok"/>
+        </w:rPr>
+        <w:t xml:space="preserve">):</w:t>
+      </w:r>
+      <w:r>
+        <w:br/>
+      </w:r>
+      <w:r>
+        <w:rPr>
+          <w:rStyle w:val="NormalTok"/>
+        </w:rPr>
+        <w:t xml:space="preserve">            state.send_cli(</w:t>
+      </w:r>
+      <w:r>
+        <w:rPr>
+          <w:rStyle w:val="StringTok"/>
+        </w:rPr>
+        <w:t xml:space="preserve">"abstractx.compass_calibrate()"</w:t>
+      </w:r>
+      <w:r>
+        <w:rPr>
+          <w:rStyle w:val="NormalTok"/>
+        </w:rPr>
+        <w:t xml:space="preserve">)</w:t>
+      </w:r>
+    </w:p>
+    <w:p>
+      <w:pPr>
+        <w:pStyle w:val="FirstParagraph"/>
+      </w:pPr>
+      <w:r>
+        <w:t xml:space="preserve">By subclassing</w:t>
+      </w:r>
+      <w:r>
+        <w:t xml:space="preserve"> </w:t>
       </w:r>
       <w:r>
         <w:rPr>
           <w:rStyle w:val="VerbatimChar"/>
         </w:rPr>
-        <w:t xml:space="preserve">imgui-bundle</w:t>
-      </w:r>
-      <w:r>
-        <w:t xml:space="preserve">):</w:t>
-      </w:r>
-    </w:p>
-    <w:p>
-      <w:pPr>
-        <w:pStyle w:val="SourceCode"/>
-      </w:pPr>
-      <w:r>
-        <w:rPr>
-          <w:rStyle w:val="ImportTok"/>
-        </w:rPr>
-        <w:t xml:space="preserve">from</w:t>
-      </w:r>
-      <w:r>
-        <w:rPr>
-          <w:rStyle w:val="NormalTok"/>
-        </w:rPr>
-        <w:t xml:space="preserve"> visualizer.sdk.plugin </w:t>
-      </w:r>
-      <w:r>
-        <w:rPr>
-          <w:rStyle w:val="ImportTok"/>
-        </w:rPr>
-        <w:t xml:space="preserve">import</w:t>
-      </w:r>
-      <w:r>
-        <w:rPr>
-          <w:rStyle w:val="NormalTok"/>
-        </w:rPr>
-        <w:t xml:space="preserve"> AbstractXStudioPlugin</w:t>
-      </w:r>
-      <w:r>
-        <w:br/>
-      </w:r>
-      <w:r>
-        <w:rPr>
-          <w:rStyle w:val="ImportTok"/>
-        </w:rPr>
-        <w:t xml:space="preserve">from</w:t>
-      </w:r>
-      <w:r>
-        <w:rPr>
-          <w:rStyle w:val="NormalTok"/>
-        </w:rPr>
-        <w:t xml:space="preserve"> imgui_bundle </w:t>
-      </w:r>
-      <w:r>
-        <w:rPr>
-          <w:rStyle w:val="ImportTok"/>
-        </w:rPr>
-        <w:t xml:space="preserve">import</w:t>
-      </w:r>
-      <w:r>
-        <w:rPr>
-          <w:rStyle w:val="NormalTok"/>
-        </w:rPr>
-        <w:t xml:space="preserve"> imgui, implot</w:t>
-      </w:r>
-      <w:r>
-        <w:br/>
-      </w:r>
-      <w:r>
-        <w:br/>
-      </w:r>
-      <w:r>
-        <w:rPr>
-          <w:rStyle w:val="KeywordTok"/>
-        </w:rPr>
-        <w:t xml:space="preserve">class</w:t>
-      </w:r>
-      <w:r>
-        <w:rPr>
-          <w:rStyle w:val="NormalTok"/>
-        </w:rPr>
-        <w:t xml:space="preserve"> CustomSensorDashboard(AbstractXStudioPlugin):</w:t>
-      </w:r>
-      <w:r>
-        <w:br/>
-      </w:r>
-      <w:r>
-        <w:rPr>
-          <w:rStyle w:val="NormalTok"/>
-        </w:rPr>
-        <w:t xml:space="preserve">    </w:t>
-      </w:r>
-      <w:r>
-        <w:rPr>
-          <w:rStyle w:val="KeywordTok"/>
-        </w:rPr>
-        <w:t xml:space="preserve">def</w:t>
-      </w:r>
-      <w:r>
-        <w:rPr>
-          <w:rStyle w:val="NormalTok"/>
-        </w:rPr>
-        <w:t xml:space="preserve"> </w:t>
-      </w:r>
-      <w:r>
-        <w:rPr>
-          <w:rStyle w:val="FunctionTok"/>
-        </w:rPr>
-        <w:t xml:space="preserve">__init__</w:t>
-      </w:r>
-      <w:r>
-        <w:rPr>
-          <w:rStyle w:val="NormalTok"/>
-        </w:rPr>
-        <w:t xml:space="preserve">(</w:t>
-      </w:r>
-      <w:r>
-        <w:rPr>
-          <w:rStyle w:val="VariableTok"/>
-        </w:rPr>
-        <w:t xml:space="preserve">self</w:t>
-      </w:r>
-      <w:r>
-        <w:rPr>
-          <w:rStyle w:val="NormalTok"/>
-        </w:rPr>
-        <w:t xml:space="preserve">):</w:t>
-      </w:r>
-      <w:r>
-        <w:br/>
-      </w:r>
-      <w:r>
-        <w:rPr>
-          <w:rStyle w:val="NormalTok"/>
-        </w:rPr>
-        <w:t xml:space="preserve">        </w:t>
-      </w:r>
-      <w:r>
-        <w:rPr>
-          <w:rStyle w:val="BuiltInTok"/>
-        </w:rPr>
-        <w:t xml:space="preserve">super</w:t>
-      </w:r>
-      <w:r>
-        <w:rPr>
-          <w:rStyle w:val="NormalTok"/>
-        </w:rPr>
-        <w:t xml:space="preserve">().</w:t>
-      </w:r>
-      <w:r>
-        <w:rPr>
-          <w:rStyle w:val="FunctionTok"/>
-        </w:rPr>
-        <w:t xml:space="preserve">__init__</w:t>
-      </w:r>
-      <w:r>
-        <w:rPr>
-          <w:rStyle w:val="NormalTok"/>
-        </w:rPr>
-        <w:t xml:space="preserve">(</w:t>
-      </w:r>
-      <w:r>
-        <w:rPr>
-          <w:rStyle w:val="StringTok"/>
-        </w:rPr>
-        <w:t xml:space="preserve">"Custom Dashboard"</w:t>
-      </w:r>
-      <w:r>
-        <w:rPr>
-          <w:rStyle w:val="NormalTok"/>
-        </w:rPr>
-        <w:t xml:space="preserve">, </w:t>
-      </w:r>
-      <w:r>
-        <w:rPr>
-          <w:rStyle w:val="StringTok"/>
-        </w:rPr>
-        <w:t xml:space="preserve">"1.0"</w:t>
-      </w:r>
-      <w:r>
-        <w:rPr>
-          <w:rStyle w:val="NormalTok"/>
-        </w:rPr>
-        <w:t xml:space="preserve">)</w:t>
-      </w:r>
-      <w:r>
-        <w:br/>
-      </w:r>
-      <w:r>
-        <w:rPr>
-          <w:rStyle w:val="NormalTok"/>
-        </w:rPr>
-        <w:t xml:space="preserve">        </w:t>
-      </w:r>
-      <w:r>
-        <w:rPr>
-          <w:rStyle w:val="VariableTok"/>
-        </w:rPr>
-        <w:t xml:space="preserve">self</w:t>
-      </w:r>
-      <w:r>
-        <w:rPr>
-          <w:rStyle w:val="NormalTok"/>
-        </w:rPr>
-        <w:t xml:space="preserve">.latest_heading </w:t>
-      </w:r>
-      <w:r>
-        <w:rPr>
-          <w:rStyle w:val="OperatorTok"/>
-        </w:rPr>
-        <w:t xml:space="preserve">=</w:t>
-      </w:r>
-      <w:r>
-        <w:rPr>
-          <w:rStyle w:val="NormalTok"/>
-        </w:rPr>
-        <w:t xml:space="preserve"> </w:t>
-      </w:r>
-      <w:r>
-        <w:rPr>
-          <w:rStyle w:val="FloatTok"/>
-        </w:rPr>
-        <w:t xml:space="preserve">0.0</w:t>
-      </w:r>
-      <w:r>
-        <w:br/>
-      </w:r>
-      <w:r>
-        <w:br/>
-      </w:r>
-      <w:r>
-        <w:rPr>
-          <w:rStyle w:val="NormalTok"/>
-        </w:rPr>
-        <w:t xml:space="preserve">    </w:t>
-      </w:r>
-      <w:r>
-        <w:rPr>
-          <w:rStyle w:val="KeywordTok"/>
-        </w:rPr>
-        <w:t xml:space="preserve">def</w:t>
-      </w:r>
-      <w:r>
-        <w:rPr>
-          <w:rStyle w:val="NormalTok"/>
-        </w:rPr>
-        <w:t xml:space="preserve"> on_tlp_packet(</w:t>
-      </w:r>
-      <w:r>
-        <w:rPr>
-          <w:rStyle w:val="VariableTok"/>
-        </w:rPr>
-        <w:t xml:space="preserve">self</w:t>
-      </w:r>
-      <w:r>
-        <w:rPr>
-          <w:rStyle w:val="NormalTok"/>
-        </w:rPr>
-        <w:t xml:space="preserve">, header, payload_dict):</w:t>
-      </w:r>
-      <w:r>
-        <w:br/>
-      </w:r>
-      <w:r>
-        <w:rPr>
-          <w:rStyle w:val="NormalTok"/>
-        </w:rPr>
-        <w:t xml:space="preserve">        </w:t>
-      </w:r>
-      <w:r>
-        <w:rPr>
-          <w:rStyle w:val="CommentTok"/>
-        </w:rPr>
-        <w:t xml:space="preserve"># Asynchronously invoked when relevant telemetry packets arrive</w:t>
-      </w:r>
-      <w:r>
-        <w:br/>
-      </w:r>
-      <w:r>
-        <w:rPr>
-          <w:rStyle w:val="NormalTok"/>
-        </w:rPr>
-        <w:t xml:space="preserve">        </w:t>
-      </w:r>
-      <w:r>
-        <w:rPr>
-          <w:rStyle w:val="ControlFlowTok"/>
-        </w:rPr>
-        <w:t xml:space="preserve">if</w:t>
-      </w:r>
-      <w:r>
-        <w:rPr>
-          <w:rStyle w:val="NormalTok"/>
-        </w:rPr>
-        <w:t xml:space="preserve"> </w:t>
-      </w:r>
-      <w:r>
-        <w:rPr>
-          <w:rStyle w:val="StringTok"/>
-        </w:rPr>
-        <w:t xml:space="preserve">"heading_cdeg"</w:t>
-      </w:r>
-      <w:r>
-        <w:rPr>
-          <w:rStyle w:val="NormalTok"/>
-        </w:rPr>
-        <w:t xml:space="preserve"> </w:t>
-      </w:r>
-      <w:r>
-        <w:rPr>
-          <w:rStyle w:val="KeywordTok"/>
-        </w:rPr>
-        <w:t xml:space="preserve">in</w:t>
-      </w:r>
-      <w:r>
-        <w:rPr>
-          <w:rStyle w:val="NormalTok"/>
-        </w:rPr>
-        <w:t xml:space="preserve"> payload_dict:</w:t>
-      </w:r>
-      <w:r>
-        <w:br/>
-      </w:r>
-      <w:r>
-        <w:rPr>
-          <w:rStyle w:val="NormalTok"/>
-        </w:rPr>
-        <w:t xml:space="preserve">            </w:t>
-      </w:r>
-      <w:r>
-        <w:rPr>
-          <w:rStyle w:val="VariableTok"/>
-        </w:rPr>
-        <w:t xml:space="preserve">self</w:t>
-      </w:r>
-      <w:r>
-        <w:rPr>
-          <w:rStyle w:val="NormalTok"/>
-        </w:rPr>
-        <w:t xml:space="preserve">.latest_heading </w:t>
-      </w:r>
-      <w:r>
-        <w:rPr>
-          <w:rStyle w:val="OperatorTok"/>
-        </w:rPr>
-        <w:t xml:space="preserve">=</w:t>
-      </w:r>
-      <w:r>
-        <w:rPr>
-          <w:rStyle w:val="NormalTok"/>
-        </w:rPr>
-        <w:t xml:space="preserve"> payload_dict[</w:t>
-      </w:r>
-      <w:r>
-        <w:rPr>
-          <w:rStyle w:val="StringTok"/>
-        </w:rPr>
-        <w:t xml:space="preserve">"heading_cdeg"</w:t>
-      </w:r>
-      <w:r>
-        <w:rPr>
-          <w:rStyle w:val="NormalTok"/>
-        </w:rPr>
-        <w:t xml:space="preserve">] </w:t>
-      </w:r>
-      <w:r>
-        <w:rPr>
-          <w:rStyle w:val="OperatorTok"/>
-        </w:rPr>
-        <w:t xml:space="preserve">*</w:t>
-      </w:r>
-      <w:r>
-        <w:rPr>
-          <w:rStyle w:val="NormalTok"/>
-        </w:rPr>
-        <w:t xml:space="preserve"> </w:t>
-      </w:r>
-      <w:r>
-        <w:rPr>
-          <w:rStyle w:val="FloatTok"/>
-        </w:rPr>
-        <w:t xml:space="preserve">0.01</w:t>
-      </w:r>
-      <w:r>
-        <w:br/>
-      </w:r>
-      <w:r>
-        <w:br/>
-      </w:r>
-      <w:r>
-        <w:rPr>
-          <w:rStyle w:val="NormalTok"/>
-        </w:rPr>
-        <w:t xml:space="preserve">    </w:t>
-      </w:r>
-      <w:r>
-        <w:rPr>
-          <w:rStyle w:val="KeywordTok"/>
-        </w:rPr>
-        <w:t xml:space="preserve">def</w:t>
-      </w:r>
-      <w:r>
-        <w:rPr>
-          <w:rStyle w:val="NormalTok"/>
-        </w:rPr>
-        <w:t xml:space="preserve"> render_ui(</w:t>
-      </w:r>
-      <w:r>
-        <w:rPr>
-          <w:rStyle w:val="VariableTok"/>
-        </w:rPr>
-        <w:t xml:space="preserve">self</w:t>
-      </w:r>
-      <w:r>
-        <w:rPr>
-          <w:rStyle w:val="NormalTok"/>
-        </w:rPr>
-        <w:t xml:space="preserve">, delta_time, state):</w:t>
-      </w:r>
-      <w:r>
-        <w:br/>
-      </w:r>
-      <w:r>
-        <w:rPr>
-          <w:rStyle w:val="NormalTok"/>
-        </w:rPr>
-        <w:t xml:space="preserve">        </w:t>
-      </w:r>
-      <w:r>
-        <w:rPr>
-          <w:rStyle w:val="CommentTok"/>
-        </w:rPr>
-        <w:t xml:space="preserve"># Rendered at 60 FPS inside Studio's dockable workbench</w:t>
-      </w:r>
-      <w:r>
-        <w:br/>
-      </w:r>
-      <w:r>
-        <w:rPr>
-          <w:rStyle w:val="NormalTok"/>
-        </w:rPr>
-        <w:t xml:space="preserve">        imgui.text(</w:t>
-      </w:r>
-      <w:r>
-        <w:rPr>
-          <w:rStyle w:val="SpecialStringTok"/>
-        </w:rPr>
-        <w:t xml:space="preserve">f"Live Heading: </w:t>
-      </w:r>
-      <w:r>
-        <w:rPr>
-          <w:rStyle w:val="SpecialCharTok"/>
-        </w:rPr>
-        <w:t xml:space="preserve">{</w:t>
-      </w:r>
-      <w:r>
-        <w:rPr>
-          <w:rStyle w:val="VariableTok"/>
-        </w:rPr>
-        <w:t xml:space="preserve">self</w:t>
-      </w:r>
-      <w:r>
-        <w:rPr>
-          <w:rStyle w:val="SpecialCharTok"/>
-        </w:rPr>
-        <w:t xml:space="preserve">.</w:t>
-      </w:r>
-      <w:r>
-        <w:rPr>
-          <w:rStyle w:val="NormalTok"/>
-        </w:rPr>
-        <w:t xml:space="preserve">latest_heading</w:t>
-      </w:r>
-      <w:r>
-        <w:rPr>
-          <w:rStyle w:val="SpecialCharTok"/>
-        </w:rPr>
-        <w:t xml:space="preserve">:.1f}</w:t>
-      </w:r>
-      <w:r>
-        <w:rPr>
-          <w:rStyle w:val="SpecialStringTok"/>
-        </w:rPr>
-        <w:t xml:space="preserve">°"</w:t>
-      </w:r>
-      <w:r>
-        <w:rPr>
-          <w:rStyle w:val="NormalTok"/>
-        </w:rPr>
-        <w:t xml:space="preserve">)</w:t>
-      </w:r>
-      <w:r>
-        <w:br/>
-      </w:r>
-      <w:r>
-        <w:rPr>
-          <w:rStyle w:val="NormalTok"/>
-        </w:rPr>
-        <w:t xml:space="preserve">        </w:t>
-      </w:r>
-      <w:r>
-        <w:rPr>
-          <w:rStyle w:val="ControlFlowTok"/>
-        </w:rPr>
-        <w:t xml:space="preserve">if</w:t>
-      </w:r>
-      <w:r>
-        <w:rPr>
-          <w:rStyle w:val="NormalTok"/>
-        </w:rPr>
-        <w:t xml:space="preserve"> imgui.button(</w:t>
-      </w:r>
-      <w:r>
-        <w:rPr>
-          <w:rStyle w:val="StringTok"/>
-        </w:rPr>
-        <w:t xml:space="preserve">"Zero Compass Bias"</w:t>
-      </w:r>
-      <w:r>
-        <w:rPr>
-          <w:rStyle w:val="NormalTok"/>
-        </w:rPr>
-        <w:t xml:space="preserve">):</w:t>
-      </w:r>
-      <w:r>
-        <w:br/>
-      </w:r>
-      <w:r>
-        <w:rPr>
-          <w:rStyle w:val="NormalTok"/>
-        </w:rPr>
-        <w:t xml:space="preserve">            state.send_cli(</w:t>
-      </w:r>
-      <w:r>
-        <w:rPr>
-          <w:rStyle w:val="StringTok"/>
-        </w:rPr>
-        <w:t xml:space="preserve">"abstractx.compass_calibrate()"</w:t>
-      </w:r>
-      <w:r>
-        <w:rPr>
-          <w:rStyle w:val="NormalTok"/>
-        </w:rPr>
-        <w:t xml:space="preserve">)</w:t>
-      </w:r>
-    </w:p>
-    <w:p>
-      <w:pPr>
-        <w:pStyle w:val="FirstParagraph"/>
-      </w:pPr>
-      <w:r>
-        <w:t xml:space="preserve">Plugins integrate seamlessly into Studio’s multi-window docking layout. They inherit native OS window pop-outs (moving the plugin to a second monitor), dark-mode styling, and zero-copy packet ingestion without having to manage windowing loops, OpenGL contexts, or threading primitives.</w:t>
+        <w:t xml:space="preserve">AbstractXStudioPlugin</w:t>
+      </w:r>
+      <w:r>
+        <w:t xml:space="preserve">, your custom tool becomes a</w:t>
+      </w:r>
+      <w:r>
+        <w:t xml:space="preserve"> </w:t>
+      </w:r>
+      <w:r>
+        <w:rPr>
+          <w:b/>
+          <w:bCs/>
+        </w:rPr>
+        <w:t xml:space="preserve">first-class citizen on the workbench</w:t>
+      </w:r>
+      <w:r>
+        <w:t xml:space="preserve">:</w:t>
+      </w:r>
+      <w:r>
+        <w:t xml:space="preserve"> </w:t>
+      </w:r>
+      <w:r>
+        <w:t xml:space="preserve">-</w:t>
+      </w:r>
+      <w:r>
+        <w:t xml:space="preserve"> </w:t>
+      </w:r>
+      <w:r>
+        <w:rPr>
+          <w:b/>
+          <w:bCs/>
+        </w:rPr>
+        <w:t xml:space="preserve">Automatic Docking &amp; Layout Customization</w:t>
+      </w:r>
+      <w:r>
+        <w:t xml:space="preserve">: Your tab can be dragged, nested into tab groups, or split side-by-side with CPU gauges, the timeline, or the memory inspector.</w:t>
+      </w:r>
+      <w:r>
+        <w:t xml:space="preserve"> </w:t>
+      </w:r>
+      <w:r>
+        <w:t xml:space="preserve">-</w:t>
+      </w:r>
+      <w:r>
+        <w:t xml:space="preserve"> </w:t>
+      </w:r>
+      <w:r>
+        <w:rPr>
+          <w:b/>
+          <w:bCs/>
+        </w:rPr>
+        <w:t xml:space="preserve">Multi-Monitor</w:t>
+      </w:r>
+      <w:r>
+        <w:rPr>
+          <w:b/>
+          <w:bCs/>
+        </w:rPr>
+        <w:t xml:space="preserve"> </w:t>
+      </w:r>
+      <w:r>
+        <w:rPr>
+          <w:b/>
+          <w:bCs/>
+        </w:rPr>
+        <w:t xml:space="preserve">“Pop to Canvas”</w:t>
+      </w:r>
+      <w:r>
+        <w:t xml:space="preserve">: Any embedded tab gets a native OS window tear-off button (</w:t>
+      </w:r>
+      <w:r>
+        <w:rPr>
+          <w:rStyle w:val="VerbatimChar"/>
+        </w:rPr>
+        <w:t xml:space="preserve">🗖 Pop to Canvas</w:t>
+      </w:r>
+      <w:r>
+        <w:t xml:space="preserve">). You can pull your custom dashboard onto a second monitor, resize it, and dock it back with 1 click (</w:t>
+      </w:r>
+      <w:r>
+        <w:rPr>
+          <w:rStyle w:val="VerbatimChar"/>
+        </w:rPr>
+        <w:t xml:space="preserve">🗗 Pop In</w:t>
+      </w:r>
+      <w:r>
+        <w:t xml:space="preserve">).</w:t>
+      </w:r>
+      <w:r>
+        <w:t xml:space="preserve"> </w:t>
+      </w:r>
+      <w:r>
+        <w:t xml:space="preserve">-</w:t>
+      </w:r>
+      <w:r>
+        <w:t xml:space="preserve"> </w:t>
+      </w:r>
+      <w:r>
+        <w:rPr>
+          <w:b/>
+          <w:bCs/>
+        </w:rPr>
+        <w:t xml:space="preserve">Direct Real-Time Target Interaction</w:t>
+      </w:r>
+      <w:r>
+        <w:t xml:space="preserve">: Through</w:t>
+      </w:r>
+      <w:r>
+        <w:t xml:space="preserve"> </w:t>
+      </w:r>
+      <w:r>
+        <w:rPr>
+          <w:rStyle w:val="VerbatimChar"/>
+        </w:rPr>
+        <w:t xml:space="preserve">state.send_cli(...)</w:t>
+      </w:r>
+      <w:r>
+        <w:t xml:space="preserve">, your custom tab can send Python expressions, calibrate sensors, or tweak control gains on the live E906 coprocessor while streaming continues uninterrupted.</w:t>
+      </w:r>
+      <w:r>
+        <w:t xml:space="preserve"> </w:t>
+      </w:r>
+      <w:r>
+        <w:t xml:space="preserve">-</w:t>
+      </w:r>
+      <w:r>
+        <w:t xml:space="preserve"> </w:t>
+      </w:r>
+      <w:r>
+        <w:rPr>
+          <w:b/>
+          <w:bCs/>
+        </w:rPr>
+        <w:t xml:space="preserve">Zero GUI Boilerplate</w:t>
+      </w:r>
+      <w:r>
+        <w:t xml:space="preserve">: No OpenGL shaders, GLFW event loops, or thread synchronizers. You write high-level ImGui and ImPlot Python code, and Studio handles the rendering at 60 FPS.</w:t>
       </w:r>
     </w:p>
     <w:bookmarkEnd w:id="80"/>

</xml_diff>

<commit_message>
docs: add DMA bring-up last-byte issue and Studio pop-out viewport war stories to Section 12
</commit_message>
<xml_diff>
--- a/docs/articles/micropython-on-e906/micropython_on_e906.docx
+++ b/docs/articles/micropython-on-e906/micropython_on_e906.docx
@@ -17053,16 +17053,548 @@
     </w:p>
     <w:p>
       <w:pPr>
+        <w:pStyle w:val="BlockText"/>
+      </w:pPr>
+      <w:r>
+        <w:rPr>
+          <w:b/>
+          <w:bCs/>
+        </w:rPr>
+        <w:t xml:space="preserve">The DMA bring-up &amp; the</w:t>
+      </w:r>
+      <w:r>
+        <w:rPr>
+          <w:b/>
+          <w:bCs/>
+        </w:rPr>
+        <w:t xml:space="preserve"> </w:t>
+      </w:r>
+      <w:r>
+        <w:rPr>
+          <w:b/>
+          <w:bCs/>
+        </w:rPr>
+        <w:t xml:space="preserve">“last byte”</w:t>
+      </w:r>
+      <w:r>
+        <w:rPr>
+          <w:b/>
+          <w:bCs/>
+        </w:rPr>
+        <w:t xml:space="preserve"> </w:t>
+      </w:r>
+      <w:r>
+        <w:rPr>
+          <w:b/>
+          <w:bCs/>
+        </w:rPr>
+        <w:t xml:space="preserve">trap.</w:t>
+      </w:r>
+      <w:r>
+        <w:t xml:space="preserve"> </w:t>
+      </w:r>
+      <w:r>
+        <w:t xml:space="preserve">Getting hardware DMA working across</w:t>
+      </w:r>
+      <w:r>
+        <w:t xml:space="preserve"> </w:t>
+      </w:r>
+      <w:r>
+        <w:t xml:space="preserve">asymmetric processors took days of grueling bring-up. First, Linux claimed all 16 DMA</w:t>
+      </w:r>
+      <w:r>
+        <w:t xml:space="preserve"> </w:t>
+      </w:r>
+      <w:r>
+        <w:t xml:space="preserve">channels by default, so we had to patch the device tree (</w:t>
+      </w:r>
+      <w:r>
+        <w:rPr>
+          <w:rStyle w:val="VerbatimChar"/>
+        </w:rPr>
+        <w:t xml:space="preserve">dma-channels = &lt;8&gt;</w:t>
+      </w:r>
+      <w:r>
+        <w:t xml:space="preserve">) and reprogram</w:t>
+      </w:r>
+      <w:r>
+        <w:t xml:space="preserve"> </w:t>
+      </w:r>
+      <w:r>
+        <w:t xml:space="preserve">interrupt routing registers so the Linux kernel wouldn’t panic on unhandled coprocessor interrupts.</w:t>
+      </w:r>
+      <w:r>
+        <w:t xml:space="preserve"> </w:t>
+      </w:r>
+      <w:r>
+        <w:t xml:space="preserve">Second, the E906 views SRAM through its local core addresses (</w:t>
+      </w:r>
+      <w:r>
+        <w:rPr>
+          <w:rStyle w:val="VerbatimChar"/>
+        </w:rPr>
+        <w:t xml:space="preserve">0x3FFC0000</w:t>
+      </w:r>
+      <w:r>
+        <w:t xml:space="preserve"> </w:t>
+      </w:r>
+      <w:r>
+        <w:t xml:space="preserve">/</w:t>
+      </w:r>
+      <w:r>
+        <w:t xml:space="preserve"> </w:t>
+      </w:r>
+      <w:r>
+        <w:rPr>
+          <w:rStyle w:val="VerbatimChar"/>
+        </w:rPr>
+        <w:t xml:space="preserve">0x40000000</w:t>
+      </w:r>
+      <w:r>
+        <w:t xml:space="preserve">), but</w:t>
+      </w:r>
+      <w:r>
+        <w:t xml:space="preserve"> </w:t>
+      </w:r>
+      <w:r>
+        <w:t xml:space="preserve">the system DMA controller requires physical bus addresses (</w:t>
+      </w:r>
+      <w:r>
+        <w:rPr>
+          <w:rStyle w:val="VerbatimChar"/>
+        </w:rPr>
+        <w:t xml:space="preserve">0x00020000</w:t>
+      </w:r>
+      <w:r>
+        <w:t xml:space="preserve">); passing raw C++ pointers</w:t>
+      </w:r>
+      <w:r>
+        <w:t xml:space="preserve"> </w:t>
+      </w:r>
+      <w:r>
+        <w:t xml:space="preserve">silently caused DMA bus errors. But the most insidious bug was the</w:t>
+      </w:r>
+      <w:r>
+        <w:t xml:space="preserve"> </w:t>
+      </w:r>
+      <w:r>
+        <w:rPr>
+          <w:b/>
+          <w:bCs/>
+        </w:rPr>
+        <w:t xml:space="preserve">“last byte”</w:t>
+      </w:r>
+      <w:r>
+        <w:rPr>
+          <w:b/>
+          <w:bCs/>
+        </w:rPr>
+        <w:t xml:space="preserve"> </w:t>
+      </w:r>
+      <w:r>
+        <w:rPr>
+          <w:b/>
+          <w:bCs/>
+        </w:rPr>
+        <w:t xml:space="preserve">issue</w:t>
+      </w:r>
+      <w:r>
+        <w:t xml:space="preserve">:</w:t>
+      </w:r>
+      <w:r>
+        <w:t xml:space="preserve"> </w:t>
+      </w:r>
+      <w:r>
+        <w:t xml:space="preserve">UART GPS sentences are variable in length (e.g. 73 bytes). If you configure DMA to transfer</w:t>
+      </w:r>
+      <w:r>
+        <w:t xml:space="preserve"> </w:t>
+      </w:r>
+      <w:r>
+        <w:t xml:space="preserve">64 or 512 bytes, the transfer only triggers when the block completes—leaving the</w:t>
+      </w:r>
+      <w:r>
+        <w:t xml:space="preserve"> </w:t>
+      </w:r>
+      <w:r>
+        <w:rPr>
+          <w:b/>
+          <w:bCs/>
+        </w:rPr>
+        <w:t xml:space="preserve">trailing</w:t>
+      </w:r>
+      <w:r>
+        <w:rPr>
+          <w:b/>
+          <w:bCs/>
+        </w:rPr>
+        <w:t xml:space="preserve"> </w:t>
+      </w:r>
+      <w:r>
+        <w:rPr>
+          <w:b/>
+          <w:bCs/>
+        </w:rPr>
+        <w:t xml:space="preserve">bytes of a sentence trapped in the hardware FIFO indefinitely</w:t>
+      </w:r>
+      <w:r>
+        <w:t xml:space="preserve"> </w:t>
+      </w:r>
+      <w:r>
+        <w:t xml:space="preserve">until the next burst arrived!</w:t>
+      </w:r>
+      <w:r>
+        <w:t xml:space="preserve"> </w:t>
+      </w:r>
+      <w:r>
+        <w:t xml:space="preserve">The fix was pairing</w:t>
+      </w:r>
+      <w:r>
+        <w:t xml:space="preserve"> </w:t>
+      </w:r>
+      <w:r>
+        <w:rPr>
+          <w:b/>
+          <w:bCs/>
+        </w:rPr>
+        <w:t xml:space="preserve">circular DMA mode</w:t>
+      </w:r>
+      <w:r>
+        <w:t xml:space="preserve"> </w:t>
+      </w:r>
+      <w:r>
+        <w:t xml:space="preserve">(a 16×64-byte ring buffer in shared SRAM) with the</w:t>
+      </w:r>
+      <w:r>
+        <w:t xml:space="preserve"> </w:t>
+      </w:r>
+      <w:r>
+        <w:t xml:space="preserve">UART’s hardware</w:t>
+      </w:r>
+      <w:r>
+        <w:t xml:space="preserve"> </w:t>
+      </w:r>
+      <w:r>
+        <w:rPr>
+          <w:b/>
+          <w:bCs/>
+        </w:rPr>
+        <w:t xml:space="preserve">character timeout interrupt</w:t>
+      </w:r>
+      <w:r>
+        <w:t xml:space="preserve"> </w:t>
+      </w:r>
+      <w:r>
+        <w:t xml:space="preserve">(</w:t>
+      </w:r>
+      <w:r>
+        <w:rPr>
+          <w:rStyle w:val="VerbatimChar"/>
+        </w:rPr>
+        <w:t xml:space="preserve">IIR = 0x0C</w:t>
+      </w:r>
+      <w:r>
+        <w:t xml:space="preserve">,</w:t>
+      </w:r>
+      <w:r>
+        <w:t xml:space="preserve"> </w:t>
+      </w:r>
+      <w:r>
+        <w:rPr>
+          <w:rStyle w:val="VerbatimChar"/>
+        </w:rPr>
+        <w:t xml:space="preserve">UART_DMA_REQ_EN</w:t>
+      </w:r>
+      <w:r>
+        <w:t xml:space="preserve"> </w:t>
+      </w:r>
+      <w:r>
+        <w:t xml:space="preserve">bit 2). When the</w:t>
+      </w:r>
+      <w:r>
+        <w:t xml:space="preserve"> </w:t>
+      </w:r>
+      <w:r>
+        <w:t xml:space="preserve">line goes idle for 4 character times, the timeout interrupt flushes the pipeline and delivers the</w:t>
+      </w:r>
+      <w:r>
+        <w:t xml:space="preserve"> </w:t>
+      </w:r>
+      <w:r>
+        <w:t xml:space="preserve">trailing bytes to Python immediately.</w:t>
+      </w:r>
+    </w:p>
+    <w:p>
+      <w:pPr>
+        <w:pStyle w:val="BlockText"/>
+      </w:pPr>
+      <w:r>
+        <w:rPr>
+          <w:b/>
+          <w:bCs/>
+        </w:rPr>
+        <w:t xml:space="preserve">Studio pop-outs, multi-viewports &amp; the disappearing canvas.</w:t>
+      </w:r>
+      <w:r>
+        <w:t xml:space="preserve"> </w:t>
+      </w:r>
+      <w:r>
+        <w:t xml:space="preserve">Giving AbstractX Studio multi-monitor</w:t>
+      </w:r>
+      <w:r>
+        <w:t xml:space="preserve"> </w:t>
+      </w:r>
+      <w:r>
+        <w:t xml:space="preserve">pop-out capabilities took three iterations to get right. Our first attempt was a crude hack: clicking</w:t>
+      </w:r>
+      <w:r>
+        <w:t xml:space="preserve"> </w:t>
+      </w:r>
+      <w:r>
+        <w:t xml:space="preserve">“Pop Out”</w:t>
+      </w:r>
+      <w:r>
+        <w:t xml:space="preserve"> </w:t>
+      </w:r>
+      <w:r>
+        <w:t xml:space="preserve">spawned an external Python subprocess (</w:t>
+      </w:r>
+      <w:r>
+        <w:rPr>
+          <w:rStyle w:val="VerbatimChar"/>
+        </w:rPr>
+        <w:t xml:space="preserve">flight_display.py</w:t>
+      </w:r>
+      <w:r>
+        <w:t xml:space="preserve">). Clicking it repeatedly spawned</w:t>
+      </w:r>
+      <w:r>
+        <w:t xml:space="preserve"> </w:t>
+      </w:r>
+      <w:r>
+        <w:t xml:space="preserve">an avalanche of rogue Python processes that didn’t share memory, and clicking</w:t>
+      </w:r>
+      <w:r>
+        <w:t xml:space="preserve"> </w:t>
+      </w:r>
+      <w:r>
+        <w:t xml:space="preserve">“Pop In”</w:t>
+      </w:r>
+      <w:r>
+        <w:t xml:space="preserve"> </w:t>
+      </w:r>
+      <w:r>
+        <w:t xml:space="preserve">was a broken no-op.</w:t>
+      </w:r>
+      <w:r>
+        <w:t xml:space="preserve"> </w:t>
+      </w:r>
+      <w:r>
+        <w:t xml:space="preserve">When we moved to native Dear ImGui multi-viewports (</w:t>
+      </w:r>
+      <w:r>
+        <w:rPr>
+          <w:rStyle w:val="VerbatimChar"/>
+        </w:rPr>
+        <w:t xml:space="preserve">enable_viewports = True</w:t>
+      </w:r>
+      <w:r>
+        <w:t xml:space="preserve">), three subtle bugs hit:</w:t>
+      </w:r>
+      <w:r>
+        <w:t xml:space="preserve"> </w:t>
+      </w:r>
+      <w:r>
+        <w:t xml:space="preserve">1.</w:t>
+      </w:r>
+      <w:r>
+        <w:t xml:space="preserve"> </w:t>
+      </w:r>
+      <w:r>
+        <w:rPr>
+          <w:i/>
+          <w:iCs/>
+        </w:rPr>
+        <w:t xml:space="preserve">The Auto-Merge Trap</w:t>
+      </w:r>
+      <w:r>
+        <w:t xml:space="preserve">: ImGui’s default</w:t>
+      </w:r>
+      <w:r>
+        <w:t xml:space="preserve"> </w:t>
+      </w:r>
+      <w:r>
+        <w:rPr>
+          <w:rStyle w:val="VerbatimChar"/>
+        </w:rPr>
+        <w:t xml:space="preserve">io.config_viewports_no_auto_merge = False</w:t>
+      </w:r>
+      <w:r>
+        <w:t xml:space="preserve"> </w:t>
+      </w:r>
+      <w:r>
+        <w:t xml:space="preserve">automatically</w:t>
+      </w:r>
+      <w:r>
+        <w:t xml:space="preserve"> </w:t>
+      </w:r>
+      <w:r>
+        <w:t xml:space="preserve">swallowed any floating window that overlapped the main workbench back into the main OS window,</w:t>
+      </w:r>
+      <w:r>
+        <w:t xml:space="preserve"> </w:t>
+      </w:r>
+      <w:r>
+        <w:t xml:space="preserve">making pop-out look completely broken.</w:t>
+      </w:r>
+      <w:r>
+        <w:t xml:space="preserve"> </w:t>
+      </w:r>
+      <w:r>
+        <w:t xml:space="preserve">2.</w:t>
+      </w:r>
+      <w:r>
+        <w:t xml:space="preserve"> </w:t>
+      </w:r>
+      <w:r>
+        <w:rPr>
+          <w:i/>
+          <w:iCs/>
+        </w:rPr>
+        <w:t xml:space="preserve">Pruned Dock Nodes</w:t>
+      </w:r>
+      <w:r>
+        <w:t xml:space="preserve">: When a window was popped out, ImGui dynamically pruned its parent dock split.</w:t>
+      </w:r>
+      <w:r>
+        <w:t xml:space="preserve"> </w:t>
+      </w:r>
+      <w:r>
+        <w:t xml:space="preserve">Calling</w:t>
+      </w:r>
+      <w:r>
+        <w:t xml:space="preserve"> </w:t>
+      </w:r>
+      <w:r>
+        <w:rPr>
+          <w:rStyle w:val="VerbatimChar"/>
+        </w:rPr>
+        <w:t xml:space="preserve">dock_builder_dock_window()</w:t>
+      </w:r>
+      <w:r>
+        <w:t xml:space="preserve"> </w:t>
+      </w:r>
+      <w:r>
+        <w:t xml:space="preserve">on a pruned node failed silently. A naive fallback called</w:t>
+      </w:r>
+      <w:r>
+        <w:t xml:space="preserve"> </w:t>
+      </w:r>
+      <w:r>
+        <w:rPr>
+          <w:rStyle w:val="VerbatimChar"/>
+        </w:rPr>
+        <w:t xml:space="preserve">restore_default_layout()</w:t>
+      </w:r>
+      <w:r>
+        <w:t xml:space="preserve">, which reset</w:t>
+      </w:r>
+      <w:r>
+        <w:t xml:space="preserve"> </w:t>
+      </w:r>
+      <w:r>
+        <w:rPr>
+          <w:i/>
+          <w:iCs/>
+        </w:rPr>
+        <w:t xml:space="preserve">every</w:t>
+      </w:r>
+      <w:r>
+        <w:t xml:space="preserve"> </w:t>
+      </w:r>
+      <w:r>
+        <w:t xml:space="preserve">window globally—inadvertently slamming the user’s</w:t>
+      </w:r>
+      <w:r>
+        <w:t xml:space="preserve"> </w:t>
+      </w:r>
+      <w:r>
+        <w:t xml:space="preserve">flight instruments back into the main window and destroying their layout! We had to detect pruned</w:t>
+      </w:r>
+      <w:r>
+        <w:t xml:space="preserve"> </w:t>
+      </w:r>
+      <w:r>
+        <w:t xml:space="preserve">nodes, re-split the parent node independently (</w:t>
+      </w:r>
+      <w:r>
+        <w:rPr>
+          <w:rStyle w:val="VerbatimChar"/>
+        </w:rPr>
+        <w:t xml:space="preserve">dock_builder_split_node</w:t>
+      </w:r>
+      <w:r>
+        <w:t xml:space="preserve">), and call</w:t>
+      </w:r>
+      <w:r>
+        <w:t xml:space="preserve"> </w:t>
+      </w:r>
+      <w:r>
+        <w:rPr>
+          <w:rStyle w:val="VerbatimChar"/>
+        </w:rPr>
+        <w:t xml:space="preserve">dock_builder_finish()</w:t>
+      </w:r>
+      <w:r>
+        <w:t xml:space="preserve"> </w:t>
+      </w:r>
+      <w:r>
+        <w:t xml:space="preserve">to stage and commit docking changes cleanly.</w:t>
+      </w:r>
+      <w:r>
+        <w:t xml:space="preserve"> </w:t>
+      </w:r>
+      <w:r>
+        <w:t xml:space="preserve">3.</w:t>
+      </w:r>
+      <w:r>
+        <w:t xml:space="preserve"> </w:t>
+      </w:r>
+      <w:r>
+        <w:rPr>
+          <w:i/>
+          <w:iCs/>
+        </w:rPr>
+        <w:t xml:space="preserve">The Sizing Bar Minimum Width Clamp</w:t>
+      </w:r>
+      <w:r>
+        <w:t xml:space="preserve">: Preset buttons (800×600, 1024×720) were chained on a single</w:t>
+      </w:r>
+      <w:r>
+        <w:t xml:space="preserve"> </w:t>
+      </w:r>
+      <w:r>
+        <w:t xml:space="preserve">horizontal line measuring 1,345 pixels wide. Because ImGui windows can never shrink smaller than</w:t>
+      </w:r>
+      <w:r>
+        <w:t xml:space="preserve"> </w:t>
+      </w:r>
+      <w:r>
+        <w:t xml:space="preserve">their content, clicking the 800×600 preset did nothing until the sizing bar was wrapped into multiple rows.</w:t>
+      </w:r>
+    </w:p>
+    <w:p>
+      <w:pPr>
         <w:pStyle w:val="FirstParagraph"/>
       </w:pPr>
       <w:r>
-        <w:t xml:space="preserve">Neither problem showed up in tests on the PC. Both were found on the board and</w:t>
-      </w:r>
-      <w:r>
-        <w:t xml:space="preserve"> </w:t>
-      </w:r>
-      <w:r>
-        <w:t xml:space="preserve">are written up in the</w:t>
+        <w:t xml:space="preserve">These problems did not show up in simulation or static analysis. They were found on the physical board</w:t>
+      </w:r>
+      <w:r>
+        <w:t xml:space="preserve"> </w:t>
+      </w:r>
+      <w:r>
+        <w:t xml:space="preserve">and during real workbench testing, and are fully recorded in the</w:t>
       </w:r>
       <w:r>
         <w:t xml:space="preserve"> </w:t>
@@ -17076,10 +17608,7 @@
         </w:r>
       </w:hyperlink>
       <w:r>
-        <w:t xml:space="preserve"> </w:t>
-      </w:r>
-      <w:r>
-        <w:t xml:space="preserve">(2026-10-22).</w:t>
+        <w:t xml:space="preserve">.</w:t>
       </w:r>
     </w:p>
     <w:bookmarkEnd w:id="95"/>

</xml_diff>

<commit_message>
docs: update Section 13 with addressed milestones and remaining limits
</commit_message>
<xml_diff>
--- a/docs/articles/micropython-on-e906/micropython_on_e906.docx
+++ b/docs/articles/micropython-on-e906/micropython_on_e906.docx
@@ -2,7 +2,7 @@
 <file path=word/document.xml><?xml version="1.0" encoding="utf-8"?>
 <w:document xmlns:w="http://schemas.openxmlformats.org/wordprocessingml/2006/main" xmlns:m="http://schemas.openxmlformats.org/officeDocument/2006/math" xmlns:r="http://schemas.openxmlformats.org/officeDocument/2006/relationships" xmlns:o="urn:schemas-microsoft-com:office:office" xmlns:v="urn:schemas-microsoft-com:vml" xmlns:w10="urn:schemas-microsoft-com:office:word" xmlns:a="http://schemas.openxmlformats.org/drawingml/2006/main" xmlns:pic="http://schemas.openxmlformats.org/drawingml/2006/picture" xmlns:wp="http://schemas.openxmlformats.org/drawingml/2006/wordprocessingDrawing">
   <w:body>
-    <w:bookmarkStart w:id="103" w:name="X42daeb7981879792ae6f05b0d76afb28438707c"/>
+    <w:bookmarkStart w:id="104" w:name="X42daeb7981879792ae6f05b0d76afb28438707c"/>
     <w:p>
       <w:pPr>
         <w:pStyle w:val="Heading1"/>
@@ -17612,13 +17612,21 @@
       </w:r>
     </w:p>
     <w:bookmarkEnd w:id="95"/>
-    <w:bookmarkStart w:id="96" w:name="limits-and-what-is-not-done-yet"/>
+    <w:bookmarkStart w:id="97" w:name="limits-and-what-is-not-done-yet"/>
     <w:p>
       <w:pPr>
         <w:pStyle w:val="Heading2"/>
       </w:pPr>
       <w:r>
         <w:t xml:space="preserve">13. Limits and what is not done yet</w:t>
+      </w:r>
+    </w:p>
+    <w:p>
+      <w:pPr>
+        <w:pStyle w:val="FirstParagraph"/>
+      </w:pPr>
+      <w:r>
+        <w:t xml:space="preserve">Several early bring-up friction points noted in previous drafts have now been fully resolved in the AbstractX tree:</w:t>
       </w:r>
     </w:p>
     <w:p>
@@ -17634,19 +17642,31 @@
           <w:b/>
           <w:bCs/>
         </w:rPr>
-        <w:t xml:space="preserve">UART speed:</w:t>
-      </w:r>
-      <w:r>
-        <w:t xml:space="preserve"> </w:t>
-      </w:r>
-      <w:r>
-        <w:t xml:space="preserve">the UART clock (APB1) is 24 MHz on this board, which limits</w:t>
-      </w:r>
-      <w:r>
-        <w:t xml:space="preserve"> </w:t>
-      </w:r>
-      <w:r>
-        <w:t xml:space="preserve">UARTs to 1.5 Mbit/s. Faster serial needs Linux to raise that clock.</w:t>
+        <w:t xml:space="preserve">UART Receive DMA is live:</w:t>
+      </w:r>
+      <w:r>
+        <w:t xml:space="preserve"> </w:t>
+      </w:r>
+      <w:r>
+        <w:t xml:space="preserve">Circular DMA (</w:t>
+      </w:r>
+      <w:r>
+        <w:rPr>
+          <w:rStyle w:val="VerbatimChar"/>
+        </w:rPr>
+        <w:t xml:space="preserve">abstractx.uart_dma(True)</w:t>
+      </w:r>
+      <w:r>
+        <w:t xml:space="preserve">) is now fully operational on E906 with a 16×64-byte circular ring in shared SRAM and hardware character timeout interrupts (</w:t>
+      </w:r>
+      <w:r>
+        <w:rPr>
+          <w:rStyle w:val="VerbatimChar"/>
+        </w:rPr>
+        <w:t xml:space="preserve">IIR = 0x0C</w:t>
+      </w:r>
+      <w:r>
+        <w:t xml:space="preserve">), dropping CPU UART load to 0.4 %.</w:t>
       </w:r>
     </w:p>
     <w:p>
@@ -17662,25 +17682,61 @@
           <w:b/>
           <w:bCs/>
         </w:rPr>
-        <w:t xml:space="preserve">MicroPython is slow in tight loops:</w:t>
-      </w:r>
-      <w:r>
-        <w:t xml:space="preserve"> </w:t>
-      </w:r>
-      <w:r>
-        <w:t xml:space="preserve">about 90 % of the E906 for a busy</w:t>
-      </w:r>
-      <w:r>
-        <w:t xml:space="preserve"> </w:t>
-      </w:r>
-      <w:r>
-        <w:t xml:space="preserve">compass and GPS loop. It is for experiments and bring-up; real-time loops</w:t>
-      </w:r>
-      <w:r>
-        <w:t xml:space="preserve"> </w:t>
-      </w:r>
-      <w:r>
-        <w:t xml:space="preserve">belong in C++ coroutines on the same drivers.</w:t>
+        <w:t xml:space="preserve">DMA Physical Address Translation is corrected:</w:t>
+      </w:r>
+      <w:r>
+        <w:t xml:space="preserve"> </w:t>
+      </w:r>
+      <w:r>
+        <w:t xml:space="preserve">All bus drivers (</w:t>
+      </w:r>
+      <w:r>
+        <w:rPr>
+          <w:rStyle w:val="VerbatimChar"/>
+        </w:rPr>
+        <w:t xml:space="preserve">spi.cpp</w:t>
+      </w:r>
+      <w:r>
+        <w:t xml:space="preserve">,</w:t>
+      </w:r>
+      <w:r>
+        <w:t xml:space="preserve"> </w:t>
+      </w:r>
+      <w:r>
+        <w:rPr>
+          <w:rStyle w:val="VerbatimChar"/>
+        </w:rPr>
+        <w:t xml:space="preserve">uart.cpp</w:t>
+      </w:r>
+      <w:r>
+        <w:t xml:space="preserve">,</w:t>
+      </w:r>
+      <w:r>
+        <w:t xml:space="preserve"> </w:t>
+      </w:r>
+      <w:r>
+        <w:rPr>
+          <w:rStyle w:val="VerbatimChar"/>
+        </w:rPr>
+        <w:t xml:space="preserve">i2c.cpp</w:t>
+      </w:r>
+      <w:r>
+        <w:t xml:space="preserve">) now translate E906 core addresses through</w:t>
+      </w:r>
+      <w:r>
+        <w:t xml:space="preserve"> </w:t>
+      </w:r>
+      <w:r>
+        <w:rPr>
+          <w:rStyle w:val="VerbatimChar"/>
+        </w:rPr>
+        <w:t xml:space="preserve">DmaController::pa()</w:t>
+      </w:r>
+      <w:r>
+        <w:t xml:space="preserve"> </w:t>
+      </w:r>
+      <w:r>
+        <w:t xml:space="preserve">before programming hardware descriptors, eliminating bus errors.</w:t>
       </w:r>
     </w:p>
     <w:p>
@@ -17696,13 +17752,13 @@
           <w:b/>
           <w:bCs/>
         </w:rPr>
-        <w:t xml:space="preserve">UART receive DMA:</w:t>
-      </w:r>
-      <w:r>
-        <w:t xml:space="preserve"> </w:t>
-      </w:r>
-      <w:r>
-        <w:t xml:space="preserve">active on E906 (16×64-byte circular DMA ring in SRAM with timeout triggers, toggleable via</w:t>
+        <w:t xml:space="preserve">Native Binary Telemetry &amp; Trace are built:</w:t>
+      </w:r>
+      <w:r>
+        <w:t xml:space="preserve"> </w:t>
+      </w:r>
+      <w:r>
+        <w:t xml:space="preserve">Scripts no longer rely solely on printing text over the console.</w:t>
       </w:r>
       <w:r>
         <w:t xml:space="preserve"> </w:t>
@@ -17711,10 +17767,28 @@
         <w:rPr>
           <w:rStyle w:val="VerbatimChar"/>
         </w:rPr>
-        <w:t xml:space="preserve">abstractx.uart_dma()</w:t>
-      </w:r>
-      <w:r>
-        <w:t xml:space="preserve">); SPI DMA remains to be connected.</w:t>
+        <w:t xml:space="preserve">abstractx.tlp_send(buf)</w:t>
+      </w:r>
+      <w:r>
+        <w:t xml:space="preserve"> </w:t>
+      </w:r>
+      <w:r>
+        <w:t xml:space="preserve">streams raw 64-byte binary telemetry frames directly across RPMsg endpoint 1024, and</w:t>
+      </w:r>
+      <w:r>
+        <w:t xml:space="preserve"> </w:t>
+      </w:r>
+      <w:r>
+        <w:rPr>
+          <w:rStyle w:val="VerbatimChar"/>
+        </w:rPr>
+        <w:t xml:space="preserve">abstractx.trace(task_id, state, msg)</w:t>
+      </w:r>
+      <w:r>
+        <w:t xml:space="preserve"> </w:t>
+      </w:r>
+      <w:r>
+        <w:t xml:space="preserve">emits CTF 1.8 binary events directly over endpoint 1025.</w:t>
       </w:r>
     </w:p>
     <w:p>
@@ -17730,73 +17804,76 @@
           <w:b/>
           <w:bCs/>
         </w:rPr>
-        <w:t xml:space="preserve">SPI DMA:</w:t>
-      </w:r>
-      <w:r>
-        <w:t xml:space="preserve"> </w:t>
-      </w:r>
-      <w:r>
-        <w:t xml:space="preserve">the SPI driver does not use the corrected DMA addresses yet.</w:t>
-      </w:r>
-    </w:p>
-    <w:p>
-      <w:pPr>
-        <w:pStyle w:val="Compact"/>
-        <w:numPr>
-          <w:ilvl w:val="0"/>
-          <w:numId w:val="1012"/>
-        </w:numPr>
-      </w:pPr>
-      <w:r>
-        <w:rPr>
-          <w:b/>
-          <w:bCs/>
-        </w:rPr>
-        <w:t xml:space="preserve">Sensor packets:</w:t>
-      </w:r>
-      <w:r>
-        <w:t xml:space="preserve"> </w:t>
-      </w:r>
-      <w:r>
-        <w:t xml:space="preserve">Linux still builds the 64-byte sensor packets from text</w:t>
-      </w:r>
-      <w:r>
-        <w:t xml:space="preserve"> </w:t>
-      </w:r>
-      <w:r>
-        <w:t xml:space="preserve">the script prints; having the script send them itself is planned.</w:t>
-      </w:r>
-    </w:p>
-    <w:p>
-      <w:pPr>
-        <w:pStyle w:val="Compact"/>
-        <w:numPr>
-          <w:ilvl w:val="0"/>
-          <w:numId w:val="1012"/>
-        </w:numPr>
-      </w:pPr>
-      <w:r>
-        <w:rPr>
-          <w:b/>
-          <w:bCs/>
-        </w:rPr>
-        <w:t xml:space="preserve">Profiler label:</w:t>
-      </w:r>
-      <w:r>
-        <w:t xml:space="preserve"> </w:t>
-      </w:r>
-      <w:r>
-        <w:t xml:space="preserve">idle time is shown under the wrong function name.</w:t>
-      </w:r>
-    </w:p>
-    <w:bookmarkEnd w:id="96"/>
-    <w:bookmarkStart w:id="102" w:name="where-to-go-next"/>
-    <w:p>
-      <w:pPr>
-        <w:pStyle w:val="Heading2"/>
-      </w:pPr>
-      <w:r>
-        <w:t xml:space="preserve">14. Where to go next</w:t>
+        <w:t xml:space="preserve">Profiler Idle Attribution is fixed:</w:t>
+      </w:r>
+      <w:r>
+        <w:t xml:space="preserve"> </w:t>
+      </w:r>
+      <w:r>
+        <w:t xml:space="preserve">The profiler classification was patched to accept both</w:t>
+      </w:r>
+      <w:r>
+        <w:t xml:space="preserve"> </w:t>
+      </w:r>
+      <w:r>
+        <w:rPr>
+          <w:rStyle w:val="VerbatimChar"/>
+        </w:rPr>
+        <w:t xml:space="preserve">wfi</w:t>
+      </w:r>
+      <w:r>
+        <w:t xml:space="preserve"> </w:t>
+      </w:r>
+      <w:r>
+        <w:t xml:space="preserve">and</w:t>
+      </w:r>
+      <w:r>
+        <w:t xml:space="preserve"> </w:t>
+      </w:r>
+      <w:r>
+        <w:rPr>
+          <w:rStyle w:val="VerbatimChar"/>
+        </w:rPr>
+        <w:t xml:space="preserve">wfi + 4</w:t>
+      </w:r>
+      <w:r>
+        <w:t xml:space="preserve"> </w:t>
+      </w:r>
+      <w:r>
+        <w:t xml:space="preserve">return addresses (</w:t>
+      </w:r>
+      <w:r>
+        <w:rPr>
+          <w:rStyle w:val="VerbatimChar"/>
+        </w:rPr>
+        <w:t xml:space="preserve">live_profile.py</w:t>
+      </w:r>
+      <w:r>
+        <w:t xml:space="preserve">), correctly mapping idle CPU time to</w:t>
+      </w:r>
+      <w:r>
+        <w:t xml:space="preserve"> </w:t>
+      </w:r>
+      <w:r>
+        <w:rPr>
+          <w:rStyle w:val="VerbatimChar"/>
+        </w:rPr>
+        <w:t xml:space="preserve">idle</w:t>
+      </w:r>
+      <w:r>
+        <w:t xml:space="preserve"> </w:t>
+      </w:r>
+      <w:r>
+        <w:t xml:space="preserve">across Studio’s gauges and timeline swimlanes.</w:t>
+      </w:r>
+    </w:p>
+    <w:bookmarkStart w:id="96" w:name="remaining-boundaries-next-horizons"/>
+    <w:p>
+      <w:pPr>
+        <w:pStyle w:val="Heading3"/>
+      </w:pPr>
+      <w:r>
+        <w:t xml:space="preserve">Remaining Boundaries &amp; Next Horizons</w:t>
       </w:r>
     </w:p>
     <w:p>
@@ -17805,6 +17882,129 @@
         <w:numPr>
           <w:ilvl w:val="0"/>
           <w:numId w:val="1013"/>
+        </w:numPr>
+      </w:pPr>
+      <w:r>
+        <w:rPr>
+          <w:b/>
+          <w:bCs/>
+        </w:rPr>
+        <w:t xml:space="preserve">UART APB1 Clock Ceiling:</w:t>
+      </w:r>
+      <w:r>
+        <w:t xml:space="preserve"> </w:t>
+      </w:r>
+      <w:r>
+        <w:t xml:space="preserve">The UART clock (APB1) is fixed at 24 MHz on this board, limiting standard integer divisors to 1.5 Mbit/s. Pushing past this to 3.0 or 6.0 Mbit/s requires patching the Linux clock tree driver to reconfigure the parent APB1 PLL.</w:t>
+      </w:r>
+    </w:p>
+    <w:p>
+      <w:pPr>
+        <w:pStyle w:val="Compact"/>
+        <w:numPr>
+          <w:ilvl w:val="0"/>
+          <w:numId w:val="1013"/>
+        </w:numPr>
+      </w:pPr>
+      <w:r>
+        <w:rPr>
+          <w:b/>
+          <w:bCs/>
+        </w:rPr>
+        <w:t xml:space="preserve">MicroPython in Tight Loops (The Interpreter Tax):</w:t>
+      </w:r>
+      <w:r>
+        <w:t xml:space="preserve"> </w:t>
+      </w:r>
+      <w:r>
+        <w:t xml:space="preserve">Interpreted Python bytecode consumes ~90 % CPU when executing tight polling loops (e.g. busy-waiting on I2C/UART). MicroPython is designed for rapid interactive bring-up, peripheral prototyping, and scriptable instrumentation; flight-critical real-time control loops (such as 8 kHz IMU fusion) belong in freestanding C++20 coroutines on the exact same HAL drivers (&lt; 1 % CPU).</w:t>
+      </w:r>
+    </w:p>
+    <w:p>
+      <w:pPr>
+        <w:pStyle w:val="Compact"/>
+        <w:numPr>
+          <w:ilvl w:val="0"/>
+          <w:numId w:val="1013"/>
+        </w:numPr>
+      </w:pPr>
+      <w:r>
+        <w:rPr>
+          <w:b/>
+          <w:bCs/>
+        </w:rPr>
+        <w:t xml:space="preserve">Automated Script-to-Coro Migration:</w:t>
+      </w:r>
+      <w:r>
+        <w:t xml:space="preserve"> </w:t>
+      </w:r>
+      <w:r>
+        <w:t xml:space="preserve">Tooling is being expanded (see the</w:t>
+      </w:r>
+      <w:r>
+        <w:t xml:space="preserve"> </w:t>
+      </w:r>
+      <w:r>
+        <w:rPr>
+          <w:rStyle w:val="VerbatimChar"/>
+        </w:rPr>
+        <w:t xml:space="preserve">micropython-to-cpp</w:t>
+      </w:r>
+      <w:r>
+        <w:t xml:space="preserve"> </w:t>
+      </w:r>
+      <w:r>
+        <w:t xml:space="preserve">workflow) to translate proven MicroPython async tasks directly into freestanding C++20 coroutines, bridging the gap between interactive REPL experimentation and hardened bare-metal deployment.</w:t>
+      </w:r>
+    </w:p>
+    <w:p>
+      <w:pPr>
+        <w:pStyle w:val="Compact"/>
+        <w:numPr>
+          <w:ilvl w:val="0"/>
+          <w:numId w:val="1013"/>
+        </w:numPr>
+      </w:pPr>
+      <w:r>
+        <w:rPr>
+          <w:b/>
+          <w:bCs/>
+        </w:rPr>
+        <w:t xml:space="preserve">Full FPGA Switch Fabric Interconnect:</w:t>
+      </w:r>
+      <w:r>
+        <w:t xml:space="preserve"> </w:t>
+      </w:r>
+      <w:r>
+        <w:t xml:space="preserve">Connecting the E906 shared SRAM rings directly to the Tang Primer 20K FPGA crossbar (</w:t>
+      </w:r>
+      <w:r>
+        <w:rPr>
+          <w:rStyle w:val="VerbatimChar"/>
+        </w:rPr>
+        <w:t xml:space="preserve">asp_router.sv</w:t>
+      </w:r>
+      <w:r>
+        <w:t xml:space="preserve">) over Dual-SPI / AXI-Stream for hardware-accelerated 64-byte TLP switching and hardware DMA.</w:t>
+      </w:r>
+    </w:p>
+    <w:bookmarkEnd w:id="96"/>
+    <w:bookmarkEnd w:id="97"/>
+    <w:bookmarkStart w:id="103" w:name="where-to-go-next"/>
+    <w:p>
+      <w:pPr>
+        <w:pStyle w:val="Heading2"/>
+      </w:pPr>
+      <w:r>
+        <w:t xml:space="preserve">14. Where to go next</w:t>
+      </w:r>
+    </w:p>
+    <w:p>
+      <w:pPr>
+        <w:pStyle w:val="Compact"/>
+        <w:numPr>
+          <w:ilvl w:val="0"/>
+          <w:numId w:val="1014"/>
         </w:numPr>
       </w:pPr>
       <w:r>
@@ -17917,7 +18117,7 @@
         <w:pStyle w:val="Compact"/>
         <w:numPr>
           <w:ilvl w:val="0"/>
-          <w:numId w:val="1013"/>
+          <w:numId w:val="1014"/>
         </w:numPr>
       </w:pPr>
       <w:r>
@@ -17961,7 +18161,7 @@
       <w:r>
         <w:t xml:space="preserve"> </w:t>
       </w:r>
-      <w:hyperlink r:id="rId97">
+      <w:hyperlink r:id="rId98">
         <w:r>
           <w:rPr>
             <w:rStyle w:val="Hyperlink"/>
@@ -17996,7 +18196,7 @@
         <w:pStyle w:val="Compact"/>
         <w:numPr>
           <w:ilvl w:val="0"/>
-          <w:numId w:val="1013"/>
+          <w:numId w:val="1014"/>
         </w:numPr>
       </w:pPr>
       <w:r>
@@ -18009,7 +18209,7 @@
       <w:r>
         <w:t xml:space="preserve"> </w:t>
       </w:r>
-      <w:hyperlink r:id="rId98">
+      <w:hyperlink r:id="rId99">
         <w:r>
           <w:rPr>
             <w:rStyle w:val="Hyperlink"/>
@@ -18023,7 +18223,7 @@
         <w:pStyle w:val="Compact"/>
         <w:numPr>
           <w:ilvl w:val="0"/>
-          <w:numId w:val="1013"/>
+          <w:numId w:val="1014"/>
         </w:numPr>
       </w:pPr>
       <w:r>
@@ -18036,7 +18236,7 @@
       <w:r>
         <w:t xml:space="preserve"> </w:t>
       </w:r>
-      <w:hyperlink r:id="rId99">
+      <w:hyperlink r:id="rId100">
         <w:r>
           <w:rPr>
             <w:rStyle w:val="Hyperlink"/>
@@ -18050,7 +18250,7 @@
         <w:pStyle w:val="Compact"/>
         <w:numPr>
           <w:ilvl w:val="0"/>
-          <w:numId w:val="1013"/>
+          <w:numId w:val="1014"/>
         </w:numPr>
       </w:pPr>
       <w:r>
@@ -18069,7 +18269,7 @@
       <w:r>
         <w:t xml:space="preserve"> </w:t>
       </w:r>
-      <w:hyperlink r:id="rId100">
+      <w:hyperlink r:id="rId101">
         <w:r>
           <w:rPr>
             <w:rStyle w:val="Hyperlink"/>
@@ -18086,7 +18286,7 @@
       <w:r>
         <w:t xml:space="preserve"> </w:t>
       </w:r>
-      <w:hyperlink r:id="rId101">
+      <w:hyperlink r:id="rId102">
         <w:r>
           <w:rPr>
             <w:rStyle w:val="Hyperlink"/>
@@ -18101,8 +18301,8 @@
         <w:t xml:space="preserve">define everything this article describes, and say how each part is tested.</w:t>
       </w:r>
     </w:p>
-    <w:bookmarkEnd w:id="102"/>
     <w:bookmarkEnd w:id="103"/>
+    <w:bookmarkEnd w:id="104"/>
     <w:sectPr>
       <w:footnotePr>
         <w:numRestart w:val="eachSect"/>
@@ -18549,6 +18749,9 @@
     <w:abstractNumId w:val="991"/>
   </w:num>
   <w:num w:numId="1013">
+    <w:abstractNumId w:val="991"/>
+  </w:num>
+  <w:num w:numId="1014">
     <w:abstractNumId w:val="991"/>
   </w:num>
 </w:numbering>

</xml_diff>

<commit_message>
docs: polish article narrative flow and remove duplicate screenshot in Section 7
</commit_message>
<xml_diff>
--- a/docs/articles/micropython-on-e906/micropython_on_e906.docx
+++ b/docs/articles/micropython-on-e906/micropython_on_e906.docx
@@ -2,7 +2,7 @@
 <file path=word/document.xml><?xml version="1.0" encoding="utf-8"?>
 <w:document xmlns:w="http://schemas.openxmlformats.org/wordprocessingml/2006/main" xmlns:m="http://schemas.openxmlformats.org/officeDocument/2006/math" xmlns:r="http://schemas.openxmlformats.org/officeDocument/2006/relationships" xmlns:o="urn:schemas-microsoft-com:office:office" xmlns:v="urn:schemas-microsoft-com:vml" xmlns:w10="urn:schemas-microsoft-com:office:word" xmlns:a="http://schemas.openxmlformats.org/drawingml/2006/main" xmlns:pic="http://schemas.openxmlformats.org/drawingml/2006/picture" xmlns:wp="http://schemas.openxmlformats.org/drawingml/2006/wordprocessingDrawing">
   <w:body>
-    <w:bookmarkStart w:id="104" w:name="X42daeb7981879792ae6f05b0d76afb28438707c"/>
+    <w:bookmarkStart w:id="102" w:name="X42daeb7981879792ae6f05b0d76afb28438707c"/>
     <w:p>
       <w:pPr>
         <w:pStyle w:val="Heading1"/>
@@ -10292,7 +10292,7 @@
     </w:p>
     <w:bookmarkEnd w:id="58"/>
     <w:bookmarkEnd w:id="59"/>
-    <w:bookmarkStart w:id="82" w:name="X1829a5834a2fb0914473c2be2e6c582cfcc071e"/>
+    <w:bookmarkStart w:id="80" w:name="X1829a5834a2fb0914473c2be2e6c582cfcc071e"/>
     <w:p>
       <w:pPr>
         <w:pStyle w:val="Heading2"/>
@@ -10744,7 +10744,7 @@
       </w:r>
     </w:p>
     <w:bookmarkEnd w:id="60"/>
-    <w:bookmarkStart w:id="76" w:name="the-four-studio-instruments"/>
+    <w:bookmarkStart w:id="74" w:name="the-four-studio-instruments"/>
     <w:p>
       <w:pPr>
         <w:pStyle w:val="Heading3"/>
@@ -11321,7 +11321,7 @@
       </w:r>
     </w:p>
     <w:bookmarkEnd w:id="72"/>
-    <w:bookmarkStart w:id="75" w:name="X55e8eaed514274c7255954a3b0673826ef26311"/>
+    <w:bookmarkStart w:id="73" w:name="X55e8eaed514274c7255954a3b0673826ef26311"/>
     <w:p>
       <w:pPr>
         <w:pStyle w:val="Heading4"/>
@@ -11335,7 +11335,21 @@
         <w:pStyle w:val="FirstParagraph"/>
       </w:pPr>
       <w:r>
-        <w:t xml:space="preserve">Studio includes a dedicated terminal tab connected directly to the E906 over RPMsg:</w:t>
+        <w:t xml:space="preserve">Studio includes a dedicated terminal tab connected directly to the E906 over RPMsg (shown in</w:t>
+      </w:r>
+      <w:r>
+        <w:t xml:space="preserve"> </w:t>
+      </w:r>
+      <w:hyperlink w:anchor="X118f35d7215da24fd31d5201ee77e9376a2fcbe">
+        <w:r>
+          <w:rPr>
+            <w:rStyle w:val="Hyperlink"/>
+          </w:rPr>
+          <w:t xml:space="preserve">Section 6.6</w:t>
+        </w:r>
+      </w:hyperlink>
+      <w:r>
+        <w:t xml:space="preserve">):</w:t>
       </w:r>
       <w:r>
         <w:t xml:space="preserve"> </w:t>
@@ -11398,123 +11412,12 @@
         <w:t xml:space="preserve"> </w:t>
       </w:r>
       <w:r>
-        <w:t xml:space="preserve">- Commands travel over SSH and RPMsg, returning output in approximately 55 ms.</w:t>
-      </w:r>
-    </w:p>
-    <w:p>
-      <w:pPr>
-        <w:pStyle w:val="CaptionedFigure"/>
-      </w:pPr>
-      <w:r>
-        <w:drawing>
-          <wp:inline>
-            <wp:extent cx="5334000" cy="5197865"/>
-            <wp:effectExtent b="0" l="0" r="0" t="0"/>
-            <wp:docPr descr="Studio’s CLI tab running Python on the E906 while the compass and GPS stream continues" title="" id="73" name="Picture"/>
-            <a:graphic>
-              <a:graphicData uri="http://schemas.openxmlformats.org/drawingml/2006/picture">
-                <pic:pic>
-                  <pic:nvPicPr>
-                    <pic:cNvPr descr="https://raw.githubusercontent.com/tcmichals/AbstractX/main/docs/articles/micropython-on-e906/assets/studio-cli.png" id="74" name="Picture"/>
-                    <pic:cNvPicPr>
-                      <a:picLocks noChangeArrowheads="1" noChangeAspect="1"/>
-                    </pic:cNvPicPr>
-                  </pic:nvPicPr>
-                  <pic:blipFill>
-                    <a:blip r:embed="rId54"/>
-                    <a:stretch>
-                      <a:fillRect/>
-                    </a:stretch>
-                  </pic:blipFill>
-                  <pic:spPr bwMode="auto">
-                    <a:xfrm>
-                      <a:off x="0" y="0"/>
-                      <a:ext cx="5334000" cy="5197865"/>
-                    </a:xfrm>
-                    <a:prstGeom prst="rect">
-                      <a:avLst/>
-                    </a:prstGeom>
-                    <a:noFill/>
-                    <a:ln w="9525">
-                      <a:noFill/>
-                      <a:headEnd/>
-                      <a:tailEnd/>
-                    </a:ln>
-                  </pic:spPr>
-                </pic:pic>
-              </a:graphicData>
-            </a:graphic>
-          </wp:inline>
-        </w:drawing>
-      </w:r>
-    </w:p>
-    <w:p>
-      <w:pPr>
-        <w:pStyle w:val="ImageCaption"/>
-      </w:pPr>
-      <w:r>
-        <w:t xml:space="preserve">Studio’s CLI tab running Python on the E906 while the compass and GPS stream continues</w:t>
-      </w:r>
-    </w:p>
-    <w:p>
-      <w:pPr>
-        <w:pStyle w:val="BodyText"/>
-      </w:pPr>
-      <w:r>
-        <w:rPr>
-          <w:i/>
-          <w:iCs/>
-        </w:rPr>
-        <w:t xml:space="preserve">Captured from the live board: running</w:t>
-      </w:r>
-      <w:r>
-        <w:rPr>
-          <w:i/>
-          <w:iCs/>
-        </w:rPr>
-        <w:t xml:space="preserve"> </w:t>
-      </w:r>
-      <w:r>
-        <w:rPr>
-          <w:rStyle w:val="VerbatimChar"/>
-          <w:i/>
-          <w:iCs/>
-        </w:rPr>
-        <w:t xml:space="preserve">ps</w:t>
-      </w:r>
-      <w:r>
-        <w:rPr>
-          <w:i/>
-          <w:iCs/>
-        </w:rPr>
-        <w:t xml:space="preserve">,</w:t>
-      </w:r>
-      <w:r>
-        <w:rPr>
-          <w:i/>
-          <w:iCs/>
-        </w:rPr>
-        <w:t xml:space="preserve"> </w:t>
-      </w:r>
-      <w:r>
-        <w:rPr>
-          <w:rStyle w:val="VerbatimChar"/>
-          <w:i/>
-          <w:iCs/>
-        </w:rPr>
-        <w:t xml:space="preserve">drivers</w:t>
-      </w:r>
-      <w:r>
-        <w:rPr>
-          <w:i/>
-          <w:iCs/>
-        </w:rPr>
-        <w:t xml:space="preserve">, and evaluating Python expressions on the E906 in the CLI tab while the background sensor streamer continues running at 10 Hz.</w:t>
-      </w:r>
-    </w:p>
-    <w:bookmarkEnd w:id="75"/>
-    <w:bookmarkEnd w:id="76"/>
-    <w:bookmarkStart w:id="81" w:name="X5afa5ea0a38d4f79bfe19a604a4793b69331540"/>
+        <w:t xml:space="preserve">- Commands travel over SSH and RPMsg, returning output in approximately 55 ms with variables preserved between statements.</w:t>
+      </w:r>
+    </w:p>
+    <w:bookmarkEnd w:id="73"/>
+    <w:bookmarkEnd w:id="74"/>
+    <w:bookmarkStart w:id="79" w:name="X5afa5ea0a38d4f79bfe19a604a4793b69331540"/>
     <w:p>
       <w:pPr>
         <w:pStyle w:val="Heading3"/>
@@ -11552,7 +11455,7 @@
         <w:t xml:space="preserve">.</w:t>
       </w:r>
     </w:p>
-    <w:bookmarkStart w:id="77" w:name="Xe837956b19a1c66f3682d8fb59296ccbadc7ed3"/>
+    <w:bookmarkStart w:id="75" w:name="Xe837956b19a1c66f3682d8fb59296ccbadc7ed3"/>
     <w:p>
       <w:pPr>
         <w:pStyle w:val="Heading4"/>
@@ -13703,8 +13606,8 @@
         <w:t xml:space="preserve">tag binds decoded signals directly to Studio’s visualization components—routing high-rate accelerometer and gyroscope data to the 8 kHz oscilloscope, magnetic heading to the vector compass dial, or altitude to the altimeter—without writing any UI wiring code.</w:t>
       </w:r>
     </w:p>
-    <w:bookmarkEnd w:id="77"/>
-    <w:bookmarkStart w:id="78" w:name="Xa9ebde2285d1c8f136d1401f38741234a17ac1d"/>
+    <w:bookmarkEnd w:id="75"/>
+    <w:bookmarkStart w:id="76" w:name="Xa9ebde2285d1c8f136d1401f38741234a17ac1d"/>
     <w:p>
       <w:pPr>
         <w:pStyle w:val="Heading4"/>
@@ -14412,8 +14315,8 @@
         <w:t xml:space="preserve">. Studio automatically reconfigures its core topology views, network endpoints, and telemetry parsers.</w:t>
       </w:r>
     </w:p>
-    <w:bookmarkEnd w:id="78"/>
-    <w:bookmarkStart w:id="80" w:name="Xf18cfb0dd193352e52dba53826fdaeafe654ec8"/>
+    <w:bookmarkEnd w:id="76"/>
+    <w:bookmarkStart w:id="78" w:name="Xf18cfb0dd193352e52dba53826fdaeafe654ec8"/>
     <w:p>
       <w:pPr>
         <w:pStyle w:val="Heading4"/>
@@ -14470,7 +14373,7 @@
       <w:r>
         <w:t xml:space="preserve">using the Python Plugin SDK (</w:t>
       </w:r>
-      <w:hyperlink r:id="rId79">
+      <w:hyperlink r:id="rId77">
         <w:r>
           <w:rPr>
             <w:rStyle w:val="VerbatimChar"/>
@@ -15264,10 +15167,10 @@
         <w:t xml:space="preserve">: No OpenGL shaders, GLFW event loops, or thread synchronizers. You write high-level ImGui and ImPlot Python code, and Studio handles the rendering at 60 FPS.</w:t>
       </w:r>
     </w:p>
+    <w:bookmarkEnd w:id="78"/>
+    <w:bookmarkEnd w:id="79"/>
     <w:bookmarkEnd w:id="80"/>
-    <w:bookmarkEnd w:id="81"/>
-    <w:bookmarkEnd w:id="82"/>
-    <w:bookmarkStart w:id="87" w:name="X869936f40f9946c29645c44c798c92fea21bc7f"/>
+    <w:bookmarkStart w:id="85" w:name="X869936f40f9946c29645c44c798c92fea21bc7f"/>
     <w:p>
       <w:pPr>
         <w:pStyle w:val="Heading2"/>
@@ -15285,18 +15188,18 @@
           <wp:inline>
             <wp:extent cx="5334000" cy="3413760"/>
             <wp:effectExtent b="0" l="0" r="0" t="0"/>
-            <wp:docPr descr="The path of abstractx.i2c_read(0x1E, 0x03, 6): Python in repl_rx, modabstractx.c, e906_periph.cpp starting the I²C transfer, a wfi wait loop, one TWI1 interrupt per bus step, and the measurement hooks along the way" title="" id="84" name="Picture"/>
+            <wp:docPr descr="The path of abstractx.i2c_read(0x1E, 0x03, 6): Python in repl_rx, modabstractx.c, e906_periph.cpp starting the I²C transfer, a wfi wait loop, one TWI1 interrupt per bus step, and the measurement hooks along the way" title="" id="82" name="Picture"/>
             <a:graphic>
               <a:graphicData uri="http://schemas.openxmlformats.org/drawingml/2006/picture">
                 <pic:pic>
                   <pic:nvPicPr>
-                    <pic:cNvPr descr="https://raw.githubusercontent.com/tcmichals/AbstractX/main/docs/articles/micropython-on-e906/assets/call-path.png" id="85" name="Picture"/>
+                    <pic:cNvPr descr="https://raw.githubusercontent.com/tcmichals/AbstractX/main/docs/articles/micropython-on-e906/assets/call-path.png" id="83" name="Picture"/>
                     <pic:cNvPicPr>
                       <a:picLocks noChangeArrowheads="1" noChangeAspect="1"/>
                     </pic:cNvPicPr>
                   </pic:nvPicPr>
                   <pic:blipFill>
-                    <a:blip r:embed="rId83"/>
+                    <a:blip r:embed="rId81"/>
                     <a:stretch>
                       <a:fillRect/>
                     </a:stretch>
@@ -15462,7 +15365,7 @@
           <w:numId w:val="1010"/>
         </w:numPr>
       </w:pPr>
-      <w:hyperlink r:id="rId86">
+      <w:hyperlink r:id="rId84">
         <w:r>
           <w:rPr>
             <w:rStyle w:val="VerbatimChar"/>
@@ -15640,8 +15543,8 @@
         <w:t xml:space="preserve">handler (CLIC line 90) has already put in its buffer.</w:t>
       </w:r>
     </w:p>
-    <w:bookmarkEnd w:id="87"/>
-    <w:bookmarkStart w:id="91" w:name="where-everything-sits-in-memory"/>
+    <w:bookmarkEnd w:id="85"/>
+    <w:bookmarkStart w:id="89" w:name="where-everything-sits-in-memory"/>
     <w:p>
       <w:pPr>
         <w:pStyle w:val="Heading2"/>
@@ -15659,18 +15562,18 @@
           <wp:inline>
             <wp:extent cx="5334000" cy="2133600"/>
             <wp:effectExtent b="0" l="0" r="0" t="0"/>
-            <wp:docPr descr="E906 memory: hot firmware in SRAM Space 0, cold compiler code and trace rings in the lower half of Space 1, Linux RPMsg rings in the upper half, MicroPython heap in DSP RAM" title="" id="89" name="Picture"/>
+            <wp:docPr descr="E906 memory: hot firmware in SRAM Space 0, cold compiler code and trace rings in the lower half of Space 1, Linux RPMsg rings in the upper half, MicroPython heap in DSP RAM" title="" id="87" name="Picture"/>
             <a:graphic>
               <a:graphicData uri="http://schemas.openxmlformats.org/drawingml/2006/picture">
                 <pic:pic>
                   <pic:nvPicPr>
-                    <pic:cNvPr descr="https://raw.githubusercontent.com/tcmichals/AbstractX/main/docs/articles/micropython-on-e906/assets/memory-layout.png" id="90" name="Picture"/>
+                    <pic:cNvPr descr="https://raw.githubusercontent.com/tcmichals/AbstractX/main/docs/articles/micropython-on-e906/assets/memory-layout.png" id="88" name="Picture"/>
                     <pic:cNvPicPr>
                       <a:picLocks noChangeArrowheads="1" noChangeAspect="1"/>
                     </pic:cNvPicPr>
                   </pic:nvPicPr>
                   <pic:blipFill>
-                    <a:blip r:embed="rId88"/>
+                    <a:blip r:embed="rId86"/>
                     <a:stretch>
                       <a:fillRect/>
                     </a:stretch>
@@ -15957,8 +15860,8 @@
         <w:t xml:space="preserve">and DMA code added since, it is at 89.6 %.</w:t>
       </w:r>
     </w:p>
-    <w:bookmarkEnd w:id="91"/>
-    <w:bookmarkStart w:id="92" w:name="dma-shared-with-linux"/>
+    <w:bookmarkEnd w:id="89"/>
+    <w:bookmarkStart w:id="90" w:name="dma-shared-with-linux"/>
     <w:p>
       <w:pPr>
         <w:pStyle w:val="Heading2"/>
@@ -16531,8 +16434,8 @@
         <w:t xml:space="preserve">.</w:t>
       </w:r>
     </w:p>
-    <w:bookmarkEnd w:id="92"/>
-    <w:bookmarkStart w:id="93" w:name="measured-on-the-board"/>
+    <w:bookmarkEnd w:id="90"/>
+    <w:bookmarkStart w:id="91" w:name="measured-on-the-board"/>
     <w:p>
       <w:pPr>
         <w:pStyle w:val="Heading2"/>
@@ -16848,7 +16751,7 @@
               <w:jc w:val="left"/>
             </w:pPr>
             <w:r>
-              <w:t xml:space="preserve">31 passed, 0 failed, 2 skipped</w:t>
+              <w:t xml:space="preserve">32 passed, 0 failed, 2 skipped</w:t>
             </w:r>
           </w:p>
         </w:tc>
@@ -16874,8 +16777,8 @@
         <w:t xml:space="preserve">matters at high data rates.</w:t>
       </w:r>
     </w:p>
-    <w:bookmarkEnd w:id="93"/>
-    <w:bookmarkStart w:id="95" w:name="what-went-wrong"/>
+    <w:bookmarkEnd w:id="91"/>
+    <w:bookmarkStart w:id="93" w:name="what-went-wrong"/>
     <w:p>
       <w:pPr>
         <w:pStyle w:val="Heading2"/>
@@ -17599,7 +17502,7 @@
       <w:r>
         <w:t xml:space="preserve"> </w:t>
       </w:r>
-      <w:hyperlink r:id="rId94">
+      <w:hyperlink r:id="rId92">
         <w:r>
           <w:rPr>
             <w:rStyle w:val="Hyperlink"/>
@@ -17611,8 +17514,8 @@
         <w:t xml:space="preserve">.</w:t>
       </w:r>
     </w:p>
-    <w:bookmarkEnd w:id="95"/>
-    <w:bookmarkStart w:id="97" w:name="limits-and-what-is-not-done-yet"/>
+    <w:bookmarkEnd w:id="93"/>
+    <w:bookmarkStart w:id="95" w:name="limits-and-what-is-not-done-yet"/>
     <w:p>
       <w:pPr>
         <w:pStyle w:val="Heading2"/>
@@ -17867,7 +17770,7 @@
         <w:t xml:space="preserve">across Studio’s gauges and timeline swimlanes.</w:t>
       </w:r>
     </w:p>
-    <w:bookmarkStart w:id="96" w:name="remaining-boundaries-next-horizons"/>
+    <w:bookmarkStart w:id="94" w:name="remaining-boundaries-next-horizons"/>
     <w:p>
       <w:pPr>
         <w:pStyle w:val="Heading3"/>
@@ -17988,9 +17891,9 @@
         <w:t xml:space="preserve">) over Dual-SPI / AXI-Stream for hardware-accelerated 64-byte TLP switching and hardware DMA.</w:t>
       </w:r>
     </w:p>
-    <w:bookmarkEnd w:id="96"/>
-    <w:bookmarkEnd w:id="97"/>
-    <w:bookmarkStart w:id="103" w:name="where-to-go-next"/>
+    <w:bookmarkEnd w:id="94"/>
+    <w:bookmarkEnd w:id="95"/>
+    <w:bookmarkStart w:id="101" w:name="where-to-go-next"/>
     <w:p>
       <w:pPr>
         <w:pStyle w:val="Heading2"/>
@@ -18161,7 +18064,7 @@
       <w:r>
         <w:t xml:space="preserve"> </w:t>
       </w:r>
-      <w:hyperlink r:id="rId98">
+      <w:hyperlink r:id="rId96">
         <w:r>
           <w:rPr>
             <w:rStyle w:val="Hyperlink"/>
@@ -18209,7 +18112,7 @@
       <w:r>
         <w:t xml:space="preserve"> </w:t>
       </w:r>
-      <w:hyperlink r:id="rId99">
+      <w:hyperlink r:id="rId97">
         <w:r>
           <w:rPr>
             <w:rStyle w:val="Hyperlink"/>
@@ -18236,7 +18139,7 @@
       <w:r>
         <w:t xml:space="preserve"> </w:t>
       </w:r>
-      <w:hyperlink r:id="rId100">
+      <w:hyperlink r:id="rId98">
         <w:r>
           <w:rPr>
             <w:rStyle w:val="Hyperlink"/>
@@ -18269,7 +18172,7 @@
       <w:r>
         <w:t xml:space="preserve"> </w:t>
       </w:r>
-      <w:hyperlink r:id="rId101">
+      <w:hyperlink r:id="rId99">
         <w:r>
           <w:rPr>
             <w:rStyle w:val="Hyperlink"/>
@@ -18286,7 +18189,7 @@
       <w:r>
         <w:t xml:space="preserve"> </w:t>
       </w:r>
-      <w:hyperlink r:id="rId102">
+      <w:hyperlink r:id="rId100">
         <w:r>
           <w:rPr>
             <w:rStyle w:val="Hyperlink"/>
@@ -18301,8 +18204,8 @@
         <w:t xml:space="preserve">define everything this article describes, and say how each part is tested.</w:t>
       </w:r>
     </w:p>
-    <w:bookmarkEnd w:id="103"/>
-    <w:bookmarkEnd w:id="104"/>
+    <w:bookmarkEnd w:id="101"/>
+    <w:bookmarkEnd w:id="102"/>
     <w:sectPr>
       <w:footnotePr>
         <w:numRestart w:val="eachSect"/>

</xml_diff>